<commit_message>
Apply A4 template page setup to Article5
</commit_message>
<xml_diff>
--- a/Article5_English_IEEE_Letter_Compact.docx
+++ b/Article5_English_IEEE_Letter_Compact.docx
@@ -566,9 +566,9 @@
         </w:rPr>
         <w:sectPr>
           <w:type w:val="continuous"/>
-          <w:pgSz w:w="12240" w:h="15840" w:code="1"/>
-          <w:pgMar w:top="1080" w:right="893" w:bottom="1440" w:left="893" w:header="720" w:footer="720" w:gutter="0"/>
-          <w:cols w:num="1" w:space="360"/>
+          <w:pgSz w:w="11906" w:h="16838"/>
+          <w:pgMar w:top="540" w:right="893" w:bottom="1440" w:left="893" w:header="720" w:footer="720" w:gutter="0"/>
+          <w:cols w:space="720" w:num="1"/>
         </w:sectPr>
       </w:pPr>
     </w:p>
@@ -35677,17 +35677,17 @@
         </w:rPr>
         <w:sectPr>
           <w:type w:val="continuous"/>
-          <w:pgSz w:w="12240" w:h="15840" w:code="1"/>
+          <w:pgSz w:w="11906" w:h="16838"/>
           <w:pgMar w:top="1080" w:right="907" w:bottom="1440" w:left="907" w:header="720" w:footer="720" w:gutter="0"/>
-          <w:cols w:num="2" w:space="360"/>
+          <w:cols w:space="360" w:num="2"/>
         </w:sectPr>
       </w:pPr>
     </w:p>
     <w:sectPr>
       <w:type w:val="continuous"/>
-      <w:pgSz w:w="12240" w:h="15840" w:code="1"/>
-      <w:pgMar w:top="1080" w:right="907" w:bottom="1440" w:left="907" w:header="720" w:footer="720" w:gutter="0"/>
-      <w:cols w:num="1" w:space="360"/>
+      <w:pgSz w:w="11906" w:h="16838"/>
+      <w:pgMar w:top="1080" w:right="893" w:bottom="1440" w:left="893" w:header="720" w:footer="720" w:gutter="0"/>
+      <w:cols w:space="720" w:num="1"/>
     </w:sectPr>
   </w:body>
 </w:document>

</xml_diff>

<commit_message>
Trim repeated paper overview text
</commit_message>
<xml_diff>
--- a/Article5_English_IEEE_Letter_Compact.docx
+++ b/Article5_English_IEEE_Letter_Compact.docx
@@ -754,7 +754,7 @@
           <w:i w:val="0"/>
           <w:lang w:val="en-US"/>
         </w:rPr>
-        <w:t xml:space="preserve">This paper presents a Mecanum-wheeled quadrupedal mobile manipulator and heterogeneous teleoperation system. Torque feedforward and attitude feedback control the four-wheeled-legged chassis carrying a six-axis arm and gripper. The master combines Delta translation and a three-encoder orientation handle. Frame calibration, position scaling, and analytical arm inverse kinematics convert master poses into joint commands. Teleoperated grasping and consecutive step-climbing demonstrations illustrate physical execution.</w:t>
+        <w:t xml:space="preserve">This paper makes three contributions: an integrated Mecanum-wheeled quadrupedal mobile manipulator with heterogeneous teleoperation; a model-based chassis torque-feedforward controller with attitude-based support adjustment; and calibrated pose mapping from a Delta master to a six-axis arm. Teleoperated grasping and consecutive step-climbing demonstrations assess the complete system.</w:t>
       </w:r>
     </w:p>
     <w:p ns2:paraId="246607AC" ns2:textId="77777777">
@@ -1224,7 +1224,7 @@
           <w:i w:val="0"/>
           <w:lang w:val="en-US"/>
         </w:rPr>
-        <w:t xml:space="preserve">The robot-side chassis and arm and operator-side Delta controller respectively provide locomotion and attitude adjustment, manipulation, and pose input (Fig. 1). The robot has a 12-degree-of-freedom chassis, a six-revolute-joint arm, and a one-degree-of-freedom gripper: 19 active degrees of freedom. The master’s three translational and three orientation-input degrees of freedom are counted separately. Fig. 1 also identifies the principal frames.</w:t>
+        <w:t xml:space="preserve">Figure 1 shows the chassis, arm, Delta master, and principal coordinate frames. The robot has a 12-degree-of-freedom chassis, a six-revolute-joint arm, and a one-degree-of-freedom gripper (19 active degrees of freedom total); the master provides three translational and three orientation-input degrees of freedom.</w:t>
       </w:r>
     </w:p>
     <w:p ns2:paraId="642FC0A6" ns2:textId="77777777">

</xml_diff>

<commit_message>
Shorten introduction and simplify system overview
</commit_message>
<xml_diff>
--- a/Article5_English_IEEE_Letter_Compact.docx
+++ b/Article5_English_IEEE_Letter_Compact.docx
@@ -728,7 +728,7 @@
           <w:i w:val="0"/>
           <w:lang w:val="en-US"/>
         </w:rPr>
-        <w:t>Prior work spans wheel–leg mobility, mobile manipulation, and teleoperation. Bjelonic et al. combined rolling constraints and whole-body model predictive control for wheel–leg coordination [1], [2]; Iotti et al.’s OmniQuad paired Mecanum wheels with a quadrupedal mechanism for fixed-heading planar motion [3]. Wang, Zhang, and Chen et al. studied arm-constrained learning, cross-configuration motion control, and whole-body optimization [4]–[6]. Cruz Ulloa et al. demonstrated mixed-reality quadruped-manipulator teleoperation [7], while Uchiyama et al. integrated Delta translation and orientation in a six-degree-of-freedom master [8]. Task-specific chassis–arm coordination and pose mapping across heterogeneous master–slave workspaces remain open needs.</w:t>
+        <w:t>Prior work includes wheel–leg coordination using rolling constraints and whole-body control [1], [2], and Mecanum quadrupeds for planar motion [3]. Mobile-manipulation studies address arm-constrained learning, cross-configuration control, and whole-body optimization [4]–[6]. Teleoperation has used mixed reality [7] and Delta-based six-degree-of-freedom masters [8]. Task-specific chassis–arm coordination and heterogeneous pose mapping remain open needs.</w:t>
       </w:r>
     </w:p>
     <w:p ns2:paraId="17D6BEE5" ns2:textId="77777777">
@@ -754,7 +754,7 @@
           <w:i w:val="0"/>
           <w:lang w:val="en-US"/>
         </w:rPr>
-        <w:t xml:space="preserve">This paper makes three contributions: an integrated Mecanum-wheeled quadrupedal mobile manipulator with heterogeneous teleoperation; a model-based chassis torque-feedforward controller with attitude-based support adjustment; and calibrated pose mapping from a Delta master to a six-axis arm. Teleoperated grasping and consecutive step-climbing demonstrations assess the complete system.</w:t>
+        <w:t>This paper presents an integrated Mecanum-wheeled quadrupedal mobile manipulator and heterogeneous teleoperation architecture. Its control system coordinates chassis locomotion, arm manipulation, and Delta-master input. Grasping and step-climbing demonstrations evaluate the integrated system.</w:t>
       </w:r>
     </w:p>
     <w:p ns2:paraId="246607AC" ns2:textId="77777777">

</xml_diff>

<commit_message>
Remove teleoperation master gravity feedforward
</commit_message>
<xml_diff>
--- a/Article5_English_IEEE_Letter_Compact.docx
+++ b/Article5_English_IEEE_Letter_Compact.docx
@@ -611,7 +611,7 @@
           <w:i w:val="0"/>
           <w:iCs w:val="0"/>
         </w:rPr>
-        <w:t xml:space="preserve">Quadrupedal manipulators combine terrain adaptability and environmental interaction for disaster response, hazardous operations, and campus inspection. This paper presents a Mecanum-wheeled quadrupedal mobile manipulator and heterogeneous teleoperation system. Each leg has two pitch joints and one wheel-drive degree of freedom; Mecanum wheel constraints enable omnidirectional planar motion. Hierarchical torque feedforward combines single-leg virtual-work mapping and whole-body single-rigid-body modeling, with attitude feedback adjusting leg length. The six-axis arm uses analytical inverse kinematics through position–orientation decomposition. A Delta parallel mechanism and three-encoder handle provide master position and orientation inputs. Frame calibration and pose mapping convert these inputs into arm joint commands; master gravity compensation reduces static holding effort. The framework connects mechanism design, kinematic modeling, model-based feedforward, and joint control to support system design and implementation. Physical demonstrations illustrate system execution.</w:t>
+        <w:t xml:space="preserve">Quadrupedal manipulators combine terrain adaptability and environmental interaction for disaster response, hazardous operations, and campus inspection. This paper presents a Mecanum-wheeled quadrupedal mobile manipulator and heterogeneous teleoperation system. Each leg has two pitch joints and one wheel-drive degree of freedom; Mecanum wheel constraints enable omnidirectional planar motion. Hierarchical torque feedforward combines single-leg virtual-work mapping and whole-body single-rigid-body modeling, with attitude feedback adjusting leg length. The six-axis arm uses analytical inverse kinematics through position–orientation decomposition. A Delta parallel mechanism and three-encoder handle provide master position and orientation inputs. Frame calibration and pose mapping convert these inputs into arm joint commands.. The framework connects mechanism design, kinematic modeling, model-based feedforward, and joint control to support system design and implementation. Physical demonstrations illustrate system execution.</w:t>
       </w:r>
     </w:p>
     <w:p ns2:paraId="1BD36AE0" ns2:textId="77777777">
@@ -29136,1014 +29136,6 @@
         <w:t xml:space="preserve">Select the candidate root satisfying the working-side and continuity conditions.</w:t>
       </w:r>
     </w:p>
-    <w:p ns2:paraId="4AB5EBE4" ns2:textId="77777777">
-      <w:pPr>
-        <w:pStyle w:val="Heading3"/>
-        <w:snapToGrid w:val="0"/>
-        <w:widowControl/>
-        <w:numPr>
-          <w:ilvl w:val="2"/>
-          <w:numId w:val="4"/>
-        </w:numPr>
-        <w:keepNext w:val="0"/>
-        <w:rPr>
-          <w:rFonts w:ascii="Times New Roman" w:hAnsi="Times New Roman" w:eastAsia="SimSun" w:cs="Times New Roman"/>
-          <w:sz w:val="20"/>
-          <w:szCs w:val="20"/>
-          <w:color w:val="000000"/>
-          <w:b w:val="0"/>
-          <w:bCs w:val="0"/>
-          <w:i w:val="1"/>
-          <w:iCs w:val="1"/>
-        </w:rPr>
-        <w:keepLines w:val="0"/>
-      </w:pPr>
-      <w:r>
-        <w:rPr>
-          <w:rFonts w:ascii="Times New Roman" w:hAnsi="Times New Roman" w:eastAsia="SimSun" w:cs="Times New Roman"/>
-          <w:sz w:val="20"/>
-          <w:szCs w:val="20"/>
-          <w:color w:val="000000"/>
-          <w:b w:val="0"/>
-          <w:i w:val="1"/>
-          <w:lang w:val="en-US"/>
-        </w:rPr>
-        <w:t xml:space="preserve">Jacobian and Torque Feedforward</w:t>
-      </w:r>
-      <w:r>
-        <w:rPr>
-          <w:rFonts w:ascii="Times New Roman" w:hAnsi="Times New Roman" w:eastAsia="SimSun" w:cs="Times New Roman"/>
-          <w:sz w:val="20"/>
-          <w:szCs w:val="20"/>
-          <w:color w:val="000000"/>
-          <w:b w:val="0"/>
-          <w:bCs w:val="0"/>
-          <w:i w:val="1"/>
-          <w:iCs w:val="1"/>
-        </w:rPr>
-        <w:t xml:space="preserve">: </w:t>
-      </w:r>
-      <w:r>
-        <w:rPr>
-          <w:rFonts w:ascii="Times New Roman" w:hAnsi="Times New Roman" w:eastAsia="SimSun" w:cs="Times New Roman"/>
-          <w:sz w:val="20"/>
-          <w:szCs w:val="20"/>
-          <w:color w:val="000000"/>
-          <w:b w:val="0"/>
-          <w:lang w:val="en-US"/>
-          <w:i w:val="0"/>
-          <w:iCs w:val="0"/>
-        </w:rPr>
-        <w:t xml:space="preserve">To reduce operator effort and improve input accuracy, feedforward torques at the three active Delta joints partially compensate mechanism weight.</w:t>
-      </w:r>
-    </w:p>
-    <w:p ns2:paraId="428EE423" ns2:textId="77777777">
-      <w:pPr>
-        <w:pStyle w:val="BodyText"/>
-        <w:snapToGrid w:val="0"/>
-        <w:widowControl/>
-        <w:rPr>
-          <w:rFonts w:ascii="Times New Roman" w:hAnsi="Times New Roman" w:eastAsia="SimSun" w:cs="Times New Roman"/>
-          <w:sz w:val="20"/>
-          <w:szCs w:val="20"/>
-          <w:color w:val="000000"/>
-        </w:rPr>
-        <w:keepNext/>
-      </w:pPr>
-      <w:r>
-        <w:rPr>
-          <w:rFonts w:ascii="Times New Roman" w:hAnsi="Times New Roman" w:eastAsia="SimSun" w:cs="Times New Roman"/>
-          <w:sz w:val="20"/>
-          <w:szCs w:val="20"/>
-          <w:color w:val="000000"/>
-          <w:b w:val="0"/>
-          <w:i w:val="0"/>
-          <w:lang w:val="en-US"/>
-        </w:rPr>
-        <w:t xml:space="preserve">Let </w:t>
-      </w:r>
-      <ns8:oMath>
-        <ns8:sSub>
-          <ns8:sSubPr>
-            <ns8:ctrlPr>
-              <w:rPr>
-                <w:rFonts w:ascii="Cambria Math" w:hAnsi="Cambria Math"/>
-              </w:rPr>
-            </ns8:ctrlPr>
-          </ns8:sSubPr>
-          <ns8:e>
-            <ns8:r>
-              <ns8:rPr>
-                <ns8:sty ns8:val="bi"/>
-              </ns8:rPr>
-              <w:rPr>
-                <w:rFonts w:ascii="Times New Roman" w:hAnsi="Times New Roman" w:eastAsia="SimSun" w:cs="Times New Roman"/>
-                <w:sz w:val="20"/>
-                <w:szCs w:val="20"/>
-                <w:color w:val="000000"/>
-              </w:rPr>
-              <ns8:t>θ</ns8:t>
-            </ns8:r>
-          </ns8:e>
-          <ns8:sub>
-            <ns8:r>
-              <ns8:rPr>
-                <ns8:sty ns8:val="p"/>
-              </ns8:rPr>
-              <w:rPr>
-                <w:rFonts w:ascii="Times New Roman" w:hAnsi="Times New Roman" w:eastAsia="SimSun" w:cs="Times New Roman"/>
-                <w:sz w:val="20"/>
-                <w:szCs w:val="20"/>
-                <w:color w:val="000000"/>
-              </w:rPr>
-              <ns8:t>D</ns8:t>
-            </ns8:r>
-          </ns8:sub>
-        </ns8:sSub>
-      </ns8:oMath>
-      <w:r>
-        <w:rPr>
-          <w:rFonts w:ascii="Times New Roman" w:hAnsi="Times New Roman" w:eastAsia="SimSun" w:cs="Times New Roman"/>
-          <w:sz w:val="20"/>
-          <w:szCs w:val="20"/>
-          <w:color w:val="000000"/>
-          <w:b w:val="0"/>
-          <w:i w:val="0"/>
-          <w:lang w:val="en-US"/>
-        </w:rPr>
-        <w:t xml:space="preserve"> collect the three active joint angles. In a nonsingular workspace region, the position Jacobian and velocity relation are</w:t>
-      </w:r>
-    </w:p>
-    <w:p>
-      <w:pPr>
-        <w:pStyle w:val="equation"/>
-        <w:snapToGrid w:val="0"/>
-        <w:widowControl/>
-        <w:keepLines/>
-        <w:ind w:left="0" w:right="0" w:firstLine="0"/>
-        <w:jc w:val="left"/>
-        <w:tabs>
-          <w:tab w:val="center" w:pos="2517"/>
-          <w:tab w:val="right" w:pos="5033"/>
-        </w:tabs>
-        <w:rPr>
-          <w:rFonts w:ascii="Times New Roman" w:hAnsi="Times New Roman" w:eastAsia="SimSun" w:cs="Times New Roman"/>
-          <w:sz w:val="20"/>
-          <w:szCs w:val="20"/>
-          <w:color w:val="000000"/>
-          <w:b w:val="0"/>
-          <w:bCs w:val="0"/>
-          <w:i w:val="0"/>
-          <w:iCs w:val="0"/>
-        </w:rPr>
-      </w:pPr>
-      <w:r>
-        <w:tab/>
-      </w:r>
-      <ns8:oMath>
-        <ns8:sSub>
-          <ns8:sSubPr>
-            <ns8:ctrlPr>
-              <w:rPr>
-                <w:rFonts w:ascii="Cambria Math" w:hAnsi="Cambria Math"/>
-              </w:rPr>
-            </ns8:ctrlPr>
-          </ns8:sSubPr>
-          <ns8:e>
-            <ns8:r>
-              <ns8:rPr>
-                <ns8:sty ns8:val="b"/>
-              </ns8:rPr>
-              <w:rPr>
-                <w:rFonts w:ascii="Times New Roman" w:hAnsi="Times New Roman" w:eastAsia="SimSun" w:cs="Times New Roman"/>
-                <w:sz w:val="20"/>
-                <w:szCs w:val="20"/>
-                <w:color w:val="000000"/>
-              </w:rPr>
-              <ns8:t>J</ns8:t>
-            </ns8:r>
-          </ns8:e>
-          <ns8:sub>
-            <ns8:r>
-              <ns8:rPr>
-                <ns8:sty ns8:val="p"/>
-              </ns8:rPr>
-              <w:rPr>
-                <w:rFonts w:ascii="Times New Roman" w:hAnsi="Times New Roman" w:eastAsia="SimSun" w:cs="Times New Roman"/>
-                <w:sz w:val="20"/>
-                <w:szCs w:val="20"/>
-                <w:color w:val="000000"/>
-              </w:rPr>
-              <ns8:t>D</ns8:t>
-            </ns8:r>
-          </ns8:sub>
-        </ns8:sSub>
-        <ns8:r>
-          <ns8:rPr>
-            <ns8:sty ns8:val="p"/>
-          </ns8:rPr>
-          <w:rPr>
-            <w:rFonts w:ascii="Times New Roman" w:hAnsi="Times New Roman" w:eastAsia="SimSun" w:cs="Times New Roman"/>
-            <w:sz w:val="20"/>
-            <w:szCs w:val="20"/>
-            <w:color w:val="000000"/>
-            <w:i w:val="0"/>
-            <w:iCs w:val="0"/>
-          </w:rPr>
-          <ns8:t>=</ns8:t>
-        </ns8:r>
-        <ns8:f>
-          <ns8:fPr>
-            <ns8:ctrlPr>
-              <w:rPr>
-                <w:rFonts w:ascii="Cambria Math" w:hAnsi="Cambria Math"/>
-              </w:rPr>
-            </ns8:ctrlPr>
-          </ns8:fPr>
-          <ns8:num>
-            <ns8:r>
-              <ns8:rPr>
-                <ns8:sty ns8:val="p"/>
-              </ns8:rPr>
-              <w:rPr>
-                <w:rFonts w:ascii="Times New Roman" w:hAnsi="Times New Roman" w:eastAsia="SimSun" w:cs="Times New Roman"/>
-                <w:sz w:val="20"/>
-                <w:szCs w:val="20"/>
-                <w:color w:val="000000"/>
-              </w:rPr>
-              <ns8:t>∂</ns8:t>
-            </ns8:r>
-            <ns8:sSub>
-              <ns8:sSubPr>
-                <ns8:ctrlPr>
-                  <w:rPr>
-                    <w:rFonts w:ascii="Cambria Math" w:hAnsi="Cambria Math"/>
-                  </w:rPr>
-                </ns8:ctrlPr>
-              </ns8:sSubPr>
-              <ns8:e>
-                <ns8:r>
-                  <ns8:rPr>
-                    <ns8:sty ns8:val="bi"/>
-                  </ns8:rPr>
-                  <w:rPr>
-                    <w:rFonts w:ascii="Times New Roman" w:hAnsi="Times New Roman" w:eastAsia="SimSun" w:cs="Times New Roman"/>
-                    <w:sz w:val="20"/>
-                    <w:szCs w:val="20"/>
-                    <w:color w:val="000000"/>
-                  </w:rPr>
-                  <ns8:t>p</ns8:t>
-                </ns8:r>
-              </ns8:e>
-              <ns8:sub>
-                <ns8:r>
-                  <ns8:rPr>
-                    <ns8:sty ns8:val="p"/>
-                  </ns8:rPr>
-                  <w:rPr>
-                    <w:rFonts w:ascii="Times New Roman" w:hAnsi="Times New Roman" w:eastAsia="SimSun" w:cs="Times New Roman"/>
-                    <w:sz w:val="20"/>
-                    <w:szCs w:val="20"/>
-                    <w:color w:val="000000"/>
-                  </w:rPr>
-                  <ns8:t>D</ns8:t>
-                </ns8:r>
-              </ns8:sub>
-            </ns8:sSub>
-          </ns8:num>
-          <ns8:den>
-            <ns8:r>
-              <ns8:rPr>
-                <ns8:sty ns8:val="p"/>
-              </ns8:rPr>
-              <w:rPr>
-                <w:rFonts w:ascii="Times New Roman" w:hAnsi="Times New Roman" w:eastAsia="SimSun" w:cs="Times New Roman"/>
-                <w:sz w:val="20"/>
-                <w:szCs w:val="20"/>
-                <w:color w:val="000000"/>
-              </w:rPr>
-              <ns8:t>∂</ns8:t>
-            </ns8:r>
-            <ns8:sSub>
-              <ns8:sSubPr>
-                <ns8:ctrlPr>
-                  <w:rPr>
-                    <w:rFonts w:ascii="Cambria Math" w:hAnsi="Cambria Math"/>
-                  </w:rPr>
-                </ns8:ctrlPr>
-              </ns8:sSubPr>
-              <ns8:e>
-                <ns8:r>
-                  <ns8:rPr>
-                    <ns8:sty ns8:val="bi"/>
-                  </ns8:rPr>
-                  <w:rPr>
-                    <w:rFonts w:ascii="Times New Roman" w:hAnsi="Times New Roman" w:eastAsia="SimSun" w:cs="Times New Roman"/>
-                    <w:sz w:val="20"/>
-                    <w:szCs w:val="20"/>
-                    <w:color w:val="000000"/>
-                  </w:rPr>
-                  <ns8:t>θ</ns8:t>
-                </ns8:r>
-              </ns8:e>
-              <ns8:sub>
-                <ns8:r>
-                  <ns8:rPr>
-                    <ns8:sty ns8:val="p"/>
-                  </ns8:rPr>
-                  <w:rPr>
-                    <w:rFonts w:ascii="Times New Roman" w:hAnsi="Times New Roman" w:eastAsia="SimSun" w:cs="Times New Roman"/>
-                    <w:sz w:val="20"/>
-                    <w:szCs w:val="20"/>
-                    <w:color w:val="000000"/>
-                  </w:rPr>
-                  <ns8:t>D</ns8:t>
-                </ns8:r>
-              </ns8:sub>
-            </ns8:sSub>
-          </ns8:den>
-        </ns8:f>
-        <ns8:r>
-          <ns8:rPr>
-            <ns8:sty ns8:val="p"/>
-          </ns8:rPr>
-          <w:rPr>
-            <w:rFonts w:ascii="Times New Roman" w:hAnsi="Times New Roman" w:eastAsia="SimSun" w:cs="Times New Roman"/>
-            <w:sz w:val="20"/>
-            <w:szCs w:val="20"/>
-            <w:color w:val="000000"/>
-            <w:i w:val="0"/>
-            <w:iCs w:val="0"/>
-          </w:rPr>
-          <ns8:t>, </ns8:t>
-        </ns8:r>
-        <ns8:sSub>
-          <ns8:sSubPr>
-            <ns8:ctrlPr>
-              <w:rPr>
-                <w:rFonts w:ascii="Cambria Math" w:hAnsi="Cambria Math"/>
-              </w:rPr>
-            </ns8:ctrlPr>
-          </ns8:sSubPr>
-          <ns8:e>
-            <ns8:acc>
-              <ns8:accPr>
-                <ns8:chr ns8:val="̇"/>
-                <ns8:ctrlPr>
-                  <w:rPr>
-                    <w:rFonts w:ascii="Cambria Math" w:hAnsi="Cambria Math"/>
-                  </w:rPr>
-                </ns8:ctrlPr>
-              </ns8:accPr>
-              <ns8:e>
-                <ns8:r>
-                  <ns8:rPr>
-                    <ns8:sty ns8:val="bi"/>
-                  </ns8:rPr>
-                  <w:rPr>
-                    <w:rFonts w:ascii="Times New Roman" w:hAnsi="Times New Roman" w:eastAsia="SimSun" w:cs="Times New Roman"/>
-                    <w:sz w:val="20"/>
-                    <w:szCs w:val="20"/>
-                    <w:color w:val="000000"/>
-                  </w:rPr>
-                  <ns8:t>p</ns8:t>
-                </ns8:r>
-              </ns8:e>
-            </ns8:acc>
-          </ns8:e>
-          <ns8:sub>
-            <ns8:r>
-              <ns8:rPr>
-                <ns8:sty ns8:val="p"/>
-              </ns8:rPr>
-              <w:rPr>
-                <w:rFonts w:ascii="Times New Roman" w:hAnsi="Times New Roman" w:eastAsia="SimSun" w:cs="Times New Roman"/>
-                <w:sz w:val="20"/>
-                <w:szCs w:val="20"/>
-                <w:color w:val="000000"/>
-              </w:rPr>
-              <ns8:t>D</ns8:t>
-            </ns8:r>
-          </ns8:sub>
-        </ns8:sSub>
-        <ns8:r>
-          <ns8:rPr>
-            <ns8:sty ns8:val="p"/>
-          </ns8:rPr>
-          <w:rPr>
-            <w:rFonts w:ascii="Times New Roman" w:hAnsi="Times New Roman" w:eastAsia="SimSun" w:cs="Times New Roman"/>
-            <w:sz w:val="20"/>
-            <w:szCs w:val="20"/>
-            <w:color w:val="000000"/>
-            <w:i w:val="0"/>
-            <w:iCs w:val="0"/>
-          </w:rPr>
-          <ns8:t>=</ns8:t>
-        </ns8:r>
-        <ns8:sSub>
-          <ns8:sSubPr>
-            <ns8:ctrlPr>
-              <w:rPr>
-                <w:rFonts w:ascii="Cambria Math" w:hAnsi="Cambria Math"/>
-              </w:rPr>
-            </ns8:ctrlPr>
-          </ns8:sSubPr>
-          <ns8:e>
-            <ns8:r>
-              <ns8:rPr>
-                <ns8:sty ns8:val="b"/>
-              </ns8:rPr>
-              <w:rPr>
-                <w:rFonts w:ascii="Times New Roman" w:hAnsi="Times New Roman" w:eastAsia="SimSun" w:cs="Times New Roman"/>
-                <w:sz w:val="20"/>
-                <w:szCs w:val="20"/>
-                <w:color w:val="000000"/>
-              </w:rPr>
-              <ns8:t>J</ns8:t>
-            </ns8:r>
-          </ns8:e>
-          <ns8:sub>
-            <ns8:r>
-              <ns8:rPr>
-                <ns8:sty ns8:val="p"/>
-              </ns8:rPr>
-              <w:rPr>
-                <w:rFonts w:ascii="Times New Roman" w:hAnsi="Times New Roman" w:eastAsia="SimSun" w:cs="Times New Roman"/>
-                <w:sz w:val="20"/>
-                <w:szCs w:val="20"/>
-                <w:color w:val="000000"/>
-              </w:rPr>
-              <ns8:t>D</ns8:t>
-            </ns8:r>
-          </ns8:sub>
-        </ns8:sSub>
-        <ns8:sSub>
-          <ns8:sSubPr>
-            <ns8:ctrlPr>
-              <w:rPr>
-                <w:rFonts w:ascii="Cambria Math" w:hAnsi="Cambria Math"/>
-              </w:rPr>
-            </ns8:ctrlPr>
-          </ns8:sSubPr>
-          <ns8:e>
-            <ns8:acc>
-              <ns8:accPr>
-                <ns8:chr ns8:val="̇"/>
-                <ns8:ctrlPr>
-                  <w:rPr>
-                    <w:rFonts w:ascii="Cambria Math" w:hAnsi="Cambria Math"/>
-                  </w:rPr>
-                </ns8:ctrlPr>
-              </ns8:accPr>
-              <ns8:e>
-                <ns8:r>
-                  <ns8:rPr>
-                    <ns8:sty ns8:val="bi"/>
-                  </ns8:rPr>
-                  <w:rPr>
-                    <w:rFonts w:ascii="Times New Roman" w:hAnsi="Times New Roman" w:eastAsia="SimSun" w:cs="Times New Roman"/>
-                    <w:sz w:val="20"/>
-                    <w:szCs w:val="20"/>
-                    <w:color w:val="000000"/>
-                  </w:rPr>
-                  <ns8:t>θ</ns8:t>
-                </ns8:r>
-              </ns8:e>
-            </ns8:acc>
-          </ns8:e>
-          <ns8:sub>
-            <ns8:r>
-              <ns8:rPr>
-                <ns8:sty ns8:val="p"/>
-              </ns8:rPr>
-              <w:rPr>
-                <w:rFonts w:ascii="Times New Roman" w:hAnsi="Times New Roman" w:eastAsia="SimSun" w:cs="Times New Roman"/>
-                <w:sz w:val="20"/>
-                <w:szCs w:val="20"/>
-                <w:color w:val="000000"/>
-              </w:rPr>
-              <ns8:t>D</ns8:t>
-            </ns8:r>
-          </ns8:sub>
-        </ns8:sSub>
-        <ns8:r>
-          <ns8:rPr>
-            <ns8:sty ns8:val="p"/>
-          </ns8:rPr>
-          <w:rPr>
-            <w:rFonts w:ascii="Times New Roman" w:hAnsi="Times New Roman" w:eastAsia="SimSun" w:cs="Times New Roman"/>
-            <w:sz w:val="20"/>
-            <w:szCs w:val="20"/>
-            <w:color w:val="000000"/>
-            <w:i w:val="0"/>
-            <w:iCs w:val="0"/>
-          </w:rPr>
-          <ns8:t>.</ns8:t>
-        </ns8:r>
-      </ns8:oMath>
-      <w:r>
-        <w:tab/>
-      </w:r>
-      <w:r>
-        <w:rPr>
-          <w:rFonts w:ascii="Times New Roman" w:hAnsi="Times New Roman" w:eastAsia="SimSun" w:cs="Times New Roman"/>
-          <w:sz w:val="20"/>
-          <w:szCs w:val="20"/>
-          <w:color w:val="000000"/>
-          <w:b w:val="0"/>
-          <w:bCs w:val="0"/>
-          <w:i w:val="0"/>
-          <w:iCs w:val="0"/>
-        </w:rPr>
-        <w:t>(24)</w:t>
-      </w:r>
-    </w:p>
-    <w:p ns2:paraId="06A03706" ns2:textId="77777777">
-      <w:pPr>
-        <w:pStyle w:val="BodyText"/>
-        <w:snapToGrid w:val="0"/>
-        <w:widowControl/>
-        <w:rPr>
-          <w:rFonts w:ascii="Times New Roman" w:hAnsi="Times New Roman" w:eastAsia="SimSun" w:cs="Times New Roman"/>
-          <w:sz w:val="20"/>
-          <w:szCs w:val="20"/>
-          <w:color w:val="000000"/>
-        </w:rPr>
-        <w:keepNext/>
-      </w:pPr>
-      <w:r>
-        <w:rPr>
-          <w:rFonts w:ascii="Times New Roman" w:hAnsi="Times New Roman" w:eastAsia="SimSun" w:cs="Times New Roman"/>
-          <w:sz w:val="20"/>
-          <w:szCs w:val="20"/>
-          <w:color w:val="000000"/>
-          <w:b w:val="0"/>
-          <w:i w:val="0"/>
-          <w:lang w:val="en-US"/>
-        </w:rPr>
-        <w:t xml:space="preserve">By virtual work, desired moving-platform support force </w:t>
-      </w:r>
-      <ns8:oMath>
-        <ns8:sSub>
-          <ns8:sSubPr>
-            <ns8:ctrlPr>
-              <w:rPr>
-                <w:rFonts w:ascii="Cambria Math" w:hAnsi="Cambria Math"/>
-              </w:rPr>
-            </ns8:ctrlPr>
-          </ns8:sSubPr>
-          <ns8:e>
-            <ns8:r>
-              <ns8:rPr>
-                <ns8:sty ns8:val="bi"/>
-              </ns8:rPr>
-              <w:rPr>
-                <w:rFonts w:ascii="Times New Roman" w:hAnsi="Times New Roman" w:eastAsia="SimSun" w:cs="Times New Roman"/>
-                <w:sz w:val="20"/>
-                <w:szCs w:val="20"/>
-                <w:color w:val="000000"/>
-              </w:rPr>
-              <ns8:t>f</ns8:t>
-            </ns8:r>
-          </ns8:e>
-          <ns8:sub>
-            <ns8:r>
-              <ns8:rPr>
-                <ns8:sty ns8:val="p"/>
-              </ns8:rPr>
-              <w:rPr>
-                <w:rFonts w:ascii="Times New Roman" w:hAnsi="Times New Roman" w:eastAsia="SimSun" w:cs="Times New Roman"/>
-                <w:sz w:val="20"/>
-                <w:szCs w:val="20"/>
-                <w:color w:val="000000"/>
-              </w:rPr>
-              <ns8:t>D</ns8:t>
-            </ns8:r>
-          </ns8:sub>
-        </ns8:sSub>
-      </ns8:oMath>
-      <w:r>
-        <w:rPr>
-          <w:rFonts w:ascii="Times New Roman" w:hAnsi="Times New Roman" w:eastAsia="SimSun" w:cs="Times New Roman"/>
-          <w:sz w:val="20"/>
-          <w:szCs w:val="20"/>
-          <w:color w:val="000000"/>
-          <w:b w:val="0"/>
-          <w:i w:val="0"/>
-          <w:lang w:val="en-US"/>
-        </w:rPr>
-        <w:t xml:space="preserve"> gives motor feedforward torque</w:t>
-      </w:r>
-    </w:p>
-    <w:p>
-      <w:pPr>
-        <w:pStyle w:val="equation"/>
-        <w:snapToGrid w:val="0"/>
-        <w:widowControl/>
-        <w:keepLines/>
-        <w:ind w:left="0" w:right="0" w:firstLine="0"/>
-        <w:jc w:val="left"/>
-        <w:tabs>
-          <w:tab w:val="center" w:pos="2517"/>
-          <w:tab w:val="right" w:pos="5033"/>
-        </w:tabs>
-        <w:rPr>
-          <w:rFonts w:ascii="Times New Roman" w:hAnsi="Times New Roman" w:eastAsia="SimSun" w:cs="Times New Roman"/>
-          <w:sz w:val="20"/>
-          <w:szCs w:val="20"/>
-          <w:color w:val="000000"/>
-          <w:b w:val="0"/>
-          <w:bCs w:val="0"/>
-          <w:i w:val="0"/>
-          <w:iCs w:val="0"/>
-        </w:rPr>
-      </w:pPr>
-      <w:r>
-        <w:tab/>
-      </w:r>
-      <ns8:oMath>
-        <ns8:sSub>
-          <ns8:sSubPr>
-            <ns8:ctrlPr>
-              <w:rPr>
-                <w:rFonts w:ascii="Cambria Math" w:hAnsi="Cambria Math"/>
-              </w:rPr>
-            </ns8:ctrlPr>
-          </ns8:sSubPr>
-          <ns8:e>
-            <ns8:r>
-              <ns8:rPr>
-                <ns8:sty ns8:val="bi"/>
-              </ns8:rPr>
-              <w:rPr>
-                <w:rFonts w:ascii="Times New Roman" w:hAnsi="Times New Roman" w:eastAsia="SimSun" w:cs="Times New Roman"/>
-                <w:sz w:val="20"/>
-                <w:szCs w:val="20"/>
-                <w:color w:val="000000"/>
-              </w:rPr>
-              <ns8:t>τ</ns8:t>
-            </ns8:r>
-          </ns8:e>
-          <ns8:sub>
-            <ns8:r>
-              <ns8:rPr>
-                <ns8:sty ns8:val="p"/>
-              </ns8:rPr>
-              <w:rPr>
-                <w:rFonts w:ascii="Times New Roman" w:hAnsi="Times New Roman" w:eastAsia="SimSun" w:cs="Times New Roman"/>
-                <w:sz w:val="20"/>
-                <w:szCs w:val="20"/>
-                <w:color w:val="000000"/>
-              </w:rPr>
-              <ns8:t>D,ff</ns8:t>
-            </ns8:r>
-          </ns8:sub>
-        </ns8:sSub>
-        <ns8:r>
-          <ns8:rPr>
-            <ns8:sty ns8:val="p"/>
-          </ns8:rPr>
-          <w:rPr>
-            <w:rFonts w:ascii="Times New Roman" w:hAnsi="Times New Roman" w:eastAsia="SimSun" w:cs="Times New Roman"/>
-            <w:sz w:val="20"/>
-            <w:szCs w:val="20"/>
-            <w:color w:val="000000"/>
-            <w:i w:val="0"/>
-            <w:iCs w:val="0"/>
-          </w:rPr>
-          <ns8:t>=</ns8:t>
-        </ns8:r>
-        <ns8:sSubSup>
-          <ns8:sSubSupPr>
-            <ns8:ctrlPr>
-              <w:rPr>
-                <w:rFonts w:ascii="Cambria Math" w:hAnsi="Cambria Math"/>
-              </w:rPr>
-            </ns8:ctrlPr>
-          </ns8:sSubSupPr>
-          <ns8:e>
-            <ns8:r>
-              <ns8:rPr>
-                <ns8:sty ns8:val="b"/>
-              </ns8:rPr>
-              <w:rPr>
-                <w:rFonts w:ascii="Times New Roman" w:hAnsi="Times New Roman" w:eastAsia="SimSun" w:cs="Times New Roman"/>
-                <w:sz w:val="20"/>
-                <w:szCs w:val="20"/>
-                <w:color w:val="000000"/>
-              </w:rPr>
-              <ns8:t>J</ns8:t>
-            </ns8:r>
-          </ns8:e>
-          <ns8:sub>
-            <ns8:r>
-              <ns8:rPr>
-                <ns8:sty ns8:val="p"/>
-              </ns8:rPr>
-              <w:rPr>
-                <w:rFonts w:ascii="Times New Roman" w:hAnsi="Times New Roman" w:eastAsia="SimSun" w:cs="Times New Roman"/>
-                <w:sz w:val="20"/>
-                <w:szCs w:val="20"/>
-                <w:color w:val="000000"/>
-              </w:rPr>
-              <ns8:t>D</ns8:t>
-            </ns8:r>
-          </ns8:sub>
-          <ns8:sup>
-            <ns8:r>
-              <ns8:rPr>
-                <ns8:sty ns8:val="p"/>
-              </ns8:rPr>
-              <w:rPr>
-                <w:rFonts w:ascii="Times New Roman" w:hAnsi="Times New Roman" w:eastAsia="SimSun" w:cs="Times New Roman"/>
-                <w:sz w:val="20"/>
-                <w:szCs w:val="20"/>
-                <w:color w:val="000000"/>
-              </w:rPr>
-              <ns8:t>T</ns8:t>
-            </ns8:r>
-          </ns8:sup>
-        </ns8:sSubSup>
-        <ns8:sSub>
-          <ns8:sSubPr>
-            <ns8:ctrlPr>
-              <w:rPr>
-                <w:rFonts w:ascii="Cambria Math" w:hAnsi="Cambria Math"/>
-              </w:rPr>
-            </ns8:ctrlPr>
-          </ns8:sSubPr>
-          <ns8:e>
-            <ns8:r>
-              <ns8:rPr>
-                <ns8:sty ns8:val="bi"/>
-              </ns8:rPr>
-              <w:rPr>
-                <w:rFonts w:ascii="Times New Roman" w:hAnsi="Times New Roman" w:eastAsia="SimSun" w:cs="Times New Roman"/>
-                <w:sz w:val="20"/>
-                <w:szCs w:val="20"/>
-                <w:color w:val="000000"/>
-              </w:rPr>
-              <ns8:t>f</ns8:t>
-            </ns8:r>
-          </ns8:e>
-          <ns8:sub>
-            <ns8:r>
-              <ns8:rPr>
-                <ns8:sty ns8:val="p"/>
-              </ns8:rPr>
-              <w:rPr>
-                <w:rFonts w:ascii="Times New Roman" w:hAnsi="Times New Roman" w:eastAsia="SimSun" w:cs="Times New Roman"/>
-                <w:sz w:val="20"/>
-                <w:szCs w:val="20"/>
-                <w:color w:val="000000"/>
-              </w:rPr>
-              <ns8:t>D</ns8:t>
-            </ns8:r>
-          </ns8:sub>
-        </ns8:sSub>
-        <ns8:r>
-          <ns8:rPr>
-            <ns8:sty ns8:val="p"/>
-          </ns8:rPr>
-          <w:rPr>
-            <w:rFonts w:ascii="Times New Roman" w:hAnsi="Times New Roman" w:eastAsia="SimSun" w:cs="Times New Roman"/>
-            <w:sz w:val="20"/>
-            <w:szCs w:val="20"/>
-            <w:color w:val="000000"/>
-            <w:i w:val="0"/>
-            <w:iCs w:val="0"/>
-          </w:rPr>
-          <ns8:t>.</ns8:t>
-        </ns8:r>
-      </ns8:oMath>
-      <w:r>
-        <w:tab/>
-      </w:r>
-      <w:r>
-        <w:rPr>
-          <w:rFonts w:ascii="Times New Roman" w:hAnsi="Times New Roman" w:eastAsia="SimSun" w:cs="Times New Roman"/>
-          <w:sz w:val="20"/>
-          <w:szCs w:val="20"/>
-          <w:color w:val="000000"/>
-          <w:b w:val="0"/>
-          <w:bCs w:val="0"/>
-          <w:i w:val="0"/>
-          <w:iCs w:val="0"/>
-        </w:rPr>
-        <w:t>(25)</w:t>
-      </w:r>
-    </w:p>
-    <w:p ns2:paraId="11AA1FA9" ns2:textId="77777777">
-      <w:pPr>
-        <w:pStyle w:val="BodyText"/>
-        <w:snapToGrid w:val="0"/>
-        <w:widowControl/>
-        <w:keepNext w:val="0"/>
-        <w:rPr>
-          <w:rFonts w:ascii="Times New Roman" w:hAnsi="Times New Roman" w:eastAsia="SimSun" w:cs="Times New Roman"/>
-          <w:sz w:val="20"/>
-          <w:szCs w:val="20"/>
-          <w:color w:val="000000"/>
-        </w:rPr>
-      </w:pPr>
-      <w:r>
-        <w:rPr>
-          <w:rFonts w:ascii="Times New Roman" w:hAnsi="Times New Roman" w:eastAsia="SimSun" w:cs="Times New Roman"/>
-          <w:sz w:val="20"/>
-          <w:szCs w:val="20"/>
-          <w:color w:val="000000"/>
-          <w:b w:val="0"/>
-          <w:i w:val="0"/>
-          <w:lang w:val="en-US"/>
-        </w:rPr>
-        <w:t xml:space="preserve">Gravity compensation uses </w:t>
-      </w:r>
-      <ns8:oMath>
-        <ns8:sSub>
-          <ns8:sSubPr>
-            <ns8:ctrlPr>
-              <w:rPr>
-                <w:rFonts w:ascii="Cambria Math" w:hAnsi="Cambria Math"/>
-              </w:rPr>
-            </ns8:ctrlPr>
-          </ns8:sSubPr>
-          <ns8:e>
-            <ns8:r>
-              <ns8:rPr>
-                <ns8:sty ns8:val="bi"/>
-              </ns8:rPr>
-              <w:rPr>
-                <w:rFonts w:ascii="Times New Roman" w:hAnsi="Times New Roman" w:eastAsia="SimSun" w:cs="Times New Roman"/>
-                <w:sz w:val="20"/>
-                <w:szCs w:val="20"/>
-                <w:color w:val="000000"/>
-              </w:rPr>
-              <ns8:t>f</ns8:t>
-            </ns8:r>
-          </ns8:e>
-          <ns8:sub>
-            <ns8:r>
-              <ns8:rPr>
-                <ns8:sty ns8:val="p"/>
-              </ns8:rPr>
-              <w:rPr>
-                <w:rFonts w:ascii="Times New Roman" w:hAnsi="Times New Roman" w:eastAsia="SimSun" w:cs="Times New Roman"/>
-                <w:sz w:val="20"/>
-                <w:szCs w:val="20"/>
-                <w:color w:val="000000"/>
-              </w:rPr>
-              <ns8:t>D</ns8:t>
-            </ns8:r>
-          </ns8:sub>
-        </ns8:sSub>
-        <ns8:r>
-          <ns8:rPr>
-            <ns8:sty ns8:val="p"/>
-          </ns8:rPr>
-          <w:rPr>
-            <w:rFonts w:ascii="Times New Roman" w:hAnsi="Times New Roman" w:eastAsia="SimSun" w:cs="Times New Roman"/>
-            <w:sz w:val="20"/>
-            <w:szCs w:val="20"/>
-            <w:color w:val="000000"/>
-            <w:i w:val="0"/>
-            <w:iCs w:val="0"/>
-          </w:rPr>
-          <ns8:t>=-</ns8:t>
-        </ns8:r>
-        <ns8:sSub>
-          <ns8:sSubPr>
-            <ns8:ctrlPr>
-              <w:rPr>
-                <w:rFonts w:ascii="Cambria Math" w:hAnsi="Cambria Math"/>
-              </w:rPr>
-            </ns8:ctrlPr>
-          </ns8:sSubPr>
-          <ns8:e>
-            <ns8:r>
-              <w:rPr>
-                <w:rFonts w:ascii="Times New Roman" w:hAnsi="Times New Roman" w:eastAsia="SimSun" w:cs="Times New Roman"/>
-                <w:sz w:val="20"/>
-                <w:szCs w:val="20"/>
-                <w:color w:val="000000"/>
-              </w:rPr>
-              <ns8:t>m</ns8:t>
-            </ns8:r>
-          </ns8:e>
-          <ns8:sub>
-            <ns8:r>
-              <ns8:rPr>
-                <ns8:sty ns8:val="p"/>
-              </ns8:rPr>
-              <w:rPr>
-                <w:rFonts w:ascii="Times New Roman" w:hAnsi="Times New Roman" w:eastAsia="SimSun" w:cs="Times New Roman"/>
-                <w:sz w:val="20"/>
-                <w:szCs w:val="20"/>
-                <w:color w:val="000000"/>
-              </w:rPr>
-              <ns8:t>D</ns8:t>
-            </ns8:r>
-          </ns8:sub>
-        </ns8:sSub>
-        <ns8:r>
-          <ns8:rPr>
-            <ns8:sty ns8:val="bi"/>
-          </ns8:rPr>
-          <w:rPr>
-            <w:rFonts w:ascii="Times New Roman" w:hAnsi="Times New Roman" w:eastAsia="SimSun" w:cs="Times New Roman"/>
-            <w:sz w:val="20"/>
-            <w:szCs w:val="20"/>
-            <w:color w:val="000000"/>
-          </w:rPr>
-          <ns8:t>g</ns8:t>
-        </ns8:r>
-      </ns8:oMath>
-      <w:r>
-        <w:rPr>
-          <w:rFonts w:ascii="Times New Roman" w:hAnsi="Times New Roman" w:eastAsia="SimSun" w:cs="Times New Roman"/>
-          <w:sz w:val="20"/>
-          <w:szCs w:val="20"/>
-          <w:color w:val="000000"/>
-          <w:b w:val="0"/>
-          <w:i w:val="0"/>
-          <w:lang w:val="en-US"/>
-        </w:rPr>
-        <w:t xml:space="preserve">, with </w:t>
-      </w:r>
-      <ns8:oMath>
-        <ns8:sSub>
-          <ns8:sSubPr>
-            <ns8:ctrlPr>
-              <w:rPr>
-                <w:rFonts w:ascii="Cambria Math" w:hAnsi="Cambria Math"/>
-              </w:rPr>
-            </ns8:ctrlPr>
-          </ns8:sSubPr>
-          <ns8:e>
-            <ns8:r>
-              <w:rPr>
-                <w:rFonts w:ascii="Times New Roman" w:hAnsi="Times New Roman" w:eastAsia="SimSun" w:cs="Times New Roman"/>
-                <w:sz w:val="20"/>
-                <w:szCs w:val="20"/>
-                <w:color w:val="000000"/>
-              </w:rPr>
-              <ns8:t>m</ns8:t>
-            </ns8:r>
-          </ns8:e>
-          <ns8:sub>
-            <ns8:r>
-              <ns8:rPr>
-                <ns8:sty ns8:val="p"/>
-              </ns8:rPr>
-              <w:rPr>
-                <w:rFonts w:ascii="Times New Roman" w:hAnsi="Times New Roman" w:eastAsia="SimSun" w:cs="Times New Roman"/>
-                <w:sz w:val="20"/>
-                <w:szCs w:val="20"/>
-                <w:color w:val="000000"/>
-              </w:rPr>
-              <ns8:t>D</ns8:t>
-            </ns8:r>
-          </ns8:sub>
-        </ns8:sSub>
-      </ns8:oMath>
-      <w:r>
-        <w:rPr>
-          <w:rFonts w:ascii="Times New Roman" w:hAnsi="Times New Roman" w:eastAsia="SimSun" w:cs="Times New Roman"/>
-          <w:sz w:val="20"/>
-          <w:szCs w:val="20"/>
-          <w:color w:val="000000"/>
-          <w:b w:val="0"/>
-          <w:i w:val="0"/>
-          <w:lang w:val="en-US"/>
-        </w:rPr>
-        <w:t xml:space="preserve"> the equivalent moving-platform-and-handle mass and </w:t>
-      </w:r>
-      <ns8:oMath>
-        <ns8:r>
-          <ns8:rPr>
-            <ns8:sty ns8:val="bi"/>
-          </ns8:rPr>
-          <w:rPr>
-            <w:rFonts w:ascii="Times New Roman" w:hAnsi="Times New Roman" w:eastAsia="SimSun" w:cs="Times New Roman"/>
-            <w:sz w:val="20"/>
-            <w:szCs w:val="20"/>
-            <w:color w:val="000000"/>
-          </w:rPr>
-          <ns8:t>g</ns8:t>
-        </ns8:r>
-      </ns8:oMath>
-      <w:r>
-        <w:rPr>
-          <w:rFonts w:ascii="Times New Roman" w:hAnsi="Times New Roman" w:eastAsia="SimSun" w:cs="Times New Roman"/>
-          <w:sz w:val="20"/>
-          <w:szCs w:val="20"/>
-          <w:color w:val="000000"/>
-          <w:b w:val="0"/>
-          <w:i w:val="0"/>
-          <w:lang w:val="en-US"/>
-        </w:rPr>
-        <w:t xml:space="preserve"> gravitational acceleration in {D}.</w:t>
-      </w:r>
-    </w:p>
     <w:p ns2:paraId="468D441A" ns2:textId="77777777">
       <w:pPr>
         <w:pStyle w:val="Heading3"/>
@@ -31232,7 +30224,7 @@
           <w:i w:val="0"/>
           <w:iCs w:val="0"/>
         </w:rPr>
-        <w:t>(26)</w:t>
+        <w:t>(24)</w:t>
       </w:r>
     </w:p>
     <w:p ns2:paraId="7E38FCCE" ns2:textId="77777777">
@@ -32115,7 +31107,7 @@
           <w:i w:val="0"/>
           <w:iCs w:val="0"/>
         </w:rPr>
-        <w:t>(27)</w:t>
+        <w:t>(25)</w:t>
       </w:r>
     </w:p>
     <w:p ns2:paraId="6A570EEF" ns2:textId="77777777">
@@ -32524,7 +31516,7 @@
           <w:i w:val="0"/>
           <w:lang w:val="en-US"/>
         </w:rPr>
-        <w:t xml:space="preserve">Recombining (29) gives the slave end-effector target homogeneous transformation relative to its arm base:</w:t>
+        <w:t xml:space="preserve">Recombining (27) gives the slave end-effector target homogeneous transformation relative to its arm base:</w:t>
       </w:r>
     </w:p>
     <w:p>
@@ -32803,7 +31795,7 @@
           <w:i w:val="0"/>
           <w:iCs w:val="0"/>
         </w:rPr>
-        <w:t>(28)</w:t>
+        <w:t>(26)</w:t>
       </w:r>
     </w:p>
     <w:p ns2:paraId="49B2B100" ns2:textId="77777777">
@@ -33036,7 +32028,7 @@
           <w:i w:val="0"/>
           <w:iCs w:val="0"/>
         </w:rPr>
-        <w:t>(29)</w:t>
+        <w:t>(27)</w:t>
       </w:r>
     </w:p>
     <w:p ns2:paraId="7DF9FAA0" ns2:textId="77777777">

</xml_diff>

<commit_message>
Simplify three-axis handle pose mapping
</commit_message>
<xml_diff>
--- a/Article5_English_IEEE_Letter_Compact.docx
+++ b/Article5_English_IEEE_Letter_Compact.docx
@@ -29194,7 +29194,7 @@
           <w:i w:val="0"/>
           <w:iCs w:val="0"/>
         </w:rPr>
-        <w:t xml:space="preserve">Master position input is Delta moving-platform center </w:t>
+        <w:t xml:space="preserve">The Delta moving-platform center </w:t>
       </w:r>
       <ns8:oMath>
         <ns8:sSub>
@@ -29428,7 +29428,7 @@
           <w:i w:val="0"/>
           <w:iCs w:val="0"/>
         </w:rPr>
-        <w:t xml:space="preserve">. Handle joints j1–j3 give moving-axis X–Y–Z Euler angles: roll, pitch, and yaw. After encoder zero and direction calibration, these are </w:t>
+        <w:t xml:space="preserve"> provides master position. The three-axis spherical-wrist result [9] gives orientation directly from calibrated joints j1–j3 as moving-axis roll, pitch, and yaw, respectively; the corresponding angles are </w:t>
       </w:r>
       <ns8:oMath>
         <ns8:d>
@@ -29584,7 +29584,7 @@
           <w:i w:val="0"/>
           <w:iCs w:val="0"/>
         </w:rPr>
-        <w:t xml:space="preserve"> in radians. Master rotation and homogeneous pose matrices are</w:t>
+        <w:t xml:space="preserve"> (in radians). The handle rotation and homogeneous pose matrices are</w:t>
       </w:r>
     </w:p>
     <w:p>
@@ -30301,7 +30301,7 @@
           <w:i w:val="0"/>
           <w:lang w:val="en-US"/>
         </w:rPr>
-        <w:t xml:space="preserve"> is the handle’s fixed zero-orientation mounting rotation relative to {D}; </w:t>
+        <w:t xml:space="preserve"> is the fixed mounting rotation relative to {D}; </w:t>
       </w:r>
       <ns8:oMath>
         <ns8:sSub>
@@ -30405,7 +30405,7 @@
           <w:i w:val="0"/>
           <w:lang w:val="en-US"/>
         </w:rPr>
-        <w:t xml:space="preserve"> if their zero axes align. Moving-axis rotations multiply on the right in roll–pitch–yaw order. Matrix </w:t>
+        <w:t xml:space="preserve"> when the zero axes align. Matrix </w:t>
       </w:r>
       <ns8:oMath>
         <ns8:sSub>
@@ -30456,7 +30456,7 @@
           <w:i w:val="0"/>
           <w:lang w:val="en-US"/>
         </w:rPr>
-        <w:t xml:space="preserve"> transforms handle orientation-frame components into {D}.</w:t>
+        <w:t xml:space="preserve"> maps handle-frame components into {D}.</w:t>
       </w:r>
     </w:p>
     <w:p ns2:paraId="6B4762DE" ns2:textId="77777777">

</xml_diff>

<commit_message>
Simplify single-leg kinematics section
</commit_message>
<xml_diff>
--- a/Article5_English_IEEE_Letter_Compact.docx
+++ b/Article5_English_IEEE_Letter_Compact.docx
@@ -2572,7 +2572,7 @@
           <w:i w:val="0"/>
           <w:iCs w:val="0"/>
         </w:rPr>
-        <w:t xml:space="preserve">Let leg joint angles be </w:t>
+        <w:t xml:space="preserve">Let the equivalent joint angles be </w:t>
       </w:r>
       <ns8:oMath>
         <ns8:sSub>
@@ -2888,7 +2888,7 @@
           <w:i w:val="0"/>
           <w:iCs w:val="0"/>
         </w:rPr>
-        <w:t xml:space="preserve">, and wheel-center position </w:t>
+        <w:t xml:space="preserve">, and wheel-axis center position </w:t>
       </w:r>
       <ns8:oMath>
         <ns8:sSubSup>
@@ -3117,7 +3117,7 @@
           <w:i w:val="0"/>
           <w:iCs w:val="0"/>
         </w:rPr>
-        <w:t xml:space="preserve">. The kinematic endpoint is the wheel-axis center, distinct from ground contact. At zero configuration, both links extend along the leg frame’s negative </w:t>
+        <w:t xml:space="preserve">. At zero configuration, both links extend along negative </w:t>
       </w:r>
       <ns8:oMath>
         <ns8:r>
@@ -3141,7 +3141,7 @@
           <w:i w:val="0"/>
           <w:iCs w:val="0"/>
         </w:rPr>
-        <w:t xml:space="preserve"> axis; positive joint directions follow the equations below. Table I lists geometric parameters; Fig. 3(a) shows the leg and its frame.</w:t>
+        <w:t xml:space="preserve"> in {leg}; see Fig. 3(a).</w:t>
       </w:r>
     </w:p>
     <w:tbl>
@@ -4633,7 +4633,7 @@
           <w:i w:val="0"/>
           <w:lang w:val="en-US"/>
         </w:rPr>
-        <w:t xml:space="preserve">Neglecting link elasticity, the forward kinematics is</w:t>
+        <w:t xml:space="preserve">The forward kinematics is</w:t>
       </w:r>
     </w:p>
     <w:p>
@@ -5377,7 +5377,7 @@
           <w:i w:val="0"/>
           <w:lang w:val="en-US"/>
         </w:rPr>
-        <w:t xml:space="preserve">For the inverse-kinematic branch with the wheel center below the hip, define</w:t>
+        <w:t xml:space="preserve">For the below-hip wheel-center branch, define</w:t>
       </w:r>
     </w:p>
     <w:p>
@@ -6133,7 +6133,7 @@
           <w:i w:val="0"/>
           <w:lang w:val="en-US"/>
         </w:rPr>
-        <w:t xml:space="preserve">With </w:t>
+        <w:t xml:space="preserve">Set </w:t>
       </w:r>
       <ns8:oMath>
         <ns8:sSub>
@@ -6282,7 +6282,7 @@
           <w:i w:val="0"/>
           <w:lang w:val="en-US"/>
         </w:rPr>
-        <w:t xml:space="preserve">, the inverse solution is</w:t>
+        <w:t xml:space="preserve">, and the inverse angles are</w:t>
       </w:r>
     </w:p>
     <w:p>
@@ -7293,1410 +7293,6 @@
           <w:lang w:val="en-US"/>
         </w:rPr>
         <w:t xml:space="preserve">.</w:t>
-      </w:r>
-    </w:p>
-    <w:p ns2:paraId="03B116D2" ns2:textId="77777777">
-      <w:pPr>
-        <w:pStyle w:val="BodyText"/>
-        <w:snapToGrid w:val="0"/>
-        <w:widowControl/>
-        <w:rPr>
-          <w:rFonts w:ascii="Times New Roman" w:hAnsi="Times New Roman" w:eastAsia="SimSun" w:cs="Times New Roman"/>
-          <w:sz w:val="20"/>
-          <w:szCs w:val="20"/>
-          <w:color w:val="000000"/>
-        </w:rPr>
-        <w:keepNext/>
-      </w:pPr>
-      <w:r>
-        <w:rPr>
-          <w:rFonts w:ascii="Times New Roman" w:hAnsi="Times New Roman" w:eastAsia="SimSun" w:cs="Times New Roman"/>
-          <w:sz w:val="20"/>
-          <w:szCs w:val="20"/>
-          <w:color w:val="000000"/>
-          <w:b w:val="0"/>
-          <w:i w:val="0"/>
-          <w:lang w:val="en-US"/>
-        </w:rPr>
-        <w:t xml:space="preserve">Writing </w:t>
-      </w:r>
-      <ns8:oMath>
-        <ns8:sSub>
-          <ns8:sSubPr>
-            <ns8:ctrlPr>
-              <w:rPr>
-                <w:rFonts w:ascii="Cambria Math" w:hAnsi="Cambria Math"/>
-              </w:rPr>
-            </ns8:ctrlPr>
-          </ns8:sSubPr>
-          <ns8:e>
-            <ns8:r>
-              <w:rPr>
-                <w:rFonts w:ascii="Times New Roman" w:hAnsi="Times New Roman" w:eastAsia="SimSun" w:cs="Times New Roman"/>
-                <w:sz w:val="20"/>
-                <w:szCs w:val="20"/>
-                <w:color w:val="000000"/>
-              </w:rPr>
-              <ns8:t>c</ns8:t>
-            </ns8:r>
-          </ns8:e>
-          <ns8:sub>
-            <ns8:r>
-              <ns8:rPr>
-                <ns8:sty ns8:val="p"/>
-              </ns8:rPr>
-              <w:rPr>
-                <w:rFonts w:ascii="Times New Roman" w:hAnsi="Times New Roman" w:eastAsia="SimSun" w:cs="Times New Roman"/>
-                <w:sz w:val="20"/>
-                <w:szCs w:val="20"/>
-                <w:color w:val="000000"/>
-                <w:i w:val="0"/>
-                <w:iCs w:val="0"/>
-              </w:rPr>
-              <ns8:t>1</ns8:t>
-            </ns8:r>
-          </ns8:sub>
-        </ns8:sSub>
-        <ns8:r>
-          <ns8:rPr>
-            <ns8:sty ns8:val="p"/>
-          </ns8:rPr>
-          <w:rPr>
-            <w:rFonts w:ascii="Times New Roman" w:hAnsi="Times New Roman" w:eastAsia="SimSun" w:cs="Times New Roman"/>
-            <w:sz w:val="20"/>
-            <w:szCs w:val="20"/>
-            <w:color w:val="000000"/>
-          </w:rPr>
-          <ns8:t>=cos</ns8:t>
-        </ns8:r>
-        <ns8:sSub>
-          <ns8:sSubPr>
-            <ns8:ctrlPr>
-              <w:rPr>
-                <w:rFonts w:ascii="Cambria Math" w:hAnsi="Cambria Math"/>
-              </w:rPr>
-            </ns8:ctrlPr>
-          </ns8:sSubPr>
-          <ns8:e>
-            <ns8:r>
-              <w:rPr>
-                <w:rFonts w:ascii="Times New Roman" w:hAnsi="Times New Roman" w:eastAsia="SimSun" w:cs="Times New Roman"/>
-                <w:sz w:val="20"/>
-                <w:szCs w:val="20"/>
-                <w:color w:val="000000"/>
-              </w:rPr>
-              <ns8:t>q</ns8:t>
-            </ns8:r>
-          </ns8:e>
-          <ns8:sub>
-            <ns8:r>
-              <ns8:rPr>
-                <ns8:sty ns8:val="p"/>
-              </ns8:rPr>
-              <w:rPr>
-                <w:rFonts w:ascii="Times New Roman" w:hAnsi="Times New Roman" w:eastAsia="SimSun" w:cs="Times New Roman"/>
-                <w:sz w:val="20"/>
-                <w:szCs w:val="20"/>
-                <w:color w:val="000000"/>
-              </w:rPr>
-              <ns8:t>leg,</ns8:t>
-            </ns8:r>
-            <ns8:r>
-              <ns8:rPr>
-                <ns8:sty ns8:val="p"/>
-              </ns8:rPr>
-              <w:rPr>
-                <w:rFonts w:ascii="Times New Roman" w:hAnsi="Times New Roman" w:eastAsia="SimSun" w:cs="Times New Roman"/>
-                <w:sz w:val="20"/>
-                <w:szCs w:val="20"/>
-                <w:color w:val="000000"/>
-                <w:i w:val="0"/>
-                <w:iCs w:val="0"/>
-              </w:rPr>
-              <ns8:t>1</ns8:t>
-            </ns8:r>
-          </ns8:sub>
-        </ns8:sSub>
-      </ns8:oMath>
-      <w:r>
-        <w:rPr>
-          <w:rFonts w:ascii="Times New Roman" w:hAnsi="Times New Roman" w:eastAsia="SimSun" w:cs="Times New Roman"/>
-          <w:sz w:val="20"/>
-          <w:szCs w:val="20"/>
-          <w:color w:val="000000"/>
-          <w:b w:val="0"/>
-          <w:i w:val="0"/>
-          <w:lang w:val="en-US"/>
-        </w:rPr>
-        <w:t xml:space="preserve">, </w:t>
-      </w:r>
-      <ns8:oMath>
-        <ns8:sSub>
-          <ns8:sSubPr>
-            <ns8:ctrlPr>
-              <w:rPr>
-                <w:rFonts w:ascii="Cambria Math" w:hAnsi="Cambria Math"/>
-              </w:rPr>
-            </ns8:ctrlPr>
-          </ns8:sSubPr>
-          <ns8:e>
-            <ns8:r>
-              <w:rPr>
-                <w:rFonts w:ascii="Times New Roman" w:hAnsi="Times New Roman" w:eastAsia="SimSun" w:cs="Times New Roman"/>
-                <w:sz w:val="20"/>
-                <w:szCs w:val="20"/>
-                <w:color w:val="000000"/>
-              </w:rPr>
-              <ns8:t>s</ns8:t>
-            </ns8:r>
-          </ns8:e>
-          <ns8:sub>
-            <ns8:r>
-              <ns8:rPr>
-                <ns8:sty ns8:val="p"/>
-              </ns8:rPr>
-              <w:rPr>
-                <w:rFonts w:ascii="Times New Roman" w:hAnsi="Times New Roman" w:eastAsia="SimSun" w:cs="Times New Roman"/>
-                <w:sz w:val="20"/>
-                <w:szCs w:val="20"/>
-                <w:color w:val="000000"/>
-                <w:i w:val="0"/>
-                <w:iCs w:val="0"/>
-              </w:rPr>
-              <ns8:t>1</ns8:t>
-            </ns8:r>
-          </ns8:sub>
-        </ns8:sSub>
-        <ns8:r>
-          <ns8:rPr>
-            <ns8:sty ns8:val="p"/>
-          </ns8:rPr>
-          <w:rPr>
-            <w:rFonts w:ascii="Times New Roman" w:hAnsi="Times New Roman" w:eastAsia="SimSun" w:cs="Times New Roman"/>
-            <w:sz w:val="20"/>
-            <w:szCs w:val="20"/>
-            <w:color w:val="000000"/>
-          </w:rPr>
-          <ns8:t>=sin</ns8:t>
-        </ns8:r>
-        <ns8:sSub>
-          <ns8:sSubPr>
-            <ns8:ctrlPr>
-              <w:rPr>
-                <w:rFonts w:ascii="Cambria Math" w:hAnsi="Cambria Math"/>
-              </w:rPr>
-            </ns8:ctrlPr>
-          </ns8:sSubPr>
-          <ns8:e>
-            <ns8:r>
-              <w:rPr>
-                <w:rFonts w:ascii="Times New Roman" w:hAnsi="Times New Roman" w:eastAsia="SimSun" w:cs="Times New Roman"/>
-                <w:sz w:val="20"/>
-                <w:szCs w:val="20"/>
-                <w:color w:val="000000"/>
-              </w:rPr>
-              <ns8:t>q</ns8:t>
-            </ns8:r>
-          </ns8:e>
-          <ns8:sub>
-            <ns8:r>
-              <ns8:rPr>
-                <ns8:sty ns8:val="p"/>
-              </ns8:rPr>
-              <w:rPr>
-                <w:rFonts w:ascii="Times New Roman" w:hAnsi="Times New Roman" w:eastAsia="SimSun" w:cs="Times New Roman"/>
-                <w:sz w:val="20"/>
-                <w:szCs w:val="20"/>
-                <w:color w:val="000000"/>
-              </w:rPr>
-              <ns8:t>leg,</ns8:t>
-            </ns8:r>
-            <ns8:r>
-              <ns8:rPr>
-                <ns8:sty ns8:val="p"/>
-              </ns8:rPr>
-              <w:rPr>
-                <w:rFonts w:ascii="Times New Roman" w:hAnsi="Times New Roman" w:eastAsia="SimSun" w:cs="Times New Roman"/>
-                <w:sz w:val="20"/>
-                <w:szCs w:val="20"/>
-                <w:color w:val="000000"/>
-                <w:i w:val="0"/>
-                <w:iCs w:val="0"/>
-              </w:rPr>
-              <ns8:t>1</ns8:t>
-            </ns8:r>
-          </ns8:sub>
-        </ns8:sSub>
-      </ns8:oMath>
-      <w:r>
-        <w:rPr>
-          <w:rFonts w:ascii="Times New Roman" w:hAnsi="Times New Roman" w:eastAsia="SimSun" w:cs="Times New Roman"/>
-          <w:sz w:val="20"/>
-          <w:szCs w:val="20"/>
-          <w:color w:val="000000"/>
-          <w:b w:val="0"/>
-          <w:i w:val="0"/>
-          <w:lang w:val="en-US"/>
-        </w:rPr>
-        <w:t xml:space="preserve">, </w:t>
-      </w:r>
-      <ns8:oMath>
-        <ns8:sSub>
-          <ns8:sSubPr>
-            <ns8:ctrlPr>
-              <w:rPr>
-                <w:rFonts w:ascii="Cambria Math" w:hAnsi="Cambria Math"/>
-              </w:rPr>
-            </ns8:ctrlPr>
-          </ns8:sSubPr>
-          <ns8:e>
-            <ns8:r>
-              <w:rPr>
-                <w:rFonts w:ascii="Times New Roman" w:hAnsi="Times New Roman" w:eastAsia="SimSun" w:cs="Times New Roman"/>
-                <w:sz w:val="20"/>
-                <w:szCs w:val="20"/>
-                <w:color w:val="000000"/>
-              </w:rPr>
-              <ns8:t>c</ns8:t>
-            </ns8:r>
-          </ns8:e>
-          <ns8:sub>
-            <ns8:r>
-              <ns8:rPr>
-                <ns8:sty ns8:val="p"/>
-              </ns8:rPr>
-              <w:rPr>
-                <w:rFonts w:ascii="Times New Roman" w:hAnsi="Times New Roman" w:eastAsia="SimSun" w:cs="Times New Roman"/>
-                <w:sz w:val="20"/>
-                <w:szCs w:val="20"/>
-                <w:color w:val="000000"/>
-                <w:i w:val="0"/>
-                <w:iCs w:val="0"/>
-              </w:rPr>
-              <ns8:t>12</ns8:t>
-            </ns8:r>
-          </ns8:sub>
-        </ns8:sSub>
-        <ns8:r>
-          <ns8:rPr>
-            <ns8:sty ns8:val="p"/>
-          </ns8:rPr>
-          <w:rPr>
-            <w:rFonts w:ascii="Times New Roman" w:hAnsi="Times New Roman" w:eastAsia="SimSun" w:cs="Times New Roman"/>
-            <w:sz w:val="20"/>
-            <w:szCs w:val="20"/>
-            <w:color w:val="000000"/>
-          </w:rPr>
-          <ns8:t>=cos(</ns8:t>
-        </ns8:r>
-        <ns8:sSub>
-          <ns8:sSubPr>
-            <ns8:ctrlPr>
-              <w:rPr>
-                <w:rFonts w:ascii="Cambria Math" w:hAnsi="Cambria Math"/>
-              </w:rPr>
-            </ns8:ctrlPr>
-          </ns8:sSubPr>
-          <ns8:e>
-            <ns8:r>
-              <w:rPr>
-                <w:rFonts w:ascii="Times New Roman" w:hAnsi="Times New Roman" w:eastAsia="SimSun" w:cs="Times New Roman"/>
-                <w:sz w:val="20"/>
-                <w:szCs w:val="20"/>
-                <w:color w:val="000000"/>
-              </w:rPr>
-              <ns8:t>q</ns8:t>
-            </ns8:r>
-          </ns8:e>
-          <ns8:sub>
-            <ns8:r>
-              <ns8:rPr>
-                <ns8:sty ns8:val="p"/>
-              </ns8:rPr>
-              <w:rPr>
-                <w:rFonts w:ascii="Times New Roman" w:hAnsi="Times New Roman" w:eastAsia="SimSun" w:cs="Times New Roman"/>
-                <w:sz w:val="20"/>
-                <w:szCs w:val="20"/>
-                <w:color w:val="000000"/>
-              </w:rPr>
-              <ns8:t>leg,</ns8:t>
-            </ns8:r>
-            <ns8:r>
-              <ns8:rPr>
-                <ns8:sty ns8:val="p"/>
-              </ns8:rPr>
-              <w:rPr>
-                <w:rFonts w:ascii="Times New Roman" w:hAnsi="Times New Roman" w:eastAsia="SimSun" w:cs="Times New Roman"/>
-                <w:sz w:val="20"/>
-                <w:szCs w:val="20"/>
-                <w:color w:val="000000"/>
-                <w:i w:val="0"/>
-                <w:iCs w:val="0"/>
-              </w:rPr>
-              <ns8:t>1</ns8:t>
-            </ns8:r>
-          </ns8:sub>
-        </ns8:sSub>
-        <ns8:r>
-          <ns8:rPr>
-            <ns8:sty ns8:val="p"/>
-          </ns8:rPr>
-          <w:rPr>
-            <w:rFonts w:ascii="Times New Roman" w:hAnsi="Times New Roman" w:eastAsia="SimSun" w:cs="Times New Roman"/>
-            <w:sz w:val="20"/>
-            <w:szCs w:val="20"/>
-            <w:color w:val="000000"/>
-            <w:i w:val="0"/>
-            <w:iCs w:val="0"/>
-          </w:rPr>
-          <ns8:t>+</ns8:t>
-        </ns8:r>
-        <ns8:sSub>
-          <ns8:sSubPr>
-            <ns8:ctrlPr>
-              <w:rPr>
-                <w:rFonts w:ascii="Cambria Math" w:hAnsi="Cambria Math"/>
-              </w:rPr>
-            </ns8:ctrlPr>
-          </ns8:sSubPr>
-          <ns8:e>
-            <ns8:r>
-              <w:rPr>
-                <w:rFonts w:ascii="Times New Roman" w:hAnsi="Times New Roman" w:eastAsia="SimSun" w:cs="Times New Roman"/>
-                <w:sz w:val="20"/>
-                <w:szCs w:val="20"/>
-                <w:color w:val="000000"/>
-              </w:rPr>
-              <ns8:t>q</ns8:t>
-            </ns8:r>
-          </ns8:e>
-          <ns8:sub>
-            <ns8:r>
-              <ns8:rPr>
-                <ns8:sty ns8:val="p"/>
-              </ns8:rPr>
-              <w:rPr>
-                <w:rFonts w:ascii="Times New Roman" w:hAnsi="Times New Roman" w:eastAsia="SimSun" w:cs="Times New Roman"/>
-                <w:sz w:val="20"/>
-                <w:szCs w:val="20"/>
-                <w:color w:val="000000"/>
-              </w:rPr>
-              <ns8:t>leg,</ns8:t>
-            </ns8:r>
-            <ns8:r>
-              <ns8:rPr>
-                <ns8:sty ns8:val="p"/>
-              </ns8:rPr>
-              <w:rPr>
-                <w:rFonts w:ascii="Times New Roman" w:hAnsi="Times New Roman" w:eastAsia="SimSun" w:cs="Times New Roman"/>
-                <w:sz w:val="20"/>
-                <w:szCs w:val="20"/>
-                <w:color w:val="000000"/>
-                <w:i w:val="0"/>
-                <w:iCs w:val="0"/>
-              </w:rPr>
-              <ns8:t>2</ns8:t>
-            </ns8:r>
-          </ns8:sub>
-        </ns8:sSub>
-        <ns8:r>
-          <ns8:rPr>
-            <ns8:sty ns8:val="p"/>
-          </ns8:rPr>
-          <w:rPr>
-            <w:rFonts w:ascii="Times New Roman" w:hAnsi="Times New Roman" w:eastAsia="SimSun" w:cs="Times New Roman"/>
-            <w:sz w:val="20"/>
-            <w:szCs w:val="20"/>
-            <w:color w:val="000000"/>
-            <w:i w:val="0"/>
-            <w:iCs w:val="0"/>
-          </w:rPr>
-          <ns8:t>)</ns8:t>
-        </ns8:r>
-      </ns8:oMath>
-      <w:r>
-        <w:rPr>
-          <w:rFonts w:ascii="Times New Roman" w:hAnsi="Times New Roman" w:eastAsia="SimSun" w:cs="Times New Roman"/>
-          <w:sz w:val="20"/>
-          <w:szCs w:val="20"/>
-          <w:color w:val="000000"/>
-          <w:b w:val="0"/>
-          <w:i w:val="0"/>
-          <w:lang w:val="en-US"/>
-        </w:rPr>
-        <w:t xml:space="preserve">, and </w:t>
-      </w:r>
-      <ns8:oMath>
-        <ns8:sSub>
-          <ns8:sSubPr>
-            <ns8:ctrlPr>
-              <w:rPr>
-                <w:rFonts w:ascii="Cambria Math" w:hAnsi="Cambria Math"/>
-              </w:rPr>
-            </ns8:ctrlPr>
-          </ns8:sSubPr>
-          <ns8:e>
-            <ns8:r>
-              <w:rPr>
-                <w:rFonts w:ascii="Times New Roman" w:hAnsi="Times New Roman" w:eastAsia="SimSun" w:cs="Times New Roman"/>
-                <w:sz w:val="20"/>
-                <w:szCs w:val="20"/>
-                <w:color w:val="000000"/>
-              </w:rPr>
-              <ns8:t>s</ns8:t>
-            </ns8:r>
-          </ns8:e>
-          <ns8:sub>
-            <ns8:r>
-              <ns8:rPr>
-                <ns8:sty ns8:val="p"/>
-              </ns8:rPr>
-              <w:rPr>
-                <w:rFonts w:ascii="Times New Roman" w:hAnsi="Times New Roman" w:eastAsia="SimSun" w:cs="Times New Roman"/>
-                <w:sz w:val="20"/>
-                <w:szCs w:val="20"/>
-                <w:color w:val="000000"/>
-                <w:i w:val="0"/>
-                <w:iCs w:val="0"/>
-              </w:rPr>
-              <ns8:t>12</ns8:t>
-            </ns8:r>
-          </ns8:sub>
-        </ns8:sSub>
-        <ns8:r>
-          <ns8:rPr>
-            <ns8:sty ns8:val="p"/>
-          </ns8:rPr>
-          <w:rPr>
-            <w:rFonts w:ascii="Times New Roman" w:hAnsi="Times New Roman" w:eastAsia="SimSun" w:cs="Times New Roman"/>
-            <w:sz w:val="20"/>
-            <w:szCs w:val="20"/>
-            <w:color w:val="000000"/>
-          </w:rPr>
-          <ns8:t>=sin(</ns8:t>
-        </ns8:r>
-        <ns8:sSub>
-          <ns8:sSubPr>
-            <ns8:ctrlPr>
-              <w:rPr>
-                <w:rFonts w:ascii="Cambria Math" w:hAnsi="Cambria Math"/>
-              </w:rPr>
-            </ns8:ctrlPr>
-          </ns8:sSubPr>
-          <ns8:e>
-            <ns8:r>
-              <w:rPr>
-                <w:rFonts w:ascii="Times New Roman" w:hAnsi="Times New Roman" w:eastAsia="SimSun" w:cs="Times New Roman"/>
-                <w:sz w:val="20"/>
-                <w:szCs w:val="20"/>
-                <w:color w:val="000000"/>
-              </w:rPr>
-              <ns8:t>q</ns8:t>
-            </ns8:r>
-          </ns8:e>
-          <ns8:sub>
-            <ns8:r>
-              <ns8:rPr>
-                <ns8:sty ns8:val="p"/>
-              </ns8:rPr>
-              <w:rPr>
-                <w:rFonts w:ascii="Times New Roman" w:hAnsi="Times New Roman" w:eastAsia="SimSun" w:cs="Times New Roman"/>
-                <w:sz w:val="20"/>
-                <w:szCs w:val="20"/>
-                <w:color w:val="000000"/>
-              </w:rPr>
-              <ns8:t>leg,</ns8:t>
-            </ns8:r>
-            <ns8:r>
-              <ns8:rPr>
-                <ns8:sty ns8:val="p"/>
-              </ns8:rPr>
-              <w:rPr>
-                <w:rFonts w:ascii="Times New Roman" w:hAnsi="Times New Roman" w:eastAsia="SimSun" w:cs="Times New Roman"/>
-                <w:sz w:val="20"/>
-                <w:szCs w:val="20"/>
-                <w:color w:val="000000"/>
-                <w:i w:val="0"/>
-                <w:iCs w:val="0"/>
-              </w:rPr>
-              <ns8:t>1</ns8:t>
-            </ns8:r>
-          </ns8:sub>
-        </ns8:sSub>
-        <ns8:r>
-          <ns8:rPr>
-            <ns8:sty ns8:val="p"/>
-          </ns8:rPr>
-          <w:rPr>
-            <w:rFonts w:ascii="Times New Roman" w:hAnsi="Times New Roman" w:eastAsia="SimSun" w:cs="Times New Roman"/>
-            <w:sz w:val="20"/>
-            <w:szCs w:val="20"/>
-            <w:color w:val="000000"/>
-            <w:i w:val="0"/>
-            <w:iCs w:val="0"/>
-          </w:rPr>
-          <ns8:t>+</ns8:t>
-        </ns8:r>
-        <ns8:sSub>
-          <ns8:sSubPr>
-            <ns8:ctrlPr>
-              <w:rPr>
-                <w:rFonts w:ascii="Cambria Math" w:hAnsi="Cambria Math"/>
-              </w:rPr>
-            </ns8:ctrlPr>
-          </ns8:sSubPr>
-          <ns8:e>
-            <ns8:r>
-              <w:rPr>
-                <w:rFonts w:ascii="Times New Roman" w:hAnsi="Times New Roman" w:eastAsia="SimSun" w:cs="Times New Roman"/>
-                <w:sz w:val="20"/>
-                <w:szCs w:val="20"/>
-                <w:color w:val="000000"/>
-              </w:rPr>
-              <ns8:t>q</ns8:t>
-            </ns8:r>
-          </ns8:e>
-          <ns8:sub>
-            <ns8:r>
-              <ns8:rPr>
-                <ns8:sty ns8:val="p"/>
-              </ns8:rPr>
-              <w:rPr>
-                <w:rFonts w:ascii="Times New Roman" w:hAnsi="Times New Roman" w:eastAsia="SimSun" w:cs="Times New Roman"/>
-                <w:sz w:val="20"/>
-                <w:szCs w:val="20"/>
-                <w:color w:val="000000"/>
-              </w:rPr>
-              <ns8:t>leg,</ns8:t>
-            </ns8:r>
-            <ns8:r>
-              <ns8:rPr>
-                <ns8:sty ns8:val="p"/>
-              </ns8:rPr>
-              <w:rPr>
-                <w:rFonts w:ascii="Times New Roman" w:hAnsi="Times New Roman" w:eastAsia="SimSun" w:cs="Times New Roman"/>
-                <w:sz w:val="20"/>
-                <w:szCs w:val="20"/>
-                <w:color w:val="000000"/>
-                <w:i w:val="0"/>
-                <w:iCs w:val="0"/>
-              </w:rPr>
-              <ns8:t>2</ns8:t>
-            </ns8:r>
-          </ns8:sub>
-        </ns8:sSub>
-        <ns8:r>
-          <ns8:rPr>
-            <ns8:sty ns8:val="p"/>
-          </ns8:rPr>
-          <w:rPr>
-            <w:rFonts w:ascii="Times New Roman" w:hAnsi="Times New Roman" w:eastAsia="SimSun" w:cs="Times New Roman"/>
-            <w:sz w:val="20"/>
-            <w:szCs w:val="20"/>
-            <w:color w:val="000000"/>
-            <w:i w:val="0"/>
-            <w:iCs w:val="0"/>
-          </w:rPr>
-          <ns8:t>)</ns8:t>
-        </ns8:r>
-      </ns8:oMath>
-      <w:r>
-        <w:rPr>
-          <w:rFonts w:ascii="Times New Roman" w:hAnsi="Times New Roman" w:eastAsia="SimSun" w:cs="Times New Roman"/>
-          <w:sz w:val="20"/>
-          <w:szCs w:val="20"/>
-          <w:color w:val="000000"/>
-          <w:b w:val="0"/>
-          <w:i w:val="0"/>
-          <w:lang w:val="en-US"/>
-        </w:rPr>
-        <w:t xml:space="preserve"> for brevity, the wheel-center Jacobian is</w:t>
-      </w:r>
-    </w:p>
-    <w:p>
-      <w:pPr>
-        <w:pStyle w:val="equation"/>
-        <w:snapToGrid w:val="0"/>
-        <w:widowControl/>
-        <w:keepLines/>
-        <w:ind w:left="0" w:right="0" w:firstLine="0"/>
-        <w:jc w:val="left"/>
-        <w:tabs>
-          <w:tab w:val="center" w:pos="2517"/>
-          <w:tab w:val="right" w:pos="5033"/>
-        </w:tabs>
-        <w:rPr>
-          <w:rFonts w:ascii="Times New Roman" w:hAnsi="Times New Roman" w:eastAsia="SimSun" w:cs="Times New Roman"/>
-          <w:sz w:val="20"/>
-          <w:szCs w:val="20"/>
-          <w:color w:val="000000"/>
-          <w:b w:val="0"/>
-          <w:bCs w:val="0"/>
-          <w:i w:val="0"/>
-          <w:iCs w:val="0"/>
-        </w:rPr>
-      </w:pPr>
-      <w:r>
-        <w:tab/>
-      </w:r>
-      <ns8:oMath>
-        <ns8:sSub>
-          <ns8:sSubPr>
-            <ns8:ctrlPr>
-              <w:rPr>
-                <w:rFonts w:ascii="Cambria Math" w:hAnsi="Cambria Math"/>
-              </w:rPr>
-            </ns8:ctrlPr>
-          </ns8:sSubPr>
-          <ns8:e>
-            <ns8:r>
-              <ns8:rPr>
-                <ns8:sty ns8:val="b"/>
-              </ns8:rPr>
-              <w:rPr>
-                <w:rFonts w:ascii="Times New Roman" w:hAnsi="Times New Roman" w:eastAsia="SimSun" w:cs="Times New Roman"/>
-                <w:sz w:val="20"/>
-                <w:szCs w:val="20"/>
-                <w:color w:val="000000"/>
-              </w:rPr>
-              <ns8:t>J</ns8:t>
-            </ns8:r>
-          </ns8:e>
-          <ns8:sub>
-            <ns8:r>
-              <ns8:rPr>
-                <ns8:sty ns8:val="p"/>
-              </ns8:rPr>
-              <w:rPr>
-                <w:rFonts w:ascii="Times New Roman" w:hAnsi="Times New Roman" w:eastAsia="SimSun" w:cs="Times New Roman"/>
-                <w:sz w:val="20"/>
-                <w:szCs w:val="20"/>
-                <w:color w:val="000000"/>
-              </w:rPr>
-              <ns8:t>leg</ns8:t>
-            </ns8:r>
-          </ns8:sub>
-        </ns8:sSub>
-        <ns8:r>
-          <ns8:rPr>
-            <ns8:sty ns8:val="p"/>
-          </ns8:rPr>
-          <w:rPr>
-            <w:rFonts w:ascii="Times New Roman" w:hAnsi="Times New Roman" w:eastAsia="SimSun" w:cs="Times New Roman"/>
-            <w:sz w:val="20"/>
-            <w:szCs w:val="20"/>
-            <w:color w:val="000000"/>
-            <w:i w:val="0"/>
-            <w:iCs w:val="0"/>
-          </w:rPr>
-          <ns8:t>=</ns8:t>
-        </ns8:r>
-        <ns8:f>
-          <ns8:fPr>
-            <ns8:ctrlPr>
-              <w:rPr>
-                <w:rFonts w:ascii="Cambria Math" w:hAnsi="Cambria Math"/>
-              </w:rPr>
-            </ns8:ctrlPr>
-          </ns8:fPr>
-          <ns8:num>
-            <ns8:r>
-              <ns8:rPr>
-                <ns8:sty ns8:val="p"/>
-              </ns8:rPr>
-              <w:rPr>
-                <w:rFonts w:ascii="Times New Roman" w:hAnsi="Times New Roman" w:eastAsia="SimSun" w:cs="Times New Roman"/>
-                <w:sz w:val="20"/>
-                <w:szCs w:val="20"/>
-                <w:color w:val="000000"/>
-              </w:rPr>
-              <ns8:t>∂</ns8:t>
-            </ns8:r>
-            <ns8:sSubSup>
-              <ns8:sSubSupPr>
-                <ns8:ctrlPr>
-                  <w:rPr>
-                    <w:rFonts w:ascii="Cambria Math" w:hAnsi="Cambria Math"/>
-                  </w:rPr>
-                </ns8:ctrlPr>
-              </ns8:sSubSupPr>
-              <ns8:e>
-                <ns8:r>
-                  <ns8:rPr>
-                    <ns8:sty ns8:val="bi"/>
-                  </ns8:rPr>
-                  <w:rPr>
-                    <w:rFonts w:ascii="Times New Roman" w:hAnsi="Times New Roman" w:eastAsia="SimSun" w:cs="Times New Roman"/>
-                    <w:sz w:val="20"/>
-                    <w:szCs w:val="20"/>
-                    <w:color w:val="000000"/>
-                  </w:rPr>
-                  <ns8:t>p</ns8:t>
-                </ns8:r>
-              </ns8:e>
-              <ns8:sub>
-                <ns8:r>
-                  <ns8:rPr>
-                    <ns8:sty ns8:val="p"/>
-                  </ns8:rPr>
-                  <w:rPr>
-                    <w:rFonts w:ascii="Times New Roman" w:hAnsi="Times New Roman" w:eastAsia="SimSun" w:cs="Times New Roman"/>
-                    <w:sz w:val="20"/>
-                    <w:szCs w:val="20"/>
-                    <w:color w:val="000000"/>
-                  </w:rPr>
-                  <ns8:t>a</ns8:t>
-                </ns8:r>
-              </ns8:sub>
-              <ns8:sup>
-                <ns8:r>
-                  <ns8:rPr>
-                    <ns8:sty ns8:val="p"/>
-                  </ns8:rPr>
-                  <w:rPr>
-                    <w:rFonts w:ascii="Times New Roman" w:hAnsi="Times New Roman" w:eastAsia="SimSun" w:cs="Times New Roman"/>
-                    <w:sz w:val="20"/>
-                    <w:szCs w:val="20"/>
-                    <w:color w:val="000000"/>
-                  </w:rPr>
-                  <ns8:t>leg</ns8:t>
-                </ns8:r>
-              </ns8:sup>
-            </ns8:sSubSup>
-          </ns8:num>
-          <ns8:den>
-            <ns8:r>
-              <ns8:rPr>
-                <ns8:sty ns8:val="p"/>
-              </ns8:rPr>
-              <w:rPr>
-                <w:rFonts w:ascii="Times New Roman" w:hAnsi="Times New Roman" w:eastAsia="SimSun" w:cs="Times New Roman"/>
-                <w:sz w:val="20"/>
-                <w:szCs w:val="20"/>
-                <w:color w:val="000000"/>
-              </w:rPr>
-              <ns8:t>∂</ns8:t>
-            </ns8:r>
-            <ns8:sSub>
-              <ns8:sSubPr>
-                <ns8:ctrlPr>
-                  <w:rPr>
-                    <w:rFonts w:ascii="Cambria Math" w:hAnsi="Cambria Math"/>
-                  </w:rPr>
-                </ns8:ctrlPr>
-              </ns8:sSubPr>
-              <ns8:e>
-                <ns8:r>
-                  <ns8:rPr>
-                    <ns8:sty ns8:val="bi"/>
-                  </ns8:rPr>
-                  <w:rPr>
-                    <w:rFonts w:ascii="Times New Roman" w:hAnsi="Times New Roman" w:eastAsia="SimSun" w:cs="Times New Roman"/>
-                    <w:sz w:val="20"/>
-                    <w:szCs w:val="20"/>
-                    <w:color w:val="000000"/>
-                  </w:rPr>
-                  <ns8:t>q</ns8:t>
-                </ns8:r>
-              </ns8:e>
-              <ns8:sub>
-                <ns8:r>
-                  <ns8:rPr>
-                    <ns8:sty ns8:val="p"/>
-                  </ns8:rPr>
-                  <w:rPr>
-                    <w:rFonts w:ascii="Times New Roman" w:hAnsi="Times New Roman" w:eastAsia="SimSun" w:cs="Times New Roman"/>
-                    <w:sz w:val="20"/>
-                    <w:szCs w:val="20"/>
-                    <w:color w:val="000000"/>
-                  </w:rPr>
-                  <ns8:t>leg</ns8:t>
-                </ns8:r>
-              </ns8:sub>
-            </ns8:sSub>
-          </ns8:den>
-        </ns8:f>
-        <ns8:r>
-          <ns8:rPr>
-            <ns8:sty ns8:val="p"/>
-          </ns8:rPr>
-          <w:rPr>
-            <w:rFonts w:ascii="Times New Roman" w:hAnsi="Times New Roman" w:eastAsia="SimSun" w:cs="Times New Roman"/>
-            <w:sz w:val="20"/>
-            <w:szCs w:val="20"/>
-            <w:color w:val="000000"/>
-            <w:i w:val="0"/>
-            <w:iCs w:val="0"/>
-          </w:rPr>
-          <ns8:t>=</ns8:t>
-        </ns8:r>
-        <ns8:d>
-          <ns8:dPr>
-            <ns8:begChr ns8:val="["/>
-            <ns8:endChr ns8:val="]"/>
-            <ns8:ctrlPr>
-              <w:rPr>
-                <w:rFonts w:ascii="Cambria Math" w:hAnsi="Cambria Math"/>
-              </w:rPr>
-            </ns8:ctrlPr>
-          </ns8:dPr>
-          <ns8:e>
-            <ns8:m>
-              <ns8:mPr>
-                <ns8:plcHide ns8:val="1"/>
-                <ns8:mcs>
-                  <ns8:mc>
-                    <ns8:mcPr>
-                      <ns8:count ns8:val="2"/>
-                      <ns8:mcJc ns8:val="center"/>
-                    </ns8:mcPr>
-                  </ns8:mc>
-                </ns8:mcs>
-                <ns8:ctrlPr>
-                  <w:rPr>
-                    <w:rFonts w:ascii="Cambria Math" w:hAnsi="Cambria Math"/>
-                  </w:rPr>
-                </ns8:ctrlPr>
-              </ns8:mPr>
-              <ns8:mr>
-                <ns8:e>
-                  <ns8:sSub>
-                    <ns8:sSubPr>
-                      <ns8:ctrlPr>
-                        <w:rPr>
-                          <w:rFonts w:ascii="Cambria Math" w:hAnsi="Cambria Math"/>
-                        </w:rPr>
-                      </ns8:ctrlPr>
-                    </ns8:sSubPr>
-                    <ns8:e>
-                      <ns8:r>
-                        <w:rPr>
-                          <w:rFonts w:ascii="Times New Roman" w:hAnsi="Times New Roman" w:eastAsia="SimSun" w:cs="Times New Roman"/>
-                          <w:sz w:val="20"/>
-                          <w:szCs w:val="20"/>
-                          <w:color w:val="000000"/>
-                        </w:rPr>
-                        <ns8:t>L</ns8:t>
-                      </ns8:r>
-                    </ns8:e>
-                    <ns8:sub>
-                      <ns8:r>
-                        <ns8:rPr>
-                          <ns8:sty ns8:val="p"/>
-                        </ns8:rPr>
-                        <w:rPr>
-                          <w:rFonts w:ascii="Times New Roman" w:hAnsi="Times New Roman" w:eastAsia="SimSun" w:cs="Times New Roman"/>
-                          <w:sz w:val="20"/>
-                          <w:szCs w:val="20"/>
-                          <w:color w:val="000000"/>
-                          <w:i w:val="0"/>
-                          <w:iCs w:val="0"/>
-                        </w:rPr>
-                        <ns8:t>1</ns8:t>
-                      </ns8:r>
-                    </ns8:sub>
-                  </ns8:sSub>
-                  <ns8:sSub>
-                    <ns8:sSubPr>
-                      <ns8:ctrlPr>
-                        <w:rPr>
-                          <w:rFonts w:ascii="Cambria Math" w:hAnsi="Cambria Math"/>
-                        </w:rPr>
-                      </ns8:ctrlPr>
-                    </ns8:sSubPr>
-                    <ns8:e>
-                      <ns8:r>
-                        <w:rPr>
-                          <w:rFonts w:ascii="Times New Roman" w:hAnsi="Times New Roman" w:eastAsia="SimSun" w:cs="Times New Roman"/>
-                          <w:sz w:val="20"/>
-                          <w:szCs w:val="20"/>
-                          <w:color w:val="000000"/>
-                        </w:rPr>
-                        <ns8:t>c</ns8:t>
-                      </ns8:r>
-                    </ns8:e>
-                    <ns8:sub>
-                      <ns8:r>
-                        <ns8:rPr>
-                          <ns8:sty ns8:val="p"/>
-                        </ns8:rPr>
-                        <w:rPr>
-                          <w:rFonts w:ascii="Times New Roman" w:hAnsi="Times New Roman" w:eastAsia="SimSun" w:cs="Times New Roman"/>
-                          <w:sz w:val="20"/>
-                          <w:szCs w:val="20"/>
-                          <w:color w:val="000000"/>
-                          <w:i w:val="0"/>
-                          <w:iCs w:val="0"/>
-                        </w:rPr>
-                        <ns8:t>1</ns8:t>
-                      </ns8:r>
-                    </ns8:sub>
-                  </ns8:sSub>
-                  <ns8:r>
-                    <ns8:rPr>
-                      <ns8:sty ns8:val="p"/>
-                    </ns8:rPr>
-                    <w:rPr>
-                      <w:rFonts w:ascii="Times New Roman" w:hAnsi="Times New Roman" w:eastAsia="SimSun" w:cs="Times New Roman"/>
-                      <w:sz w:val="20"/>
-                      <w:szCs w:val="20"/>
-                      <w:color w:val="000000"/>
-                      <w:i w:val="0"/>
-                      <w:iCs w:val="0"/>
-                    </w:rPr>
-                    <ns8:t>+</ns8:t>
-                  </ns8:r>
-                  <ns8:sSub>
-                    <ns8:sSubPr>
-                      <ns8:ctrlPr>
-                        <w:rPr>
-                          <w:rFonts w:ascii="Cambria Math" w:hAnsi="Cambria Math"/>
-                        </w:rPr>
-                      </ns8:ctrlPr>
-                    </ns8:sSubPr>
-                    <ns8:e>
-                      <ns8:r>
-                        <w:rPr>
-                          <w:rFonts w:ascii="Times New Roman" w:hAnsi="Times New Roman" w:eastAsia="SimSun" w:cs="Times New Roman"/>
-                          <w:sz w:val="20"/>
-                          <w:szCs w:val="20"/>
-                          <w:color w:val="000000"/>
-                        </w:rPr>
-                        <ns8:t>L</ns8:t>
-                      </ns8:r>
-                    </ns8:e>
-                    <ns8:sub>
-                      <ns8:r>
-                        <ns8:rPr>
-                          <ns8:sty ns8:val="p"/>
-                        </ns8:rPr>
-                        <w:rPr>
-                          <w:rFonts w:ascii="Times New Roman" w:hAnsi="Times New Roman" w:eastAsia="SimSun" w:cs="Times New Roman"/>
-                          <w:sz w:val="20"/>
-                          <w:szCs w:val="20"/>
-                          <w:color w:val="000000"/>
-                          <w:i w:val="0"/>
-                          <w:iCs w:val="0"/>
-                        </w:rPr>
-                        <ns8:t>2</ns8:t>
-                      </ns8:r>
-                    </ns8:sub>
-                  </ns8:sSub>
-                  <ns8:sSub>
-                    <ns8:sSubPr>
-                      <ns8:ctrlPr>
-                        <w:rPr>
-                          <w:rFonts w:ascii="Cambria Math" w:hAnsi="Cambria Math"/>
-                        </w:rPr>
-                      </ns8:ctrlPr>
-                    </ns8:sSubPr>
-                    <ns8:e>
-                      <ns8:r>
-                        <w:rPr>
-                          <w:rFonts w:ascii="Times New Roman" w:hAnsi="Times New Roman" w:eastAsia="SimSun" w:cs="Times New Roman"/>
-                          <w:sz w:val="20"/>
-                          <w:szCs w:val="20"/>
-                          <w:color w:val="000000"/>
-                        </w:rPr>
-                        <ns8:t>c</ns8:t>
-                      </ns8:r>
-                    </ns8:e>
-                    <ns8:sub>
-                      <ns8:r>
-                        <ns8:rPr>
-                          <ns8:sty ns8:val="p"/>
-                        </ns8:rPr>
-                        <w:rPr>
-                          <w:rFonts w:ascii="Times New Roman" w:hAnsi="Times New Roman" w:eastAsia="SimSun" w:cs="Times New Roman"/>
-                          <w:sz w:val="20"/>
-                          <w:szCs w:val="20"/>
-                          <w:color w:val="000000"/>
-                          <w:i w:val="0"/>
-                          <w:iCs w:val="0"/>
-                        </w:rPr>
-                        <ns8:t>12</ns8:t>
-                      </ns8:r>
-                    </ns8:sub>
-                  </ns8:sSub>
-                </ns8:e>
-                <ns8:e>
-                  <ns8:sSub>
-                    <ns8:sSubPr>
-                      <ns8:ctrlPr>
-                        <w:rPr>
-                          <w:rFonts w:ascii="Cambria Math" w:hAnsi="Cambria Math"/>
-                        </w:rPr>
-                      </ns8:ctrlPr>
-                    </ns8:sSubPr>
-                    <ns8:e>
-                      <ns8:r>
-                        <w:rPr>
-                          <w:rFonts w:ascii="Times New Roman" w:hAnsi="Times New Roman" w:eastAsia="SimSun" w:cs="Times New Roman"/>
-                          <w:sz w:val="20"/>
-                          <w:szCs w:val="20"/>
-                          <w:color w:val="000000"/>
-                        </w:rPr>
-                        <ns8:t>L</ns8:t>
-                      </ns8:r>
-                    </ns8:e>
-                    <ns8:sub>
-                      <ns8:r>
-                        <ns8:rPr>
-                          <ns8:sty ns8:val="p"/>
-                        </ns8:rPr>
-                        <w:rPr>
-                          <w:rFonts w:ascii="Times New Roman" w:hAnsi="Times New Roman" w:eastAsia="SimSun" w:cs="Times New Roman"/>
-                          <w:sz w:val="20"/>
-                          <w:szCs w:val="20"/>
-                          <w:color w:val="000000"/>
-                          <w:i w:val="0"/>
-                          <w:iCs w:val="0"/>
-                        </w:rPr>
-                        <ns8:t>2</ns8:t>
-                      </ns8:r>
-                    </ns8:sub>
-                  </ns8:sSub>
-                  <ns8:sSub>
-                    <ns8:sSubPr>
-                      <ns8:ctrlPr>
-                        <w:rPr>
-                          <w:rFonts w:ascii="Cambria Math" w:hAnsi="Cambria Math"/>
-                        </w:rPr>
-                      </ns8:ctrlPr>
-                    </ns8:sSubPr>
-                    <ns8:e>
-                      <ns8:r>
-                        <w:rPr>
-                          <w:rFonts w:ascii="Times New Roman" w:hAnsi="Times New Roman" w:eastAsia="SimSun" w:cs="Times New Roman"/>
-                          <w:sz w:val="20"/>
-                          <w:szCs w:val="20"/>
-                          <w:color w:val="000000"/>
-                        </w:rPr>
-                        <ns8:t>c</ns8:t>
-                      </ns8:r>
-                    </ns8:e>
-                    <ns8:sub>
-                      <ns8:r>
-                        <ns8:rPr>
-                          <ns8:sty ns8:val="p"/>
-                        </ns8:rPr>
-                        <w:rPr>
-                          <w:rFonts w:ascii="Times New Roman" w:hAnsi="Times New Roman" w:eastAsia="SimSun" w:cs="Times New Roman"/>
-                          <w:sz w:val="20"/>
-                          <w:szCs w:val="20"/>
-                          <w:color w:val="000000"/>
-                          <w:i w:val="0"/>
-                          <w:iCs w:val="0"/>
-                        </w:rPr>
-                        <ns8:t>12</ns8:t>
-                      </ns8:r>
-                    </ns8:sub>
-                  </ns8:sSub>
-                </ns8:e>
-              </ns8:mr>
-              <ns8:mr>
-                <ns8:e>
-                  <ns8:sSub>
-                    <ns8:sSubPr>
-                      <ns8:ctrlPr>
-                        <w:rPr>
-                          <w:rFonts w:ascii="Cambria Math" w:hAnsi="Cambria Math"/>
-                        </w:rPr>
-                      </ns8:ctrlPr>
-                    </ns8:sSubPr>
-                    <ns8:e>
-                      <ns8:r>
-                        <w:rPr>
-                          <w:rFonts w:ascii="Times New Roman" w:hAnsi="Times New Roman" w:eastAsia="SimSun" w:cs="Times New Roman"/>
-                          <w:sz w:val="20"/>
-                          <w:szCs w:val="20"/>
-                          <w:color w:val="000000"/>
-                        </w:rPr>
-                        <ns8:t>L</ns8:t>
-                      </ns8:r>
-                    </ns8:e>
-                    <ns8:sub>
-                      <ns8:r>
-                        <ns8:rPr>
-                          <ns8:sty ns8:val="p"/>
-                        </ns8:rPr>
-                        <w:rPr>
-                          <w:rFonts w:ascii="Times New Roman" w:hAnsi="Times New Roman" w:eastAsia="SimSun" w:cs="Times New Roman"/>
-                          <w:sz w:val="20"/>
-                          <w:szCs w:val="20"/>
-                          <w:color w:val="000000"/>
-                          <w:i w:val="0"/>
-                          <w:iCs w:val="0"/>
-                        </w:rPr>
-                        <ns8:t>1</ns8:t>
-                      </ns8:r>
-                    </ns8:sub>
-                  </ns8:sSub>
-                  <ns8:sSub>
-                    <ns8:sSubPr>
-                      <ns8:ctrlPr>
-                        <w:rPr>
-                          <w:rFonts w:ascii="Cambria Math" w:hAnsi="Cambria Math"/>
-                        </w:rPr>
-                      </ns8:ctrlPr>
-                    </ns8:sSubPr>
-                    <ns8:e>
-                      <ns8:r>
-                        <w:rPr>
-                          <w:rFonts w:ascii="Times New Roman" w:hAnsi="Times New Roman" w:eastAsia="SimSun" w:cs="Times New Roman"/>
-                          <w:sz w:val="20"/>
-                          <w:szCs w:val="20"/>
-                          <w:color w:val="000000"/>
-                        </w:rPr>
-                        <ns8:t>s</ns8:t>
-                      </ns8:r>
-                    </ns8:e>
-                    <ns8:sub>
-                      <ns8:r>
-                        <ns8:rPr>
-                          <ns8:sty ns8:val="p"/>
-                        </ns8:rPr>
-                        <w:rPr>
-                          <w:rFonts w:ascii="Times New Roman" w:hAnsi="Times New Roman" w:eastAsia="SimSun" w:cs="Times New Roman"/>
-                          <w:sz w:val="20"/>
-                          <w:szCs w:val="20"/>
-                          <w:color w:val="000000"/>
-                          <w:i w:val="0"/>
-                          <w:iCs w:val="0"/>
-                        </w:rPr>
-                        <ns8:t>1</ns8:t>
-                      </ns8:r>
-                    </ns8:sub>
-                  </ns8:sSub>
-                  <ns8:r>
-                    <ns8:rPr>
-                      <ns8:sty ns8:val="p"/>
-                    </ns8:rPr>
-                    <w:rPr>
-                      <w:rFonts w:ascii="Times New Roman" w:hAnsi="Times New Roman" w:eastAsia="SimSun" w:cs="Times New Roman"/>
-                      <w:sz w:val="20"/>
-                      <w:szCs w:val="20"/>
-                      <w:color w:val="000000"/>
-                      <w:i w:val="0"/>
-                      <w:iCs w:val="0"/>
-                    </w:rPr>
-                    <ns8:t>+</ns8:t>
-                  </ns8:r>
-                  <ns8:sSub>
-                    <ns8:sSubPr>
-                      <ns8:ctrlPr>
-                        <w:rPr>
-                          <w:rFonts w:ascii="Cambria Math" w:hAnsi="Cambria Math"/>
-                        </w:rPr>
-                      </ns8:ctrlPr>
-                    </ns8:sSubPr>
-                    <ns8:e>
-                      <ns8:r>
-                        <w:rPr>
-                          <w:rFonts w:ascii="Times New Roman" w:hAnsi="Times New Roman" w:eastAsia="SimSun" w:cs="Times New Roman"/>
-                          <w:sz w:val="20"/>
-                          <w:szCs w:val="20"/>
-                          <w:color w:val="000000"/>
-                        </w:rPr>
-                        <ns8:t>L</ns8:t>
-                      </ns8:r>
-                    </ns8:e>
-                    <ns8:sub>
-                      <ns8:r>
-                        <ns8:rPr>
-                          <ns8:sty ns8:val="p"/>
-                        </ns8:rPr>
-                        <w:rPr>
-                          <w:rFonts w:ascii="Times New Roman" w:hAnsi="Times New Roman" w:eastAsia="SimSun" w:cs="Times New Roman"/>
-                          <w:sz w:val="20"/>
-                          <w:szCs w:val="20"/>
-                          <w:color w:val="000000"/>
-                          <w:i w:val="0"/>
-                          <w:iCs w:val="0"/>
-                        </w:rPr>
-                        <ns8:t>2</ns8:t>
-                      </ns8:r>
-                    </ns8:sub>
-                  </ns8:sSub>
-                  <ns8:sSub>
-                    <ns8:sSubPr>
-                      <ns8:ctrlPr>
-                        <w:rPr>
-                          <w:rFonts w:ascii="Cambria Math" w:hAnsi="Cambria Math"/>
-                        </w:rPr>
-                      </ns8:ctrlPr>
-                    </ns8:sSubPr>
-                    <ns8:e>
-                      <ns8:r>
-                        <w:rPr>
-                          <w:rFonts w:ascii="Times New Roman" w:hAnsi="Times New Roman" w:eastAsia="SimSun" w:cs="Times New Roman"/>
-                          <w:sz w:val="20"/>
-                          <w:szCs w:val="20"/>
-                          <w:color w:val="000000"/>
-                        </w:rPr>
-                        <ns8:t>s</ns8:t>
-                      </ns8:r>
-                    </ns8:e>
-                    <ns8:sub>
-                      <ns8:r>
-                        <ns8:rPr>
-                          <ns8:sty ns8:val="p"/>
-                        </ns8:rPr>
-                        <w:rPr>
-                          <w:rFonts w:ascii="Times New Roman" w:hAnsi="Times New Roman" w:eastAsia="SimSun" w:cs="Times New Roman"/>
-                          <w:sz w:val="20"/>
-                          <w:szCs w:val="20"/>
-                          <w:color w:val="000000"/>
-                          <w:i w:val="0"/>
-                          <w:iCs w:val="0"/>
-                        </w:rPr>
-                        <ns8:t>12</ns8:t>
-                      </ns8:r>
-                    </ns8:sub>
-                  </ns8:sSub>
-                </ns8:e>
-                <ns8:e>
-                  <ns8:sSub>
-                    <ns8:sSubPr>
-                      <ns8:ctrlPr>
-                        <w:rPr>
-                          <w:rFonts w:ascii="Cambria Math" w:hAnsi="Cambria Math"/>
-                        </w:rPr>
-                      </ns8:ctrlPr>
-                    </ns8:sSubPr>
-                    <ns8:e>
-                      <ns8:r>
-                        <w:rPr>
-                          <w:rFonts w:ascii="Times New Roman" w:hAnsi="Times New Roman" w:eastAsia="SimSun" w:cs="Times New Roman"/>
-                          <w:sz w:val="20"/>
-                          <w:szCs w:val="20"/>
-                          <w:color w:val="000000"/>
-                        </w:rPr>
-                        <ns8:t>L</ns8:t>
-                      </ns8:r>
-                    </ns8:e>
-                    <ns8:sub>
-                      <ns8:r>
-                        <ns8:rPr>
-                          <ns8:sty ns8:val="p"/>
-                        </ns8:rPr>
-                        <w:rPr>
-                          <w:rFonts w:ascii="Times New Roman" w:hAnsi="Times New Roman" w:eastAsia="SimSun" w:cs="Times New Roman"/>
-                          <w:sz w:val="20"/>
-                          <w:szCs w:val="20"/>
-                          <w:color w:val="000000"/>
-                          <w:i w:val="0"/>
-                          <w:iCs w:val="0"/>
-                        </w:rPr>
-                        <ns8:t>2</ns8:t>
-                      </ns8:r>
-                    </ns8:sub>
-                  </ns8:sSub>
-                  <ns8:sSub>
-                    <ns8:sSubPr>
-                      <ns8:ctrlPr>
-                        <w:rPr>
-                          <w:rFonts w:ascii="Cambria Math" w:hAnsi="Cambria Math"/>
-                        </w:rPr>
-                      </ns8:ctrlPr>
-                    </ns8:sSubPr>
-                    <ns8:e>
-                      <ns8:r>
-                        <w:rPr>
-                          <w:rFonts w:ascii="Times New Roman" w:hAnsi="Times New Roman" w:eastAsia="SimSun" w:cs="Times New Roman"/>
-                          <w:sz w:val="20"/>
-                          <w:szCs w:val="20"/>
-                          <w:color w:val="000000"/>
-                        </w:rPr>
-                        <ns8:t>s</ns8:t>
-                      </ns8:r>
-                    </ns8:e>
-                    <ns8:sub>
-                      <ns8:r>
-                        <ns8:rPr>
-                          <ns8:sty ns8:val="p"/>
-                        </ns8:rPr>
-                        <w:rPr>
-                          <w:rFonts w:ascii="Times New Roman" w:hAnsi="Times New Roman" w:eastAsia="SimSun" w:cs="Times New Roman"/>
-                          <w:sz w:val="20"/>
-                          <w:szCs w:val="20"/>
-                          <w:color w:val="000000"/>
-                          <w:i w:val="0"/>
-                          <w:iCs w:val="0"/>
-                        </w:rPr>
-                        <ns8:t>12</ns8:t>
-                      </ns8:r>
-                    </ns8:sub>
-                  </ns8:sSub>
-                </ns8:e>
-              </ns8:mr>
-              <ns8:mr>
-                <ns8:e>
-                  <ns8:r>
-                    <ns8:rPr>
-                      <ns8:sty ns8:val="p"/>
-                    </ns8:rPr>
-                    <w:rPr>
-                      <w:rFonts w:ascii="Times New Roman" w:hAnsi="Times New Roman" w:eastAsia="SimSun" w:cs="Times New Roman"/>
-                      <w:sz w:val="20"/>
-                      <w:szCs w:val="20"/>
-                      <w:color w:val="000000"/>
-                      <w:i w:val="0"/>
-                      <w:iCs w:val="0"/>
-                    </w:rPr>
-                    <ns8:t>0</ns8:t>
-                  </ns8:r>
-                </ns8:e>
-                <ns8:e>
-                  <ns8:r>
-                    <ns8:rPr>
-                      <ns8:sty ns8:val="p"/>
-                    </ns8:rPr>
-                    <w:rPr>
-                      <w:rFonts w:ascii="Times New Roman" w:hAnsi="Times New Roman" w:eastAsia="SimSun" w:cs="Times New Roman"/>
-                      <w:sz w:val="20"/>
-                      <w:szCs w:val="20"/>
-                      <w:color w:val="000000"/>
-                      <w:i w:val="0"/>
-                      <w:iCs w:val="0"/>
-                    </w:rPr>
-                    <ns8:t>0</ns8:t>
-                  </ns8:r>
-                </ns8:e>
-              </ns8:mr>
-            </ns8:m>
-          </ns8:e>
-        </ns8:d>
-        <ns8:r>
-          <ns8:rPr>
-            <ns8:sty ns8:val="p"/>
-          </ns8:rPr>
-          <w:rPr>
-            <w:rFonts w:ascii="Times New Roman" w:hAnsi="Times New Roman" w:eastAsia="SimSun" w:cs="Times New Roman"/>
-            <w:sz w:val="20"/>
-            <w:szCs w:val="20"/>
-            <w:color w:val="000000"/>
-            <w:i w:val="0"/>
-            <w:iCs w:val="0"/>
-          </w:rPr>
-          <ns8:t>.</ns8:t>
-        </ns8:r>
-      </ns8:oMath>
-      <w:r>
-        <w:tab/>
-      </w:r>
-      <w:r>
-        <w:rPr>
-          <w:rFonts w:ascii="Times New Roman" w:hAnsi="Times New Roman" w:eastAsia="SimSun" w:cs="Times New Roman"/>
-          <w:sz w:val="20"/>
-          <w:szCs w:val="20"/>
-          <w:color w:val="000000"/>
-          <w:b w:val="0"/>
-          <w:bCs w:val="0"/>
-          <w:i w:val="0"/>
-          <w:iCs w:val="0"/>
-        </w:rPr>
-        <w:t>(4)</w:t>
       </w:r>
     </w:p>
     <w:p ns2:paraId="51B476F9" ns2:textId="77777777">
@@ -9448,7 +8044,7 @@
           <w:i w:val="0"/>
           <w:iCs w:val="0"/>
         </w:rPr>
-        <w:t>(5)</w:t>
+        <w:t>(4)</w:t>
       </w:r>
     </w:p>
     <w:tbl>
@@ -10756,7 +9352,7 @@
           <w:i w:val="0"/>
           <w:iCs w:val="0"/>
         </w:rPr>
-        <w:t>(6)</w:t>
+        <w:t>(5)</w:t>
       </w:r>
     </w:p>
     <w:p ns2:paraId="6C796972" ns2:textId="77777777">
@@ -11167,7 +9763,7 @@
           <w:i w:val="0"/>
           <w:iCs w:val="0"/>
         </w:rPr>
-        <w:t>(7)</w:t>
+        <w:t>(6)</w:t>
       </w:r>
     </w:p>
     <w:p ns2:paraId="07070668" ns2:textId="77777777">
@@ -11561,7 +10157,7 @@
           <w:i w:val="0"/>
           <w:iCs w:val="0"/>
         </w:rPr>
-        <w:t>(8)</w:t>
+        <w:t>(7)</w:t>
       </w:r>
     </w:p>
     <w:p ns2:paraId="369D2F48" ns2:textId="77777777">
@@ -11587,7 +10183,7 @@
           <w:i w:val="0"/>
           <w:lang w:val="en-US"/>
         </w:rPr>
-        <w:t xml:space="preserve">Equation (8) maps body velocity to wheel-motor angular speeds, forming the chassis inverse-kinematic model.</w:t>
+        <w:t xml:space="preserve">Equation (7) maps body velocity to wheel-motor angular speeds, forming the chassis inverse-kinematic model.</w:t>
       </w:r>
     </w:p>
     <w:p ns2:paraId="472BB379" ns2:textId="77777777">
@@ -12295,7 +10891,7 @@
           <w:i w:val="0"/>
           <w:iCs w:val="0"/>
         </w:rPr>
-        <w:t>(9)</w:t>
+        <w:t>(8)</w:t>
       </w:r>
     </w:p>
     <w:p ns2:paraId="2A55581D" ns2:textId="77777777">
@@ -12945,7 +11541,7 @@
           <w:i w:val="0"/>
           <w:iCs w:val="0"/>
         </w:rPr>
-        <w:t>(10)</w:t>
+        <w:t>(9)</w:t>
       </w:r>
     </w:p>
     <w:p ns2:paraId="31D0E066" ns2:textId="77777777">
@@ -13538,7 +12134,7 @@
           <w:i w:val="0"/>
           <w:iCs w:val="0"/>
         </w:rPr>
-        <w:t>(11)</w:t>
+        <w:t>(10)</w:t>
       </w:r>
     </w:p>
     <w:p ns2:paraId="1C2255A6" ns2:textId="77777777">
@@ -14592,7 +13188,7 @@
           <w:i w:val="0"/>
           <w:iCs w:val="0"/>
         </w:rPr>
-        <w:t>(12)</w:t>
+        <w:t>(11)</w:t>
       </w:r>
     </w:p>
     <w:p ns2:paraId="21299FD9" ns2:textId="77777777">
@@ -16296,7 +14892,7 @@
           <w:i w:val="0"/>
           <w:iCs w:val="0"/>
         </w:rPr>
-        <w:t>(13)</w:t>
+        <w:t>(12)</w:t>
       </w:r>
     </w:p>
     <w:p>
@@ -16966,7 +15562,7 @@
           <w:i w:val="0"/>
           <w:iCs w:val="0"/>
         </w:rPr>
-        <w:t>(14)</w:t>
+        <w:t>(13)</w:t>
       </w:r>
     </w:p>
     <w:p ns2:paraId="25E0EFD8" ns2:textId="77777777">
@@ -17279,7 +15875,7 @@
           <w:i w:val="0"/>
           <w:iCs w:val="0"/>
         </w:rPr>
-        <w:t>(15)</w:t>
+        <w:t>(14)</w:t>
       </w:r>
     </w:p>
     <w:p ns2:paraId="5E17A8DC" ns2:textId="77777777">
@@ -17914,7 +16510,7 @@
           <w:i w:val="0"/>
           <w:iCs w:val="0"/>
         </w:rPr>
-        <w:t>(16)</w:t>
+        <w:t>(15)</w:t>
       </w:r>
     </w:p>
     <w:p ns2:paraId="05FCF358" ns2:textId="77777777">
@@ -19104,7 +17700,7 @@
           <w:i w:val="0"/>
           <w:iCs w:val="0"/>
         </w:rPr>
-        <w:t>(17)</w:t>
+        <w:t>(16)</w:t>
       </w:r>
     </w:p>
     <w:p ns2:paraId="1C17AC4C" ns2:textId="77777777">
@@ -20733,7 +19329,7 @@
           <w:i w:val="0"/>
           <w:iCs w:val="0"/>
         </w:rPr>
-        <w:t>(18)</w:t>
+        <w:t>(17)</w:t>
       </w:r>
     </w:p>
     <w:p ns2:paraId="730C998D" ns2:textId="77777777">
@@ -21504,7 +20100,7 @@
                 <w:i w:val="0"/>
                 <w:lang w:val="en-US"/>
               </w:rPr>
-              <w:t xml:space="preserve">Closed-loop chassis attitude control. Cascaded roll/pitch P loops and height-increment accumulation follow (18); (19) allocates both corrections to four legs. Joint-servo inner loops are combined.</w:t>
+              <w:t xml:space="preserve">Closed-loop chassis attitude control. Cascaded roll/pitch P loops and height-increment accumulation follow (17); (18) allocates both corrections to four legs. Joint-servo inner loops are combined.</w:t>
             </w:r>
           </w:p>
         </w:tc>
@@ -24621,7 +23217,7 @@
           <w:i w:val="0"/>
           <w:iCs w:val="0"/>
         </w:rPr>
-        <w:t>(19)</w:t>
+        <w:t>(18)</w:t>
       </w:r>
     </w:p>
     <w:p ns2:paraId="2F974117" ns2:textId="77777777">
@@ -25029,7 +23625,7 @@
           <w:i w:val="0"/>
           <w:iCs w:val="0"/>
         </w:rPr>
-        <w:t>(20)</w:t>
+        <w:t>(19)</w:t>
       </w:r>
     </w:p>
     <w:p ns2:paraId="3118AC29" ns2:textId="77777777">
@@ -25591,7 +24187,7 @@
           <w:i w:val="0"/>
           <w:iCs w:val="0"/>
         </w:rPr>
-        <w:t>(21)</w:t>
+        <w:t>(20)</w:t>
       </w:r>
     </w:p>
     <w:p ns2:paraId="2D0A6DBC" ns2:textId="77777777">
@@ -27087,7 +25683,7 @@
           <w:i w:val="0"/>
           <w:iCs w:val="0"/>
         </w:rPr>
-        <w:t>(22)</w:t>
+        <w:t>(21)</w:t>
       </w:r>
     </w:p>
     <w:p ns2:paraId="1984F696" ns2:textId="77777777">
@@ -29107,7 +27703,7 @@
           <w:i w:val="0"/>
           <w:iCs w:val="0"/>
         </w:rPr>
-        <w:t>(23)</w:t>
+        <w:t>(22)</w:t>
       </w:r>
     </w:p>
     <w:p ns2:paraId="6D6805DD" ns2:textId="77777777">
@@ -30224,7 +28820,7 @@
           <w:i w:val="0"/>
           <w:iCs w:val="0"/>
         </w:rPr>
-        <w:t>(24)</w:t>
+        <w:t>(23)</w:t>
       </w:r>
     </w:p>
     <w:p ns2:paraId="7E38FCCE" ns2:textId="77777777">
@@ -31107,7 +29703,7 @@
           <w:i w:val="0"/>
           <w:iCs w:val="0"/>
         </w:rPr>
-        <w:t>(25)</w:t>
+        <w:t>(24)</w:t>
       </w:r>
     </w:p>
     <w:p ns2:paraId="6A570EEF" ns2:textId="77777777">
@@ -31516,7 +30112,7 @@
           <w:i w:val="0"/>
           <w:lang w:val="en-US"/>
         </w:rPr>
-        <w:t xml:space="preserve">Recombining (27) gives the slave end-effector target homogeneous transformation relative to its arm base:</w:t>
+        <w:t xml:space="preserve">Recombining (26) gives the slave end-effector target homogeneous transformation relative to its arm base:</w:t>
       </w:r>
     </w:p>
     <w:p>
@@ -31795,7 +30391,7 @@
           <w:i w:val="0"/>
           <w:iCs w:val="0"/>
         </w:rPr>
-        <w:t>(26)</w:t>
+        <w:t>(25)</w:t>
       </w:r>
     </w:p>
     <w:p ns2:paraId="49B2B100" ns2:textId="77777777">
@@ -32028,7 +30624,7 @@
           <w:i w:val="0"/>
           <w:iCs w:val="0"/>
         </w:rPr>
-        <w:t>(27)</w:t>
+        <w:t>(26)</w:t>
       </w:r>
     </w:p>
     <w:p ns2:paraId="7DF9FAA0" ns2:textId="77777777">

</xml_diff>

<commit_message>
Improve article pagination and figure placement
</commit_message>
<xml_diff>
--- a/Article5_English_IEEE_Letter_Compact.docx
+++ b/Article5_English_IEEE_Letter_Compact.docx
@@ -684,7 +684,6 @@
         <w:pStyle w:val="BodyText"/>
         <w:snapToGrid w:val="0"/>
         <w:widowControl/>
-        <w:keepNext w:val="0"/>
         <w:rPr>
           <w:rFonts w:ascii="Times New Roman" w:hAnsi="Times New Roman" w:eastAsia="SimSun" w:cs="Times New Roman"/>
           <w:sz w:val="20"/>
@@ -710,7 +709,6 @@
         <w:pStyle w:val="BodyText"/>
         <w:snapToGrid w:val="0"/>
         <w:widowControl/>
-        <w:keepNext w:val="0"/>
         <w:rPr>
           <w:rFonts w:ascii="Times New Roman" w:hAnsi="Times New Roman" w:eastAsia="SimSun" w:cs="Times New Roman"/>
           <w:sz w:val="20"/>
@@ -736,7 +734,6 @@
         <w:pStyle w:val="BodyText"/>
         <w:snapToGrid w:val="0"/>
         <w:widowControl/>
-        <w:keepNext w:val="0"/>
         <w:rPr>
           <w:rFonts w:ascii="Times New Roman" w:hAnsi="Times New Roman" w:eastAsia="SimSun" w:cs="Times New Roman"/>
           <w:sz w:val="20"/>
@@ -826,6 +823,40 @@
           <w:lang w:val="en-US"/>
         </w:rPr>
         <w:t xml:space="preserve">System Architecture and Notation</w:t>
+      </w:r>
+    </w:p>
+    <w:p>
+      <w:pPr>
+        <w:spacing w:before="0" w:after="0" w:line="20" w:lineRule="exact"/>
+        <w:ind w:firstLine="0"/>
+        <w:rPr>
+          <w:sz w:val="2"/>
+        </w:rPr>
+      </w:pPr>
+    </w:p>
+    <w:p ns2:paraId="5167A082" ns2:textId="77777777">
+      <w:pPr>
+        <w:pStyle w:val="BodyText"/>
+        <w:snapToGrid w:val="0"/>
+        <w:widowControl/>
+        <w:rPr>
+          <w:rFonts w:ascii="Times New Roman" w:hAnsi="Times New Roman" w:eastAsia="SimSun" w:cs="Times New Roman"/>
+          <w:sz w:val="20"/>
+          <w:szCs w:val="20"/>
+          <w:color w:val="000000"/>
+        </w:rPr>
+      </w:pPr>
+      <w:r>
+        <w:rPr>
+          <w:rFonts w:ascii="Times New Roman" w:hAnsi="Times New Roman" w:eastAsia="SimSun" w:cs="Times New Roman"/>
+          <w:sz w:val="20"/>
+          <w:szCs w:val="20"/>
+          <w:color w:val="000000"/>
+          <w:b w:val="0"/>
+          <w:i w:val="0"/>
+          <w:lang w:val="en-US"/>
+        </w:rPr>
+        <w:t xml:space="preserve">Figure 1 shows the chassis, arm, Delta master, and principal coordinate frames. The robot has a 12-degree-of-freedom chassis, a six-revolute-joint arm, and a one-degree-of-freedom gripper (19 active degrees of freedom total); the master provides three translational and three orientation-input degrees of freedom.</w:t>
       </w:r>
     </w:p>
     <w:tbl>
@@ -1192,47 +1223,11 @@
         </w:tc>
       </w:tr>
     </w:tbl>
-    <w:p>
-      <w:pPr>
-        <w:spacing w:before="0" w:after="0" w:line="20" w:lineRule="exact"/>
-        <w:ind w:firstLine="0"/>
-        <w:rPr>
-          <w:sz w:val="2"/>
-        </w:rPr>
-      </w:pPr>
-    </w:p>
-    <w:p ns2:paraId="5167A082" ns2:textId="77777777">
-      <w:pPr>
-        <w:pStyle w:val="BodyText"/>
-        <w:snapToGrid w:val="0"/>
-        <w:widowControl/>
-        <w:keepNext w:val="0"/>
-        <w:rPr>
-          <w:rFonts w:ascii="Times New Roman" w:hAnsi="Times New Roman" w:eastAsia="SimSun" w:cs="Times New Roman"/>
-          <w:sz w:val="20"/>
-          <w:szCs w:val="20"/>
-          <w:color w:val="000000"/>
-        </w:rPr>
-      </w:pPr>
-      <w:r>
-        <w:rPr>
-          <w:rFonts w:ascii="Times New Roman" w:hAnsi="Times New Roman" w:eastAsia="SimSun" w:cs="Times New Roman"/>
-          <w:sz w:val="20"/>
-          <w:szCs w:val="20"/>
-          <w:color w:val="000000"/>
-          <w:b w:val="0"/>
-          <w:i w:val="0"/>
-          <w:lang w:val="en-US"/>
-        </w:rPr>
-        <w:t xml:space="preserve">Figure 1 shows the chassis, arm, Delta master, and principal coordinate frames. The robot has a 12-degree-of-freedom chassis, a six-revolute-joint arm, and a one-degree-of-freedom gripper (19 active degrees of freedom total); the master provides three translational and three orientation-input degrees of freedom.</w:t>
-      </w:r>
-    </w:p>
     <w:p ns2:paraId="642FC0A6" ns2:textId="77777777">
       <w:pPr>
         <w:pStyle w:val="BodyText"/>
         <w:snapToGrid w:val="0"/>
         <w:widowControl/>
-        <w:keepNext w:val="0"/>
         <w:rPr>
           <w:rFonts w:ascii="Times New Roman" w:hAnsi="Times New Roman" w:eastAsia="SimSun" w:cs="Times New Roman"/>
           <w:sz w:val="20"/>
@@ -1258,7 +1253,6 @@
         <w:pStyle w:val="BodyText"/>
         <w:snapToGrid w:val="0"/>
         <w:widowControl/>
-        <w:keepNext w:val="0"/>
         <w:rPr>
           <w:rFonts w:ascii="Times New Roman" w:hAnsi="Times New Roman" w:eastAsia="SimSun" w:cs="Times New Roman"/>
           <w:sz w:val="20"/>
@@ -1436,7 +1430,6 @@
         <w:pStyle w:val="BodyText"/>
         <w:snapToGrid w:val="0"/>
         <w:widowControl/>
-        <w:keepNext w:val="0"/>
         <w:rPr>
           <w:rFonts w:ascii="Times New Roman" w:hAnsi="Times New Roman" w:eastAsia="SimSun" w:cs="Times New Roman"/>
           <w:sz w:val="20"/>
@@ -2055,7 +2048,6 @@
         <w:pStyle w:val="BodyText"/>
         <w:snapToGrid w:val="0"/>
         <w:widowControl/>
-        <w:keepNext w:val="0"/>
         <w:rPr>
           <w:rFonts w:ascii="Times New Roman" w:hAnsi="Times New Roman" w:eastAsia="SimSun" w:cs="Times New Roman"/>
           <w:sz w:val="20"/>
@@ -2371,7 +2363,6 @@
         <w:pStyle w:val="BodyText"/>
         <w:snapToGrid w:val="0"/>
         <w:widowControl/>
-        <w:keepNext w:val="0"/>
         <w:rPr>
           <w:rFonts w:ascii="Times New Roman" w:hAnsi="Times New Roman" w:eastAsia="SimSun" w:cs="Times New Roman"/>
           <w:sz w:val="20"/>
@@ -2493,7 +2484,6 @@
         <w:pStyle w:val="BodyText"/>
         <w:snapToGrid w:val="0"/>
         <w:widowControl/>
-        <w:keepNext w:val="0"/>
         <w:rPr>
           <w:rFonts w:ascii="Times New Roman" w:hAnsi="Times New Roman" w:eastAsia="SimSun" w:cs="Times New Roman"/>
           <w:sz w:val="20"/>
@@ -6931,7 +6921,6 @@
         <w:pStyle w:val="BodyText"/>
         <w:snapToGrid w:val="0"/>
         <w:widowControl/>
-        <w:keepNext w:val="0"/>
         <w:rPr>
           <w:rFonts w:ascii="Times New Roman" w:hAnsi="Times New Roman" w:eastAsia="SimSun" w:cs="Times New Roman"/>
           <w:sz w:val="20"/>
@@ -10165,7 +10154,6 @@
         <w:pStyle w:val="BodyText"/>
         <w:snapToGrid w:val="0"/>
         <w:widowControl/>
-        <w:keepNext w:val="0"/>
         <w:rPr>
           <w:rFonts w:ascii="Times New Roman" w:hAnsi="Times New Roman" w:eastAsia="SimSun" w:cs="Times New Roman"/>
           <w:sz w:val="20"/>
@@ -11549,7 +11537,6 @@
         <w:pStyle w:val="BodyText"/>
         <w:snapToGrid w:val="0"/>
         <w:widowControl/>
-        <w:keepNext w:val="0"/>
         <w:rPr>
           <w:rFonts w:ascii="Times New Roman" w:hAnsi="Times New Roman" w:eastAsia="SimSun" w:cs="Times New Roman"/>
           <w:sz w:val="20"/>
@@ -12148,7 +12135,6 @@
           <w:szCs w:val="20"/>
           <w:color w:val="000000"/>
         </w:rPr>
-        <w:keepNext/>
       </w:pPr>
       <w:r>
         <w:rPr>
@@ -13196,7 +13182,6 @@
         <w:pStyle w:val="BodyText"/>
         <w:snapToGrid w:val="0"/>
         <w:widowControl/>
-        <w:keepNext w:val="0"/>
         <w:rPr>
           <w:rFonts w:ascii="Times New Roman" w:hAnsi="Times New Roman" w:eastAsia="SimSun" w:cs="Times New Roman"/>
           <w:sz w:val="20"/>
@@ -13485,6 +13470,231 @@
           <w:lang w:val="en-US"/>
         </w:rPr>
         <w:t xml:space="preserve"> is leg-motor output torque.</w:t>
+      </w:r>
+    </w:p>
+    <w:p>
+      <w:pPr>
+        <w:spacing w:before="0" w:after="0" w:line="20" w:lineRule="exact"/>
+        <w:ind w:firstLine="0"/>
+        <w:rPr>
+          <w:sz w:val="2"/>
+        </w:rPr>
+      </w:pPr>
+    </w:p>
+    <w:p ns2:paraId="54E60B31" ns2:textId="77777777">
+      <w:pPr>
+        <w:pStyle w:val="Heading3"/>
+        <w:snapToGrid w:val="0"/>
+        <w:widowControl/>
+        <w:numPr>
+          <w:ilvl w:val="2"/>
+          <w:numId w:val="4"/>
+        </w:numPr>
+        <w:keepNext w:val="0"/>
+        <w:rPr>
+          <w:rFonts w:ascii="Times New Roman" w:hAnsi="Times New Roman" w:eastAsia="SimSun" w:cs="Times New Roman"/>
+          <w:sz w:val="20"/>
+          <w:szCs w:val="20"/>
+          <w:color w:val="000000"/>
+          <w:b w:val="0"/>
+          <w:bCs w:val="0"/>
+          <w:i w:val="1"/>
+          <w:iCs w:val="1"/>
+        </w:rPr>
+        <w:keepLines w:val="0"/>
+      </w:pPr>
+      <w:r>
+        <w:rPr>
+          <w:rFonts w:ascii="Times New Roman" w:hAnsi="Times New Roman" w:eastAsia="SimSun" w:cs="Times New Roman"/>
+          <w:sz w:val="20"/>
+          <w:szCs w:val="20"/>
+          <w:color w:val="000000"/>
+          <w:b w:val="0"/>
+          <w:i w:val="1"/>
+          <w:lang w:val="en-US"/>
+        </w:rPr>
+        <w:t xml:space="preserve">Whole-Body Single-Rigid-Body Dynamics</w:t>
+      </w:r>
+      <w:r>
+        <w:rPr>
+          <w:rFonts w:ascii="Times New Roman" w:hAnsi="Times New Roman" w:eastAsia="SimSun" w:cs="Times New Roman"/>
+          <w:sz w:val="20"/>
+          <w:szCs w:val="20"/>
+          <w:color w:val="000000"/>
+          <w:b w:val="0"/>
+          <w:bCs w:val="0"/>
+          <w:i w:val="1"/>
+          <w:iCs w:val="1"/>
+        </w:rPr>
+        <w:t xml:space="preserve">: </w:t>
+      </w:r>
+      <w:r>
+        <w:rPr>
+          <w:rFonts w:ascii="Times New Roman" w:hAnsi="Times New Roman" w:eastAsia="SimSun" w:cs="Times New Roman"/>
+          <w:sz w:val="20"/>
+          <w:szCs w:val="20"/>
+          <w:color w:val="000000"/>
+          <w:b w:val="0"/>
+          <w:lang w:val="en-US"/>
+          <w:i w:val="0"/>
+          <w:iCs w:val="0"/>
+        </w:rPr>
+        <w:t xml:space="preserve">Fig. 5 shows the whole-body center of mass and contact forces on the three-dimensional chassis configuration. During rapid chassis motion, the arm is usually stationary relative to the chassis. Both can then be approximated as one rigid body with equivalent mass and inertia. Let </w:t>
+      </w:r>
+      <ns8:oMath>
+        <ns8:r>
+          <ns8:rPr>
+            <ns8:sty ns8:val="p"/>
+          </ns8:rPr>
+          <w:rPr>
+            <w:rFonts w:ascii="Times New Roman" w:hAnsi="Times New Roman" w:eastAsia="SimSun" w:cs="Times New Roman"/>
+            <w:sz w:val="20"/>
+            <w:szCs w:val="20"/>
+            <w:color w:val="000000"/>
+          </w:rPr>
+          <ns8:t>m</ns8:t>
+        </ns8:r>
+      </ns8:oMath>
+      <w:r>
+        <w:rPr>
+          <w:rFonts w:ascii="Times New Roman" w:hAnsi="Times New Roman" w:eastAsia="SimSun" w:cs="Times New Roman"/>
+          <w:sz w:val="20"/>
+          <w:szCs w:val="20"/>
+          <w:color w:val="000000"/>
+          <w:b w:val="0"/>
+          <w:lang w:val="en-US"/>
+          <w:i w:val="0"/>
+          <w:iCs w:val="0"/>
+        </w:rPr>
+        <w:t xml:space="preserve"> be total mass, </w:t>
+      </w:r>
+      <ns8:oMath>
+        <ns8:sSub>
+          <ns8:sSubPr>
+            <ns8:ctrlPr>
+              <w:rPr>
+                <w:rFonts w:ascii="Cambria Math" w:hAnsi="Cambria Math" w:hint="eastAsia"/>
+              </w:rPr>
+            </ns8:ctrlPr>
+          </ns8:sSubPr>
+          <ns8:e>
+            <ns8:r>
+              <ns8:rPr>
+                <ns8:sty ns8:val="p"/>
+              </ns8:rPr>
+              <w:rPr>
+                <w:rFonts w:ascii="Times New Roman" w:hAnsi="Times New Roman" w:eastAsia="SimSun" w:cs="Times New Roman"/>
+                <w:sz w:val="20"/>
+                <w:szCs w:val="20"/>
+                <w:color w:val="000000"/>
+              </w:rPr>
+              <ns8:t>a</ns8:t>
+            </ns8:r>
+          </ns8:e>
+          <ns8:sub>
+            <ns8:r>
+              <ns8:rPr>
+                <ns8:sty ns8:val="p"/>
+              </ns8:rPr>
+              <w:rPr>
+                <w:rFonts w:ascii="Times New Roman" w:hAnsi="Times New Roman" w:eastAsia="SimSun" w:cs="Times New Roman"/>
+                <w:sz w:val="20"/>
+                <w:szCs w:val="20"/>
+                <w:color w:val="000000"/>
+              </w:rPr>
+              <ns8:t>G</ns8:t>
+            </ns8:r>
+          </ns8:sub>
+        </ns8:sSub>
+      </ns8:oMath>
+      <w:r>
+        <w:rPr>
+          <w:rFonts w:ascii="Times New Roman" w:hAnsi="Times New Roman" w:eastAsia="SimSun" w:cs="Times New Roman"/>
+          <w:sz w:val="20"/>
+          <w:szCs w:val="20"/>
+          <w:color w:val="000000"/>
+          <w:b w:val="0"/>
+          <w:lang w:val="en-US"/>
+          <w:i w:val="0"/>
+          <w:iCs w:val="0"/>
+        </w:rPr>
+        <w:t xml:space="preserve"> center-of-mass acceleration, and </w:t>
+      </w:r>
+      <ns8:oMath>
+        <ns8:sSub>
+          <ns8:sSubPr>
+            <ns8:ctrlPr>
+              <w:rPr>
+                <w:rFonts w:ascii="Cambria Math" w:hAnsi="Cambria Math" w:hint="eastAsia"/>
+              </w:rPr>
+            </ns8:ctrlPr>
+          </ns8:sSubPr>
+          <ns8:e>
+            <ns8:r>
+              <ns8:rPr>
+                <ns8:sty ns8:val="p"/>
+              </ns8:rPr>
+              <w:rPr>
+                <w:rFonts w:ascii="Times New Roman" w:hAnsi="Times New Roman" w:eastAsia="SimSun" w:cs="Times New Roman"/>
+                <w:sz w:val="20"/>
+                <w:szCs w:val="20"/>
+                <w:color w:val="000000"/>
+              </w:rPr>
+              <ns8:t>r</ns8:t>
+            </ns8:r>
+          </ns8:e>
+          <ns8:sub>
+            <ns8:r>
+              <ns8:rPr>
+                <ns8:sty ns8:val="p"/>
+              </ns8:rPr>
+              <w:rPr>
+                <w:rFonts w:ascii="Times New Roman" w:hAnsi="Times New Roman" w:eastAsia="SimSun" w:cs="Times New Roman"/>
+                <w:sz w:val="20"/>
+                <w:szCs w:val="20"/>
+                <w:color w:val="000000"/>
+              </w:rPr>
+              <ns8:t>e,i</ns8:t>
+            </ns8:r>
+          </ns8:sub>
+        </ns8:sSub>
+      </ns8:oMath>
+      <w:r>
+        <w:rPr>
+          <w:rFonts w:ascii="Times New Roman" w:hAnsi="Times New Roman" w:eastAsia="SimSun" w:cs="Times New Roman"/>
+          <w:sz w:val="20"/>
+          <w:szCs w:val="20"/>
+          <w:color w:val="000000"/>
+          <w:b w:val="0"/>
+          <w:lang w:val="en-US"/>
+          <w:i w:val="0"/>
+          <w:iCs w:val="0"/>
+        </w:rPr>
+        <w:t xml:space="preserve"> the vector from the center of mass to contact </w:t>
+      </w:r>
+      <ns8:oMath>
+        <ns8:r>
+          <w:rPr>
+            <w:rFonts w:ascii="Times New Roman" w:hAnsi="Times New Roman" w:eastAsia="SimSun" w:cs="Times New Roman"/>
+            <w:sz w:val="20"/>
+            <w:szCs w:val="20"/>
+            <w:color w:val="000000"/>
+          </w:rPr>
+          <ns8:t>i</ns8:t>
+        </ns8:r>
+      </ns8:oMath>
+      <w:r>
+        <w:rPr>
+          <w:rFonts w:ascii="Times New Roman" w:hAnsi="Times New Roman" w:eastAsia="SimSun" w:cs="Times New Roman"/>
+          <w:sz w:val="20"/>
+          <w:szCs w:val="20"/>
+          <w:color w:val="000000"/>
+          <w:b w:val="0"/>
+          <w:lang w:val="en-US"/>
+          <w:i w:val="0"/>
+          <w:iCs w:val="0"/>
+        </w:rPr>
+        <w:t xml:space="preserve">.</w:t>
       </w:r>
     </w:p>
     <w:tbl>
@@ -13631,231 +13841,6 @@
         </w:tc>
       </w:tr>
     </w:tbl>
-    <w:p>
-      <w:pPr>
-        <w:spacing w:before="0" w:after="0" w:line="20" w:lineRule="exact"/>
-        <w:ind w:firstLine="0"/>
-        <w:rPr>
-          <w:sz w:val="2"/>
-        </w:rPr>
-      </w:pPr>
-    </w:p>
-    <w:p ns2:paraId="54E60B31" ns2:textId="77777777">
-      <w:pPr>
-        <w:pStyle w:val="Heading3"/>
-        <w:snapToGrid w:val="0"/>
-        <w:widowControl/>
-        <w:numPr>
-          <w:ilvl w:val="2"/>
-          <w:numId w:val="4"/>
-        </w:numPr>
-        <w:keepNext w:val="0"/>
-        <w:rPr>
-          <w:rFonts w:ascii="Times New Roman" w:hAnsi="Times New Roman" w:eastAsia="SimSun" w:cs="Times New Roman"/>
-          <w:sz w:val="20"/>
-          <w:szCs w:val="20"/>
-          <w:color w:val="000000"/>
-          <w:b w:val="0"/>
-          <w:bCs w:val="0"/>
-          <w:i w:val="1"/>
-          <w:iCs w:val="1"/>
-        </w:rPr>
-        <w:keepLines w:val="0"/>
-      </w:pPr>
-      <w:r>
-        <w:rPr>
-          <w:rFonts w:ascii="Times New Roman" w:hAnsi="Times New Roman" w:eastAsia="SimSun" w:cs="Times New Roman"/>
-          <w:sz w:val="20"/>
-          <w:szCs w:val="20"/>
-          <w:color w:val="000000"/>
-          <w:b w:val="0"/>
-          <w:i w:val="1"/>
-          <w:lang w:val="en-US"/>
-        </w:rPr>
-        <w:t xml:space="preserve">Whole-Body Single-Rigid-Body Dynamics</w:t>
-      </w:r>
-      <w:r>
-        <w:rPr>
-          <w:rFonts w:ascii="Times New Roman" w:hAnsi="Times New Roman" w:eastAsia="SimSun" w:cs="Times New Roman"/>
-          <w:sz w:val="20"/>
-          <w:szCs w:val="20"/>
-          <w:color w:val="000000"/>
-          <w:b w:val="0"/>
-          <w:bCs w:val="0"/>
-          <w:i w:val="1"/>
-          <w:iCs w:val="1"/>
-        </w:rPr>
-        <w:t xml:space="preserve">: </w:t>
-      </w:r>
-      <w:r>
-        <w:rPr>
-          <w:rFonts w:ascii="Times New Roman" w:hAnsi="Times New Roman" w:eastAsia="SimSun" w:cs="Times New Roman"/>
-          <w:sz w:val="20"/>
-          <w:szCs w:val="20"/>
-          <w:color w:val="000000"/>
-          <w:b w:val="0"/>
-          <w:lang w:val="en-US"/>
-          <w:i w:val="0"/>
-          <w:iCs w:val="0"/>
-        </w:rPr>
-        <w:t xml:space="preserve">Fig. 5 shows the whole-body center of mass and contact forces on the three-dimensional chassis configuration. During rapid chassis motion, the arm is usually stationary relative to the chassis. Both can then be approximated as one rigid body with equivalent mass and inertia. Let </w:t>
-      </w:r>
-      <ns8:oMath>
-        <ns8:r>
-          <ns8:rPr>
-            <ns8:sty ns8:val="p"/>
-          </ns8:rPr>
-          <w:rPr>
-            <w:rFonts w:ascii="Times New Roman" w:hAnsi="Times New Roman" w:eastAsia="SimSun" w:cs="Times New Roman"/>
-            <w:sz w:val="20"/>
-            <w:szCs w:val="20"/>
-            <w:color w:val="000000"/>
-          </w:rPr>
-          <ns8:t>m</ns8:t>
-        </ns8:r>
-      </ns8:oMath>
-      <w:r>
-        <w:rPr>
-          <w:rFonts w:ascii="Times New Roman" w:hAnsi="Times New Roman" w:eastAsia="SimSun" w:cs="Times New Roman"/>
-          <w:sz w:val="20"/>
-          <w:szCs w:val="20"/>
-          <w:color w:val="000000"/>
-          <w:b w:val="0"/>
-          <w:lang w:val="en-US"/>
-          <w:i w:val="0"/>
-          <w:iCs w:val="0"/>
-        </w:rPr>
-        <w:t xml:space="preserve"> be total mass, </w:t>
-      </w:r>
-      <ns8:oMath>
-        <ns8:sSub>
-          <ns8:sSubPr>
-            <ns8:ctrlPr>
-              <w:rPr>
-                <w:rFonts w:ascii="Cambria Math" w:hAnsi="Cambria Math" w:hint="eastAsia"/>
-              </w:rPr>
-            </ns8:ctrlPr>
-          </ns8:sSubPr>
-          <ns8:e>
-            <ns8:r>
-              <ns8:rPr>
-                <ns8:sty ns8:val="p"/>
-              </ns8:rPr>
-              <w:rPr>
-                <w:rFonts w:ascii="Times New Roman" w:hAnsi="Times New Roman" w:eastAsia="SimSun" w:cs="Times New Roman"/>
-                <w:sz w:val="20"/>
-                <w:szCs w:val="20"/>
-                <w:color w:val="000000"/>
-              </w:rPr>
-              <ns8:t>a</ns8:t>
-            </ns8:r>
-          </ns8:e>
-          <ns8:sub>
-            <ns8:r>
-              <ns8:rPr>
-                <ns8:sty ns8:val="p"/>
-              </ns8:rPr>
-              <w:rPr>
-                <w:rFonts w:ascii="Times New Roman" w:hAnsi="Times New Roman" w:eastAsia="SimSun" w:cs="Times New Roman"/>
-                <w:sz w:val="20"/>
-                <w:szCs w:val="20"/>
-                <w:color w:val="000000"/>
-              </w:rPr>
-              <ns8:t>G</ns8:t>
-            </ns8:r>
-          </ns8:sub>
-        </ns8:sSub>
-      </ns8:oMath>
-      <w:r>
-        <w:rPr>
-          <w:rFonts w:ascii="Times New Roman" w:hAnsi="Times New Roman" w:eastAsia="SimSun" w:cs="Times New Roman"/>
-          <w:sz w:val="20"/>
-          <w:szCs w:val="20"/>
-          <w:color w:val="000000"/>
-          <w:b w:val="0"/>
-          <w:lang w:val="en-US"/>
-          <w:i w:val="0"/>
-          <w:iCs w:val="0"/>
-        </w:rPr>
-        <w:t xml:space="preserve"> center-of-mass acceleration, and </w:t>
-      </w:r>
-      <ns8:oMath>
-        <ns8:sSub>
-          <ns8:sSubPr>
-            <ns8:ctrlPr>
-              <w:rPr>
-                <w:rFonts w:ascii="Cambria Math" w:hAnsi="Cambria Math" w:hint="eastAsia"/>
-              </w:rPr>
-            </ns8:ctrlPr>
-          </ns8:sSubPr>
-          <ns8:e>
-            <ns8:r>
-              <ns8:rPr>
-                <ns8:sty ns8:val="p"/>
-              </ns8:rPr>
-              <w:rPr>
-                <w:rFonts w:ascii="Times New Roman" w:hAnsi="Times New Roman" w:eastAsia="SimSun" w:cs="Times New Roman"/>
-                <w:sz w:val="20"/>
-                <w:szCs w:val="20"/>
-                <w:color w:val="000000"/>
-              </w:rPr>
-              <ns8:t>r</ns8:t>
-            </ns8:r>
-          </ns8:e>
-          <ns8:sub>
-            <ns8:r>
-              <ns8:rPr>
-                <ns8:sty ns8:val="p"/>
-              </ns8:rPr>
-              <w:rPr>
-                <w:rFonts w:ascii="Times New Roman" w:hAnsi="Times New Roman" w:eastAsia="SimSun" w:cs="Times New Roman"/>
-                <w:sz w:val="20"/>
-                <w:szCs w:val="20"/>
-                <w:color w:val="000000"/>
-              </w:rPr>
-              <ns8:t>e,i</ns8:t>
-            </ns8:r>
-          </ns8:sub>
-        </ns8:sSub>
-      </ns8:oMath>
-      <w:r>
-        <w:rPr>
-          <w:rFonts w:ascii="Times New Roman" w:hAnsi="Times New Roman" w:eastAsia="SimSun" w:cs="Times New Roman"/>
-          <w:sz w:val="20"/>
-          <w:szCs w:val="20"/>
-          <w:color w:val="000000"/>
-          <w:b w:val="0"/>
-          <w:lang w:val="en-US"/>
-          <w:i w:val="0"/>
-          <w:iCs w:val="0"/>
-        </w:rPr>
-        <w:t xml:space="preserve"> the vector from the center of mass to contact </w:t>
-      </w:r>
-      <ns8:oMath>
-        <ns8:r>
-          <w:rPr>
-            <w:rFonts w:ascii="Times New Roman" w:hAnsi="Times New Roman" w:eastAsia="SimSun" w:cs="Times New Roman"/>
-            <w:sz w:val="20"/>
-            <w:szCs w:val="20"/>
-            <w:color w:val="000000"/>
-          </w:rPr>
-          <ns8:t>i</ns8:t>
-        </ns8:r>
-      </ns8:oMath>
-      <w:r>
-        <w:rPr>
-          <w:rFonts w:ascii="Times New Roman" w:hAnsi="Times New Roman" w:eastAsia="SimSun" w:cs="Times New Roman"/>
-          <w:sz w:val="20"/>
-          <w:szCs w:val="20"/>
-          <w:color w:val="000000"/>
-          <w:b w:val="0"/>
-          <w:lang w:val="en-US"/>
-          <w:i w:val="0"/>
-          <w:iCs w:val="0"/>
-        </w:rPr>
-        <w:t xml:space="preserve">.</w:t>
-      </w:r>
-    </w:p>
     <w:p ns2:paraId="6EC59D6B" ns2:textId="77777777">
       <w:pPr>
         <w:pStyle w:val="BodyText"/>
@@ -16518,7 +16503,6 @@
         <w:pStyle w:val="BodyText"/>
         <w:snapToGrid w:val="0"/>
         <w:widowControl/>
-        <w:keepNext w:val="0"/>
         <w:rPr>
           <w:rFonts w:ascii="Times New Roman" w:hAnsi="Times New Roman" w:eastAsia="SimSun" w:cs="Times New Roman"/>
           <w:sz w:val="20"/>
@@ -16743,6 +16727,146 @@
         <w:t xml:space="preserve">,</w:t>
       </w:r>
     </w:p>
+    <w:tbl>
+      <w:tblPr>
+        <w:tblW w:w="5033" w:type="dxa"/>
+        <w:tblLayout w:type="fixed"/>
+        <w:tblBorders>
+          <w:top w:val="nil"/>
+          <w:bottom w:val="nil"/>
+          <w:left w:val="nil"/>
+          <w:right w:val="nil"/>
+          <w:insideH w:val="nil"/>
+          <w:insideV w:val="nil"/>
+        </w:tblBorders>
+      </w:tblPr>
+      <w:tblGrid>
+        <w:gridCol w:w="5033"/>
+      </w:tblGrid>
+      <w:tr>
+        <w:trPr>
+          <w:cantSplit/>
+        </w:trPr>
+        <w:tc>
+          <w:tcPr>
+            <w:tcW w:w="5033" w:type="dxa"/>
+            <w:tcMar>
+              <w:top w:w="0" w:type="dxa"/>
+              <w:bottom w:w="0" w:type="dxa"/>
+              <w:left w:w="0" w:type="dxa"/>
+              <w:right w:w="0" w:type="dxa"/>
+            </w:tcMar>
+          </w:tcPr>
+          <w:p ns2:paraId="456B9A1A" ns2:textId="77777777">
+            <w:pPr>
+              <w:pStyle w:val="Normal"/>
+              <w:snapToGrid w:val="0"/>
+              <w:widowControl/>
+              <w:keepNext/>
+              <w:keepLines/>
+              <w:spacing w:before="0" w:after="0" w:line="240" w:lineRule="auto"/>
+              <w:ind w:firstLine="0"/>
+              <w:jc w:val="center"/>
+              <w:rPr>
+                <w:rFonts w:ascii="Times New Roman" w:hAnsi="Times New Roman" w:eastAsia="SimSun" w:cs="Times New Roman"/>
+                <w:sz w:val="20"/>
+                <w:szCs w:val="20"/>
+                <w:color w:val="000000"/>
+                <w:b w:val="0"/>
+                <w:bCs w:val="0"/>
+                <w:i w:val="0"/>
+                <w:iCs w:val="0"/>
+              </w:rPr>
+            </w:pPr>
+            <w:r>
+              <w:rPr>
+                <w:noProof/>
+                <w:rFonts w:ascii="Times New Roman" w:hAnsi="Times New Roman" w:eastAsia="SimSun" w:cs="Times New Roman"/>
+                <w:sz w:val="20"/>
+                <w:szCs w:val="20"/>
+                <w:color w:val="000000"/>
+                <w:b w:val="0"/>
+                <w:bCs w:val="0"/>
+                <w:i w:val="0"/>
+                <w:iCs w:val="0"/>
+              </w:rPr>
+              <w:drawing>
+                <wp:inline distT="0" distB="0" distL="0" distR="0" ns4:anchorId="7382684C" ns4:editId="65D58A3B">
+                  <wp:extent cx="2590800" cy="3463491"/>
+                  <wp:effectExtent l="0" t="0" r="0" b="0"/>
+                  <wp:docPr id="1008" name="Fig. 6" descr="底盘姿态控制器闭环方框图"/>
+                  <wp:cNvGraphicFramePr>
+                    <ns5:graphicFrameLocks noChangeAspect="1"/>
+                  </wp:cNvGraphicFramePr>
+                  <ns5:graphic>
+                    <ns5:graphicData uri="http://schemas.openxmlformats.org/drawingml/2006/picture">
+                      <ns6:pic>
+                        <ns6:nvPicPr>
+                          <ns6:cNvPr id="1008" name="Fig. 6" descr="底盘姿态控制器闭环方框图"/>
+                          <ns6:cNvPicPr>
+                            <ns5:picLocks noChangeAspect="1"/>
+                          </ns6:cNvPicPr>
+                        </ns6:nvPicPr>
+                        <ns6:blipFill>
+                          <ns5:blip ns7:embed="rIdArticle2"/>
+                          <ns5:stretch>
+                            <ns5:fillRect/>
+                          </ns5:stretch>
+                        </ns6:blipFill>
+                        <ns6:spPr>
+                          <ns5:xfrm>
+                            <ns5:off x="0" y="0"/>
+                            <ns5:ext cx="2592787" cy="3463491"/>
+                          </ns5:xfrm>
+                          <ns5:prstGeom prst="rect">
+                            <ns5:avLst/>
+                          </ns5:prstGeom>
+                        </ns6:spPr>
+                      </ns6:pic>
+                    </ns5:graphicData>
+                  </ns5:graphic>
+                </wp:inline>
+              </w:drawing>
+            </w:r>
+          </w:p>
+          <w:p ns2:paraId="4C03B63B" ns2:textId="77777777">
+            <w:pPr>
+              <w:pStyle w:val="figurecaption"/>
+              <w:snapToGrid w:val="0"/>
+              <w:widowControl/>
+              <w:numPr>
+                <w:ilvl w:val="0"/>
+                <w:numId w:val="2"/>
+              </w:numPr>
+              <w:keepLines/>
+              <w:keepNext w:val="0"/>
+              <w:rPr>
+                <w:rFonts w:ascii="Times New Roman" w:hAnsi="Times New Roman" w:eastAsia="SimSun" w:cs="Times New Roman"/>
+                <w:sz w:val="16"/>
+                <w:szCs w:val="16"/>
+                <w:color w:val="000000"/>
+                <w:b w:val="0"/>
+                <w:bCs w:val="0"/>
+                <w:i w:val="0"/>
+                <w:iCs w:val="0"/>
+              </w:rPr>
+            </w:pPr>
+            <w:r>
+              <w:rPr>
+                <w:rFonts w:ascii="Times New Roman" w:hAnsi="Times New Roman" w:eastAsia="SimSun" w:cs="Times New Roman"/>
+                <w:sz w:val="16"/>
+                <w:szCs w:val="16"/>
+                <w:color w:val="000000"/>
+                <w:b w:val="0"/>
+                <w:i w:val="0"/>
+                <w:lang w:val="en-US"/>
+              </w:rPr>
+              <w:t xml:space="preserve">Closed-loop chassis attitude control. Cascaded roll/pitch P loops and height-increment accumulation follow (17); (18) allocates both corrections to four legs. Joint-servo inner loops are combined.</w:t>
+            </w:r>
+          </w:p>
+        </w:tc>
+      </w:tr>
+    </w:tbl>
     <w:p>
       <w:pPr>
         <w:pStyle w:val="equation"/>
@@ -17708,7 +17832,6 @@
         <w:pStyle w:val="BodyText"/>
         <w:snapToGrid w:val="0"/>
         <w:widowControl/>
-        <w:keepNext w:val="0"/>
         <w:rPr>
           <w:rFonts w:ascii="Times New Roman" w:hAnsi="Times New Roman" w:eastAsia="SimSun" w:cs="Times New Roman"/>
           <w:sz w:val="20"/>
@@ -18153,7 +18276,6 @@
         <w:pStyle w:val="BodyText"/>
         <w:snapToGrid w:val="0"/>
         <w:widowControl/>
-        <w:keepNext w:val="0"/>
         <w:rPr>
           <w:rFonts w:ascii="Times New Roman" w:hAnsi="Times New Roman" w:eastAsia="SimSun" w:cs="Times New Roman"/>
           <w:sz w:val="20"/>
@@ -19337,7 +19459,6 @@
         <w:pStyle w:val="BodyText"/>
         <w:snapToGrid w:val="0"/>
         <w:widowControl/>
-        <w:keepNext w:val="0"/>
         <w:rPr>
           <w:rFonts w:ascii="Times New Roman" w:hAnsi="Times New Roman" w:eastAsia="SimSun" w:cs="Times New Roman"/>
           <w:sz w:val="20"/>
@@ -19964,6 +20085,111 @@
           <w:lang w:val="en-US"/>
         </w:rPr>
         <w:t xml:space="preserve">; inverse kinematics gives joint targets.</w:t>
+      </w:r>
+    </w:p>
+    <w:p>
+      <w:pPr>
+        <w:spacing w:before="0" w:after="0" w:line="20" w:lineRule="exact"/>
+        <w:ind w:firstLine="0"/>
+        <w:rPr>
+          <w:sz w:val="2"/>
+        </w:rPr>
+      </w:pPr>
+    </w:p>
+    <w:p ns2:paraId="4572C6A8" ns2:textId="77777777">
+      <w:pPr>
+        <w:pStyle w:val="Heading2"/>
+        <w:snapToGrid w:val="0"/>
+        <w:widowControl/>
+        <w:numPr>
+          <w:ilvl w:val="1"/>
+          <w:numId w:val="4"/>
+        </w:numPr>
+        <w:keepNext/>
+        <w:keepLines/>
+        <w:rPr>
+          <w:rFonts w:ascii="Times New Roman" w:hAnsi="Times New Roman" w:eastAsia="SimSun" w:cs="Times New Roman"/>
+          <w:sz w:val="20"/>
+          <w:szCs w:val="20"/>
+          <w:color w:val="000000"/>
+          <w:b w:val="0"/>
+          <w:bCs w:val="0"/>
+          <w:i w:val="1"/>
+          <w:iCs w:val="1"/>
+        </w:rPr>
+      </w:pPr>
+      <w:r>
+        <w:rPr>
+          <w:rFonts w:ascii="Times New Roman" w:hAnsi="Times New Roman" w:eastAsia="SimSun" w:cs="Times New Roman"/>
+          <w:sz w:val="20"/>
+          <w:szCs w:val="20"/>
+          <w:color w:val="000000"/>
+          <w:b w:val="0"/>
+          <w:i w:val="1"/>
+          <w:lang w:val="en-US"/>
+        </w:rPr>
+        <w:t xml:space="preserve">Delta Teleoperation Controller</w:t>
+      </w:r>
+    </w:p>
+    <w:p ns2:paraId="5F3BF0F9" ns2:textId="77777777">
+      <w:pPr>
+        <w:pStyle w:val="Heading3"/>
+        <w:snapToGrid w:val="0"/>
+        <w:widowControl/>
+        <w:numPr>
+          <w:ilvl w:val="2"/>
+          <w:numId w:val="4"/>
+        </w:numPr>
+        <w:keepNext w:val="0"/>
+        <w:rPr>
+          <w:rFonts w:ascii="Times New Roman" w:hAnsi="Times New Roman" w:eastAsia="SimSun" w:cs="Times New Roman"/>
+          <w:sz w:val="20"/>
+          <w:szCs w:val="20"/>
+          <w:color w:val="000000"/>
+          <w:b w:val="0"/>
+          <w:bCs w:val="0"/>
+          <w:i w:val="1"/>
+          <w:iCs w:val="1"/>
+        </w:rPr>
+        <w:keepLines w:val="0"/>
+      </w:pPr>
+      <w:r>
+        <w:rPr>
+          <w:rFonts w:ascii="Times New Roman" w:hAnsi="Times New Roman" w:eastAsia="SimSun" w:cs="Times New Roman"/>
+          <w:sz w:val="20"/>
+          <w:szCs w:val="20"/>
+          <w:color w:val="000000"/>
+          <w:b w:val="0"/>
+          <w:i w:val="1"/>
+          <w:lang w:val="en-US"/>
+        </w:rPr>
+        <w:t xml:space="preserve">Structure</w:t>
+      </w:r>
+      <w:r>
+        <w:rPr>
+          <w:rFonts w:ascii="Times New Roman" w:hAnsi="Times New Roman" w:eastAsia="SimSun" w:cs="Times New Roman"/>
+          <w:sz w:val="20"/>
+          <w:szCs w:val="20"/>
+          <w:color w:val="000000"/>
+          <w:b w:val="0"/>
+          <w:bCs w:val="0"/>
+          <w:i w:val="1"/>
+          <w:iCs w:val="1"/>
+        </w:rPr>
+        <w:t xml:space="preserve">: </w:t>
+      </w:r>
+      <w:r>
+        <w:rPr>
+          <w:rFonts w:ascii="Times New Roman" w:hAnsi="Times New Roman" w:eastAsia="SimSun" w:cs="Times New Roman"/>
+          <w:sz w:val="20"/>
+          <w:szCs w:val="20"/>
+          <w:color w:val="000000"/>
+          <w:b w:val="0"/>
+          <w:lang w:val="en-US"/>
+          <w:i w:val="0"/>
+          <w:iCs w:val="0"/>
+        </w:rPr>
+        <w:t xml:space="preserve">The master uses a three-limb Delta parallel mechanism for translation and three encoder-equipped revolute joints on the moving platform for orientation input (Fig. 7). Parallelogram passive arms keep both platforms parallel, separating position and orientation. Fig. 7 identifies the Delta mechanism, three-axis handle, and rotation axes. Handle joints j1–j3 give moving-axis roll, pitch, and yaw (RPY).</w:t>
       </w:r>
     </w:p>
     <w:tbl>
@@ -19996,7 +20222,7 @@
               <w:right w:w="0" w:type="dxa"/>
             </w:tcMar>
           </w:tcPr>
-          <w:p ns2:paraId="456B9A1A" ns2:textId="77777777">
+          <w:p ns2:paraId="697DD451" ns2:textId="77777777">
             <w:pPr>
               <w:pStyle w:val="Normal"/>
               <w:snapToGrid w:val="0"/>
@@ -20030,10 +20256,10 @@
                 <w:iCs w:val="0"/>
               </w:rPr>
               <w:drawing>
-                <wp:inline distT="0" distB="0" distL="0" distR="0" ns4:anchorId="7382684C" ns4:editId="65D58A3B">
-                  <wp:extent cx="2590800" cy="3463491"/>
-                  <wp:effectExtent l="0" t="0" r="0" b="0"/>
-                  <wp:docPr id="1008" name="Fig. 6" descr="底盘姿态控制器闭环方框图"/>
+                <wp:inline distT="0" distB="0" distL="0" distR="0" ns4:anchorId="21C8DD9B" ns4:editId="31EA403A">
+                  <wp:extent cx="3059430" cy="2039620"/>
+                  <wp:effectExtent l="0" t="0" r="7620" b="8255"/>
+                  <wp:docPr id="1009" name="Fig. 8" descr="Delta 平移机构与三轴姿态手柄的机构、转轴和平行约束示意"/>
                   <wp:cNvGraphicFramePr>
                     <ns5:graphicFrameLocks noChangeAspect="1"/>
                   </wp:cNvGraphicFramePr>
@@ -20041,13 +20267,13 @@
                     <ns5:graphicData uri="http://schemas.openxmlformats.org/drawingml/2006/picture">
                       <ns6:pic>
                         <ns6:nvPicPr>
-                          <ns6:cNvPr id="1008" name="Fig. 6" descr="底盘姿态控制器闭环方框图"/>
+                          <ns6:cNvPr id="1009" name="Fig. 8" descr="Delta 平移机构与三轴姿态手柄的机构、转轴和平行约束示意"/>
                           <ns6:cNvPicPr>
                             <ns5:picLocks noChangeAspect="1"/>
                           </ns6:cNvPicPr>
                         </ns6:nvPicPr>
                         <ns6:blipFill>
-                          <ns5:blip ns7:embed="rIdArticle2"/>
+                          <ns5:blip ns7:embed="rIdArticle18"/>
                           <ns5:stretch>
                             <ns5:fillRect/>
                           </ns5:stretch>
@@ -20055,7 +20281,7 @@
                         <ns6:spPr>
                           <ns5:xfrm>
                             <ns5:off x="0" y="0"/>
-                            <ns5:ext cx="2592787" cy="3463491"/>
+                            <ns5:ext cx="3060000" cy="2040000"/>
                           </ns5:xfrm>
                           <ns5:prstGeom prst="rect">
                             <ns5:avLst/>
@@ -20068,7 +20294,7 @@
               </w:drawing>
             </w:r>
           </w:p>
-          <w:p ns2:paraId="4C03B63B" ns2:textId="77777777">
+          <w:p ns2:paraId="1B4719FE" ns2:textId="77777777">
             <w:pPr>
               <w:pStyle w:val="figurecaption"/>
               <w:snapToGrid w:val="0"/>
@@ -20100,123 +20326,17 @@
                 <w:i w:val="0"/>
                 <w:lang w:val="en-US"/>
               </w:rPr>
-              <w:t xml:space="preserve">Closed-loop chassis attitude control. Cascaded roll/pitch P loops and height-increment accumulation follow (17); (18) allocates both corrections to four legs. Joint-servo inner loops are combined.</w:t>
+              <w:t xml:space="preserve">Teleoperation master and rotation axes. (a) Delta mechanism; highlighted parallelogram links keep the platforms parallel. (b) Three-axis handle, with joints and rotation axes shown from mount to grip.</w:t>
             </w:r>
           </w:p>
         </w:tc>
       </w:tr>
     </w:tbl>
-    <w:p>
-      <w:pPr>
-        <w:spacing w:before="0" w:after="0" w:line="20" w:lineRule="exact"/>
-        <w:ind w:firstLine="0"/>
-        <w:rPr>
-          <w:sz w:val="2"/>
-        </w:rPr>
-      </w:pPr>
-    </w:p>
-    <w:p ns2:paraId="4572C6A8" ns2:textId="77777777">
-      <w:pPr>
-        <w:pStyle w:val="Heading2"/>
-        <w:snapToGrid w:val="0"/>
-        <w:widowControl/>
-        <w:numPr>
-          <w:ilvl w:val="1"/>
-          <w:numId w:val="4"/>
-        </w:numPr>
-        <w:keepNext/>
-        <w:keepLines/>
-        <w:rPr>
-          <w:rFonts w:ascii="Times New Roman" w:hAnsi="Times New Roman" w:eastAsia="SimSun" w:cs="Times New Roman"/>
-          <w:sz w:val="20"/>
-          <w:szCs w:val="20"/>
-          <w:color w:val="000000"/>
-          <w:b w:val="0"/>
-          <w:bCs w:val="0"/>
-          <w:i w:val="1"/>
-          <w:iCs w:val="1"/>
-        </w:rPr>
-      </w:pPr>
-      <w:r>
-        <w:rPr>
-          <w:rFonts w:ascii="Times New Roman" w:hAnsi="Times New Roman" w:eastAsia="SimSun" w:cs="Times New Roman"/>
-          <w:sz w:val="20"/>
-          <w:szCs w:val="20"/>
-          <w:color w:val="000000"/>
-          <w:b w:val="0"/>
-          <w:i w:val="1"/>
-          <w:lang w:val="en-US"/>
-        </w:rPr>
-        <w:t xml:space="preserve">Delta Teleoperation Controller</w:t>
-      </w:r>
-    </w:p>
-    <w:p ns2:paraId="5F3BF0F9" ns2:textId="77777777">
-      <w:pPr>
-        <w:pStyle w:val="Heading3"/>
-        <w:snapToGrid w:val="0"/>
-        <w:widowControl/>
-        <w:numPr>
-          <w:ilvl w:val="2"/>
-          <w:numId w:val="4"/>
-        </w:numPr>
-        <w:keepNext w:val="0"/>
-        <w:rPr>
-          <w:rFonts w:ascii="Times New Roman" w:hAnsi="Times New Roman" w:eastAsia="SimSun" w:cs="Times New Roman"/>
-          <w:sz w:val="20"/>
-          <w:szCs w:val="20"/>
-          <w:color w:val="000000"/>
-          <w:b w:val="0"/>
-          <w:bCs w:val="0"/>
-          <w:i w:val="1"/>
-          <w:iCs w:val="1"/>
-        </w:rPr>
-        <w:keepLines w:val="0"/>
-      </w:pPr>
-      <w:r>
-        <w:rPr>
-          <w:rFonts w:ascii="Times New Roman" w:hAnsi="Times New Roman" w:eastAsia="SimSun" w:cs="Times New Roman"/>
-          <w:sz w:val="20"/>
-          <w:szCs w:val="20"/>
-          <w:color w:val="000000"/>
-          <w:b w:val="0"/>
-          <w:i w:val="1"/>
-          <w:lang w:val="en-US"/>
-        </w:rPr>
-        <w:t xml:space="preserve">Structure</w:t>
-      </w:r>
-      <w:r>
-        <w:rPr>
-          <w:rFonts w:ascii="Times New Roman" w:hAnsi="Times New Roman" w:eastAsia="SimSun" w:cs="Times New Roman"/>
-          <w:sz w:val="20"/>
-          <w:szCs w:val="20"/>
-          <w:color w:val="000000"/>
-          <w:b w:val="0"/>
-          <w:bCs w:val="0"/>
-          <w:i w:val="1"/>
-          <w:iCs w:val="1"/>
-        </w:rPr>
-        <w:t xml:space="preserve">: </w:t>
-      </w:r>
-      <w:r>
-        <w:rPr>
-          <w:rFonts w:ascii="Times New Roman" w:hAnsi="Times New Roman" w:eastAsia="SimSun" w:cs="Times New Roman"/>
-          <w:sz w:val="20"/>
-          <w:szCs w:val="20"/>
-          <w:color w:val="000000"/>
-          <w:b w:val="0"/>
-          <w:lang w:val="en-US"/>
-          <w:i w:val="0"/>
-          <w:iCs w:val="0"/>
-        </w:rPr>
-        <w:t xml:space="preserve">The master uses a three-limb Delta parallel mechanism for translation and three encoder-equipped revolute joints on the moving platform for orientation input (Fig. 7). Parallelogram passive arms keep both platforms parallel, separating position and orientation. Fig. 7 identifies the Delta mechanism, three-axis handle, and rotation axes. Handle joints j1–j3 give moving-axis roll, pitch, and yaw (RPY).</w:t>
-      </w:r>
-    </w:p>
     <w:p ns2:paraId="06C3F0A7" ns2:textId="77777777">
       <w:pPr>
         <w:pStyle w:val="BodyText"/>
         <w:snapToGrid w:val="0"/>
         <w:widowControl/>
-        <w:keepNext w:val="0"/>
         <w:rPr>
           <w:rFonts w:ascii="Times New Roman" w:hAnsi="Times New Roman" w:eastAsia="SimSun" w:cs="Times New Roman"/>
           <w:sz w:val="20"/>
@@ -20303,7 +20423,6 @@
         <w:pStyle w:val="BodyText"/>
         <w:snapToGrid w:val="0"/>
         <w:widowControl/>
-        <w:keepNext w:val="0"/>
         <w:rPr>
           <w:rFonts w:ascii="Times New Roman" w:hAnsi="Times New Roman" w:eastAsia="SimSun" w:cs="Times New Roman"/>
           <w:sz w:val="20"/>
@@ -22325,15 +22444,6 @@
         </w:tc>
       </w:tr>
     </w:tbl>
-    <w:p>
-      <w:pPr>
-        <w:spacing w:before="0" w:after="0" w:line="20" w:lineRule="exact"/>
-        <w:ind w:firstLine="0"/>
-        <w:rPr>
-          <w:sz w:val="2"/>
-        </w:rPr>
-      </w:pPr>
-    </w:p>
     <w:tbl>
       <w:tblPr>
         <w:tblW w:w="5033" w:type="dxa"/>
@@ -22364,7 +22474,7 @@
               <w:right w:w="0" w:type="dxa"/>
             </w:tcMar>
           </w:tcPr>
-          <w:p ns2:paraId="697DD451" ns2:textId="77777777">
+          <w:p ns2:paraId="19043F30" ns2:textId="77777777">
             <w:pPr>
               <w:pStyle w:val="Normal"/>
               <w:snapToGrid w:val="0"/>
@@ -22398,10 +22508,10 @@
                 <w:iCs w:val="0"/>
               </w:rPr>
               <w:drawing>
-                <wp:inline distT="0" distB="0" distL="0" distR="0" ns4:anchorId="21C8DD9B" ns4:editId="31EA403A">
-                  <wp:extent cx="3059430" cy="2039620"/>
-                  <wp:effectExtent l="0" t="0" r="7620" b="8255"/>
-                  <wp:docPr id="1009" name="Fig. 8" descr="Delta 平移机构与三轴姿态手柄的机构、转轴和平行约束示意"/>
+                <wp:inline distT="0" distB="0" distL="0" distR="0" ns4:anchorId="02AEBE66" ns4:editId="04CB13EB">
+                  <wp:extent cx="3059430" cy="2045970"/>
+                  <wp:effectExtent l="0" t="0" r="0" b="0"/>
+                  <wp:docPr id="1010" name="Fig. 9" descr="Delta 三支链及单支链几何模型，基座原点位于静平台中心"/>
                   <wp:cNvGraphicFramePr>
                     <ns5:graphicFrameLocks noChangeAspect="1"/>
                   </wp:cNvGraphicFramePr>
@@ -22409,13 +22519,13 @@
                     <ns5:graphicData uri="http://schemas.openxmlformats.org/drawingml/2006/picture">
                       <ns6:pic>
                         <ns6:nvPicPr>
-                          <ns6:cNvPr id="1009" name="Fig. 8" descr="Delta 平移机构与三轴姿态手柄的机构、转轴和平行约束示意"/>
+                          <ns6:cNvPr id="1010" name="Fig. 9" descr="Delta 三支链及单支链几何模型，基座原点位于静平台中心"/>
                           <ns6:cNvPicPr>
                             <ns5:picLocks noChangeAspect="1"/>
                           </ns6:cNvPicPr>
                         </ns6:nvPicPr>
                         <ns6:blipFill>
-                          <ns5:blip ns7:embed="rIdArticle18"/>
+                          <ns5:blip ns7:embed="rIdArticle13"/>
                           <ns5:stretch>
                             <ns5:fillRect/>
                           </ns5:stretch>
@@ -22423,7 +22533,7 @@
                         <ns6:spPr>
                           <ns5:xfrm>
                             <ns5:off x="0" y="0"/>
-                            <ns5:ext cx="3060000" cy="2040000"/>
+                            <ns5:ext cx="3060000" cy="2046375"/>
                           </ns5:xfrm>
                           <ns5:prstGeom prst="rect">
                             <ns5:avLst/>
@@ -22436,7 +22546,7 @@
               </w:drawing>
             </w:r>
           </w:p>
-          <w:p ns2:paraId="1B4719FE" ns2:textId="77777777">
+          <w:p ns2:paraId="52F8C4D7" ns2:textId="77777777">
             <w:pPr>
               <w:pStyle w:val="figurecaption"/>
               <w:snapToGrid w:val="0"/>
@@ -22468,12 +22578,21 @@
                 <w:i w:val="0"/>
                 <w:lang w:val="en-US"/>
               </w:rPr>
-              <w:t xml:space="preserve">Teleoperation master and rotation axes. (a) Delta mechanism; highlighted parallelogram links keep the platforms parallel. (b) Three-axis handle, with joints and rotation axes shown from mount to grip.</w:t>
+              <w:t xml:space="preserve">Delta geometry. (a) Three limbs and right-handed frame {D}: O is the fixed-platform center, +x points normally from moving to fixed platform, +z toward A1, and P marks the moving-platform center. Parallelogram links keep platforms parallel. (b) Symmetric limb section with radii, lengths, active-arm angle, and equivalent sphere center.</w:t>
             </w:r>
           </w:p>
         </w:tc>
       </w:tr>
     </w:tbl>
+    <w:p>
+      <w:pPr>
+        <w:spacing w:before="0" w:after="0" w:line="20" w:lineRule="exact"/>
+        <w:ind w:firstLine="0"/>
+        <w:rPr>
+          <w:sz w:val="2"/>
+        </w:rPr>
+      </w:pPr>
+    </w:p>
     <w:p>
       <w:pPr>
         <w:spacing w:before="0" w:after="0" w:line="20" w:lineRule="exact"/>
@@ -25697,7 +25816,6 @@
           <w:szCs w:val="20"/>
           <w:color w:val="000000"/>
         </w:rPr>
-        <w:keepNext/>
       </w:pPr>
       <w:r>
         <w:rPr>
@@ -26291,146 +26409,6 @@
         <w:t>.</w:t>
       </w:r>
     </w:p>
-    <w:tbl>
-      <w:tblPr>
-        <w:tblW w:w="5033" w:type="dxa"/>
-        <w:tblLayout w:type="fixed"/>
-        <w:tblBorders>
-          <w:top w:val="nil"/>
-          <w:bottom w:val="nil"/>
-          <w:left w:val="nil"/>
-          <w:right w:val="nil"/>
-          <w:insideH w:val="nil"/>
-          <w:insideV w:val="nil"/>
-        </w:tblBorders>
-      </w:tblPr>
-      <w:tblGrid>
-        <w:gridCol w:w="5033"/>
-      </w:tblGrid>
-      <w:tr>
-        <w:trPr>
-          <w:cantSplit/>
-        </w:trPr>
-        <w:tc>
-          <w:tcPr>
-            <w:tcW w:w="5033" w:type="dxa"/>
-            <w:tcMar>
-              <w:top w:w="0" w:type="dxa"/>
-              <w:bottom w:w="0" w:type="dxa"/>
-              <w:left w:w="0" w:type="dxa"/>
-              <w:right w:w="0" w:type="dxa"/>
-            </w:tcMar>
-          </w:tcPr>
-          <w:p ns2:paraId="19043F30" ns2:textId="77777777">
-            <w:pPr>
-              <w:pStyle w:val="Normal"/>
-              <w:snapToGrid w:val="0"/>
-              <w:widowControl/>
-              <w:keepNext/>
-              <w:keepLines/>
-              <w:spacing w:before="0" w:after="0" w:line="240" w:lineRule="auto"/>
-              <w:ind w:firstLine="0"/>
-              <w:jc w:val="center"/>
-              <w:rPr>
-                <w:rFonts w:ascii="Times New Roman" w:hAnsi="Times New Roman" w:eastAsia="SimSun" w:cs="Times New Roman"/>
-                <w:sz w:val="20"/>
-                <w:szCs w:val="20"/>
-                <w:color w:val="000000"/>
-                <w:b w:val="0"/>
-                <w:bCs w:val="0"/>
-                <w:i w:val="0"/>
-                <w:iCs w:val="0"/>
-              </w:rPr>
-            </w:pPr>
-            <w:r>
-              <w:rPr>
-                <w:noProof/>
-                <w:rFonts w:ascii="Times New Roman" w:hAnsi="Times New Roman" w:eastAsia="SimSun" w:cs="Times New Roman"/>
-                <w:sz w:val="20"/>
-                <w:szCs w:val="20"/>
-                <w:color w:val="000000"/>
-                <w:b w:val="0"/>
-                <w:bCs w:val="0"/>
-                <w:i w:val="0"/>
-                <w:iCs w:val="0"/>
-              </w:rPr>
-              <w:drawing>
-                <wp:inline distT="0" distB="0" distL="0" distR="0" ns4:anchorId="02AEBE66" ns4:editId="04CB13EB">
-                  <wp:extent cx="3059430" cy="2045970"/>
-                  <wp:effectExtent l="0" t="0" r="0" b="0"/>
-                  <wp:docPr id="1010" name="Fig. 9" descr="Delta 三支链及单支链几何模型，基座原点位于静平台中心"/>
-                  <wp:cNvGraphicFramePr>
-                    <ns5:graphicFrameLocks noChangeAspect="1"/>
-                  </wp:cNvGraphicFramePr>
-                  <ns5:graphic>
-                    <ns5:graphicData uri="http://schemas.openxmlformats.org/drawingml/2006/picture">
-                      <ns6:pic>
-                        <ns6:nvPicPr>
-                          <ns6:cNvPr id="1010" name="Fig. 9" descr="Delta 三支链及单支链几何模型，基座原点位于静平台中心"/>
-                          <ns6:cNvPicPr>
-                            <ns5:picLocks noChangeAspect="1"/>
-                          </ns6:cNvPicPr>
-                        </ns6:nvPicPr>
-                        <ns6:blipFill>
-                          <ns5:blip ns7:embed="rIdArticle13"/>
-                          <ns5:stretch>
-                            <ns5:fillRect/>
-                          </ns5:stretch>
-                        </ns6:blipFill>
-                        <ns6:spPr>
-                          <ns5:xfrm>
-                            <ns5:off x="0" y="0"/>
-                            <ns5:ext cx="3060000" cy="2046375"/>
-                          </ns5:xfrm>
-                          <ns5:prstGeom prst="rect">
-                            <ns5:avLst/>
-                          </ns5:prstGeom>
-                        </ns6:spPr>
-                      </ns6:pic>
-                    </ns5:graphicData>
-                  </ns5:graphic>
-                </wp:inline>
-              </w:drawing>
-            </w:r>
-          </w:p>
-          <w:p ns2:paraId="52F8C4D7" ns2:textId="77777777">
-            <w:pPr>
-              <w:pStyle w:val="figurecaption"/>
-              <w:snapToGrid w:val="0"/>
-              <w:widowControl/>
-              <w:numPr>
-                <w:ilvl w:val="0"/>
-                <w:numId w:val="2"/>
-              </w:numPr>
-              <w:keepLines/>
-              <w:keepNext w:val="0"/>
-              <w:rPr>
-                <w:rFonts w:ascii="Times New Roman" w:hAnsi="Times New Roman" w:eastAsia="SimSun" w:cs="Times New Roman"/>
-                <w:sz w:val="16"/>
-                <w:szCs w:val="16"/>
-                <w:color w:val="000000"/>
-                <w:b w:val="0"/>
-                <w:bCs w:val="0"/>
-                <w:i w:val="0"/>
-                <w:iCs w:val="0"/>
-              </w:rPr>
-            </w:pPr>
-            <w:r>
-              <w:rPr>
-                <w:rFonts w:ascii="Times New Roman" w:hAnsi="Times New Roman" w:eastAsia="SimSun" w:cs="Times New Roman"/>
-                <w:sz w:val="16"/>
-                <w:szCs w:val="16"/>
-                <w:color w:val="000000"/>
-                <w:b w:val="0"/>
-                <w:i w:val="0"/>
-                <w:lang w:val="en-US"/>
-              </w:rPr>
-              <w:t xml:space="preserve">Delta geometry. (a) Three limbs and right-handed frame {D}: O is the fixed-platform center, +x points normally from moving to fixed platform, +z toward A1, and P marks the moving-platform center. Parallelogram links keep platforms parallel. (b) Symmetric limb section with radii, lengths, active-arm angle, and equivalent sphere center.</w:t>
-            </w:r>
-          </w:p>
-        </w:tc>
-      </w:tr>
-    </w:tbl>
     <w:p>
       <w:pPr>
         <w:spacing w:before="0" w:after="0" w:line="20" w:lineRule="exact"/>
@@ -27711,7 +27689,6 @@
         <w:pStyle w:val="BodyText"/>
         <w:snapToGrid w:val="0"/>
         <w:widowControl/>
-        <w:keepNext w:val="0"/>
         <w:rPr>
           <w:rFonts w:ascii="Times New Roman" w:hAnsi="Times New Roman" w:eastAsia="SimSun" w:cs="Times New Roman"/>
           <w:sz w:val="20"/>
@@ -28828,7 +28805,6 @@
         <w:pStyle w:val="BodyText"/>
         <w:snapToGrid w:val="0"/>
         <w:widowControl/>
-        <w:keepNext w:val="0"/>
         <w:rPr>
           <w:rFonts w:ascii="Times New Roman" w:hAnsi="Times New Roman" w:eastAsia="SimSun" w:cs="Times New Roman"/>
           <w:sz w:val="20"/>
@@ -29711,7 +29687,6 @@
         <w:pStyle w:val="BodyText"/>
         <w:snapToGrid w:val="0"/>
         <w:widowControl/>
-        <w:keepNext w:val="0"/>
         <w:rPr>
           <w:rFonts w:ascii="Times New Roman" w:hAnsi="Times New Roman" w:eastAsia="SimSun" w:cs="Times New Roman"/>
           <w:sz w:val="20"/>
@@ -30668,7 +30643,6 @@
         <w:pStyle w:val="BodyText"/>
         <w:snapToGrid w:val="0"/>
         <w:widowControl/>
-        <w:keepNext w:val="0"/>
         <w:rPr>
           <w:rFonts w:ascii="Times New Roman" w:hAnsi="Times New Roman" w:eastAsia="SimSun" w:cs="Times New Roman"/>
           <w:sz w:val="20"/>
@@ -30729,7 +30703,6 @@
         <w:pStyle w:val="BodyText"/>
         <w:snapToGrid w:val="0"/>
         <w:widowControl/>
-        <w:keepNext w:val="0"/>
         <w:rPr>
           <w:rFonts w:ascii="Times New Roman" w:hAnsi="Times New Roman" w:eastAsia="SimSun" w:cs="Times New Roman"/>
           <w:sz w:val="20"/>
@@ -31301,7 +31274,6 @@
         <w:pStyle w:val="BodyText"/>
         <w:snapToGrid w:val="0"/>
         <w:widowControl/>
-        <w:keepNext w:val="0"/>
         <w:rPr>
           <w:rFonts w:ascii="Times New Roman" w:hAnsi="Times New Roman" w:eastAsia="SimSun" w:cs="Times New Roman"/>
           <w:sz w:val="20"/>
@@ -31950,7 +31922,6 @@
         <w:pStyle w:val="BodyText"/>
         <w:snapToGrid w:val="0"/>
         <w:widowControl/>
-        <w:keepNext w:val="0"/>
         <w:rPr>
           <w:rFonts w:ascii="Times New Roman" w:hAnsi="Times New Roman" w:eastAsia="SimSun" w:cs="Times New Roman"/>
           <w:sz w:val="20"/>
@@ -31976,7 +31947,6 @@
         <w:pStyle w:val="BodyText"/>
         <w:snapToGrid w:val="0"/>
         <w:widowControl/>
-        <w:keepNext w:val="0"/>
         <w:rPr>
           <w:rFonts w:ascii="Times New Roman" w:hAnsi="Times New Roman" w:eastAsia="SimSun" w:cs="Times New Roman"/>
           <w:sz w:val="20"/>
@@ -32039,7 +32009,6 @@
           <w:numId w:val="8"/>
         </w:numPr>
         <w:keepLines/>
-        <w:keepNext w:val="0"/>
         <w:ind w:left="360" w:hanging="360"/>
         <w:rPr>
           <w:rFonts w:ascii="Times New Roman" w:hAnsi="Times New Roman" w:eastAsia="SimSun" w:cs="Times New Roman"/>
@@ -32160,7 +32129,6 @@
           <w:numId w:val="8"/>
         </w:numPr>
         <w:keepLines/>
-        <w:keepNext w:val="0"/>
         <w:ind w:left="360" w:hanging="360"/>
         <w:rPr>
           <w:rFonts w:ascii="Times New Roman" w:hAnsi="Times New Roman" w:eastAsia="SimSun" w:cs="Times New Roman"/>
@@ -32253,7 +32221,6 @@
           <w:numId w:val="8"/>
         </w:numPr>
         <w:keepLines/>
-        <w:keepNext w:val="0"/>
         <w:ind w:left="360" w:hanging="360"/>
         <w:rPr>
           <w:rFonts w:ascii="Times New Roman" w:hAnsi="Times New Roman" w:eastAsia="SimSun" w:cs="Times New Roman"/>
@@ -32346,7 +32313,6 @@
           <w:numId w:val="8"/>
         </w:numPr>
         <w:keepLines/>
-        <w:keepNext w:val="0"/>
         <w:ind w:left="360" w:hanging="360"/>
         <w:rPr>
           <w:rFonts w:ascii="Times New Roman" w:hAnsi="Times New Roman" w:eastAsia="SimSun" w:cs="Times New Roman"/>
@@ -32411,7 +32377,6 @@
           <w:numId w:val="8"/>
         </w:numPr>
         <w:keepLines/>
-        <w:keepNext w:val="0"/>
         <w:ind w:left="360" w:hanging="360"/>
         <w:rPr>
           <w:rFonts w:ascii="Times New Roman" w:hAnsi="Times New Roman" w:eastAsia="SimSun" w:cs="Times New Roman"/>
@@ -32476,7 +32441,6 @@
           <w:numId w:val="8"/>
         </w:numPr>
         <w:keepLines/>
-        <w:keepNext w:val="0"/>
         <w:ind w:left="360" w:hanging="360"/>
         <w:rPr>
           <w:rFonts w:ascii="Times New Roman" w:hAnsi="Times New Roman" w:eastAsia="SimSun" w:cs="Times New Roman"/>
@@ -32513,7 +32477,6 @@
           <w:numId w:val="8"/>
         </w:numPr>
         <w:keepLines/>
-        <w:keepNext w:val="0"/>
         <w:ind w:left="360" w:hanging="360"/>
         <w:rPr>
           <w:rFonts w:ascii="Times New Roman" w:hAnsi="Times New Roman" w:eastAsia="SimSun" w:cs="Times New Roman"/>
@@ -32578,7 +32541,6 @@
           <w:numId w:val="8"/>
         </w:numPr>
         <w:keepLines/>
-        <w:keepNext w:val="0"/>
         <w:ind w:left="360" w:hanging="360"/>
         <w:rPr>
           <w:rFonts w:ascii="Times New Roman" w:hAnsi="Times New Roman" w:eastAsia="SimSun" w:cs="Times New Roman"/>
@@ -32671,7 +32633,6 @@
           <w:numId w:val="8"/>
         </w:numPr>
         <w:keepLines/>
-        <w:keepNext w:val="0"/>
         <w:ind w:left="360" w:hanging="360"/>
         <w:rPr>
           <w:rFonts w:ascii="Times New Roman" w:hAnsi="Times New Roman" w:eastAsia="SimSun" w:cs="Times New Roman"/>

</xml_diff>

<commit_message>
Revert "Improve article pagination and figure placement"
This reverts commit e15f0ca3b5be6cc12358c4d9f1d55337a3e31a39.
</commit_message>
<xml_diff>
--- a/Article5_English_IEEE_Letter_Compact.docx
+++ b/Article5_English_IEEE_Letter_Compact.docx
@@ -684,6 +684,7 @@
         <w:pStyle w:val="BodyText"/>
         <w:snapToGrid w:val="0"/>
         <w:widowControl/>
+        <w:keepNext w:val="0"/>
         <w:rPr>
           <w:rFonts w:ascii="Times New Roman" w:hAnsi="Times New Roman" w:eastAsia="SimSun" w:cs="Times New Roman"/>
           <w:sz w:val="20"/>
@@ -709,6 +710,7 @@
         <w:pStyle w:val="BodyText"/>
         <w:snapToGrid w:val="0"/>
         <w:widowControl/>
+        <w:keepNext w:val="0"/>
         <w:rPr>
           <w:rFonts w:ascii="Times New Roman" w:hAnsi="Times New Roman" w:eastAsia="SimSun" w:cs="Times New Roman"/>
           <w:sz w:val="20"/>
@@ -734,6 +736,7 @@
         <w:pStyle w:val="BodyText"/>
         <w:snapToGrid w:val="0"/>
         <w:widowControl/>
+        <w:keepNext w:val="0"/>
         <w:rPr>
           <w:rFonts w:ascii="Times New Roman" w:hAnsi="Times New Roman" w:eastAsia="SimSun" w:cs="Times New Roman"/>
           <w:sz w:val="20"/>
@@ -823,40 +826,6 @@
           <w:lang w:val="en-US"/>
         </w:rPr>
         <w:t xml:space="preserve">System Architecture and Notation</w:t>
-      </w:r>
-    </w:p>
-    <w:p>
-      <w:pPr>
-        <w:spacing w:before="0" w:after="0" w:line="20" w:lineRule="exact"/>
-        <w:ind w:firstLine="0"/>
-        <w:rPr>
-          <w:sz w:val="2"/>
-        </w:rPr>
-      </w:pPr>
-    </w:p>
-    <w:p ns2:paraId="5167A082" ns2:textId="77777777">
-      <w:pPr>
-        <w:pStyle w:val="BodyText"/>
-        <w:snapToGrid w:val="0"/>
-        <w:widowControl/>
-        <w:rPr>
-          <w:rFonts w:ascii="Times New Roman" w:hAnsi="Times New Roman" w:eastAsia="SimSun" w:cs="Times New Roman"/>
-          <w:sz w:val="20"/>
-          <w:szCs w:val="20"/>
-          <w:color w:val="000000"/>
-        </w:rPr>
-      </w:pPr>
-      <w:r>
-        <w:rPr>
-          <w:rFonts w:ascii="Times New Roman" w:hAnsi="Times New Roman" w:eastAsia="SimSun" w:cs="Times New Roman"/>
-          <w:sz w:val="20"/>
-          <w:szCs w:val="20"/>
-          <w:color w:val="000000"/>
-          <w:b w:val="0"/>
-          <w:i w:val="0"/>
-          <w:lang w:val="en-US"/>
-        </w:rPr>
-        <w:t xml:space="preserve">Figure 1 shows the chassis, arm, Delta master, and principal coordinate frames. The robot has a 12-degree-of-freedom chassis, a six-revolute-joint arm, and a one-degree-of-freedom gripper (19 active degrees of freedom total); the master provides three translational and three orientation-input degrees of freedom.</w:t>
       </w:r>
     </w:p>
     <w:tbl>
@@ -1223,11 +1192,47 @@
         </w:tc>
       </w:tr>
     </w:tbl>
+    <w:p>
+      <w:pPr>
+        <w:spacing w:before="0" w:after="0" w:line="20" w:lineRule="exact"/>
+        <w:ind w:firstLine="0"/>
+        <w:rPr>
+          <w:sz w:val="2"/>
+        </w:rPr>
+      </w:pPr>
+    </w:p>
+    <w:p ns2:paraId="5167A082" ns2:textId="77777777">
+      <w:pPr>
+        <w:pStyle w:val="BodyText"/>
+        <w:snapToGrid w:val="0"/>
+        <w:widowControl/>
+        <w:keepNext w:val="0"/>
+        <w:rPr>
+          <w:rFonts w:ascii="Times New Roman" w:hAnsi="Times New Roman" w:eastAsia="SimSun" w:cs="Times New Roman"/>
+          <w:sz w:val="20"/>
+          <w:szCs w:val="20"/>
+          <w:color w:val="000000"/>
+        </w:rPr>
+      </w:pPr>
+      <w:r>
+        <w:rPr>
+          <w:rFonts w:ascii="Times New Roman" w:hAnsi="Times New Roman" w:eastAsia="SimSun" w:cs="Times New Roman"/>
+          <w:sz w:val="20"/>
+          <w:szCs w:val="20"/>
+          <w:color w:val="000000"/>
+          <w:b w:val="0"/>
+          <w:i w:val="0"/>
+          <w:lang w:val="en-US"/>
+        </w:rPr>
+        <w:t xml:space="preserve">Figure 1 shows the chassis, arm, Delta master, and principal coordinate frames. The robot has a 12-degree-of-freedom chassis, a six-revolute-joint arm, and a one-degree-of-freedom gripper (19 active degrees of freedom total); the master provides three translational and three orientation-input degrees of freedom.</w:t>
+      </w:r>
+    </w:p>
     <w:p ns2:paraId="642FC0A6" ns2:textId="77777777">
       <w:pPr>
         <w:pStyle w:val="BodyText"/>
         <w:snapToGrid w:val="0"/>
         <w:widowControl/>
+        <w:keepNext w:val="0"/>
         <w:rPr>
           <w:rFonts w:ascii="Times New Roman" w:hAnsi="Times New Roman" w:eastAsia="SimSun" w:cs="Times New Roman"/>
           <w:sz w:val="20"/>
@@ -1253,6 +1258,7 @@
         <w:pStyle w:val="BodyText"/>
         <w:snapToGrid w:val="0"/>
         <w:widowControl/>
+        <w:keepNext w:val="0"/>
         <w:rPr>
           <w:rFonts w:ascii="Times New Roman" w:hAnsi="Times New Roman" w:eastAsia="SimSun" w:cs="Times New Roman"/>
           <w:sz w:val="20"/>
@@ -1430,6 +1436,7 @@
         <w:pStyle w:val="BodyText"/>
         <w:snapToGrid w:val="0"/>
         <w:widowControl/>
+        <w:keepNext w:val="0"/>
         <w:rPr>
           <w:rFonts w:ascii="Times New Roman" w:hAnsi="Times New Roman" w:eastAsia="SimSun" w:cs="Times New Roman"/>
           <w:sz w:val="20"/>
@@ -2048,6 +2055,7 @@
         <w:pStyle w:val="BodyText"/>
         <w:snapToGrid w:val="0"/>
         <w:widowControl/>
+        <w:keepNext w:val="0"/>
         <w:rPr>
           <w:rFonts w:ascii="Times New Roman" w:hAnsi="Times New Roman" w:eastAsia="SimSun" w:cs="Times New Roman"/>
           <w:sz w:val="20"/>
@@ -2363,6 +2371,7 @@
         <w:pStyle w:val="BodyText"/>
         <w:snapToGrid w:val="0"/>
         <w:widowControl/>
+        <w:keepNext w:val="0"/>
         <w:rPr>
           <w:rFonts w:ascii="Times New Roman" w:hAnsi="Times New Roman" w:eastAsia="SimSun" w:cs="Times New Roman"/>
           <w:sz w:val="20"/>
@@ -2484,6 +2493,7 @@
         <w:pStyle w:val="BodyText"/>
         <w:snapToGrid w:val="0"/>
         <w:widowControl/>
+        <w:keepNext w:val="0"/>
         <w:rPr>
           <w:rFonts w:ascii="Times New Roman" w:hAnsi="Times New Roman" w:eastAsia="SimSun" w:cs="Times New Roman"/>
           <w:sz w:val="20"/>
@@ -6921,6 +6931,7 @@
         <w:pStyle w:val="BodyText"/>
         <w:snapToGrid w:val="0"/>
         <w:widowControl/>
+        <w:keepNext w:val="0"/>
         <w:rPr>
           <w:rFonts w:ascii="Times New Roman" w:hAnsi="Times New Roman" w:eastAsia="SimSun" w:cs="Times New Roman"/>
           <w:sz w:val="20"/>
@@ -10154,6 +10165,7 @@
         <w:pStyle w:val="BodyText"/>
         <w:snapToGrid w:val="0"/>
         <w:widowControl/>
+        <w:keepNext w:val="0"/>
         <w:rPr>
           <w:rFonts w:ascii="Times New Roman" w:hAnsi="Times New Roman" w:eastAsia="SimSun" w:cs="Times New Roman"/>
           <w:sz w:val="20"/>
@@ -11537,6 +11549,7 @@
         <w:pStyle w:val="BodyText"/>
         <w:snapToGrid w:val="0"/>
         <w:widowControl/>
+        <w:keepNext w:val="0"/>
         <w:rPr>
           <w:rFonts w:ascii="Times New Roman" w:hAnsi="Times New Roman" w:eastAsia="SimSun" w:cs="Times New Roman"/>
           <w:sz w:val="20"/>
@@ -12135,6 +12148,7 @@
           <w:szCs w:val="20"/>
           <w:color w:val="000000"/>
         </w:rPr>
+        <w:keepNext/>
       </w:pPr>
       <w:r>
         <w:rPr>
@@ -13182,6 +13196,7 @@
         <w:pStyle w:val="BodyText"/>
         <w:snapToGrid w:val="0"/>
         <w:widowControl/>
+        <w:keepNext w:val="0"/>
         <w:rPr>
           <w:rFonts w:ascii="Times New Roman" w:hAnsi="Times New Roman" w:eastAsia="SimSun" w:cs="Times New Roman"/>
           <w:sz w:val="20"/>
@@ -13470,231 +13485,6 @@
           <w:lang w:val="en-US"/>
         </w:rPr>
         <w:t xml:space="preserve"> is leg-motor output torque.</w:t>
-      </w:r>
-    </w:p>
-    <w:p>
-      <w:pPr>
-        <w:spacing w:before="0" w:after="0" w:line="20" w:lineRule="exact"/>
-        <w:ind w:firstLine="0"/>
-        <w:rPr>
-          <w:sz w:val="2"/>
-        </w:rPr>
-      </w:pPr>
-    </w:p>
-    <w:p ns2:paraId="54E60B31" ns2:textId="77777777">
-      <w:pPr>
-        <w:pStyle w:val="Heading3"/>
-        <w:snapToGrid w:val="0"/>
-        <w:widowControl/>
-        <w:numPr>
-          <w:ilvl w:val="2"/>
-          <w:numId w:val="4"/>
-        </w:numPr>
-        <w:keepNext w:val="0"/>
-        <w:rPr>
-          <w:rFonts w:ascii="Times New Roman" w:hAnsi="Times New Roman" w:eastAsia="SimSun" w:cs="Times New Roman"/>
-          <w:sz w:val="20"/>
-          <w:szCs w:val="20"/>
-          <w:color w:val="000000"/>
-          <w:b w:val="0"/>
-          <w:bCs w:val="0"/>
-          <w:i w:val="1"/>
-          <w:iCs w:val="1"/>
-        </w:rPr>
-        <w:keepLines w:val="0"/>
-      </w:pPr>
-      <w:r>
-        <w:rPr>
-          <w:rFonts w:ascii="Times New Roman" w:hAnsi="Times New Roman" w:eastAsia="SimSun" w:cs="Times New Roman"/>
-          <w:sz w:val="20"/>
-          <w:szCs w:val="20"/>
-          <w:color w:val="000000"/>
-          <w:b w:val="0"/>
-          <w:i w:val="1"/>
-          <w:lang w:val="en-US"/>
-        </w:rPr>
-        <w:t xml:space="preserve">Whole-Body Single-Rigid-Body Dynamics</w:t>
-      </w:r>
-      <w:r>
-        <w:rPr>
-          <w:rFonts w:ascii="Times New Roman" w:hAnsi="Times New Roman" w:eastAsia="SimSun" w:cs="Times New Roman"/>
-          <w:sz w:val="20"/>
-          <w:szCs w:val="20"/>
-          <w:color w:val="000000"/>
-          <w:b w:val="0"/>
-          <w:bCs w:val="0"/>
-          <w:i w:val="1"/>
-          <w:iCs w:val="1"/>
-        </w:rPr>
-        <w:t xml:space="preserve">: </w:t>
-      </w:r>
-      <w:r>
-        <w:rPr>
-          <w:rFonts w:ascii="Times New Roman" w:hAnsi="Times New Roman" w:eastAsia="SimSun" w:cs="Times New Roman"/>
-          <w:sz w:val="20"/>
-          <w:szCs w:val="20"/>
-          <w:color w:val="000000"/>
-          <w:b w:val="0"/>
-          <w:lang w:val="en-US"/>
-          <w:i w:val="0"/>
-          <w:iCs w:val="0"/>
-        </w:rPr>
-        <w:t xml:space="preserve">Fig. 5 shows the whole-body center of mass and contact forces on the three-dimensional chassis configuration. During rapid chassis motion, the arm is usually stationary relative to the chassis. Both can then be approximated as one rigid body with equivalent mass and inertia. Let </w:t>
-      </w:r>
-      <ns8:oMath>
-        <ns8:r>
-          <ns8:rPr>
-            <ns8:sty ns8:val="p"/>
-          </ns8:rPr>
-          <w:rPr>
-            <w:rFonts w:ascii="Times New Roman" w:hAnsi="Times New Roman" w:eastAsia="SimSun" w:cs="Times New Roman"/>
-            <w:sz w:val="20"/>
-            <w:szCs w:val="20"/>
-            <w:color w:val="000000"/>
-          </w:rPr>
-          <ns8:t>m</ns8:t>
-        </ns8:r>
-      </ns8:oMath>
-      <w:r>
-        <w:rPr>
-          <w:rFonts w:ascii="Times New Roman" w:hAnsi="Times New Roman" w:eastAsia="SimSun" w:cs="Times New Roman"/>
-          <w:sz w:val="20"/>
-          <w:szCs w:val="20"/>
-          <w:color w:val="000000"/>
-          <w:b w:val="0"/>
-          <w:lang w:val="en-US"/>
-          <w:i w:val="0"/>
-          <w:iCs w:val="0"/>
-        </w:rPr>
-        <w:t xml:space="preserve"> be total mass, </w:t>
-      </w:r>
-      <ns8:oMath>
-        <ns8:sSub>
-          <ns8:sSubPr>
-            <ns8:ctrlPr>
-              <w:rPr>
-                <w:rFonts w:ascii="Cambria Math" w:hAnsi="Cambria Math" w:hint="eastAsia"/>
-              </w:rPr>
-            </ns8:ctrlPr>
-          </ns8:sSubPr>
-          <ns8:e>
-            <ns8:r>
-              <ns8:rPr>
-                <ns8:sty ns8:val="p"/>
-              </ns8:rPr>
-              <w:rPr>
-                <w:rFonts w:ascii="Times New Roman" w:hAnsi="Times New Roman" w:eastAsia="SimSun" w:cs="Times New Roman"/>
-                <w:sz w:val="20"/>
-                <w:szCs w:val="20"/>
-                <w:color w:val="000000"/>
-              </w:rPr>
-              <ns8:t>a</ns8:t>
-            </ns8:r>
-          </ns8:e>
-          <ns8:sub>
-            <ns8:r>
-              <ns8:rPr>
-                <ns8:sty ns8:val="p"/>
-              </ns8:rPr>
-              <w:rPr>
-                <w:rFonts w:ascii="Times New Roman" w:hAnsi="Times New Roman" w:eastAsia="SimSun" w:cs="Times New Roman"/>
-                <w:sz w:val="20"/>
-                <w:szCs w:val="20"/>
-                <w:color w:val="000000"/>
-              </w:rPr>
-              <ns8:t>G</ns8:t>
-            </ns8:r>
-          </ns8:sub>
-        </ns8:sSub>
-      </ns8:oMath>
-      <w:r>
-        <w:rPr>
-          <w:rFonts w:ascii="Times New Roman" w:hAnsi="Times New Roman" w:eastAsia="SimSun" w:cs="Times New Roman"/>
-          <w:sz w:val="20"/>
-          <w:szCs w:val="20"/>
-          <w:color w:val="000000"/>
-          <w:b w:val="0"/>
-          <w:lang w:val="en-US"/>
-          <w:i w:val="0"/>
-          <w:iCs w:val="0"/>
-        </w:rPr>
-        <w:t xml:space="preserve"> center-of-mass acceleration, and </w:t>
-      </w:r>
-      <ns8:oMath>
-        <ns8:sSub>
-          <ns8:sSubPr>
-            <ns8:ctrlPr>
-              <w:rPr>
-                <w:rFonts w:ascii="Cambria Math" w:hAnsi="Cambria Math" w:hint="eastAsia"/>
-              </w:rPr>
-            </ns8:ctrlPr>
-          </ns8:sSubPr>
-          <ns8:e>
-            <ns8:r>
-              <ns8:rPr>
-                <ns8:sty ns8:val="p"/>
-              </ns8:rPr>
-              <w:rPr>
-                <w:rFonts w:ascii="Times New Roman" w:hAnsi="Times New Roman" w:eastAsia="SimSun" w:cs="Times New Roman"/>
-                <w:sz w:val="20"/>
-                <w:szCs w:val="20"/>
-                <w:color w:val="000000"/>
-              </w:rPr>
-              <ns8:t>r</ns8:t>
-            </ns8:r>
-          </ns8:e>
-          <ns8:sub>
-            <ns8:r>
-              <ns8:rPr>
-                <ns8:sty ns8:val="p"/>
-              </ns8:rPr>
-              <w:rPr>
-                <w:rFonts w:ascii="Times New Roman" w:hAnsi="Times New Roman" w:eastAsia="SimSun" w:cs="Times New Roman"/>
-                <w:sz w:val="20"/>
-                <w:szCs w:val="20"/>
-                <w:color w:val="000000"/>
-              </w:rPr>
-              <ns8:t>e,i</ns8:t>
-            </ns8:r>
-          </ns8:sub>
-        </ns8:sSub>
-      </ns8:oMath>
-      <w:r>
-        <w:rPr>
-          <w:rFonts w:ascii="Times New Roman" w:hAnsi="Times New Roman" w:eastAsia="SimSun" w:cs="Times New Roman"/>
-          <w:sz w:val="20"/>
-          <w:szCs w:val="20"/>
-          <w:color w:val="000000"/>
-          <w:b w:val="0"/>
-          <w:lang w:val="en-US"/>
-          <w:i w:val="0"/>
-          <w:iCs w:val="0"/>
-        </w:rPr>
-        <w:t xml:space="preserve"> the vector from the center of mass to contact </w:t>
-      </w:r>
-      <ns8:oMath>
-        <ns8:r>
-          <w:rPr>
-            <w:rFonts w:ascii="Times New Roman" w:hAnsi="Times New Roman" w:eastAsia="SimSun" w:cs="Times New Roman"/>
-            <w:sz w:val="20"/>
-            <w:szCs w:val="20"/>
-            <w:color w:val="000000"/>
-          </w:rPr>
-          <ns8:t>i</ns8:t>
-        </ns8:r>
-      </ns8:oMath>
-      <w:r>
-        <w:rPr>
-          <w:rFonts w:ascii="Times New Roman" w:hAnsi="Times New Roman" w:eastAsia="SimSun" w:cs="Times New Roman"/>
-          <w:sz w:val="20"/>
-          <w:szCs w:val="20"/>
-          <w:color w:val="000000"/>
-          <w:b w:val="0"/>
-          <w:lang w:val="en-US"/>
-          <w:i w:val="0"/>
-          <w:iCs w:val="0"/>
-        </w:rPr>
-        <w:t xml:space="preserve">.</w:t>
       </w:r>
     </w:p>
     <w:tbl>
@@ -13841,6 +13631,231 @@
         </w:tc>
       </w:tr>
     </w:tbl>
+    <w:p>
+      <w:pPr>
+        <w:spacing w:before="0" w:after="0" w:line="20" w:lineRule="exact"/>
+        <w:ind w:firstLine="0"/>
+        <w:rPr>
+          <w:sz w:val="2"/>
+        </w:rPr>
+      </w:pPr>
+    </w:p>
+    <w:p ns2:paraId="54E60B31" ns2:textId="77777777">
+      <w:pPr>
+        <w:pStyle w:val="Heading3"/>
+        <w:snapToGrid w:val="0"/>
+        <w:widowControl/>
+        <w:numPr>
+          <w:ilvl w:val="2"/>
+          <w:numId w:val="4"/>
+        </w:numPr>
+        <w:keepNext w:val="0"/>
+        <w:rPr>
+          <w:rFonts w:ascii="Times New Roman" w:hAnsi="Times New Roman" w:eastAsia="SimSun" w:cs="Times New Roman"/>
+          <w:sz w:val="20"/>
+          <w:szCs w:val="20"/>
+          <w:color w:val="000000"/>
+          <w:b w:val="0"/>
+          <w:bCs w:val="0"/>
+          <w:i w:val="1"/>
+          <w:iCs w:val="1"/>
+        </w:rPr>
+        <w:keepLines w:val="0"/>
+      </w:pPr>
+      <w:r>
+        <w:rPr>
+          <w:rFonts w:ascii="Times New Roman" w:hAnsi="Times New Roman" w:eastAsia="SimSun" w:cs="Times New Roman"/>
+          <w:sz w:val="20"/>
+          <w:szCs w:val="20"/>
+          <w:color w:val="000000"/>
+          <w:b w:val="0"/>
+          <w:i w:val="1"/>
+          <w:lang w:val="en-US"/>
+        </w:rPr>
+        <w:t xml:space="preserve">Whole-Body Single-Rigid-Body Dynamics</w:t>
+      </w:r>
+      <w:r>
+        <w:rPr>
+          <w:rFonts w:ascii="Times New Roman" w:hAnsi="Times New Roman" w:eastAsia="SimSun" w:cs="Times New Roman"/>
+          <w:sz w:val="20"/>
+          <w:szCs w:val="20"/>
+          <w:color w:val="000000"/>
+          <w:b w:val="0"/>
+          <w:bCs w:val="0"/>
+          <w:i w:val="1"/>
+          <w:iCs w:val="1"/>
+        </w:rPr>
+        <w:t xml:space="preserve">: </w:t>
+      </w:r>
+      <w:r>
+        <w:rPr>
+          <w:rFonts w:ascii="Times New Roman" w:hAnsi="Times New Roman" w:eastAsia="SimSun" w:cs="Times New Roman"/>
+          <w:sz w:val="20"/>
+          <w:szCs w:val="20"/>
+          <w:color w:val="000000"/>
+          <w:b w:val="0"/>
+          <w:lang w:val="en-US"/>
+          <w:i w:val="0"/>
+          <w:iCs w:val="0"/>
+        </w:rPr>
+        <w:t xml:space="preserve">Fig. 5 shows the whole-body center of mass and contact forces on the three-dimensional chassis configuration. During rapid chassis motion, the arm is usually stationary relative to the chassis. Both can then be approximated as one rigid body with equivalent mass and inertia. Let </w:t>
+      </w:r>
+      <ns8:oMath>
+        <ns8:r>
+          <ns8:rPr>
+            <ns8:sty ns8:val="p"/>
+          </ns8:rPr>
+          <w:rPr>
+            <w:rFonts w:ascii="Times New Roman" w:hAnsi="Times New Roman" w:eastAsia="SimSun" w:cs="Times New Roman"/>
+            <w:sz w:val="20"/>
+            <w:szCs w:val="20"/>
+            <w:color w:val="000000"/>
+          </w:rPr>
+          <ns8:t>m</ns8:t>
+        </ns8:r>
+      </ns8:oMath>
+      <w:r>
+        <w:rPr>
+          <w:rFonts w:ascii="Times New Roman" w:hAnsi="Times New Roman" w:eastAsia="SimSun" w:cs="Times New Roman"/>
+          <w:sz w:val="20"/>
+          <w:szCs w:val="20"/>
+          <w:color w:val="000000"/>
+          <w:b w:val="0"/>
+          <w:lang w:val="en-US"/>
+          <w:i w:val="0"/>
+          <w:iCs w:val="0"/>
+        </w:rPr>
+        <w:t xml:space="preserve"> be total mass, </w:t>
+      </w:r>
+      <ns8:oMath>
+        <ns8:sSub>
+          <ns8:sSubPr>
+            <ns8:ctrlPr>
+              <w:rPr>
+                <w:rFonts w:ascii="Cambria Math" w:hAnsi="Cambria Math" w:hint="eastAsia"/>
+              </w:rPr>
+            </ns8:ctrlPr>
+          </ns8:sSubPr>
+          <ns8:e>
+            <ns8:r>
+              <ns8:rPr>
+                <ns8:sty ns8:val="p"/>
+              </ns8:rPr>
+              <w:rPr>
+                <w:rFonts w:ascii="Times New Roman" w:hAnsi="Times New Roman" w:eastAsia="SimSun" w:cs="Times New Roman"/>
+                <w:sz w:val="20"/>
+                <w:szCs w:val="20"/>
+                <w:color w:val="000000"/>
+              </w:rPr>
+              <ns8:t>a</ns8:t>
+            </ns8:r>
+          </ns8:e>
+          <ns8:sub>
+            <ns8:r>
+              <ns8:rPr>
+                <ns8:sty ns8:val="p"/>
+              </ns8:rPr>
+              <w:rPr>
+                <w:rFonts w:ascii="Times New Roman" w:hAnsi="Times New Roman" w:eastAsia="SimSun" w:cs="Times New Roman"/>
+                <w:sz w:val="20"/>
+                <w:szCs w:val="20"/>
+                <w:color w:val="000000"/>
+              </w:rPr>
+              <ns8:t>G</ns8:t>
+            </ns8:r>
+          </ns8:sub>
+        </ns8:sSub>
+      </ns8:oMath>
+      <w:r>
+        <w:rPr>
+          <w:rFonts w:ascii="Times New Roman" w:hAnsi="Times New Roman" w:eastAsia="SimSun" w:cs="Times New Roman"/>
+          <w:sz w:val="20"/>
+          <w:szCs w:val="20"/>
+          <w:color w:val="000000"/>
+          <w:b w:val="0"/>
+          <w:lang w:val="en-US"/>
+          <w:i w:val="0"/>
+          <w:iCs w:val="0"/>
+        </w:rPr>
+        <w:t xml:space="preserve"> center-of-mass acceleration, and </w:t>
+      </w:r>
+      <ns8:oMath>
+        <ns8:sSub>
+          <ns8:sSubPr>
+            <ns8:ctrlPr>
+              <w:rPr>
+                <w:rFonts w:ascii="Cambria Math" w:hAnsi="Cambria Math" w:hint="eastAsia"/>
+              </w:rPr>
+            </ns8:ctrlPr>
+          </ns8:sSubPr>
+          <ns8:e>
+            <ns8:r>
+              <ns8:rPr>
+                <ns8:sty ns8:val="p"/>
+              </ns8:rPr>
+              <w:rPr>
+                <w:rFonts w:ascii="Times New Roman" w:hAnsi="Times New Roman" w:eastAsia="SimSun" w:cs="Times New Roman"/>
+                <w:sz w:val="20"/>
+                <w:szCs w:val="20"/>
+                <w:color w:val="000000"/>
+              </w:rPr>
+              <ns8:t>r</ns8:t>
+            </ns8:r>
+          </ns8:e>
+          <ns8:sub>
+            <ns8:r>
+              <ns8:rPr>
+                <ns8:sty ns8:val="p"/>
+              </ns8:rPr>
+              <w:rPr>
+                <w:rFonts w:ascii="Times New Roman" w:hAnsi="Times New Roman" w:eastAsia="SimSun" w:cs="Times New Roman"/>
+                <w:sz w:val="20"/>
+                <w:szCs w:val="20"/>
+                <w:color w:val="000000"/>
+              </w:rPr>
+              <ns8:t>e,i</ns8:t>
+            </ns8:r>
+          </ns8:sub>
+        </ns8:sSub>
+      </ns8:oMath>
+      <w:r>
+        <w:rPr>
+          <w:rFonts w:ascii="Times New Roman" w:hAnsi="Times New Roman" w:eastAsia="SimSun" w:cs="Times New Roman"/>
+          <w:sz w:val="20"/>
+          <w:szCs w:val="20"/>
+          <w:color w:val="000000"/>
+          <w:b w:val="0"/>
+          <w:lang w:val="en-US"/>
+          <w:i w:val="0"/>
+          <w:iCs w:val="0"/>
+        </w:rPr>
+        <w:t xml:space="preserve"> the vector from the center of mass to contact </w:t>
+      </w:r>
+      <ns8:oMath>
+        <ns8:r>
+          <w:rPr>
+            <w:rFonts w:ascii="Times New Roman" w:hAnsi="Times New Roman" w:eastAsia="SimSun" w:cs="Times New Roman"/>
+            <w:sz w:val="20"/>
+            <w:szCs w:val="20"/>
+            <w:color w:val="000000"/>
+          </w:rPr>
+          <ns8:t>i</ns8:t>
+        </ns8:r>
+      </ns8:oMath>
+      <w:r>
+        <w:rPr>
+          <w:rFonts w:ascii="Times New Roman" w:hAnsi="Times New Roman" w:eastAsia="SimSun" w:cs="Times New Roman"/>
+          <w:sz w:val="20"/>
+          <w:szCs w:val="20"/>
+          <w:color w:val="000000"/>
+          <w:b w:val="0"/>
+          <w:lang w:val="en-US"/>
+          <w:i w:val="0"/>
+          <w:iCs w:val="0"/>
+        </w:rPr>
+        <w:t xml:space="preserve">.</w:t>
+      </w:r>
+    </w:p>
     <w:p ns2:paraId="6EC59D6B" ns2:textId="77777777">
       <w:pPr>
         <w:pStyle w:val="BodyText"/>
@@ -16503,6 +16518,7 @@
         <w:pStyle w:val="BodyText"/>
         <w:snapToGrid w:val="0"/>
         <w:widowControl/>
+        <w:keepNext w:val="0"/>
         <w:rPr>
           <w:rFonts w:ascii="Times New Roman" w:hAnsi="Times New Roman" w:eastAsia="SimSun" w:cs="Times New Roman"/>
           <w:sz w:val="20"/>
@@ -16727,146 +16743,6 @@
         <w:t xml:space="preserve">,</w:t>
       </w:r>
     </w:p>
-    <w:tbl>
-      <w:tblPr>
-        <w:tblW w:w="5033" w:type="dxa"/>
-        <w:tblLayout w:type="fixed"/>
-        <w:tblBorders>
-          <w:top w:val="nil"/>
-          <w:bottom w:val="nil"/>
-          <w:left w:val="nil"/>
-          <w:right w:val="nil"/>
-          <w:insideH w:val="nil"/>
-          <w:insideV w:val="nil"/>
-        </w:tblBorders>
-      </w:tblPr>
-      <w:tblGrid>
-        <w:gridCol w:w="5033"/>
-      </w:tblGrid>
-      <w:tr>
-        <w:trPr>
-          <w:cantSplit/>
-        </w:trPr>
-        <w:tc>
-          <w:tcPr>
-            <w:tcW w:w="5033" w:type="dxa"/>
-            <w:tcMar>
-              <w:top w:w="0" w:type="dxa"/>
-              <w:bottom w:w="0" w:type="dxa"/>
-              <w:left w:w="0" w:type="dxa"/>
-              <w:right w:w="0" w:type="dxa"/>
-            </w:tcMar>
-          </w:tcPr>
-          <w:p ns2:paraId="456B9A1A" ns2:textId="77777777">
-            <w:pPr>
-              <w:pStyle w:val="Normal"/>
-              <w:snapToGrid w:val="0"/>
-              <w:widowControl/>
-              <w:keepNext/>
-              <w:keepLines/>
-              <w:spacing w:before="0" w:after="0" w:line="240" w:lineRule="auto"/>
-              <w:ind w:firstLine="0"/>
-              <w:jc w:val="center"/>
-              <w:rPr>
-                <w:rFonts w:ascii="Times New Roman" w:hAnsi="Times New Roman" w:eastAsia="SimSun" w:cs="Times New Roman"/>
-                <w:sz w:val="20"/>
-                <w:szCs w:val="20"/>
-                <w:color w:val="000000"/>
-                <w:b w:val="0"/>
-                <w:bCs w:val="0"/>
-                <w:i w:val="0"/>
-                <w:iCs w:val="0"/>
-              </w:rPr>
-            </w:pPr>
-            <w:r>
-              <w:rPr>
-                <w:noProof/>
-                <w:rFonts w:ascii="Times New Roman" w:hAnsi="Times New Roman" w:eastAsia="SimSun" w:cs="Times New Roman"/>
-                <w:sz w:val="20"/>
-                <w:szCs w:val="20"/>
-                <w:color w:val="000000"/>
-                <w:b w:val="0"/>
-                <w:bCs w:val="0"/>
-                <w:i w:val="0"/>
-                <w:iCs w:val="0"/>
-              </w:rPr>
-              <w:drawing>
-                <wp:inline distT="0" distB="0" distL="0" distR="0" ns4:anchorId="7382684C" ns4:editId="65D58A3B">
-                  <wp:extent cx="2590800" cy="3463491"/>
-                  <wp:effectExtent l="0" t="0" r="0" b="0"/>
-                  <wp:docPr id="1008" name="Fig. 6" descr="底盘姿态控制器闭环方框图"/>
-                  <wp:cNvGraphicFramePr>
-                    <ns5:graphicFrameLocks noChangeAspect="1"/>
-                  </wp:cNvGraphicFramePr>
-                  <ns5:graphic>
-                    <ns5:graphicData uri="http://schemas.openxmlformats.org/drawingml/2006/picture">
-                      <ns6:pic>
-                        <ns6:nvPicPr>
-                          <ns6:cNvPr id="1008" name="Fig. 6" descr="底盘姿态控制器闭环方框图"/>
-                          <ns6:cNvPicPr>
-                            <ns5:picLocks noChangeAspect="1"/>
-                          </ns6:cNvPicPr>
-                        </ns6:nvPicPr>
-                        <ns6:blipFill>
-                          <ns5:blip ns7:embed="rIdArticle2"/>
-                          <ns5:stretch>
-                            <ns5:fillRect/>
-                          </ns5:stretch>
-                        </ns6:blipFill>
-                        <ns6:spPr>
-                          <ns5:xfrm>
-                            <ns5:off x="0" y="0"/>
-                            <ns5:ext cx="2592787" cy="3463491"/>
-                          </ns5:xfrm>
-                          <ns5:prstGeom prst="rect">
-                            <ns5:avLst/>
-                          </ns5:prstGeom>
-                        </ns6:spPr>
-                      </ns6:pic>
-                    </ns5:graphicData>
-                  </ns5:graphic>
-                </wp:inline>
-              </w:drawing>
-            </w:r>
-          </w:p>
-          <w:p ns2:paraId="4C03B63B" ns2:textId="77777777">
-            <w:pPr>
-              <w:pStyle w:val="figurecaption"/>
-              <w:snapToGrid w:val="0"/>
-              <w:widowControl/>
-              <w:numPr>
-                <w:ilvl w:val="0"/>
-                <w:numId w:val="2"/>
-              </w:numPr>
-              <w:keepLines/>
-              <w:keepNext w:val="0"/>
-              <w:rPr>
-                <w:rFonts w:ascii="Times New Roman" w:hAnsi="Times New Roman" w:eastAsia="SimSun" w:cs="Times New Roman"/>
-                <w:sz w:val="16"/>
-                <w:szCs w:val="16"/>
-                <w:color w:val="000000"/>
-                <w:b w:val="0"/>
-                <w:bCs w:val="0"/>
-                <w:i w:val="0"/>
-                <w:iCs w:val="0"/>
-              </w:rPr>
-            </w:pPr>
-            <w:r>
-              <w:rPr>
-                <w:rFonts w:ascii="Times New Roman" w:hAnsi="Times New Roman" w:eastAsia="SimSun" w:cs="Times New Roman"/>
-                <w:sz w:val="16"/>
-                <w:szCs w:val="16"/>
-                <w:color w:val="000000"/>
-                <w:b w:val="0"/>
-                <w:i w:val="0"/>
-                <w:lang w:val="en-US"/>
-              </w:rPr>
-              <w:t xml:space="preserve">Closed-loop chassis attitude control. Cascaded roll/pitch P loops and height-increment accumulation follow (17); (18) allocates both corrections to four legs. Joint-servo inner loops are combined.</w:t>
-            </w:r>
-          </w:p>
-        </w:tc>
-      </w:tr>
-    </w:tbl>
     <w:p>
       <w:pPr>
         <w:pStyle w:val="equation"/>
@@ -17832,6 +17708,7 @@
         <w:pStyle w:val="BodyText"/>
         <w:snapToGrid w:val="0"/>
         <w:widowControl/>
+        <w:keepNext w:val="0"/>
         <w:rPr>
           <w:rFonts w:ascii="Times New Roman" w:hAnsi="Times New Roman" w:eastAsia="SimSun" w:cs="Times New Roman"/>
           <w:sz w:val="20"/>
@@ -18276,6 +18153,7 @@
         <w:pStyle w:val="BodyText"/>
         <w:snapToGrid w:val="0"/>
         <w:widowControl/>
+        <w:keepNext w:val="0"/>
         <w:rPr>
           <w:rFonts w:ascii="Times New Roman" w:hAnsi="Times New Roman" w:eastAsia="SimSun" w:cs="Times New Roman"/>
           <w:sz w:val="20"/>
@@ -19459,6 +19337,7 @@
         <w:pStyle w:val="BodyText"/>
         <w:snapToGrid w:val="0"/>
         <w:widowControl/>
+        <w:keepNext w:val="0"/>
         <w:rPr>
           <w:rFonts w:ascii="Times New Roman" w:hAnsi="Times New Roman" w:eastAsia="SimSun" w:cs="Times New Roman"/>
           <w:sz w:val="20"/>
@@ -20085,111 +19964,6 @@
           <w:lang w:val="en-US"/>
         </w:rPr>
         <w:t xml:space="preserve">; inverse kinematics gives joint targets.</w:t>
-      </w:r>
-    </w:p>
-    <w:p>
-      <w:pPr>
-        <w:spacing w:before="0" w:after="0" w:line="20" w:lineRule="exact"/>
-        <w:ind w:firstLine="0"/>
-        <w:rPr>
-          <w:sz w:val="2"/>
-        </w:rPr>
-      </w:pPr>
-    </w:p>
-    <w:p ns2:paraId="4572C6A8" ns2:textId="77777777">
-      <w:pPr>
-        <w:pStyle w:val="Heading2"/>
-        <w:snapToGrid w:val="0"/>
-        <w:widowControl/>
-        <w:numPr>
-          <w:ilvl w:val="1"/>
-          <w:numId w:val="4"/>
-        </w:numPr>
-        <w:keepNext/>
-        <w:keepLines/>
-        <w:rPr>
-          <w:rFonts w:ascii="Times New Roman" w:hAnsi="Times New Roman" w:eastAsia="SimSun" w:cs="Times New Roman"/>
-          <w:sz w:val="20"/>
-          <w:szCs w:val="20"/>
-          <w:color w:val="000000"/>
-          <w:b w:val="0"/>
-          <w:bCs w:val="0"/>
-          <w:i w:val="1"/>
-          <w:iCs w:val="1"/>
-        </w:rPr>
-      </w:pPr>
-      <w:r>
-        <w:rPr>
-          <w:rFonts w:ascii="Times New Roman" w:hAnsi="Times New Roman" w:eastAsia="SimSun" w:cs="Times New Roman"/>
-          <w:sz w:val="20"/>
-          <w:szCs w:val="20"/>
-          <w:color w:val="000000"/>
-          <w:b w:val="0"/>
-          <w:i w:val="1"/>
-          <w:lang w:val="en-US"/>
-        </w:rPr>
-        <w:t xml:space="preserve">Delta Teleoperation Controller</w:t>
-      </w:r>
-    </w:p>
-    <w:p ns2:paraId="5F3BF0F9" ns2:textId="77777777">
-      <w:pPr>
-        <w:pStyle w:val="Heading3"/>
-        <w:snapToGrid w:val="0"/>
-        <w:widowControl/>
-        <w:numPr>
-          <w:ilvl w:val="2"/>
-          <w:numId w:val="4"/>
-        </w:numPr>
-        <w:keepNext w:val="0"/>
-        <w:rPr>
-          <w:rFonts w:ascii="Times New Roman" w:hAnsi="Times New Roman" w:eastAsia="SimSun" w:cs="Times New Roman"/>
-          <w:sz w:val="20"/>
-          <w:szCs w:val="20"/>
-          <w:color w:val="000000"/>
-          <w:b w:val="0"/>
-          <w:bCs w:val="0"/>
-          <w:i w:val="1"/>
-          <w:iCs w:val="1"/>
-        </w:rPr>
-        <w:keepLines w:val="0"/>
-      </w:pPr>
-      <w:r>
-        <w:rPr>
-          <w:rFonts w:ascii="Times New Roman" w:hAnsi="Times New Roman" w:eastAsia="SimSun" w:cs="Times New Roman"/>
-          <w:sz w:val="20"/>
-          <w:szCs w:val="20"/>
-          <w:color w:val="000000"/>
-          <w:b w:val="0"/>
-          <w:i w:val="1"/>
-          <w:lang w:val="en-US"/>
-        </w:rPr>
-        <w:t xml:space="preserve">Structure</w:t>
-      </w:r>
-      <w:r>
-        <w:rPr>
-          <w:rFonts w:ascii="Times New Roman" w:hAnsi="Times New Roman" w:eastAsia="SimSun" w:cs="Times New Roman"/>
-          <w:sz w:val="20"/>
-          <w:szCs w:val="20"/>
-          <w:color w:val="000000"/>
-          <w:b w:val="0"/>
-          <w:bCs w:val="0"/>
-          <w:i w:val="1"/>
-          <w:iCs w:val="1"/>
-        </w:rPr>
-        <w:t xml:space="preserve">: </w:t>
-      </w:r>
-      <w:r>
-        <w:rPr>
-          <w:rFonts w:ascii="Times New Roman" w:hAnsi="Times New Roman" w:eastAsia="SimSun" w:cs="Times New Roman"/>
-          <w:sz w:val="20"/>
-          <w:szCs w:val="20"/>
-          <w:color w:val="000000"/>
-          <w:b w:val="0"/>
-          <w:lang w:val="en-US"/>
-          <w:i w:val="0"/>
-          <w:iCs w:val="0"/>
-        </w:rPr>
-        <w:t xml:space="preserve">The master uses a three-limb Delta parallel mechanism for translation and three encoder-equipped revolute joints on the moving platform for orientation input (Fig. 7). Parallelogram passive arms keep both platforms parallel, separating position and orientation. Fig. 7 identifies the Delta mechanism, three-axis handle, and rotation axes. Handle joints j1–j3 give moving-axis roll, pitch, and yaw (RPY).</w:t>
       </w:r>
     </w:p>
     <w:tbl>
@@ -20222,7 +19996,7 @@
               <w:right w:w="0" w:type="dxa"/>
             </w:tcMar>
           </w:tcPr>
-          <w:p ns2:paraId="697DD451" ns2:textId="77777777">
+          <w:p ns2:paraId="456B9A1A" ns2:textId="77777777">
             <w:pPr>
               <w:pStyle w:val="Normal"/>
               <w:snapToGrid w:val="0"/>
@@ -20256,10 +20030,10 @@
                 <w:iCs w:val="0"/>
               </w:rPr>
               <w:drawing>
-                <wp:inline distT="0" distB="0" distL="0" distR="0" ns4:anchorId="21C8DD9B" ns4:editId="31EA403A">
-                  <wp:extent cx="3059430" cy="2039620"/>
-                  <wp:effectExtent l="0" t="0" r="7620" b="8255"/>
-                  <wp:docPr id="1009" name="Fig. 8" descr="Delta 平移机构与三轴姿态手柄的机构、转轴和平行约束示意"/>
+                <wp:inline distT="0" distB="0" distL="0" distR="0" ns4:anchorId="7382684C" ns4:editId="65D58A3B">
+                  <wp:extent cx="2590800" cy="3463491"/>
+                  <wp:effectExtent l="0" t="0" r="0" b="0"/>
+                  <wp:docPr id="1008" name="Fig. 6" descr="底盘姿态控制器闭环方框图"/>
                   <wp:cNvGraphicFramePr>
                     <ns5:graphicFrameLocks noChangeAspect="1"/>
                   </wp:cNvGraphicFramePr>
@@ -20267,13 +20041,13 @@
                     <ns5:graphicData uri="http://schemas.openxmlformats.org/drawingml/2006/picture">
                       <ns6:pic>
                         <ns6:nvPicPr>
-                          <ns6:cNvPr id="1009" name="Fig. 8" descr="Delta 平移机构与三轴姿态手柄的机构、转轴和平行约束示意"/>
+                          <ns6:cNvPr id="1008" name="Fig. 6" descr="底盘姿态控制器闭环方框图"/>
                           <ns6:cNvPicPr>
                             <ns5:picLocks noChangeAspect="1"/>
                           </ns6:cNvPicPr>
                         </ns6:nvPicPr>
                         <ns6:blipFill>
-                          <ns5:blip ns7:embed="rIdArticle18"/>
+                          <ns5:blip ns7:embed="rIdArticle2"/>
                           <ns5:stretch>
                             <ns5:fillRect/>
                           </ns5:stretch>
@@ -20281,7 +20055,7 @@
                         <ns6:spPr>
                           <ns5:xfrm>
                             <ns5:off x="0" y="0"/>
-                            <ns5:ext cx="3060000" cy="2040000"/>
+                            <ns5:ext cx="2592787" cy="3463491"/>
                           </ns5:xfrm>
                           <ns5:prstGeom prst="rect">
                             <ns5:avLst/>
@@ -20294,7 +20068,7 @@
               </w:drawing>
             </w:r>
           </w:p>
-          <w:p ns2:paraId="1B4719FE" ns2:textId="77777777">
+          <w:p ns2:paraId="4C03B63B" ns2:textId="77777777">
             <w:pPr>
               <w:pStyle w:val="figurecaption"/>
               <w:snapToGrid w:val="0"/>
@@ -20326,17 +20100,123 @@
                 <w:i w:val="0"/>
                 <w:lang w:val="en-US"/>
               </w:rPr>
-              <w:t xml:space="preserve">Teleoperation master and rotation axes. (a) Delta mechanism; highlighted parallelogram links keep the platforms parallel. (b) Three-axis handle, with joints and rotation axes shown from mount to grip.</w:t>
+              <w:t xml:space="preserve">Closed-loop chassis attitude control. Cascaded roll/pitch P loops and height-increment accumulation follow (17); (18) allocates both corrections to four legs. Joint-servo inner loops are combined.</w:t>
             </w:r>
           </w:p>
         </w:tc>
       </w:tr>
     </w:tbl>
+    <w:p>
+      <w:pPr>
+        <w:spacing w:before="0" w:after="0" w:line="20" w:lineRule="exact"/>
+        <w:ind w:firstLine="0"/>
+        <w:rPr>
+          <w:sz w:val="2"/>
+        </w:rPr>
+      </w:pPr>
+    </w:p>
+    <w:p ns2:paraId="4572C6A8" ns2:textId="77777777">
+      <w:pPr>
+        <w:pStyle w:val="Heading2"/>
+        <w:snapToGrid w:val="0"/>
+        <w:widowControl/>
+        <w:numPr>
+          <w:ilvl w:val="1"/>
+          <w:numId w:val="4"/>
+        </w:numPr>
+        <w:keepNext/>
+        <w:keepLines/>
+        <w:rPr>
+          <w:rFonts w:ascii="Times New Roman" w:hAnsi="Times New Roman" w:eastAsia="SimSun" w:cs="Times New Roman"/>
+          <w:sz w:val="20"/>
+          <w:szCs w:val="20"/>
+          <w:color w:val="000000"/>
+          <w:b w:val="0"/>
+          <w:bCs w:val="0"/>
+          <w:i w:val="1"/>
+          <w:iCs w:val="1"/>
+        </w:rPr>
+      </w:pPr>
+      <w:r>
+        <w:rPr>
+          <w:rFonts w:ascii="Times New Roman" w:hAnsi="Times New Roman" w:eastAsia="SimSun" w:cs="Times New Roman"/>
+          <w:sz w:val="20"/>
+          <w:szCs w:val="20"/>
+          <w:color w:val="000000"/>
+          <w:b w:val="0"/>
+          <w:i w:val="1"/>
+          <w:lang w:val="en-US"/>
+        </w:rPr>
+        <w:t xml:space="preserve">Delta Teleoperation Controller</w:t>
+      </w:r>
+    </w:p>
+    <w:p ns2:paraId="5F3BF0F9" ns2:textId="77777777">
+      <w:pPr>
+        <w:pStyle w:val="Heading3"/>
+        <w:snapToGrid w:val="0"/>
+        <w:widowControl/>
+        <w:numPr>
+          <w:ilvl w:val="2"/>
+          <w:numId w:val="4"/>
+        </w:numPr>
+        <w:keepNext w:val="0"/>
+        <w:rPr>
+          <w:rFonts w:ascii="Times New Roman" w:hAnsi="Times New Roman" w:eastAsia="SimSun" w:cs="Times New Roman"/>
+          <w:sz w:val="20"/>
+          <w:szCs w:val="20"/>
+          <w:color w:val="000000"/>
+          <w:b w:val="0"/>
+          <w:bCs w:val="0"/>
+          <w:i w:val="1"/>
+          <w:iCs w:val="1"/>
+        </w:rPr>
+        <w:keepLines w:val="0"/>
+      </w:pPr>
+      <w:r>
+        <w:rPr>
+          <w:rFonts w:ascii="Times New Roman" w:hAnsi="Times New Roman" w:eastAsia="SimSun" w:cs="Times New Roman"/>
+          <w:sz w:val="20"/>
+          <w:szCs w:val="20"/>
+          <w:color w:val="000000"/>
+          <w:b w:val="0"/>
+          <w:i w:val="1"/>
+          <w:lang w:val="en-US"/>
+        </w:rPr>
+        <w:t xml:space="preserve">Structure</w:t>
+      </w:r>
+      <w:r>
+        <w:rPr>
+          <w:rFonts w:ascii="Times New Roman" w:hAnsi="Times New Roman" w:eastAsia="SimSun" w:cs="Times New Roman"/>
+          <w:sz w:val="20"/>
+          <w:szCs w:val="20"/>
+          <w:color w:val="000000"/>
+          <w:b w:val="0"/>
+          <w:bCs w:val="0"/>
+          <w:i w:val="1"/>
+          <w:iCs w:val="1"/>
+        </w:rPr>
+        <w:t xml:space="preserve">: </w:t>
+      </w:r>
+      <w:r>
+        <w:rPr>
+          <w:rFonts w:ascii="Times New Roman" w:hAnsi="Times New Roman" w:eastAsia="SimSun" w:cs="Times New Roman"/>
+          <w:sz w:val="20"/>
+          <w:szCs w:val="20"/>
+          <w:color w:val="000000"/>
+          <w:b w:val="0"/>
+          <w:lang w:val="en-US"/>
+          <w:i w:val="0"/>
+          <w:iCs w:val="0"/>
+        </w:rPr>
+        <w:t xml:space="preserve">The master uses a three-limb Delta parallel mechanism for translation and three encoder-equipped revolute joints on the moving platform for orientation input (Fig. 7). Parallelogram passive arms keep both platforms parallel, separating position and orientation. Fig. 7 identifies the Delta mechanism, three-axis handle, and rotation axes. Handle joints j1–j3 give moving-axis roll, pitch, and yaw (RPY).</w:t>
+      </w:r>
+    </w:p>
     <w:p ns2:paraId="06C3F0A7" ns2:textId="77777777">
       <w:pPr>
         <w:pStyle w:val="BodyText"/>
         <w:snapToGrid w:val="0"/>
         <w:widowControl/>
+        <w:keepNext w:val="0"/>
         <w:rPr>
           <w:rFonts w:ascii="Times New Roman" w:hAnsi="Times New Roman" w:eastAsia="SimSun" w:cs="Times New Roman"/>
           <w:sz w:val="20"/>
@@ -20423,6 +20303,7 @@
         <w:pStyle w:val="BodyText"/>
         <w:snapToGrid w:val="0"/>
         <w:widowControl/>
+        <w:keepNext w:val="0"/>
         <w:rPr>
           <w:rFonts w:ascii="Times New Roman" w:hAnsi="Times New Roman" w:eastAsia="SimSun" w:cs="Times New Roman"/>
           <w:sz w:val="20"/>
@@ -22444,6 +22325,15 @@
         </w:tc>
       </w:tr>
     </w:tbl>
+    <w:p>
+      <w:pPr>
+        <w:spacing w:before="0" w:after="0" w:line="20" w:lineRule="exact"/>
+        <w:ind w:firstLine="0"/>
+        <w:rPr>
+          <w:sz w:val="2"/>
+        </w:rPr>
+      </w:pPr>
+    </w:p>
     <w:tbl>
       <w:tblPr>
         <w:tblW w:w="5033" w:type="dxa"/>
@@ -22474,7 +22364,7 @@
               <w:right w:w="0" w:type="dxa"/>
             </w:tcMar>
           </w:tcPr>
-          <w:p ns2:paraId="19043F30" ns2:textId="77777777">
+          <w:p ns2:paraId="697DD451" ns2:textId="77777777">
             <w:pPr>
               <w:pStyle w:val="Normal"/>
               <w:snapToGrid w:val="0"/>
@@ -22508,10 +22398,10 @@
                 <w:iCs w:val="0"/>
               </w:rPr>
               <w:drawing>
-                <wp:inline distT="0" distB="0" distL="0" distR="0" ns4:anchorId="02AEBE66" ns4:editId="04CB13EB">
-                  <wp:extent cx="3059430" cy="2045970"/>
-                  <wp:effectExtent l="0" t="0" r="0" b="0"/>
-                  <wp:docPr id="1010" name="Fig. 9" descr="Delta 三支链及单支链几何模型，基座原点位于静平台中心"/>
+                <wp:inline distT="0" distB="0" distL="0" distR="0" ns4:anchorId="21C8DD9B" ns4:editId="31EA403A">
+                  <wp:extent cx="3059430" cy="2039620"/>
+                  <wp:effectExtent l="0" t="0" r="7620" b="8255"/>
+                  <wp:docPr id="1009" name="Fig. 8" descr="Delta 平移机构与三轴姿态手柄的机构、转轴和平行约束示意"/>
                   <wp:cNvGraphicFramePr>
                     <ns5:graphicFrameLocks noChangeAspect="1"/>
                   </wp:cNvGraphicFramePr>
@@ -22519,13 +22409,13 @@
                     <ns5:graphicData uri="http://schemas.openxmlformats.org/drawingml/2006/picture">
                       <ns6:pic>
                         <ns6:nvPicPr>
-                          <ns6:cNvPr id="1010" name="Fig. 9" descr="Delta 三支链及单支链几何模型，基座原点位于静平台中心"/>
+                          <ns6:cNvPr id="1009" name="Fig. 8" descr="Delta 平移机构与三轴姿态手柄的机构、转轴和平行约束示意"/>
                           <ns6:cNvPicPr>
                             <ns5:picLocks noChangeAspect="1"/>
                           </ns6:cNvPicPr>
                         </ns6:nvPicPr>
                         <ns6:blipFill>
-                          <ns5:blip ns7:embed="rIdArticle13"/>
+                          <ns5:blip ns7:embed="rIdArticle18"/>
                           <ns5:stretch>
                             <ns5:fillRect/>
                           </ns5:stretch>
@@ -22533,7 +22423,7 @@
                         <ns6:spPr>
                           <ns5:xfrm>
                             <ns5:off x="0" y="0"/>
-                            <ns5:ext cx="3060000" cy="2046375"/>
+                            <ns5:ext cx="3060000" cy="2040000"/>
                           </ns5:xfrm>
                           <ns5:prstGeom prst="rect">
                             <ns5:avLst/>
@@ -22546,7 +22436,7 @@
               </w:drawing>
             </w:r>
           </w:p>
-          <w:p ns2:paraId="52F8C4D7" ns2:textId="77777777">
+          <w:p ns2:paraId="1B4719FE" ns2:textId="77777777">
             <w:pPr>
               <w:pStyle w:val="figurecaption"/>
               <w:snapToGrid w:val="0"/>
@@ -22578,21 +22468,12 @@
                 <w:i w:val="0"/>
                 <w:lang w:val="en-US"/>
               </w:rPr>
-              <w:t xml:space="preserve">Delta geometry. (a) Three limbs and right-handed frame {D}: O is the fixed-platform center, +x points normally from moving to fixed platform, +z toward A1, and P marks the moving-platform center. Parallelogram links keep platforms parallel. (b) Symmetric limb section with radii, lengths, active-arm angle, and equivalent sphere center.</w:t>
+              <w:t xml:space="preserve">Teleoperation master and rotation axes. (a) Delta mechanism; highlighted parallelogram links keep the platforms parallel. (b) Three-axis handle, with joints and rotation axes shown from mount to grip.</w:t>
             </w:r>
           </w:p>
         </w:tc>
       </w:tr>
     </w:tbl>
-    <w:p>
-      <w:pPr>
-        <w:spacing w:before="0" w:after="0" w:line="20" w:lineRule="exact"/>
-        <w:ind w:firstLine="0"/>
-        <w:rPr>
-          <w:sz w:val="2"/>
-        </w:rPr>
-      </w:pPr>
-    </w:p>
     <w:p>
       <w:pPr>
         <w:spacing w:before="0" w:after="0" w:line="20" w:lineRule="exact"/>
@@ -25816,6 +25697,7 @@
           <w:szCs w:val="20"/>
           <w:color w:val="000000"/>
         </w:rPr>
+        <w:keepNext/>
       </w:pPr>
       <w:r>
         <w:rPr>
@@ -26409,6 +26291,146 @@
         <w:t>.</w:t>
       </w:r>
     </w:p>
+    <w:tbl>
+      <w:tblPr>
+        <w:tblW w:w="5033" w:type="dxa"/>
+        <w:tblLayout w:type="fixed"/>
+        <w:tblBorders>
+          <w:top w:val="nil"/>
+          <w:bottom w:val="nil"/>
+          <w:left w:val="nil"/>
+          <w:right w:val="nil"/>
+          <w:insideH w:val="nil"/>
+          <w:insideV w:val="nil"/>
+        </w:tblBorders>
+      </w:tblPr>
+      <w:tblGrid>
+        <w:gridCol w:w="5033"/>
+      </w:tblGrid>
+      <w:tr>
+        <w:trPr>
+          <w:cantSplit/>
+        </w:trPr>
+        <w:tc>
+          <w:tcPr>
+            <w:tcW w:w="5033" w:type="dxa"/>
+            <w:tcMar>
+              <w:top w:w="0" w:type="dxa"/>
+              <w:bottom w:w="0" w:type="dxa"/>
+              <w:left w:w="0" w:type="dxa"/>
+              <w:right w:w="0" w:type="dxa"/>
+            </w:tcMar>
+          </w:tcPr>
+          <w:p ns2:paraId="19043F30" ns2:textId="77777777">
+            <w:pPr>
+              <w:pStyle w:val="Normal"/>
+              <w:snapToGrid w:val="0"/>
+              <w:widowControl/>
+              <w:keepNext/>
+              <w:keepLines/>
+              <w:spacing w:before="0" w:after="0" w:line="240" w:lineRule="auto"/>
+              <w:ind w:firstLine="0"/>
+              <w:jc w:val="center"/>
+              <w:rPr>
+                <w:rFonts w:ascii="Times New Roman" w:hAnsi="Times New Roman" w:eastAsia="SimSun" w:cs="Times New Roman"/>
+                <w:sz w:val="20"/>
+                <w:szCs w:val="20"/>
+                <w:color w:val="000000"/>
+                <w:b w:val="0"/>
+                <w:bCs w:val="0"/>
+                <w:i w:val="0"/>
+                <w:iCs w:val="0"/>
+              </w:rPr>
+            </w:pPr>
+            <w:r>
+              <w:rPr>
+                <w:noProof/>
+                <w:rFonts w:ascii="Times New Roman" w:hAnsi="Times New Roman" w:eastAsia="SimSun" w:cs="Times New Roman"/>
+                <w:sz w:val="20"/>
+                <w:szCs w:val="20"/>
+                <w:color w:val="000000"/>
+                <w:b w:val="0"/>
+                <w:bCs w:val="0"/>
+                <w:i w:val="0"/>
+                <w:iCs w:val="0"/>
+              </w:rPr>
+              <w:drawing>
+                <wp:inline distT="0" distB="0" distL="0" distR="0" ns4:anchorId="02AEBE66" ns4:editId="04CB13EB">
+                  <wp:extent cx="3059430" cy="2045970"/>
+                  <wp:effectExtent l="0" t="0" r="0" b="0"/>
+                  <wp:docPr id="1010" name="Fig. 9" descr="Delta 三支链及单支链几何模型，基座原点位于静平台中心"/>
+                  <wp:cNvGraphicFramePr>
+                    <ns5:graphicFrameLocks noChangeAspect="1"/>
+                  </wp:cNvGraphicFramePr>
+                  <ns5:graphic>
+                    <ns5:graphicData uri="http://schemas.openxmlformats.org/drawingml/2006/picture">
+                      <ns6:pic>
+                        <ns6:nvPicPr>
+                          <ns6:cNvPr id="1010" name="Fig. 9" descr="Delta 三支链及单支链几何模型，基座原点位于静平台中心"/>
+                          <ns6:cNvPicPr>
+                            <ns5:picLocks noChangeAspect="1"/>
+                          </ns6:cNvPicPr>
+                        </ns6:nvPicPr>
+                        <ns6:blipFill>
+                          <ns5:blip ns7:embed="rIdArticle13"/>
+                          <ns5:stretch>
+                            <ns5:fillRect/>
+                          </ns5:stretch>
+                        </ns6:blipFill>
+                        <ns6:spPr>
+                          <ns5:xfrm>
+                            <ns5:off x="0" y="0"/>
+                            <ns5:ext cx="3060000" cy="2046375"/>
+                          </ns5:xfrm>
+                          <ns5:prstGeom prst="rect">
+                            <ns5:avLst/>
+                          </ns5:prstGeom>
+                        </ns6:spPr>
+                      </ns6:pic>
+                    </ns5:graphicData>
+                  </ns5:graphic>
+                </wp:inline>
+              </w:drawing>
+            </w:r>
+          </w:p>
+          <w:p ns2:paraId="52F8C4D7" ns2:textId="77777777">
+            <w:pPr>
+              <w:pStyle w:val="figurecaption"/>
+              <w:snapToGrid w:val="0"/>
+              <w:widowControl/>
+              <w:numPr>
+                <w:ilvl w:val="0"/>
+                <w:numId w:val="2"/>
+              </w:numPr>
+              <w:keepLines/>
+              <w:keepNext w:val="0"/>
+              <w:rPr>
+                <w:rFonts w:ascii="Times New Roman" w:hAnsi="Times New Roman" w:eastAsia="SimSun" w:cs="Times New Roman"/>
+                <w:sz w:val="16"/>
+                <w:szCs w:val="16"/>
+                <w:color w:val="000000"/>
+                <w:b w:val="0"/>
+                <w:bCs w:val="0"/>
+                <w:i w:val="0"/>
+                <w:iCs w:val="0"/>
+              </w:rPr>
+            </w:pPr>
+            <w:r>
+              <w:rPr>
+                <w:rFonts w:ascii="Times New Roman" w:hAnsi="Times New Roman" w:eastAsia="SimSun" w:cs="Times New Roman"/>
+                <w:sz w:val="16"/>
+                <w:szCs w:val="16"/>
+                <w:color w:val="000000"/>
+                <w:b w:val="0"/>
+                <w:i w:val="0"/>
+                <w:lang w:val="en-US"/>
+              </w:rPr>
+              <w:t xml:space="preserve">Delta geometry. (a) Three limbs and right-handed frame {D}: O is the fixed-platform center, +x points normally from moving to fixed platform, +z toward A1, and P marks the moving-platform center. Parallelogram links keep platforms parallel. (b) Symmetric limb section with radii, lengths, active-arm angle, and equivalent sphere center.</w:t>
+            </w:r>
+          </w:p>
+        </w:tc>
+      </w:tr>
+    </w:tbl>
     <w:p>
       <w:pPr>
         <w:spacing w:before="0" w:after="0" w:line="20" w:lineRule="exact"/>
@@ -27689,6 +27711,7 @@
         <w:pStyle w:val="BodyText"/>
         <w:snapToGrid w:val="0"/>
         <w:widowControl/>
+        <w:keepNext w:val="0"/>
         <w:rPr>
           <w:rFonts w:ascii="Times New Roman" w:hAnsi="Times New Roman" w:eastAsia="SimSun" w:cs="Times New Roman"/>
           <w:sz w:val="20"/>
@@ -28805,6 +28828,7 @@
         <w:pStyle w:val="BodyText"/>
         <w:snapToGrid w:val="0"/>
         <w:widowControl/>
+        <w:keepNext w:val="0"/>
         <w:rPr>
           <w:rFonts w:ascii="Times New Roman" w:hAnsi="Times New Roman" w:eastAsia="SimSun" w:cs="Times New Roman"/>
           <w:sz w:val="20"/>
@@ -29687,6 +29711,7 @@
         <w:pStyle w:val="BodyText"/>
         <w:snapToGrid w:val="0"/>
         <w:widowControl/>
+        <w:keepNext w:val="0"/>
         <w:rPr>
           <w:rFonts w:ascii="Times New Roman" w:hAnsi="Times New Roman" w:eastAsia="SimSun" w:cs="Times New Roman"/>
           <w:sz w:val="20"/>
@@ -30643,6 +30668,7 @@
         <w:pStyle w:val="BodyText"/>
         <w:snapToGrid w:val="0"/>
         <w:widowControl/>
+        <w:keepNext w:val="0"/>
         <w:rPr>
           <w:rFonts w:ascii="Times New Roman" w:hAnsi="Times New Roman" w:eastAsia="SimSun" w:cs="Times New Roman"/>
           <w:sz w:val="20"/>
@@ -30703,6 +30729,7 @@
         <w:pStyle w:val="BodyText"/>
         <w:snapToGrid w:val="0"/>
         <w:widowControl/>
+        <w:keepNext w:val="0"/>
         <w:rPr>
           <w:rFonts w:ascii="Times New Roman" w:hAnsi="Times New Roman" w:eastAsia="SimSun" w:cs="Times New Roman"/>
           <w:sz w:val="20"/>
@@ -31274,6 +31301,7 @@
         <w:pStyle w:val="BodyText"/>
         <w:snapToGrid w:val="0"/>
         <w:widowControl/>
+        <w:keepNext w:val="0"/>
         <w:rPr>
           <w:rFonts w:ascii="Times New Roman" w:hAnsi="Times New Roman" w:eastAsia="SimSun" w:cs="Times New Roman"/>
           <w:sz w:val="20"/>
@@ -31922,6 +31950,7 @@
         <w:pStyle w:val="BodyText"/>
         <w:snapToGrid w:val="0"/>
         <w:widowControl/>
+        <w:keepNext w:val="0"/>
         <w:rPr>
           <w:rFonts w:ascii="Times New Roman" w:hAnsi="Times New Roman" w:eastAsia="SimSun" w:cs="Times New Roman"/>
           <w:sz w:val="20"/>
@@ -31947,6 +31976,7 @@
         <w:pStyle w:val="BodyText"/>
         <w:snapToGrid w:val="0"/>
         <w:widowControl/>
+        <w:keepNext w:val="0"/>
         <w:rPr>
           <w:rFonts w:ascii="Times New Roman" w:hAnsi="Times New Roman" w:eastAsia="SimSun" w:cs="Times New Roman"/>
           <w:sz w:val="20"/>
@@ -32009,6 +32039,7 @@
           <w:numId w:val="8"/>
         </w:numPr>
         <w:keepLines/>
+        <w:keepNext w:val="0"/>
         <w:ind w:left="360" w:hanging="360"/>
         <w:rPr>
           <w:rFonts w:ascii="Times New Roman" w:hAnsi="Times New Roman" w:eastAsia="SimSun" w:cs="Times New Roman"/>
@@ -32129,6 +32160,7 @@
           <w:numId w:val="8"/>
         </w:numPr>
         <w:keepLines/>
+        <w:keepNext w:val="0"/>
         <w:ind w:left="360" w:hanging="360"/>
         <w:rPr>
           <w:rFonts w:ascii="Times New Roman" w:hAnsi="Times New Roman" w:eastAsia="SimSun" w:cs="Times New Roman"/>
@@ -32221,6 +32253,7 @@
           <w:numId w:val="8"/>
         </w:numPr>
         <w:keepLines/>
+        <w:keepNext w:val="0"/>
         <w:ind w:left="360" w:hanging="360"/>
         <w:rPr>
           <w:rFonts w:ascii="Times New Roman" w:hAnsi="Times New Roman" w:eastAsia="SimSun" w:cs="Times New Roman"/>
@@ -32313,6 +32346,7 @@
           <w:numId w:val="8"/>
         </w:numPr>
         <w:keepLines/>
+        <w:keepNext w:val="0"/>
         <w:ind w:left="360" w:hanging="360"/>
         <w:rPr>
           <w:rFonts w:ascii="Times New Roman" w:hAnsi="Times New Roman" w:eastAsia="SimSun" w:cs="Times New Roman"/>
@@ -32377,6 +32411,7 @@
           <w:numId w:val="8"/>
         </w:numPr>
         <w:keepLines/>
+        <w:keepNext w:val="0"/>
         <w:ind w:left="360" w:hanging="360"/>
         <w:rPr>
           <w:rFonts w:ascii="Times New Roman" w:hAnsi="Times New Roman" w:eastAsia="SimSun" w:cs="Times New Roman"/>
@@ -32441,6 +32476,7 @@
           <w:numId w:val="8"/>
         </w:numPr>
         <w:keepLines/>
+        <w:keepNext w:val="0"/>
         <w:ind w:left="360" w:hanging="360"/>
         <w:rPr>
           <w:rFonts w:ascii="Times New Roman" w:hAnsi="Times New Roman" w:eastAsia="SimSun" w:cs="Times New Roman"/>
@@ -32477,6 +32513,7 @@
           <w:numId w:val="8"/>
         </w:numPr>
         <w:keepLines/>
+        <w:keepNext w:val="0"/>
         <w:ind w:left="360" w:hanging="360"/>
         <w:rPr>
           <w:rFonts w:ascii="Times New Roman" w:hAnsi="Times New Roman" w:eastAsia="SimSun" w:cs="Times New Roman"/>
@@ -32541,6 +32578,7 @@
           <w:numId w:val="8"/>
         </w:numPr>
         <w:keepLines/>
+        <w:keepNext w:val="0"/>
         <w:ind w:left="360" w:hanging="360"/>
         <w:rPr>
           <w:rFonts w:ascii="Times New Roman" w:hAnsi="Times New Roman" w:eastAsia="SimSun" w:cs="Times New Roman"/>
@@ -32633,6 +32671,7 @@
           <w:numId w:val="8"/>
         </w:numPr>
         <w:keepLines/>
+        <w:keepNext w:val="0"/>
         <w:ind w:left="360" w:hanging="360"/>
         <w:rPr>
           <w:rFonts w:ascii="Times New Roman" w:hAnsi="Times New Roman" w:eastAsia="SimSun" w:cs="Times New Roman"/>

</xml_diff>

<commit_message>
Fit compact article into six pages
</commit_message>
<xml_diff>
--- a/Article5_English_IEEE_Letter_Compact.docx
+++ b/Article5_English_IEEE_Letter_Compact.docx
@@ -684,7 +684,6 @@
         <w:pStyle w:val="BodyText"/>
         <w:snapToGrid w:val="0"/>
         <w:widowControl/>
-        <w:keepNext w:val="0"/>
         <w:rPr>
           <w:rFonts w:ascii="Times New Roman" w:hAnsi="Times New Roman" w:eastAsia="SimSun" w:cs="Times New Roman"/>
           <w:sz w:val="20"/>
@@ -710,7 +709,6 @@
         <w:pStyle w:val="BodyText"/>
         <w:snapToGrid w:val="0"/>
         <w:widowControl/>
-        <w:keepNext w:val="0"/>
         <w:rPr>
           <w:rFonts w:ascii="Times New Roman" w:hAnsi="Times New Roman" w:eastAsia="SimSun" w:cs="Times New Roman"/>
           <w:sz w:val="20"/>
@@ -736,7 +734,6 @@
         <w:pStyle w:val="BodyText"/>
         <w:snapToGrid w:val="0"/>
         <w:widowControl/>
-        <w:keepNext w:val="0"/>
         <w:rPr>
           <w:rFonts w:ascii="Times New Roman" w:hAnsi="Times New Roman" w:eastAsia="SimSun" w:cs="Times New Roman"/>
           <w:sz w:val="20"/>
@@ -1206,7 +1203,6 @@
         <w:pStyle w:val="BodyText"/>
         <w:snapToGrid w:val="0"/>
         <w:widowControl/>
-        <w:keepNext w:val="0"/>
         <w:rPr>
           <w:rFonts w:ascii="Times New Roman" w:hAnsi="Times New Roman" w:eastAsia="SimSun" w:cs="Times New Roman"/>
           <w:sz w:val="20"/>
@@ -1232,7 +1228,6 @@
         <w:pStyle w:val="BodyText"/>
         <w:snapToGrid w:val="0"/>
         <w:widowControl/>
-        <w:keepNext w:val="0"/>
         <w:rPr>
           <w:rFonts w:ascii="Times New Roman" w:hAnsi="Times New Roman" w:eastAsia="SimSun" w:cs="Times New Roman"/>
           <w:sz w:val="20"/>
@@ -1258,7 +1253,6 @@
         <w:pStyle w:val="BodyText"/>
         <w:snapToGrid w:val="0"/>
         <w:widowControl/>
-        <w:keepNext w:val="0"/>
         <w:rPr>
           <w:rFonts w:ascii="Times New Roman" w:hAnsi="Times New Roman" w:eastAsia="SimSun" w:cs="Times New Roman"/>
           <w:sz w:val="20"/>
@@ -1436,7 +1430,6 @@
         <w:pStyle w:val="BodyText"/>
         <w:snapToGrid w:val="0"/>
         <w:widowControl/>
-        <w:keepNext w:val="0"/>
         <w:rPr>
           <w:rFonts w:ascii="Times New Roman" w:hAnsi="Times New Roman" w:eastAsia="SimSun" w:cs="Times New Roman"/>
           <w:sz w:val="20"/>
@@ -2055,7 +2048,6 @@
         <w:pStyle w:val="BodyText"/>
         <w:snapToGrid w:val="0"/>
         <w:widowControl/>
-        <w:keepNext w:val="0"/>
         <w:rPr>
           <w:rFonts w:ascii="Times New Roman" w:hAnsi="Times New Roman" w:eastAsia="SimSun" w:cs="Times New Roman"/>
           <w:sz w:val="20"/>
@@ -2371,7 +2363,6 @@
         <w:pStyle w:val="BodyText"/>
         <w:snapToGrid w:val="0"/>
         <w:widowControl/>
-        <w:keepNext w:val="0"/>
         <w:rPr>
           <w:rFonts w:ascii="Times New Roman" w:hAnsi="Times New Roman" w:eastAsia="SimSun" w:cs="Times New Roman"/>
           <w:sz w:val="20"/>
@@ -2493,7 +2484,6 @@
         <w:pStyle w:val="BodyText"/>
         <w:snapToGrid w:val="0"/>
         <w:widowControl/>
-        <w:keepNext w:val="0"/>
         <w:rPr>
           <w:rFonts w:ascii="Times New Roman" w:hAnsi="Times New Roman" w:eastAsia="SimSun" w:cs="Times New Roman"/>
           <w:sz w:val="20"/>
@@ -6931,7 +6921,6 @@
         <w:pStyle w:val="BodyText"/>
         <w:snapToGrid w:val="0"/>
         <w:widowControl/>
-        <w:keepNext w:val="0"/>
         <w:rPr>
           <w:rFonts w:ascii="Times New Roman" w:hAnsi="Times New Roman" w:eastAsia="SimSun" w:cs="Times New Roman"/>
           <w:sz w:val="20"/>
@@ -10165,7 +10154,6 @@
         <w:pStyle w:val="BodyText"/>
         <w:snapToGrid w:val="0"/>
         <w:widowControl/>
-        <w:keepNext w:val="0"/>
         <w:rPr>
           <w:rFonts w:ascii="Times New Roman" w:hAnsi="Times New Roman" w:eastAsia="SimSun" w:cs="Times New Roman"/>
           <w:sz w:val="20"/>
@@ -11549,7 +11537,6 @@
         <w:pStyle w:val="BodyText"/>
         <w:snapToGrid w:val="0"/>
         <w:widowControl/>
-        <w:keepNext w:val="0"/>
         <w:rPr>
           <w:rFonts w:ascii="Times New Roman" w:hAnsi="Times New Roman" w:eastAsia="SimSun" w:cs="Times New Roman"/>
           <w:sz w:val="20"/>
@@ -12148,7 +12135,6 @@
           <w:szCs w:val="20"/>
           <w:color w:val="000000"/>
         </w:rPr>
-        <w:keepNext/>
       </w:pPr>
       <w:r>
         <w:rPr>
@@ -13196,7 +13182,6 @@
         <w:pStyle w:val="BodyText"/>
         <w:snapToGrid w:val="0"/>
         <w:widowControl/>
-        <w:keepNext w:val="0"/>
         <w:rPr>
           <w:rFonts w:ascii="Times New Roman" w:hAnsi="Times New Roman" w:eastAsia="SimSun" w:cs="Times New Roman"/>
           <w:sz w:val="20"/>
@@ -16518,7 +16503,6 @@
         <w:pStyle w:val="BodyText"/>
         <w:snapToGrid w:val="0"/>
         <w:widowControl/>
-        <w:keepNext w:val="0"/>
         <w:rPr>
           <w:rFonts w:ascii="Times New Roman" w:hAnsi="Times New Roman" w:eastAsia="SimSun" w:cs="Times New Roman"/>
           <w:sz w:val="20"/>
@@ -17708,7 +17692,6 @@
         <w:pStyle w:val="BodyText"/>
         <w:snapToGrid w:val="0"/>
         <w:widowControl/>
-        <w:keepNext w:val="0"/>
         <w:rPr>
           <w:rFonts w:ascii="Times New Roman" w:hAnsi="Times New Roman" w:eastAsia="SimSun" w:cs="Times New Roman"/>
           <w:sz w:val="20"/>
@@ -18153,7 +18136,6 @@
         <w:pStyle w:val="BodyText"/>
         <w:snapToGrid w:val="0"/>
         <w:widowControl/>
-        <w:keepNext w:val="0"/>
         <w:rPr>
           <w:rFonts w:ascii="Times New Roman" w:hAnsi="Times New Roman" w:eastAsia="SimSun" w:cs="Times New Roman"/>
           <w:sz w:val="20"/>
@@ -19337,7 +19319,6 @@
         <w:pStyle w:val="BodyText"/>
         <w:snapToGrid w:val="0"/>
         <w:widowControl/>
-        <w:keepNext w:val="0"/>
         <w:rPr>
           <w:rFonts w:ascii="Times New Roman" w:hAnsi="Times New Roman" w:eastAsia="SimSun" w:cs="Times New Roman"/>
           <w:sz w:val="20"/>
@@ -20216,7 +20197,6 @@
         <w:pStyle w:val="BodyText"/>
         <w:snapToGrid w:val="0"/>
         <w:widowControl/>
-        <w:keepNext w:val="0"/>
         <w:rPr>
           <w:rFonts w:ascii="Times New Roman" w:hAnsi="Times New Roman" w:eastAsia="SimSun" w:cs="Times New Roman"/>
           <w:sz w:val="20"/>
@@ -20303,7 +20283,6 @@
         <w:pStyle w:val="BodyText"/>
         <w:snapToGrid w:val="0"/>
         <w:widowControl/>
-        <w:keepNext w:val="0"/>
         <w:rPr>
           <w:rFonts w:ascii="Times New Roman" w:hAnsi="Times New Roman" w:eastAsia="SimSun" w:cs="Times New Roman"/>
           <w:sz w:val="20"/>
@@ -25697,7 +25676,6 @@
           <w:szCs w:val="20"/>
           <w:color w:val="000000"/>
         </w:rPr>
-        <w:keepNext/>
       </w:pPr>
       <w:r>
         <w:rPr>
@@ -27711,7 +27689,6 @@
         <w:pStyle w:val="BodyText"/>
         <w:snapToGrid w:val="0"/>
         <w:widowControl/>
-        <w:keepNext w:val="0"/>
         <w:rPr>
           <w:rFonts w:ascii="Times New Roman" w:hAnsi="Times New Roman" w:eastAsia="SimSun" w:cs="Times New Roman"/>
           <w:sz w:val="20"/>
@@ -28828,7 +28805,6 @@
         <w:pStyle w:val="BodyText"/>
         <w:snapToGrid w:val="0"/>
         <w:widowControl/>
-        <w:keepNext w:val="0"/>
         <w:rPr>
           <w:rFonts w:ascii="Times New Roman" w:hAnsi="Times New Roman" w:eastAsia="SimSun" w:cs="Times New Roman"/>
           <w:sz w:val="20"/>
@@ -29711,7 +29687,6 @@
         <w:pStyle w:val="BodyText"/>
         <w:snapToGrid w:val="0"/>
         <w:widowControl/>
-        <w:keepNext w:val="0"/>
         <w:rPr>
           <w:rFonts w:ascii="Times New Roman" w:hAnsi="Times New Roman" w:eastAsia="SimSun" w:cs="Times New Roman"/>
           <w:sz w:val="20"/>
@@ -30668,7 +30643,6 @@
         <w:pStyle w:val="BodyText"/>
         <w:snapToGrid w:val="0"/>
         <w:widowControl/>
-        <w:keepNext w:val="0"/>
         <w:rPr>
           <w:rFonts w:ascii="Times New Roman" w:hAnsi="Times New Roman" w:eastAsia="SimSun" w:cs="Times New Roman"/>
           <w:sz w:val="20"/>
@@ -30729,7 +30703,6 @@
         <w:pStyle w:val="BodyText"/>
         <w:snapToGrid w:val="0"/>
         <w:widowControl/>
-        <w:keepNext w:val="0"/>
         <w:rPr>
           <w:rFonts w:ascii="Times New Roman" w:hAnsi="Times New Roman" w:eastAsia="SimSun" w:cs="Times New Roman"/>
           <w:sz w:val="20"/>
@@ -30752,8 +30725,6 @@
     </w:p>
     <w:tbl>
       <w:tblPr>
-        <w:tblpPr w:leftFromText="0" w:rightFromText="0" w:topFromText="120" w:bottomFromText="120" w:vertAnchor="margin" w:horzAnchor="margin" w:tblpYSpec="bottom" w:tblpXSpec="left"/>
-        <w:tblOverlap w:val="never"/>
         <w:tblW w:w="5033" w:type="dxa"/>
         <w:tblLayout w:type="fixed"/>
         <w:tblBorders>
@@ -31301,7 +31272,6 @@
         <w:pStyle w:val="BodyText"/>
         <w:snapToGrid w:val="0"/>
         <w:widowControl/>
-        <w:keepNext w:val="0"/>
         <w:rPr>
           <w:rFonts w:ascii="Times New Roman" w:hAnsi="Times New Roman" w:eastAsia="SimSun" w:cs="Times New Roman"/>
           <w:sz w:val="20"/>
@@ -31324,8 +31294,6 @@
     </w:p>
     <w:tbl>
       <w:tblPr>
-        <w:tblpPr w:leftFromText="0" w:rightFromText="0" w:topFromText="120" w:bottomFromText="120" w:vertAnchor="margin" w:horzAnchor="margin" w:tblpYSpec="top" w:tblpXSpec="right"/>
-        <w:tblOverlap w:val="never"/>
         <w:tblW w:w="5033" w:type="dxa"/>
         <w:tblLayout w:type="fixed"/>
         <w:tblBorders>
@@ -31950,7 +31918,6 @@
         <w:pStyle w:val="BodyText"/>
         <w:snapToGrid w:val="0"/>
         <w:widowControl/>
-        <w:keepNext w:val="0"/>
         <w:rPr>
           <w:rFonts w:ascii="Times New Roman" w:hAnsi="Times New Roman" w:eastAsia="SimSun" w:cs="Times New Roman"/>
           <w:sz w:val="20"/>
@@ -31976,7 +31943,6 @@
         <w:pStyle w:val="BodyText"/>
         <w:snapToGrid w:val="0"/>
         <w:widowControl/>
-        <w:keepNext w:val="0"/>
         <w:rPr>
           <w:rFonts w:ascii="Times New Roman" w:hAnsi="Times New Roman" w:eastAsia="SimSun" w:cs="Times New Roman"/>
           <w:sz w:val="20"/>
@@ -32039,7 +32005,6 @@
           <w:numId w:val="8"/>
         </w:numPr>
         <w:keepLines/>
-        <w:keepNext w:val="0"/>
         <w:ind w:left="360" w:hanging="360"/>
         <w:rPr>
           <w:rFonts w:ascii="Times New Roman" w:hAnsi="Times New Roman" w:eastAsia="SimSun" w:cs="Times New Roman"/>
@@ -32160,7 +32125,6 @@
           <w:numId w:val="8"/>
         </w:numPr>
         <w:keepLines/>
-        <w:keepNext w:val="0"/>
         <w:ind w:left="360" w:hanging="360"/>
         <w:rPr>
           <w:rFonts w:ascii="Times New Roman" w:hAnsi="Times New Roman" w:eastAsia="SimSun" w:cs="Times New Roman"/>
@@ -32253,7 +32217,6 @@
           <w:numId w:val="8"/>
         </w:numPr>
         <w:keepLines/>
-        <w:keepNext w:val="0"/>
         <w:ind w:left="360" w:hanging="360"/>
         <w:rPr>
           <w:rFonts w:ascii="Times New Roman" w:hAnsi="Times New Roman" w:eastAsia="SimSun" w:cs="Times New Roman"/>
@@ -32346,7 +32309,6 @@
           <w:numId w:val="8"/>
         </w:numPr>
         <w:keepLines/>
-        <w:keepNext w:val="0"/>
         <w:ind w:left="360" w:hanging="360"/>
         <w:rPr>
           <w:rFonts w:ascii="Times New Roman" w:hAnsi="Times New Roman" w:eastAsia="SimSun" w:cs="Times New Roman"/>
@@ -32411,7 +32373,6 @@
           <w:numId w:val="8"/>
         </w:numPr>
         <w:keepLines/>
-        <w:keepNext w:val="0"/>
         <w:ind w:left="360" w:hanging="360"/>
         <w:rPr>
           <w:rFonts w:ascii="Times New Roman" w:hAnsi="Times New Roman" w:eastAsia="SimSun" w:cs="Times New Roman"/>
@@ -32476,7 +32437,6 @@
           <w:numId w:val="8"/>
         </w:numPr>
         <w:keepLines/>
-        <w:keepNext w:val="0"/>
         <w:ind w:left="360" w:hanging="360"/>
         <w:rPr>
           <w:rFonts w:ascii="Times New Roman" w:hAnsi="Times New Roman" w:eastAsia="SimSun" w:cs="Times New Roman"/>
@@ -32513,7 +32473,6 @@
           <w:numId w:val="8"/>
         </w:numPr>
         <w:keepLines/>
-        <w:keepNext w:val="0"/>
         <w:ind w:left="360" w:hanging="360"/>
         <w:rPr>
           <w:rFonts w:ascii="Times New Roman" w:hAnsi="Times New Roman" w:eastAsia="SimSun" w:cs="Times New Roman"/>
@@ -32578,7 +32537,6 @@
           <w:numId w:val="8"/>
         </w:numPr>
         <w:keepLines/>
-        <w:keepNext w:val="0"/>
         <w:ind w:left="360" w:hanging="360"/>
         <w:rPr>
           <w:rFonts w:ascii="Times New Roman" w:hAnsi="Times New Roman" w:eastAsia="SimSun" w:cs="Times New Roman"/>
@@ -32671,7 +32629,6 @@
           <w:numId w:val="8"/>
         </w:numPr>
         <w:keepLines/>
-        <w:keepNext w:val="0"/>
         <w:ind w:left="360" w:hanging="360"/>
         <w:rPr>
           <w:rFonts w:ascii="Times New Roman" w:hAnsi="Times New Roman" w:eastAsia="SimSun" w:cs="Times New Roman"/>
@@ -34738,7 +34695,7 @@
       <w:tabs>
         <w:tab w:val="left" w:pos="288"/>
       </w:tabs>
-      <w:spacing w:after="120" w:line="228" w:lineRule="auto"/>
+      <w:spacing w:after="40" w:line="216" w:lineRule="auto"/>
       <w:ind w:firstLine="288"/>
       <w:jc w:val="both"/>
     </w:pPr>
@@ -34779,7 +34736,7 @@
         <w:tab w:val="center" w:pos="2520"/>
         <w:tab w:val="right" w:pos="5040"/>
       </w:tabs>
-      <w:spacing w:before="240" w:after="240" w:line="216" w:lineRule="auto"/>
+      <w:spacing w:before="40" w:after="40" w:line="216" w:lineRule="auto"/>
     </w:pPr>
     <w:rPr>
       <w:rFonts w:ascii="Symbol" w:hAnsi="Symbol" w:cs="Symbol"/>
@@ -34851,7 +34808,7 @@
       <w:numPr>
         <w:numId w:val="8"/>
       </w:numPr>
-      <w:spacing w:after="50" w:line="180" w:lineRule="exact"/>
+      <w:spacing w:after="0" w:line="170" w:lineRule="exact"/>
       <w:jc w:val="both"/>
     </w:pPr>
     <w:rPr>

</xml_diff>

<commit_message>
Fix equation clipping and balance column whitespace
</commit_message>
<xml_diff>
--- a/Article5_English_IEEE_Letter_Compact.docx
+++ b/Article5_English_IEEE_Letter_Compact.docx
@@ -26334,7 +26334,7 @@
               </w:rPr>
               <w:drawing>
                 <wp:inline distT="0" distB="0" distL="0" distR="0" ns4:anchorId="02AEBE66" ns4:editId="04CB13EB">
-                  <wp:extent cx="3059430" cy="2045970"/>
+                  <wp:extent cx="2202790" cy="1473098"/>
                   <wp:effectExtent l="0" t="0" r="0" b="0"/>
                   <wp:docPr id="1010" name="Fig. 9" descr="Delta 三支链及单支链几何模型，基座原点位于静平台中心"/>
                   <wp:cNvGraphicFramePr>
@@ -31360,7 +31360,7 @@
               </w:rPr>
               <w:drawing>
                 <wp:inline distT="0" distB="0" distL="0" distR="0" ns4:anchorId="393BDBD5" ns4:editId="486D490E">
-                  <wp:extent cx="1422000" cy="1063462"/>
+                  <wp:extent cx="1137600" cy="850770"/>
                   <wp:effectExtent l="0" t="0" r="0" b="3175"/>
                   <wp:docPr id="1015" name="Fig. 10(b)" descr="(b) 1.8 s"/>
                   <wp:cNvGraphicFramePr>
@@ -31423,7 +31423,7 @@
               </w:rPr>
               <w:drawing>
                 <wp:inline distT="0" distB="0" distL="0" distR="0" ns4:anchorId="23986D4A" ns4:editId="29A56323">
-                  <wp:extent cx="1422000" cy="1063462"/>
+                  <wp:extent cx="1137600" cy="850770"/>
                   <wp:effectExtent l="0" t="0" r="0" b="3175"/>
                   <wp:docPr id="1016" name="Fig. 10(c)" descr="(c) 2.6 s"/>
                   <wp:cNvGraphicFramePr>
@@ -31606,7 +31606,7 @@
               </w:rPr>
               <w:drawing>
                 <wp:inline distT="0" distB="0" distL="0" distR="0" ns4:anchorId="48D8F27B" ns4:editId="45DB3E70">
-                  <wp:extent cx="1422000" cy="1137600"/>
+                  <wp:extent cx="1137600" cy="910080"/>
                   <wp:effectExtent l="0" t="0" r="0" b="1905"/>
                   <wp:docPr id="1017" name="Fig. 10(f)" descr="(f) 5.1 s"/>
                   <wp:cNvGraphicFramePr>
@@ -31669,7 +31669,7 @@
               </w:rPr>
               <w:drawing>
                 <wp:inline distT="0" distB="0" distL="0" distR="0" ns4:anchorId="06F71BCB" ns4:editId="50F1EAB3">
-                  <wp:extent cx="1422000" cy="1137600"/>
+                  <wp:extent cx="1137600" cy="910080"/>
                   <wp:effectExtent l="0" t="0" r="0" b="1905"/>
                   <wp:docPr id="1018" name="Fig. 10(g)" descr="(g) 5.8 s"/>
                   <wp:cNvGraphicFramePr>
@@ -34736,7 +34736,7 @@
         <w:tab w:val="center" w:pos="2520"/>
         <w:tab w:val="right" w:pos="5040"/>
       </w:tabs>
-      <w:spacing w:before="40" w:after="40" w:line="216" w:lineRule="auto"/>
+      <w:spacing w:before="40" w:after="40" w:line="300" w:lineRule="auto"/>
     </w:pPr>
     <w:rPr>
       <w:rFonts w:ascii="Symbol" w:hAnsi="Symbol" w:cs="Symbol"/>

</xml_diff>

<commit_message>
Review English translation and fix figure references
</commit_message>
<xml_diff>
--- a/Article5_English_IEEE_Letter_Compact.docx
+++ b/Article5_English_IEEE_Letter_Compact.docx
@@ -611,7 +611,7 @@
           <w:i w:val="0"/>
           <w:iCs w:val="0"/>
         </w:rPr>
-        <w:t xml:space="preserve">Quadrupedal manipulators combine terrain adaptability and environmental interaction for disaster response, hazardous operations, and campus inspection. This paper presents a Mecanum-wheeled quadrupedal mobile manipulator and heterogeneous teleoperation system. Each leg has two pitch joints and one wheel-drive degree of freedom; Mecanum wheel constraints enable omnidirectional planar motion. Hierarchical torque feedforward combines single-leg virtual-work mapping and whole-body single-rigid-body modeling, with attitude feedback adjusting leg length. The six-axis arm uses analytical inverse kinematics through position–orientation decomposition. A Delta parallel mechanism and three-encoder handle provide master position and orientation inputs. Frame calibration and pose mapping convert these inputs into arm joint commands.. The framework connects mechanism design, kinematic modeling, model-based feedforward, and joint control to support system design and implementation. Physical demonstrations illustrate system execution.</w:t>
+        <w:t>Quadrupedal manipulators combine terrain adaptability and environmental interaction for disaster response, hazardous operations, and campus inspection. This paper presents a Mecanum-wheeled quadrupedal mobile manipulator and heterogeneous teleoperation system. Each leg has two pitch joints and one wheel-drive degree of freedom; The four Mecanum wheels enable omnidirectional planar motion. Hierarchical torque feedforward combines single-leg virtual-work mapping and whole-body single-rigid-body modeling, with attitude feedback adjusting leg length. The six-axis arm uses analytical inverse kinematics through position–orientation decomposition. A Delta parallel mechanism provides master position input, and a three-axis handle with three encoders provides orientation input. Frame calibration and pose mapping convert these inputs into arm joint commands. The framework connects mechanism design, kinematic modeling, model-based feedforward, and joint control to support system design and implementation. Physical demonstrations illustrate system operation.</w:t>
       </w:r>
     </w:p>
     <w:p ns2:paraId="1BD36AE0" ns2:textId="77777777">
@@ -694,7 +694,7 @@
       <w:r>
         <w:rPr>
           <w:rFonts w:ascii="Times New Roman" w:hAnsi="Times New Roman" w:eastAsia="SimSun" w:cs="Times New Roman"/>
-          <w:sz w:val="20"/>
+          <w:sz w:val="19"/>
           <w:szCs w:val="20"/>
           <w:color w:val="000000"/>
           <w:b w:val="0"/>
@@ -719,14 +719,14 @@
       <w:r>
         <w:rPr>
           <w:rFonts w:ascii="Times New Roman" w:hAnsi="Times New Roman" w:eastAsia="SimSun" w:cs="Times New Roman"/>
-          <w:sz w:val="20"/>
+          <w:sz w:val="19"/>
           <w:szCs w:val="20"/>
           <w:color w:val="000000"/>
           <w:b w:val="0"/>
           <w:i w:val="0"/>
           <w:lang w:val="en-US"/>
         </w:rPr>
-        <w:t>Prior work includes wheel–leg coordination using rolling constraints and whole-body control [1], [2], and Mecanum quadrupeds for planar motion [3]. Mobile-manipulation studies address arm-constrained learning, cross-configuration control, and whole-body optimization [4]–[6]. Teleoperation has used mixed reality [7] and Delta-based six-degree-of-freedom masters [8]. Task-specific chassis–arm coordination and heterogeneous pose mapping remain open needs.</w:t>
+        <w:t>Prior work includes wheel–leg coordination using rolling constraints and whole-body control [1], [2], and Mecanum quadrupeds for planar motion [3]. Mobile-manipulation studies address arm-constrained learning, cross-configuration control, and whole-body optimization [4]–[6]. Teleoperation has used mixed reality [7] and Delta-based six-degree-of-freedom masters [8]. Task-specific chassis–arm coordination and heterogeneous pose mapping remain important integration challenges.</w:t>
       </w:r>
     </w:p>
     <w:p ns2:paraId="17D6BEE5" ns2:textId="77777777">
@@ -744,7 +744,7 @@
       <w:r>
         <w:rPr>
           <w:rFonts w:ascii="Times New Roman" w:hAnsi="Times New Roman" w:eastAsia="SimSun" w:cs="Times New Roman"/>
-          <w:sz w:val="20"/>
+          <w:sz w:val="19"/>
           <w:szCs w:val="20"/>
           <w:color w:val="000000"/>
           <w:b w:val="0"/>
@@ -1156,10 +1156,6 @@
               <w:pStyle w:val="figurecaption"/>
               <w:snapToGrid w:val="0"/>
               <w:widowControl/>
-              <w:numPr>
-                <w:ilvl w:val="0"/>
-                <w:numId w:val="2"/>
-              </w:numPr>
               <w:keepLines/>
               <w:keepNext w:val="0"/>
               <w:rPr>
@@ -1183,7 +1179,7 @@
                 <w:i w:val="0"/>
                 <w:lang w:val="en-US"/>
               </w:rPr>
-              <w:t xml:space="preserve">System modules and coordinate frames. (a) Robot: orange/cyan mark the arm/chassis; {s}, {b}, {leg}, and {0} denote the inertial frame, base center, illustrated hip, and arm base. Forward is rightward. (b) Teleoperation master: purple marks the controller; light blue/orange mark the Delta mechanism/three-axis handle. {D} is centered at O on the fixed platform; P marks the moving-platform center. All frames are right-handed.</w:t>
+              <w:t xml:space="preserve">Fig. 1. System modules and coordinate frames. (a) Robot: orange/cyan mark the arm/chassis; {s}, {b}, {leg}, and {0} denote the inertial frame, base center, illustrated hip, and arm base. Forward is rightward. (b) Teleoperation master: purple marks the controller; light blue/orange mark the Delta mechanism/three-axis handle. {D} is centered at O on the fixed platform; P marks the moving-platform center. All frames are right-handed.</w:t>
             </w:r>
           </w:p>
         </w:tc>
@@ -1213,7 +1209,7 @@
       <w:r>
         <w:rPr>
           <w:rFonts w:ascii="Times New Roman" w:hAnsi="Times New Roman" w:eastAsia="SimSun" w:cs="Times New Roman"/>
-          <w:sz w:val="20"/>
+          <w:sz w:val="19"/>
           <w:szCs w:val="20"/>
           <w:color w:val="000000"/>
           <w:b w:val="0"/>
@@ -1238,7 +1234,7 @@
       <w:r>
         <w:rPr>
           <w:rFonts w:ascii="Times New Roman" w:hAnsi="Times New Roman" w:eastAsia="SimSun" w:cs="Times New Roman"/>
-          <w:sz w:val="20"/>
+          <w:sz w:val="19"/>
           <w:szCs w:val="20"/>
           <w:color w:val="000000"/>
           <w:b w:val="0"/>
@@ -1263,7 +1259,7 @@
       <w:r>
         <w:rPr>
           <w:rFonts w:ascii="Times New Roman" w:hAnsi="Times New Roman" w:eastAsia="SimSun" w:cs="Times New Roman"/>
-          <w:sz w:val="20"/>
+          <w:sz w:val="19"/>
           <w:szCs w:val="20"/>
           <w:color w:val="000000"/>
           <w:b w:val="0"/>
@@ -1383,10 +1379,6 @@
               <w:pStyle w:val="figurecaption"/>
               <w:snapToGrid w:val="0"/>
               <w:widowControl/>
-              <w:numPr>
-                <w:ilvl w:val="0"/>
-                <w:numId w:val="2"/>
-              </w:numPr>
               <w:keepLines/>
               <w:keepNext w:val="0"/>
               <w:rPr>
@@ -1410,7 +1402,7 @@
                 <w:i w:val="0"/>
                 <w:lang w:val="en-US"/>
               </w:rPr>
-              <w:t xml:space="preserve">System control workflow. (a) Master-to-arm pose mapping and arm control. (b) Chassis joint, Mecanum wheel, and feedforward branches. Contact-force allocation and force mapping generate feedforward torques, added to control torques. Solid/dashed lines denote forward/feedback paths; FF denotes feedforward.</w:t>
+              <w:t xml:space="preserve">Fig. 2. System control workflow. (a) Master-to-arm pose mapping and arm control. (b) Chassis joint, Mecanum wheel, and feedforward branches. Contact-force allocation and force mapping generate feedforward torques, added to control torques. Solid/dashed lines denote forward/feedback paths; FF denotes feedforward.</w:t>
             </w:r>
           </w:p>
         </w:tc>
@@ -1440,7 +1432,7 @@
       <w:r>
         <w:rPr>
           <w:rFonts w:ascii="Times New Roman" w:hAnsi="Times New Roman" w:eastAsia="SimSun" w:cs="Times New Roman"/>
-          <w:sz w:val="20"/>
+          <w:sz w:val="19"/>
           <w:szCs w:val="20"/>
           <w:color w:val="000000"/>
           <w:b w:val="0"/>
@@ -1466,7 +1458,7 @@
       <w:r>
         <w:rPr>
           <w:rFonts w:ascii="Times New Roman" w:hAnsi="Times New Roman" w:eastAsia="SimSun" w:cs="Times New Roman"/>
-          <w:sz w:val="20"/>
+          <w:sz w:val="19"/>
           <w:szCs w:val="20"/>
           <w:color w:val="000000"/>
           <w:b w:val="0"/>
@@ -1492,7 +1484,7 @@
       <w:r>
         <w:rPr>
           <w:rFonts w:ascii="Times New Roman" w:hAnsi="Times New Roman" w:eastAsia="SimSun" w:cs="Times New Roman"/>
-          <w:sz w:val="20"/>
+          <w:sz w:val="19"/>
           <w:szCs w:val="20"/>
           <w:color w:val="000000"/>
           <w:b w:val="0"/>
@@ -1633,7 +1625,7 @@
       <w:r>
         <w:rPr>
           <w:rFonts w:ascii="Times New Roman" w:hAnsi="Times New Roman" w:eastAsia="SimSun" w:cs="Times New Roman"/>
-          <w:sz w:val="20"/>
+          <w:sz w:val="19"/>
           <w:szCs w:val="20"/>
           <w:color w:val="000000"/>
           <w:b w:val="0"/>
@@ -1656,7 +1648,7 @@
       <w:r>
         <w:rPr>
           <w:rFonts w:ascii="Times New Roman" w:hAnsi="Times New Roman" w:eastAsia="SimSun" w:cs="Times New Roman"/>
-          <w:sz w:val="20"/>
+          <w:sz w:val="19"/>
           <w:szCs w:val="20"/>
           <w:color w:val="000000"/>
           <w:b w:val="0"/>
@@ -1704,7 +1696,7 @@
       <w:r>
         <w:rPr>
           <w:rFonts w:ascii="Times New Roman" w:hAnsi="Times New Roman" w:eastAsia="SimSun" w:cs="Times New Roman"/>
-          <w:sz w:val="20"/>
+          <w:sz w:val="19"/>
           <w:szCs w:val="20"/>
           <w:color w:val="000000"/>
           <w:b w:val="0"/>
@@ -1755,7 +1747,7 @@
       <w:r>
         <w:rPr>
           <w:rFonts w:ascii="Times New Roman" w:hAnsi="Times New Roman" w:eastAsia="SimSun" w:cs="Times New Roman"/>
-          <w:sz w:val="20"/>
+          <w:sz w:val="19"/>
           <w:szCs w:val="20"/>
           <w:color w:val="000000"/>
           <w:b w:val="0"/>
@@ -1806,7 +1798,7 @@
       <w:r>
         <w:rPr>
           <w:rFonts w:ascii="Times New Roman" w:hAnsi="Times New Roman" w:eastAsia="SimSun" w:cs="Times New Roman"/>
-          <w:sz w:val="20"/>
+          <w:sz w:val="19"/>
           <w:szCs w:val="20"/>
           <w:color w:val="000000"/>
           <w:b w:val="0"/>
@@ -1832,7 +1824,7 @@
       <w:r>
         <w:rPr>
           <w:rFonts w:ascii="Times New Roman" w:hAnsi="Times New Roman" w:eastAsia="SimSun" w:cs="Times New Roman"/>
-          <w:sz w:val="20"/>
+          <w:sz w:val="19"/>
           <w:szCs w:val="20"/>
           <w:color w:val="000000"/>
           <w:b w:val="0"/>
@@ -1858,7 +1850,7 @@
       <w:r>
         <w:rPr>
           <w:rFonts w:ascii="Times New Roman" w:hAnsi="Times New Roman" w:eastAsia="SimSun" w:cs="Times New Roman"/>
-          <w:sz w:val="20"/>
+          <w:sz w:val="19"/>
           <w:szCs w:val="20"/>
           <w:color w:val="000000"/>
           <w:b w:val="0"/>
@@ -1884,7 +1876,7 @@
       <w:r>
         <w:rPr>
           <w:rFonts w:ascii="Times New Roman" w:hAnsi="Times New Roman" w:eastAsia="SimSun" w:cs="Times New Roman"/>
-          <w:sz w:val="20"/>
+          <w:sz w:val="19"/>
           <w:szCs w:val="20"/>
           <w:color w:val="000000"/>
           <w:b w:val="0"/>
@@ -2033,7 +2025,7 @@
       <w:r>
         <w:rPr>
           <w:rFonts w:ascii="Times New Roman" w:hAnsi="Times New Roman" w:eastAsia="SimSun" w:cs="Times New Roman"/>
-          <w:sz w:val="20"/>
+          <w:sz w:val="19"/>
           <w:szCs w:val="20"/>
           <w:color w:val="000000"/>
           <w:b w:val="0"/>
@@ -2058,7 +2050,7 @@
       <w:r>
         <w:rPr>
           <w:rFonts w:ascii="Times New Roman" w:hAnsi="Times New Roman" w:eastAsia="SimSun" w:cs="Times New Roman"/>
-          <w:sz w:val="20"/>
+          <w:sz w:val="19"/>
           <w:szCs w:val="20"/>
           <w:color w:val="000000"/>
           <w:b w:val="0"/>
@@ -2084,7 +2076,7 @@
       <w:r>
         <w:rPr>
           <w:rFonts w:ascii="Times New Roman" w:hAnsi="Times New Roman" w:eastAsia="SimSun" w:cs="Times New Roman"/>
-          <w:sz w:val="20"/>
+          <w:sz w:val="19"/>
           <w:szCs w:val="20"/>
           <w:color w:val="000000"/>
           <w:b w:val="0"/>
@@ -2110,7 +2102,7 @@
       <w:r>
         <w:rPr>
           <w:rFonts w:ascii="Times New Roman" w:hAnsi="Times New Roman" w:eastAsia="SimSun" w:cs="Times New Roman"/>
-          <w:sz w:val="20"/>
+          <w:sz w:val="19"/>
           <w:szCs w:val="20"/>
           <w:color w:val="000000"/>
           <w:b w:val="0"/>
@@ -2133,7 +2125,7 @@
       <w:r>
         <w:rPr>
           <w:rFonts w:ascii="Times New Roman" w:hAnsi="Times New Roman" w:eastAsia="SimSun" w:cs="Times New Roman"/>
-          <w:sz w:val="20"/>
+          <w:sz w:val="19"/>
           <w:szCs w:val="20"/>
           <w:color w:val="000000"/>
           <w:b w:val="0"/>
@@ -2156,7 +2148,7 @@
       <w:r>
         <w:rPr>
           <w:rFonts w:ascii="Times New Roman" w:hAnsi="Times New Roman" w:eastAsia="SimSun" w:cs="Times New Roman"/>
-          <w:sz w:val="20"/>
+          <w:sz w:val="19"/>
           <w:szCs w:val="20"/>
           <w:color w:val="000000"/>
           <w:b w:val="0"/>
@@ -2179,7 +2171,7 @@
       <w:r>
         <w:rPr>
           <w:rFonts w:ascii="Times New Roman" w:hAnsi="Times New Roman" w:eastAsia="SimSun" w:cs="Times New Roman"/>
-          <w:sz w:val="20"/>
+          <w:sz w:val="19"/>
           <w:szCs w:val="20"/>
           <w:color w:val="000000"/>
           <w:b w:val="0"/>
@@ -2251,7 +2243,7 @@
       <w:r>
         <w:rPr>
           <w:rFonts w:ascii="Times New Roman" w:hAnsi="Times New Roman" w:eastAsia="SimSun" w:cs="Times New Roman"/>
-          <w:sz w:val="20"/>
+          <w:sz w:val="19"/>
           <w:szCs w:val="20"/>
           <w:color w:val="000000"/>
           <w:b w:val="0"/>
@@ -2274,7 +2266,7 @@
       <w:r>
         <w:rPr>
           <w:rFonts w:ascii="Times New Roman" w:hAnsi="Times New Roman" w:eastAsia="SimSun" w:cs="Times New Roman"/>
-          <w:sz w:val="20"/>
+          <w:sz w:val="19"/>
           <w:szCs w:val="20"/>
           <w:color w:val="000000"/>
           <w:b w:val="0"/>
@@ -2297,7 +2289,7 @@
       <w:r>
         <w:rPr>
           <w:rFonts w:ascii="Times New Roman" w:hAnsi="Times New Roman" w:eastAsia="SimSun" w:cs="Times New Roman"/>
-          <w:sz w:val="20"/>
+          <w:sz w:val="19"/>
           <w:szCs w:val="20"/>
           <w:color w:val="000000"/>
           <w:b w:val="0"/>
@@ -2348,7 +2340,7 @@
       <w:r>
         <w:rPr>
           <w:rFonts w:ascii="Times New Roman" w:hAnsi="Times New Roman" w:eastAsia="SimSun" w:cs="Times New Roman"/>
-          <w:sz w:val="20"/>
+          <w:sz w:val="19"/>
           <w:szCs w:val="20"/>
           <w:color w:val="000000"/>
           <w:b w:val="0"/>
@@ -2373,14 +2365,14 @@
       <w:r>
         <w:rPr>
           <w:rFonts w:ascii="Times New Roman" w:hAnsi="Times New Roman" w:eastAsia="SimSun" w:cs="Times New Roman"/>
-          <w:sz w:val="20"/>
+          <w:sz w:val="19"/>
           <w:szCs w:val="20"/>
           <w:color w:val="000000"/>
           <w:b w:val="0"/>
           <w:i w:val="0"/>
           <w:lang w:val="en-US"/>
         </w:rPr>
-        <w:t xml:space="preserve">Slave arm base frame {A} is fixed to the arm base, corresponding to {0} in Fig. 1. Master base frame {D} is fixed to the Delta fixed-platform center, with axes defined in Section II-C. Frame transformation precedes slave inverse kinematics.</w:t>
+        <w:t xml:space="preserve">Slave arm base frame {A} is fixed to the arm base, corresponding to {0} in Fig. 1. Master base frame {D} is fixed to the Delta fixed-platform center, with axes defined in Section II-D. Frame transformation precedes slave inverse kinematics.</w:t>
       </w:r>
     </w:p>
     <w:p ns2:paraId="6F223393" ns2:textId="77777777">
@@ -2494,7 +2486,7 @@
       <w:r>
         <w:rPr>
           <w:rFonts w:ascii="Times New Roman" w:hAnsi="Times New Roman" w:eastAsia="SimSun" w:cs="Times New Roman"/>
-          <w:sz w:val="20"/>
+          <w:sz w:val="19"/>
           <w:szCs w:val="20"/>
           <w:color w:val="000000"/>
           <w:b w:val="0"/>
@@ -4616,7 +4608,7 @@
       <w:r>
         <w:rPr>
           <w:rFonts w:ascii="Times New Roman" w:hAnsi="Times New Roman" w:eastAsia="SimSun" w:cs="Times New Roman"/>
-          <w:sz w:val="20"/>
+          <w:sz w:val="19"/>
           <w:szCs w:val="20"/>
           <w:color w:val="000000"/>
           <w:b w:val="0"/>
@@ -5360,7 +5352,7 @@
       <w:r>
         <w:rPr>
           <w:rFonts w:ascii="Times New Roman" w:hAnsi="Times New Roman" w:eastAsia="SimSun" w:cs="Times New Roman"/>
-          <w:sz w:val="20"/>
+          <w:sz w:val="19"/>
           <w:szCs w:val="20"/>
           <w:color w:val="000000"/>
           <w:b w:val="0"/>
@@ -6116,7 +6108,7 @@
       <w:r>
         <w:rPr>
           <w:rFonts w:ascii="Times New Roman" w:hAnsi="Times New Roman" w:eastAsia="SimSun" w:cs="Times New Roman"/>
-          <w:sz w:val="20"/>
+          <w:sz w:val="19"/>
           <w:szCs w:val="20"/>
           <w:color w:val="000000"/>
           <w:b w:val="0"/>
@@ -6265,7 +6257,7 @@
       <w:r>
         <w:rPr>
           <w:rFonts w:ascii="Times New Roman" w:hAnsi="Times New Roman" w:eastAsia="SimSun" w:cs="Times New Roman"/>
-          <w:sz w:val="20"/>
+          <w:sz w:val="19"/>
           <w:szCs w:val="20"/>
           <w:color w:val="000000"/>
           <w:b w:val="0"/>
@@ -6931,7 +6923,7 @@
       <w:r>
         <w:rPr>
           <w:rFonts w:ascii="Times New Roman" w:hAnsi="Times New Roman" w:eastAsia="SimSun" w:cs="Times New Roman"/>
-          <w:sz w:val="20"/>
+          <w:sz w:val="19"/>
           <w:szCs w:val="20"/>
           <w:color w:val="000000"/>
           <w:b w:val="0"/>
@@ -7197,7 +7189,7 @@
       <w:r>
         <w:rPr>
           <w:rFonts w:ascii="Times New Roman" w:hAnsi="Times New Roman" w:eastAsia="SimSun" w:cs="Times New Roman"/>
-          <w:sz w:val="20"/>
+          <w:sz w:val="19"/>
           <w:szCs w:val="20"/>
           <w:color w:val="000000"/>
           <w:b w:val="0"/>
@@ -7274,7 +7266,7 @@
       <w:r>
         <w:rPr>
           <w:rFonts w:ascii="Times New Roman" w:hAnsi="Times New Roman" w:eastAsia="SimSun" w:cs="Times New Roman"/>
-          <w:sz w:val="20"/>
+          <w:sz w:val="19"/>
           <w:szCs w:val="20"/>
           <w:color w:val="000000"/>
           <w:b w:val="0"/>
@@ -7361,7 +7353,7 @@
       <w:r>
         <w:rPr>
           <w:rFonts w:ascii="Times New Roman" w:hAnsi="Times New Roman" w:eastAsia="SimSun" w:cs="Times New Roman"/>
-          <w:sz w:val="20"/>
+          <w:sz w:val="19"/>
           <w:szCs w:val="20"/>
           <w:color w:val="000000"/>
           <w:b w:val="0"/>
@@ -7409,7 +7401,7 @@
       <w:r>
         <w:rPr>
           <w:rFonts w:ascii="Times New Roman" w:hAnsi="Times New Roman" w:eastAsia="SimSun" w:cs="Times New Roman"/>
-          <w:sz w:val="20"/>
+          <w:sz w:val="19"/>
           <w:szCs w:val="20"/>
           <w:color w:val="000000"/>
           <w:b w:val="0"/>
@@ -7544,7 +7536,7 @@
       <w:r>
         <w:rPr>
           <w:rFonts w:ascii="Times New Roman" w:hAnsi="Times New Roman" w:eastAsia="SimSun" w:cs="Times New Roman"/>
-          <w:sz w:val="20"/>
+          <w:sz w:val="19"/>
           <w:szCs w:val="20"/>
           <w:color w:val="000000"/>
           <w:b w:val="0"/>
@@ -7592,7 +7584,7 @@
       <w:r>
         <w:rPr>
           <w:rFonts w:ascii="Times New Roman" w:hAnsi="Times New Roman" w:eastAsia="SimSun" w:cs="Times New Roman"/>
-          <w:sz w:val="20"/>
+          <w:sz w:val="19"/>
           <w:szCs w:val="20"/>
           <w:color w:val="000000"/>
           <w:b w:val="0"/>
@@ -7643,7 +7635,7 @@
       <w:r>
         <w:rPr>
           <w:rFonts w:ascii="Times New Roman" w:hAnsi="Times New Roman" w:eastAsia="SimSun" w:cs="Times New Roman"/>
-          <w:sz w:val="20"/>
+          <w:sz w:val="19"/>
           <w:szCs w:val="20"/>
           <w:color w:val="000000"/>
           <w:b w:val="0"/>
@@ -7785,7 +7777,7 @@
       <w:r>
         <w:rPr>
           <w:rFonts w:ascii="Times New Roman" w:hAnsi="Times New Roman" w:eastAsia="SimSun" w:cs="Times New Roman"/>
-          <w:sz w:val="20"/>
+          <w:sz w:val="19"/>
           <w:szCs w:val="20"/>
           <w:color w:val="000000"/>
           <w:b w:val="0"/>
@@ -8452,10 +8444,6 @@
               <w:pStyle w:val="figurecaption"/>
               <w:snapToGrid w:val="0"/>
               <w:widowControl/>
-              <w:numPr>
-                <w:ilvl w:val="0"/>
-                <w:numId w:val="2"/>
-              </w:numPr>
               <w:keepLines/>
               <w:keepNext w:val="0"/>
               <w:rPr>
@@ -8479,7 +8467,7 @@
                 <w:i w:val="0"/>
                 <w:lang w:val="en-US"/>
               </w:rPr>
-              <w:t xml:space="preserve">Leg and Mecanum wheel structures. (a) Leg frames; angles show geometry, with zero configuration defined in the text. (b), (c) Type-A and Type-B wheels.</w:t>
+              <w:t xml:space="preserve">Fig. 3. Leg and Mecanum wheel structures. (a) Leg frames; angles show geometry, with zero configuration defined in the text. (b), (c) Type-A and Type-B wheels.</w:t>
             </w:r>
           </w:p>
         </w:tc>
@@ -8510,7 +8498,7 @@
       <w:r>
         <w:rPr>
           <w:rFonts w:ascii="Times New Roman" w:hAnsi="Times New Roman" w:eastAsia="SimSun" w:cs="Times New Roman"/>
-          <w:sz w:val="20"/>
+          <w:sz w:val="19"/>
           <w:szCs w:val="20"/>
           <w:color w:val="000000"/>
           <w:b w:val="0"/>
@@ -8555,7 +8543,7 @@
       <w:r>
         <w:rPr>
           <w:rFonts w:ascii="Times New Roman" w:hAnsi="Times New Roman" w:eastAsia="SimSun" w:cs="Times New Roman"/>
-          <w:sz w:val="20"/>
+          <w:sz w:val="19"/>
           <w:szCs w:val="20"/>
           <w:color w:val="000000"/>
           <w:b w:val="0"/>
@@ -8603,7 +8591,7 @@
       <w:r>
         <w:rPr>
           <w:rFonts w:ascii="Times New Roman" w:hAnsi="Times New Roman" w:eastAsia="SimSun" w:cs="Times New Roman"/>
-          <w:sz w:val="20"/>
+          <w:sz w:val="19"/>
           <w:szCs w:val="20"/>
           <w:color w:val="000000"/>
           <w:b w:val="0"/>
@@ -8745,7 +8733,7 @@
       <w:r>
         <w:rPr>
           <w:rFonts w:ascii="Times New Roman" w:hAnsi="Times New Roman" w:eastAsia="SimSun" w:cs="Times New Roman"/>
-          <w:sz w:val="20"/>
+          <w:sz w:val="19"/>
           <w:szCs w:val="20"/>
           <w:color w:val="000000"/>
           <w:b w:val="0"/>
@@ -8872,7 +8860,7 @@
       <w:r>
         <w:rPr>
           <w:rFonts w:ascii="Times New Roman" w:hAnsi="Times New Roman" w:eastAsia="SimSun" w:cs="Times New Roman"/>
-          <w:sz w:val="20"/>
+          <w:sz w:val="19"/>
           <w:szCs w:val="20"/>
           <w:color w:val="000000"/>
           <w:b w:val="0"/>
@@ -9360,7 +9348,7 @@
       <w:r>
         <w:rPr>
           <w:rFonts w:ascii="Times New Roman" w:hAnsi="Times New Roman" w:eastAsia="SimSun" w:cs="Times New Roman"/>
-          <w:sz w:val="20"/>
+          <w:sz w:val="19"/>
           <w:szCs w:val="20"/>
           <w:color w:val="000000"/>
           <w:b w:val="0"/>
@@ -9452,7 +9440,7 @@
       <w:r>
         <w:rPr>
           <w:rFonts w:ascii="Times New Roman" w:hAnsi="Times New Roman" w:eastAsia="SimSun" w:cs="Times New Roman"/>
-          <w:sz w:val="20"/>
+          <w:sz w:val="19"/>
           <w:szCs w:val="20"/>
           <w:color w:val="000000"/>
           <w:b w:val="0"/>
@@ -9771,7 +9759,7 @@
       <w:r>
         <w:rPr>
           <w:rFonts w:ascii="Times New Roman" w:hAnsi="Times New Roman" w:eastAsia="SimSun" w:cs="Times New Roman"/>
-          <w:sz w:val="20"/>
+          <w:sz w:val="19"/>
           <w:szCs w:val="20"/>
           <w:color w:val="000000"/>
           <w:b w:val="0"/>
@@ -10164,7 +10152,7 @@
       <w:r>
         <w:rPr>
           <w:rFonts w:ascii="Times New Roman" w:hAnsi="Times New Roman" w:eastAsia="SimSun" w:cs="Times New Roman"/>
-          <w:sz w:val="20"/>
+          <w:sz w:val="19"/>
           <w:szCs w:val="20"/>
           <w:color w:val="000000"/>
           <w:b w:val="0"/>
@@ -10302,7 +10290,7 @@
                 <wp:inline distT="0" distB="0" distL="0" distR="0" ns4:anchorId="149342BB" ns4:editId="7073B4C1">
                   <wp:extent cx="2341880" cy="1155065"/>
                   <wp:effectExtent l="0" t="0" r="1270" b="6985"/>
-                  <wp:docPr id="1006" name="Fig. 4" descr="车轮受力示意图：接触力、轴端作用力、重力、驱动力矩与力臂"/>
+                  <wp:docPr id="1006" name="Fig. 4" descr="Wheel free-body diagram with contact and axle forces, gravity, drive torque, and moment arm."/>
                   <wp:cNvGraphicFramePr>
                     <ns5:graphicFrameLocks noChangeAspect="1"/>
                   </wp:cNvGraphicFramePr>
@@ -10343,10 +10331,6 @@
               <w:pStyle w:val="figurecaption"/>
               <w:snapToGrid w:val="0"/>
               <w:widowControl/>
-              <w:numPr>
-                <w:ilvl w:val="0"/>
-                <w:numId w:val="2"/>
-              </w:numPr>
               <w:keepLines/>
               <w:keepNext w:val="0"/>
               <w:rPr>
@@ -10370,7 +10354,7 @@
                 <w:i w:val="0"/>
                 <w:lang w:val="en-US"/>
               </w:rPr>
-              <w:t xml:space="preserve">Wheel free-body diagram: contact/axle forces, gravity, drive torque, and wheel-center-to-contact moment arm.</w:t>
+              <w:t xml:space="preserve">Fig. 4. Wheel free-body diagram: contact/axle forces, gravity, drive torque, and wheel-center-to-contact moment arm.</w:t>
             </w:r>
           </w:p>
         </w:tc>
@@ -10401,7 +10385,7 @@
       <w:r>
         <w:rPr>
           <w:rFonts w:ascii="Times New Roman" w:hAnsi="Times New Roman" w:eastAsia="SimSun" w:cs="Times New Roman"/>
-          <w:sz w:val="20"/>
+          <w:sz w:val="19"/>
           <w:szCs w:val="20"/>
           <w:color w:val="000000"/>
           <w:b w:val="0"/>
@@ -10452,7 +10436,7 @@
       <w:r>
         <w:rPr>
           <w:rFonts w:ascii="Times New Roman" w:hAnsi="Times New Roman" w:eastAsia="SimSun" w:cs="Times New Roman"/>
-          <w:sz w:val="20"/>
+          <w:sz w:val="19"/>
           <w:szCs w:val="20"/>
           <w:color w:val="000000"/>
           <w:b w:val="0"/>
@@ -10503,7 +10487,7 @@
       <w:r>
         <w:rPr>
           <w:rFonts w:ascii="Times New Roman" w:hAnsi="Times New Roman" w:eastAsia="SimSun" w:cs="Times New Roman"/>
-          <w:sz w:val="20"/>
+          <w:sz w:val="19"/>
           <w:szCs w:val="20"/>
           <w:color w:val="000000"/>
           <w:b w:val="0"/>
@@ -10554,7 +10538,7 @@
       <w:r>
         <w:rPr>
           <w:rFonts w:ascii="Times New Roman" w:hAnsi="Times New Roman" w:eastAsia="SimSun" w:cs="Times New Roman"/>
-          <w:sz w:val="20"/>
+          <w:sz w:val="19"/>
           <w:szCs w:val="20"/>
           <w:color w:val="000000"/>
           <w:b w:val="0"/>
@@ -10580,7 +10564,7 @@
       <w:r>
         <w:rPr>
           <w:rFonts w:ascii="Times New Roman" w:hAnsi="Times New Roman" w:eastAsia="SimSun" w:cs="Times New Roman"/>
-          <w:sz w:val="20"/>
+          <w:sz w:val="19"/>
           <w:szCs w:val="20"/>
           <w:color w:val="000000"/>
           <w:b w:val="0"/>
@@ -10898,7 +10882,7 @@
       <w:r>
         <w:rPr>
           <w:rFonts w:ascii="Times New Roman" w:hAnsi="Times New Roman" w:eastAsia="SimSun" w:cs="Times New Roman"/>
-          <w:sz w:val="20"/>
+          <w:sz w:val="19"/>
           <w:szCs w:val="20"/>
           <w:color w:val="000000"/>
           <w:b w:val="0"/>
@@ -10949,7 +10933,7 @@
       <w:r>
         <w:rPr>
           <w:rFonts w:ascii="Times New Roman" w:hAnsi="Times New Roman" w:eastAsia="SimSun" w:cs="Times New Roman"/>
-          <w:sz w:val="20"/>
+          <w:sz w:val="19"/>
           <w:szCs w:val="20"/>
           <w:color w:val="000000"/>
           <w:b w:val="0"/>
@@ -11000,7 +10984,7 @@
       <w:r>
         <w:rPr>
           <w:rFonts w:ascii="Times New Roman" w:hAnsi="Times New Roman" w:eastAsia="SimSun" w:cs="Times New Roman"/>
-          <w:sz w:val="20"/>
+          <w:sz w:val="19"/>
           <w:szCs w:val="20"/>
           <w:color w:val="000000"/>
           <w:b w:val="0"/>
@@ -11547,7 +11531,7 @@
       <w:r>
         <w:rPr>
           <w:rFonts w:ascii="Times New Roman" w:hAnsi="Times New Roman" w:eastAsia="SimSun" w:cs="Times New Roman"/>
-          <w:sz w:val="20"/>
+          <w:sz w:val="19"/>
           <w:szCs w:val="20"/>
           <w:color w:val="000000"/>
           <w:b w:val="0"/>
@@ -11598,7 +11582,7 @@
       <w:r>
         <w:rPr>
           <w:rFonts w:ascii="Times New Roman" w:hAnsi="Times New Roman" w:eastAsia="SimSun" w:cs="Times New Roman"/>
-          <w:sz w:val="20"/>
+          <w:sz w:val="19"/>
           <w:szCs w:val="20"/>
           <w:color w:val="000000"/>
           <w:b w:val="0"/>
@@ -11649,7 +11633,7 @@
       <w:r>
         <w:rPr>
           <w:rFonts w:ascii="Times New Roman" w:hAnsi="Times New Roman" w:eastAsia="SimSun" w:cs="Times New Roman"/>
-          <w:sz w:val="20"/>
+          <w:sz w:val="19"/>
           <w:szCs w:val="20"/>
           <w:color w:val="000000"/>
           <w:b w:val="0"/>
@@ -11712,7 +11696,7 @@
       <w:r>
         <w:rPr>
           <w:rFonts w:ascii="Times New Roman" w:hAnsi="Times New Roman" w:eastAsia="SimSun" w:cs="Times New Roman"/>
-          <w:sz w:val="20"/>
+          <w:sz w:val="19"/>
           <w:szCs w:val="20"/>
           <w:color w:val="000000"/>
           <w:b w:val="0"/>
@@ -11738,7 +11722,7 @@
       <w:r>
         <w:rPr>
           <w:rFonts w:ascii="Times New Roman" w:hAnsi="Times New Roman" w:eastAsia="SimSun" w:cs="Times New Roman"/>
-          <w:sz w:val="20"/>
+          <w:sz w:val="19"/>
           <w:szCs w:val="20"/>
           <w:color w:val="000000"/>
           <w:b w:val="0"/>
@@ -12139,7 +12123,7 @@
       <w:r>
         <w:rPr>
           <w:rFonts w:ascii="Times New Roman" w:hAnsi="Times New Roman" w:eastAsia="SimSun" w:cs="Times New Roman"/>
-          <w:sz w:val="20"/>
+          <w:sz w:val="19"/>
           <w:szCs w:val="20"/>
           <w:color w:val="000000"/>
           <w:b w:val="0"/>
@@ -12199,7 +12183,7 @@
       <w:r>
         <w:rPr>
           <w:rFonts w:ascii="Times New Roman" w:hAnsi="Times New Roman" w:eastAsia="SimSun" w:cs="Times New Roman"/>
-          <w:sz w:val="20"/>
+          <w:sz w:val="19"/>
           <w:szCs w:val="20"/>
           <w:color w:val="000000"/>
           <w:b w:val="0"/>
@@ -12250,7 +12234,7 @@
       <w:r>
         <w:rPr>
           <w:rFonts w:ascii="Times New Roman" w:hAnsi="Times New Roman" w:eastAsia="SimSun" w:cs="Times New Roman"/>
-          <w:sz w:val="20"/>
+          <w:sz w:val="19"/>
           <w:szCs w:val="20"/>
           <w:color w:val="000000"/>
           <w:b w:val="0"/>
@@ -12301,7 +12285,7 @@
       <w:r>
         <w:rPr>
           <w:rFonts w:ascii="Times New Roman" w:hAnsi="Times New Roman" w:eastAsia="SimSun" w:cs="Times New Roman"/>
-          <w:sz w:val="20"/>
+          <w:sz w:val="19"/>
           <w:szCs w:val="20"/>
           <w:color w:val="000000"/>
           <w:b w:val="0"/>
@@ -12349,7 +12333,7 @@
       <w:r>
         <w:rPr>
           <w:rFonts w:ascii="Times New Roman" w:hAnsi="Times New Roman" w:eastAsia="SimSun" w:cs="Times New Roman"/>
-          <w:sz w:val="20"/>
+          <w:sz w:val="19"/>
           <w:szCs w:val="20"/>
           <w:color w:val="000000"/>
           <w:b w:val="0"/>
@@ -12400,7 +12384,7 @@
       <w:r>
         <w:rPr>
           <w:rFonts w:ascii="Times New Roman" w:hAnsi="Times New Roman" w:eastAsia="SimSun" w:cs="Times New Roman"/>
-          <w:sz w:val="20"/>
+          <w:sz w:val="19"/>
           <w:szCs w:val="20"/>
           <w:color w:val="000000"/>
           <w:b w:val="0"/>
@@ -12465,7 +12449,7 @@
       <w:r>
         <w:rPr>
           <w:rFonts w:ascii="Times New Roman" w:hAnsi="Times New Roman" w:eastAsia="SimSun" w:cs="Times New Roman"/>
-          <w:sz w:val="20"/>
+          <w:sz w:val="19"/>
           <w:szCs w:val="20"/>
           <w:color w:val="000000"/>
           <w:b w:val="0"/>
@@ -12527,7 +12511,7 @@
       <w:r>
         <w:rPr>
           <w:rFonts w:ascii="Times New Roman" w:hAnsi="Times New Roman" w:eastAsia="SimSun" w:cs="Times New Roman"/>
-          <w:sz w:val="20"/>
+          <w:sz w:val="19"/>
           <w:szCs w:val="20"/>
           <w:color w:val="000000"/>
           <w:b w:val="0"/>
@@ -12651,7 +12635,7 @@
       <w:r>
         <w:rPr>
           <w:rFonts w:ascii="Times New Roman" w:hAnsi="Times New Roman" w:eastAsia="SimSun" w:cs="Times New Roman"/>
-          <w:sz w:val="20"/>
+          <w:sz w:val="19"/>
           <w:szCs w:val="20"/>
           <w:color w:val="000000"/>
           <w:b w:val="0"/>
@@ -12677,7 +12661,7 @@
       <w:r>
         <w:rPr>
           <w:rFonts w:ascii="Times New Roman" w:hAnsi="Times New Roman" w:eastAsia="SimSun" w:cs="Times New Roman"/>
-          <w:sz w:val="20"/>
+          <w:sz w:val="19"/>
           <w:szCs w:val="20"/>
           <w:color w:val="000000"/>
           <w:b w:val="0"/>
@@ -13192,7 +13176,7 @@
       <w:r>
         <w:rPr>
           <w:rFonts w:ascii="Times New Roman" w:hAnsi="Times New Roman" w:eastAsia="SimSun" w:cs="Times New Roman"/>
-          <w:sz w:val="20"/>
+          <w:sz w:val="19"/>
           <w:szCs w:val="20"/>
           <w:color w:val="000000"/>
           <w:b w:val="0"/>
@@ -13411,7 +13395,7 @@
       <w:r>
         <w:rPr>
           <w:rFonts w:ascii="Times New Roman" w:hAnsi="Times New Roman" w:eastAsia="SimSun" w:cs="Times New Roman"/>
-          <w:sz w:val="20"/>
+          <w:sz w:val="19"/>
           <w:szCs w:val="20"/>
           <w:color w:val="000000"/>
           <w:b w:val="0"/>
@@ -13462,7 +13446,7 @@
       <w:r>
         <w:rPr>
           <w:rFonts w:ascii="Times New Roman" w:hAnsi="Times New Roman" w:eastAsia="SimSun" w:cs="Times New Roman"/>
-          <w:sz w:val="20"/>
+          <w:sz w:val="19"/>
           <w:szCs w:val="20"/>
           <w:color w:val="000000"/>
           <w:b w:val="0"/>
@@ -13542,7 +13526,7 @@
                 <wp:inline distT="0" distB="0" distL="0" distR="0" ns4:anchorId="21EA527E" ns4:editId="54787D89">
                   <wp:extent cx="2062162" cy="1435889"/>
                   <wp:effectExtent l="0" t="0" r="0" b="0"/>
-                  <wp:docPr id="1007" name="Fig. 5" descr="基于底盘立体构型的整机质心与四轮接触力示意图"/>
+                  <wp:docPr id="1007" name="Fig. 5" descr="Whole-body center of mass and four wheel-contact forces."/>
                   <wp:cNvGraphicFramePr>
                     <ns5:graphicFrameLocks noChangeAspect="1"/>
                   </wp:cNvGraphicFramePr>
@@ -13583,10 +13567,6 @@
               <w:pStyle w:val="figurecaption"/>
               <w:snapToGrid w:val="0"/>
               <w:widowControl/>
-              <w:numPr>
-                <w:ilvl w:val="0"/>
-                <w:numId w:val="2"/>
-              </w:numPr>
               <w:keepLines/>
               <w:keepNext w:val="0"/>
               <w:rPr>
@@ -13610,7 +13590,7 @@
                 <w:i w:val="0"/>
                 <w:lang w:val="en-US"/>
               </w:rPr>
-              <w:t xml:space="preserve">Whole-body center of mass and four wheel-contact forces; arrows show application points and the force/moment arm at contact i.</w:t>
+              <w:t xml:space="preserve">Fig. 5. Whole-body center of mass and four wheel-contact forces; arrows show application points and the force/moment arm at contact i.</w:t>
             </w:r>
           </w:p>
         </w:tc>
@@ -13857,7 +13837,7 @@
       <w:r>
         <w:rPr>
           <w:rFonts w:ascii="Times New Roman" w:hAnsi="Times New Roman" w:eastAsia="SimSun" w:cs="Times New Roman"/>
-          <w:sz w:val="20"/>
+          <w:sz w:val="19"/>
           <w:szCs w:val="20"/>
           <w:color w:val="000000"/>
           <w:b w:val="0"/>
@@ -13883,7 +13863,7 @@
       <w:r>
         <w:rPr>
           <w:rFonts w:ascii="Times New Roman" w:hAnsi="Times New Roman" w:eastAsia="SimSun" w:cs="Times New Roman"/>
-          <w:sz w:val="20"/>
+          <w:sz w:val="19"/>
           <w:szCs w:val="20"/>
           <w:color w:val="000000"/>
           <w:b w:val="0"/>
@@ -13921,7 +13901,7 @@
       <w:r>
         <w:rPr>
           <w:rFonts w:ascii="Times New Roman" w:hAnsi="Times New Roman" w:eastAsia="SimSun" w:cs="Times New Roman"/>
-          <w:sz w:val="20"/>
+          <w:sz w:val="19"/>
           <w:szCs w:val="20"/>
           <w:color w:val="000000"/>
           <w:b w:val="0"/>
@@ -13972,7 +13952,7 @@
       <w:r>
         <w:rPr>
           <w:rFonts w:ascii="Times New Roman" w:hAnsi="Times New Roman" w:eastAsia="SimSun" w:cs="Times New Roman"/>
-          <w:sz w:val="20"/>
+          <w:sz w:val="19"/>
           <w:szCs w:val="20"/>
           <w:color w:val="000000"/>
           <w:b w:val="0"/>
@@ -14162,7 +14142,7 @@
       <w:r>
         <w:rPr>
           <w:rFonts w:ascii="Times New Roman" w:hAnsi="Times New Roman" w:eastAsia="SimSun" w:cs="Times New Roman"/>
-          <w:sz w:val="20"/>
+          <w:sz w:val="19"/>
           <w:szCs w:val="20"/>
           <w:color w:val="000000"/>
           <w:b w:val="0"/>
@@ -15566,7 +15546,7 @@
       <w:r>
         <w:rPr>
           <w:rFonts w:ascii="Times New Roman" w:hAnsi="Times New Roman" w:eastAsia="SimSun" w:cs="Times New Roman"/>
-          <w:sz w:val="20"/>
+          <w:sz w:val="19"/>
           <w:szCs w:val="20"/>
           <w:color w:val="000000"/>
           <w:b w:val="0"/>
@@ -15592,7 +15572,7 @@
       <w:r>
         <w:rPr>
           <w:rFonts w:ascii="Times New Roman" w:hAnsi="Times New Roman" w:eastAsia="SimSun" w:cs="Times New Roman"/>
-          <w:sz w:val="20"/>
+          <w:sz w:val="19"/>
           <w:szCs w:val="20"/>
           <w:color w:val="000000"/>
           <w:b w:val="0"/>
@@ -15643,7 +15623,7 @@
       <w:r>
         <w:rPr>
           <w:rFonts w:ascii="Times New Roman" w:hAnsi="Times New Roman" w:eastAsia="SimSun" w:cs="Times New Roman"/>
-          <w:sz w:val="20"/>
+          <w:sz w:val="19"/>
           <w:szCs w:val="20"/>
           <w:color w:val="000000"/>
           <w:b w:val="0"/>
@@ -15694,7 +15674,7 @@
       <w:r>
         <w:rPr>
           <w:rFonts w:ascii="Times New Roman" w:hAnsi="Times New Roman" w:eastAsia="SimSun" w:cs="Times New Roman"/>
-          <w:sz w:val="20"/>
+          <w:sz w:val="19"/>
           <w:szCs w:val="20"/>
           <w:color w:val="000000"/>
           <w:b w:val="0"/>
@@ -15879,7 +15859,7 @@
       <w:r>
         <w:rPr>
           <w:rFonts w:ascii="Times New Roman" w:hAnsi="Times New Roman" w:eastAsia="SimSun" w:cs="Times New Roman"/>
-          <w:sz w:val="20"/>
+          <w:sz w:val="19"/>
           <w:szCs w:val="20"/>
           <w:color w:val="000000"/>
           <w:b w:val="0"/>
@@ -15983,7 +15963,7 @@
       <w:r>
         <w:rPr>
           <w:rFonts w:ascii="Times New Roman" w:hAnsi="Times New Roman" w:eastAsia="SimSun" w:cs="Times New Roman"/>
-          <w:sz w:val="20"/>
+          <w:sz w:val="19"/>
           <w:szCs w:val="20"/>
           <w:color w:val="000000"/>
           <w:b w:val="0"/>
@@ -16084,7 +16064,7 @@
       <w:r>
         <w:rPr>
           <w:rFonts w:ascii="Times New Roman" w:hAnsi="Times New Roman" w:eastAsia="SimSun" w:cs="Times New Roman"/>
-          <w:sz w:val="20"/>
+          <w:sz w:val="19"/>
           <w:szCs w:val="20"/>
           <w:color w:val="000000"/>
           <w:b w:val="0"/>
@@ -16513,7 +16493,7 @@
       <w:r>
         <w:rPr>
           <w:rFonts w:ascii="Times New Roman" w:hAnsi="Times New Roman" w:eastAsia="SimSun" w:cs="Times New Roman"/>
-          <w:sz w:val="20"/>
+          <w:sz w:val="19"/>
           <w:szCs w:val="20"/>
           <w:color w:val="000000"/>
           <w:b w:val="0"/>
@@ -16539,14 +16519,14 @@
       <w:r>
         <w:rPr>
           <w:rFonts w:ascii="Times New Roman" w:hAnsi="Times New Roman" w:eastAsia="SimSun" w:cs="Times New Roman"/>
-          <w:sz w:val="20"/>
+          <w:sz w:val="19"/>
           <w:szCs w:val="20"/>
           <w:color w:val="000000"/>
           <w:b w:val="0"/>
           <w:i w:val="0"/>
           <w:lang w:val="en-US"/>
         </w:rPr>
-        <w:t xml:space="preserve"> to have full row rank. Normal four-wheel contact gives noncollinear contact points, so the matrix has rank 6. The solution minimizes the contact-force vector’s Euclidean norm.</w:t>
+        <w:t xml:space="preserve"> to have full row rank. In the nominal four-wheel stance, the contact points are not all collinear, so the matrix has full row rank (6). The solution minimizes the contact-force vector’s Euclidean norm.</w:t>
       </w:r>
     </w:p>
     <w:p ns2:paraId="54103828" ns2:textId="77777777">
@@ -17702,7 +17682,7 @@
       <w:r>
         <w:rPr>
           <w:rFonts w:ascii="Times New Roman" w:hAnsi="Times New Roman" w:eastAsia="SimSun" w:cs="Times New Roman"/>
-          <w:sz w:val="20"/>
+          <w:sz w:val="19"/>
           <w:szCs w:val="20"/>
           <w:color w:val="000000"/>
           <w:b w:val="0"/>
@@ -17725,7 +17705,7 @@
       <w:r>
         <w:rPr>
           <w:rFonts w:ascii="Times New Roman" w:hAnsi="Times New Roman" w:eastAsia="SimSun" w:cs="Times New Roman"/>
-          <w:sz w:val="20"/>
+          <w:sz w:val="19"/>
           <w:szCs w:val="20"/>
           <w:color w:val="000000"/>
           <w:b w:val="0"/>
@@ -17785,7 +17765,7 @@
       <w:r>
         <w:rPr>
           <w:rFonts w:ascii="Times New Roman" w:hAnsi="Times New Roman" w:eastAsia="SimSun" w:cs="Times New Roman"/>
-          <w:sz w:val="20"/>
+          <w:sz w:val="19"/>
           <w:szCs w:val="20"/>
           <w:color w:val="000000"/>
           <w:b w:val="0"/>
@@ -17870,7 +17850,7 @@
       <w:r>
         <w:rPr>
           <w:rFonts w:ascii="Times New Roman" w:hAnsi="Times New Roman" w:eastAsia="SimSun" w:cs="Times New Roman"/>
-          <w:sz w:val="20"/>
+          <w:sz w:val="19"/>
           <w:szCs w:val="20"/>
           <w:color w:val="000000"/>
           <w:b w:val="0"/>
@@ -17952,7 +17932,7 @@
       <w:r>
         <w:rPr>
           <w:rFonts w:ascii="Times New Roman" w:hAnsi="Times New Roman" w:eastAsia="SimSun" w:cs="Times New Roman"/>
-          <w:sz w:val="20"/>
+          <w:sz w:val="19"/>
           <w:szCs w:val="20"/>
           <w:color w:val="000000"/>
           <w:b w:val="0"/>
@@ -18024,7 +18004,7 @@
       <w:r>
         <w:rPr>
           <w:rFonts w:ascii="Times New Roman" w:hAnsi="Times New Roman" w:eastAsia="SimSun" w:cs="Times New Roman"/>
-          <w:sz w:val="20"/>
+          <w:sz w:val="19"/>
           <w:szCs w:val="20"/>
           <w:color w:val="000000"/>
           <w:b w:val="0"/>
@@ -18121,7 +18101,7 @@
       <w:r>
         <w:rPr>
           <w:rFonts w:ascii="Times New Roman" w:hAnsi="Times New Roman" w:eastAsia="SimSun" w:cs="Times New Roman"/>
-          <w:sz w:val="20"/>
+          <w:sz w:val="19"/>
           <w:szCs w:val="20"/>
           <w:color w:val="000000"/>
           <w:b w:val="0"/>
@@ -18146,7 +18126,7 @@
       <w:r>
         <w:rPr>
           <w:rFonts w:ascii="Times New Roman" w:hAnsi="Times New Roman" w:eastAsia="SimSun" w:cs="Times New Roman"/>
-          <w:sz w:val="20"/>
+          <w:sz w:val="19"/>
           <w:szCs w:val="20"/>
           <w:color w:val="000000"/>
           <w:b w:val="0"/>
@@ -18203,7 +18183,7 @@
       <w:r>
         <w:rPr>
           <w:rFonts w:ascii="Times New Roman" w:hAnsi="Times New Roman" w:eastAsia="SimSun" w:cs="Times New Roman"/>
-          <w:sz w:val="20"/>
+          <w:sz w:val="19"/>
           <w:szCs w:val="20"/>
           <w:color w:val="000000"/>
           <w:b w:val="0"/>
@@ -18260,7 +18240,7 @@
       <w:r>
         <w:rPr>
           <w:rFonts w:ascii="Times New Roman" w:hAnsi="Times New Roman" w:eastAsia="SimSun" w:cs="Times New Roman"/>
-          <w:sz w:val="20"/>
+          <w:sz w:val="19"/>
           <w:szCs w:val="20"/>
           <w:color w:val="000000"/>
           <w:b w:val="0"/>
@@ -18354,7 +18334,7 @@
       <w:r>
         <w:rPr>
           <w:rFonts w:ascii="Times New Roman" w:hAnsi="Times New Roman" w:eastAsia="SimSun" w:cs="Times New Roman"/>
-          <w:sz w:val="20"/>
+          <w:sz w:val="19"/>
           <w:szCs w:val="20"/>
           <w:color w:val="000000"/>
           <w:b w:val="0"/>
@@ -18436,7 +18416,7 @@
       <w:r>
         <w:rPr>
           <w:rFonts w:ascii="Times New Roman" w:hAnsi="Times New Roman" w:eastAsia="SimSun" w:cs="Times New Roman"/>
-          <w:sz w:val="20"/>
+          <w:sz w:val="19"/>
           <w:szCs w:val="20"/>
           <w:color w:val="000000"/>
           <w:b w:val="0"/>
@@ -18527,7 +18507,7 @@
       <w:r>
         <w:rPr>
           <w:rFonts w:ascii="Times New Roman" w:hAnsi="Times New Roman" w:eastAsia="SimSun" w:cs="Times New Roman"/>
-          <w:sz w:val="20"/>
+          <w:sz w:val="19"/>
           <w:szCs w:val="20"/>
           <w:color w:val="000000"/>
           <w:b w:val="0"/>
@@ -18553,7 +18533,7 @@
       <w:r>
         <w:rPr>
           <w:rFonts w:ascii="Times New Roman" w:hAnsi="Times New Roman" w:eastAsia="SimSun" w:cs="Times New Roman"/>
-          <w:sz w:val="20"/>
+          <w:sz w:val="19"/>
           <w:szCs w:val="20"/>
           <w:color w:val="000000"/>
           <w:b w:val="0"/>
@@ -18601,7 +18581,7 @@
       <w:r>
         <w:rPr>
           <w:rFonts w:ascii="Times New Roman" w:hAnsi="Times New Roman" w:eastAsia="SimSun" w:cs="Times New Roman"/>
-          <w:sz w:val="20"/>
+          <w:sz w:val="19"/>
           <w:szCs w:val="20"/>
           <w:color w:val="000000"/>
           <w:b w:val="0"/>
@@ -18658,7 +18638,7 @@
       <w:r>
         <w:rPr>
           <w:rFonts w:ascii="Times New Roman" w:hAnsi="Times New Roman" w:eastAsia="SimSun" w:cs="Times New Roman"/>
-          <w:sz w:val="20"/>
+          <w:sz w:val="19"/>
           <w:szCs w:val="20"/>
           <w:color w:val="000000"/>
           <w:b w:val="0"/>
@@ -18715,7 +18695,7 @@
       <w:r>
         <w:rPr>
           <w:rFonts w:ascii="Times New Roman" w:hAnsi="Times New Roman" w:eastAsia="SimSun" w:cs="Times New Roman"/>
-          <w:sz w:val="20"/>
+          <w:sz w:val="19"/>
           <w:szCs w:val="20"/>
           <w:color w:val="000000"/>
           <w:b w:val="0"/>
@@ -18763,7 +18743,7 @@
       <w:r>
         <w:rPr>
           <w:rFonts w:ascii="Times New Roman" w:hAnsi="Times New Roman" w:eastAsia="SimSun" w:cs="Times New Roman"/>
-          <w:sz w:val="20"/>
+          <w:sz w:val="19"/>
           <w:szCs w:val="20"/>
           <w:color w:val="000000"/>
           <w:b w:val="0"/>
@@ -18811,7 +18791,7 @@
       <w:r>
         <w:rPr>
           <w:rFonts w:ascii="Times New Roman" w:hAnsi="Times New Roman" w:eastAsia="SimSun" w:cs="Times New Roman"/>
-          <w:sz w:val="20"/>
+          <w:sz w:val="19"/>
           <w:szCs w:val="20"/>
           <w:color w:val="000000"/>
           <w:b w:val="0"/>
@@ -19329,7 +19309,7 @@
       <w:r>
         <w:rPr>
           <w:rFonts w:ascii="Times New Roman" w:hAnsi="Times New Roman" w:eastAsia="SimSun" w:cs="Times New Roman"/>
-          <w:sz w:val="20"/>
+          <w:sz w:val="19"/>
           <w:szCs w:val="20"/>
           <w:color w:val="000000"/>
           <w:b w:val="0"/>
@@ -19379,7 +19359,7 @@
       <w:r>
         <w:rPr>
           <w:rFonts w:ascii="Times New Roman" w:hAnsi="Times New Roman" w:eastAsia="SimSun" w:cs="Times New Roman"/>
-          <w:sz w:val="20"/>
+          <w:sz w:val="19"/>
           <w:szCs w:val="20"/>
           <w:color w:val="000000"/>
           <w:b w:val="0"/>
@@ -19449,7 +19429,7 @@
       <w:r>
         <w:rPr>
           <w:rFonts w:ascii="Times New Roman" w:hAnsi="Times New Roman" w:eastAsia="SimSun" w:cs="Times New Roman"/>
-          <w:sz w:val="20"/>
+          <w:sz w:val="19"/>
           <w:szCs w:val="20"/>
           <w:color w:val="000000"/>
           <w:b w:val="0"/>
@@ -19472,7 +19452,7 @@
       <w:r>
         <w:rPr>
           <w:rFonts w:ascii="Times New Roman" w:hAnsi="Times New Roman" w:eastAsia="SimSun" w:cs="Times New Roman"/>
-          <w:sz w:val="20"/>
+          <w:sz w:val="19"/>
           <w:szCs w:val="20"/>
           <w:color w:val="000000"/>
           <w:b w:val="0"/>
@@ -19517,7 +19497,7 @@
       <w:r>
         <w:rPr>
           <w:rFonts w:ascii="Times New Roman" w:hAnsi="Times New Roman" w:eastAsia="SimSun" w:cs="Times New Roman"/>
-          <w:sz w:val="20"/>
+          <w:sz w:val="19"/>
           <w:szCs w:val="20"/>
           <w:color w:val="000000"/>
           <w:b w:val="0"/>
@@ -19562,7 +19542,7 @@
       <w:r>
         <w:rPr>
           <w:rFonts w:ascii="Times New Roman" w:hAnsi="Times New Roman" w:eastAsia="SimSun" w:cs="Times New Roman"/>
-          <w:sz w:val="20"/>
+          <w:sz w:val="19"/>
           <w:szCs w:val="20"/>
           <w:color w:val="000000"/>
           <w:b w:val="0"/>
@@ -19607,7 +19587,7 @@
       <w:r>
         <w:rPr>
           <w:rFonts w:ascii="Times New Roman" w:hAnsi="Times New Roman" w:eastAsia="SimSun" w:cs="Times New Roman"/>
-          <w:sz w:val="20"/>
+          <w:sz w:val="19"/>
           <w:szCs w:val="20"/>
           <w:color w:val="000000"/>
           <w:b w:val="0"/>
@@ -19652,7 +19632,7 @@
       <w:r>
         <w:rPr>
           <w:rFonts w:ascii="Times New Roman" w:hAnsi="Times New Roman" w:eastAsia="SimSun" w:cs="Times New Roman"/>
-          <w:sz w:val="20"/>
+          <w:sz w:val="19"/>
           <w:szCs w:val="20"/>
           <w:color w:val="000000"/>
           <w:b w:val="0"/>
@@ -19675,7 +19655,7 @@
       <w:r>
         <w:rPr>
           <w:rFonts w:ascii="Times New Roman" w:hAnsi="Times New Roman" w:eastAsia="SimSun" w:cs="Times New Roman"/>
-          <w:sz w:val="20"/>
+          <w:sz w:val="19"/>
           <w:szCs w:val="20"/>
           <w:color w:val="000000"/>
           <w:b w:val="0"/>
@@ -19723,7 +19703,7 @@
       <w:r>
         <w:rPr>
           <w:rFonts w:ascii="Times New Roman" w:hAnsi="Times New Roman" w:eastAsia="SimSun" w:cs="Times New Roman"/>
-          <w:sz w:val="20"/>
+          <w:sz w:val="19"/>
           <w:szCs w:val="20"/>
           <w:color w:val="000000"/>
           <w:b w:val="0"/>
@@ -19771,7 +19751,7 @@
       <w:r>
         <w:rPr>
           <w:rFonts w:ascii="Times New Roman" w:hAnsi="Times New Roman" w:eastAsia="SimSun" w:cs="Times New Roman"/>
-          <w:sz w:val="20"/>
+          <w:sz w:val="19"/>
           <w:szCs w:val="20"/>
           <w:color w:val="000000"/>
           <w:b w:val="0"/>
@@ -19822,7 +19802,7 @@
       <w:r>
         <w:rPr>
           <w:rFonts w:ascii="Times New Roman" w:hAnsi="Times New Roman" w:eastAsia="SimSun" w:cs="Times New Roman"/>
-          <w:sz w:val="20"/>
+          <w:sz w:val="19"/>
           <w:szCs w:val="20"/>
           <w:color w:val="000000"/>
           <w:b w:val="0"/>
@@ -19867,7 +19847,7 @@
       <w:r>
         <w:rPr>
           <w:rFonts w:ascii="Times New Roman" w:hAnsi="Times New Roman" w:eastAsia="SimSun" w:cs="Times New Roman"/>
-          <w:sz w:val="20"/>
+          <w:sz w:val="19"/>
           <w:szCs w:val="20"/>
           <w:color w:val="000000"/>
           <w:b w:val="0"/>
@@ -19937,7 +19917,7 @@
       <w:r>
         <w:rPr>
           <w:rFonts w:ascii="Times New Roman" w:hAnsi="Times New Roman" w:eastAsia="SimSun" w:cs="Times New Roman"/>
-          <w:sz w:val="20"/>
+          <w:sz w:val="19"/>
           <w:szCs w:val="20"/>
           <w:color w:val="000000"/>
           <w:b w:val="0"/>
@@ -20014,7 +19994,7 @@
                 <wp:inline distT="0" distB="0" distL="0" distR="0" ns4:anchorId="7382684C" ns4:editId="65D58A3B">
                   <wp:extent cx="2590800" cy="3463491"/>
                   <wp:effectExtent l="0" t="0" r="0" b="0"/>
-                  <wp:docPr id="1008" name="Fig. 6" descr="底盘姿态控制器闭环方框图"/>
+                  <wp:docPr id="1008" name="Fig. 6" descr="Closed-loop chassis attitude controller."/>
                   <wp:cNvGraphicFramePr>
                     <ns5:graphicFrameLocks noChangeAspect="1"/>
                   </wp:cNvGraphicFramePr>
@@ -20054,10 +20034,6 @@
               <w:pStyle w:val="figurecaption"/>
               <w:snapToGrid w:val="0"/>
               <w:widowControl/>
-              <w:numPr>
-                <w:ilvl w:val="0"/>
-                <w:numId w:val="2"/>
-              </w:numPr>
               <w:keepLines/>
               <w:keepNext w:val="0"/>
               <w:rPr>
@@ -20081,7 +20057,7 @@
                 <w:i w:val="0"/>
                 <w:lang w:val="en-US"/>
               </w:rPr>
-              <w:t xml:space="preserve">Closed-loop chassis attitude control. Cascaded roll/pitch P loops and height-increment accumulation follow (17); (18) allocates both corrections to four legs. Joint-servo inner loops are combined.</w:t>
+              <w:t xml:space="preserve">Fig. 6. Closed-loop chassis attitude control. Cascaded roll/pitch P loops and height-increment accumulation follow (16); (17) allocates both corrections to four legs. Joint-servo inner loops are combined.</w:t>
             </w:r>
           </w:p>
         </w:tc>
@@ -20128,6 +20104,1336 @@
           <w:i w:val="1"/>
           <w:lang w:val="en-US"/>
         </w:rPr>
+      </w:r>
+      <w:r>
+        <w:t>Arm Inverse Kinematics</w:t>
+      </w:r>
+    </w:p>
+    <w:p>
+      <w:pPr>
+        <w:pStyle w:val="BodyText"/>
+      </w:pPr>
+      <w:r>
+        <w:rPr>
+          <w:sz w:val="19"/>
+        </w:rPr>
+        <w:t>Following Pieper’s analytical solution for a six-axis arm with a spherical wrist [9], the inverse kinematics separates wrist-center positioning from wrist orientation. Given the end-effector target p₀₆ and orientation R₀₆ in frame {0}, the wrist center is pW = p₀₆ − d₆R₀₆eᵧ, where eᵧ is the tool-frame +y unit vector and d₆ is the tool offset. Let ρW = √(xW² + yW²), ρA = √((ρW − a₁)² + (zW − d₁)²), γA = atan2(zW − d₁, ρW − a₁), ℓ₂ = a₂, and ℓ₃ = d₄. Here a₁, d₁, a₂, and d₄ are DH geometric parameters; d₄ locates the wrist center along z₃. The selected arm branch is:</w:t>
+      </w:r>
+    </w:p>
+    <w:p>
+      <w:pPr>
+        <w:pStyle w:val="equation"/>
+      </w:pPr>
+      <ns8:oMathPara>
+        <ns8:oMathParaPr>
+          <ns8:jc ns8:val="center"/>
+        </ns8:oMathParaPr>
+        <ns8:oMath>
+          <ns8:eqArr>
+            <ns8:eqArrPr/>
+            <ns8:e>
+              <ns8:sSub>
+                <ns8:sSubPr/>
+                <ns8:e>
+                  <ns8:r>
+                    <ns8:rPr/>
+                    <w:rPr>
+                      <w:rFonts w:ascii="Cambria Math" w:hAnsi="Cambria Math" w:eastAsia="Cambria Math" w:cs="Cambria Math"/>
+                      <w:sz w:val="18"/>
+                      <w:szCs w:val="18"/>
+                    </w:rPr>
+                    <ns8:t>q</ns8:t>
+                  </ns8:r>
+                </ns8:e>
+                <ns8:sub>
+                  <ns8:r>
+                    <ns8:rPr>
+                      <ns8:sty ns8:val="p"/>
+                    </ns8:rPr>
+                    <w:rPr>
+                      <w:rFonts w:ascii="Cambria Math" w:hAnsi="Cambria Math" w:eastAsia="Cambria Math" w:cs="Cambria Math"/>
+                      <w:sz w:val="18"/>
+                      <w:szCs w:val="18"/>
+                    </w:rPr>
+                    <ns8:t>a,</ns8:t>
+                  </ns8:r>
+                  <ns8:r>
+                    <ns8:rPr/>
+                    <w:rPr>
+                      <w:rFonts w:ascii="Cambria Math" w:hAnsi="Cambria Math" w:eastAsia="Cambria Math" w:cs="Cambria Math"/>
+                      <w:sz w:val="18"/>
+                      <w:szCs w:val="18"/>
+                    </w:rPr>
+                    <ns8:t>1</ns8:t>
+                  </ns8:r>
+                </ns8:sub>
+              </ns8:sSub>
+              <ns8:r>
+                <ns8:rPr>
+                  <ns8:sty ns8:val="p"/>
+                </ns8:rPr>
+                <w:rPr>
+                  <w:rFonts w:ascii="Cambria Math" w:hAnsi="Cambria Math" w:eastAsia="Cambria Math" w:cs="Cambria Math"/>
+                  <w:sz w:val="18"/>
+                  <w:szCs w:val="18"/>
+                </w:rPr>
+                <ns8:t>=atan2(</ns8:t>
+              </ns8:r>
+              <ns8:sSub>
+                <ns8:sSubPr/>
+                <ns8:e>
+                  <ns8:r>
+                    <ns8:rPr/>
+                    <w:rPr>
+                      <w:rFonts w:ascii="Cambria Math" w:hAnsi="Cambria Math" w:eastAsia="Cambria Math" w:cs="Cambria Math"/>
+                      <w:sz w:val="18"/>
+                      <w:szCs w:val="18"/>
+                    </w:rPr>
+                    <ns8:t>y</ns8:t>
+                  </ns8:r>
+                </ns8:e>
+                <ns8:sub>
+                  <ns8:r>
+                    <ns8:rPr>
+                      <ns8:sty ns8:val="p"/>
+                    </ns8:rPr>
+                    <w:rPr>
+                      <w:rFonts w:ascii="Cambria Math" w:hAnsi="Cambria Math" w:eastAsia="Cambria Math" w:cs="Cambria Math"/>
+                      <w:sz w:val="18"/>
+                      <w:szCs w:val="18"/>
+                    </w:rPr>
+                    <ns8:t>W</ns8:t>
+                  </ns8:r>
+                </ns8:sub>
+              </ns8:sSub>
+              <ns8:r>
+                <ns8:rPr>
+                  <ns8:sty ns8:val="p"/>
+                </ns8:rPr>
+                <w:rPr>
+                  <w:rFonts w:ascii="Cambria Math" w:hAnsi="Cambria Math" w:eastAsia="Cambria Math" w:cs="Cambria Math"/>
+                  <w:sz w:val="18"/>
+                  <w:szCs w:val="18"/>
+                </w:rPr>
+                <ns8:t>,</ns8:t>
+              </ns8:r>
+              <ns8:sSub>
+                <ns8:sSubPr/>
+                <ns8:e>
+                  <ns8:r>
+                    <ns8:rPr/>
+                    <w:rPr>
+                      <w:rFonts w:ascii="Cambria Math" w:hAnsi="Cambria Math" w:eastAsia="Cambria Math" w:cs="Cambria Math"/>
+                      <w:sz w:val="18"/>
+                      <w:szCs w:val="18"/>
+                    </w:rPr>
+                    <ns8:t>x</ns8:t>
+                  </ns8:r>
+                </ns8:e>
+                <ns8:sub>
+                  <ns8:r>
+                    <ns8:rPr>
+                      <ns8:sty ns8:val="p"/>
+                    </ns8:rPr>
+                    <w:rPr>
+                      <w:rFonts w:ascii="Cambria Math" w:hAnsi="Cambria Math" w:eastAsia="Cambria Math" w:cs="Cambria Math"/>
+                      <w:sz w:val="18"/>
+                      <w:szCs w:val="18"/>
+                    </w:rPr>
+                    <ns8:t>W</ns8:t>
+                  </ns8:r>
+                </ns8:sub>
+              </ns8:sSub>
+              <ns8:r>
+                <ns8:rPr>
+                  <ns8:sty ns8:val="p"/>
+                </ns8:rPr>
+                <w:rPr>
+                  <w:rFonts w:ascii="Cambria Math" w:hAnsi="Cambria Math" w:eastAsia="Cambria Math" w:cs="Cambria Math"/>
+                  <w:sz w:val="18"/>
+                  <w:szCs w:val="18"/>
+                </w:rPr>
+                <ns8:t>),</ns8:t>
+              </ns8:r>
+            </ns8:e>
+            <ns8:e>
+              <ns8:sSub>
+                <ns8:sSubPr/>
+                <ns8:e>
+                  <ns8:r>
+                    <ns8:rPr/>
+                    <w:rPr>
+                      <w:rFonts w:ascii="Cambria Math" w:hAnsi="Cambria Math" w:eastAsia="Cambria Math" w:cs="Cambria Math"/>
+                      <w:sz w:val="18"/>
+                      <w:szCs w:val="18"/>
+                    </w:rPr>
+                    <ns8:t>q</ns8:t>
+                  </ns8:r>
+                </ns8:e>
+                <ns8:sub>
+                  <ns8:r>
+                    <ns8:rPr>
+                      <ns8:sty ns8:val="p"/>
+                    </ns8:rPr>
+                    <w:rPr>
+                      <w:rFonts w:ascii="Cambria Math" w:hAnsi="Cambria Math" w:eastAsia="Cambria Math" w:cs="Cambria Math"/>
+                      <w:sz w:val="18"/>
+                      <w:szCs w:val="18"/>
+                    </w:rPr>
+                    <ns8:t>a,</ns8:t>
+                  </ns8:r>
+                  <ns8:r>
+                    <ns8:rPr/>
+                    <w:rPr>
+                      <w:rFonts w:ascii="Cambria Math" w:hAnsi="Cambria Math" w:eastAsia="Cambria Math" w:cs="Cambria Math"/>
+                      <w:sz w:val="18"/>
+                      <w:szCs w:val="18"/>
+                    </w:rPr>
+                    <ns8:t>2</ns8:t>
+                  </ns8:r>
+                </ns8:sub>
+              </ns8:sSub>
+              <ns8:r>
+                <ns8:rPr>
+                  <ns8:sty ns8:val="p"/>
+                </ns8:rPr>
+                <w:rPr>
+                  <w:rFonts w:ascii="Cambria Math" w:hAnsi="Cambria Math" w:eastAsia="Cambria Math" w:cs="Cambria Math"/>
+                  <w:sz w:val="18"/>
+                  <w:szCs w:val="18"/>
+                </w:rPr>
+                <ns8:t>=</ns8:t>
+              </ns8:r>
+              <ns8:sSub>
+                <ns8:sSubPr/>
+                <ns8:e>
+                  <ns8:r>
+                    <ns8:rPr/>
+                    <w:rPr>
+                      <w:rFonts w:ascii="Cambria Math" w:hAnsi="Cambria Math" w:eastAsia="Cambria Math" w:cs="Cambria Math"/>
+                      <w:sz w:val="18"/>
+                      <w:szCs w:val="18"/>
+                    </w:rPr>
+                    <ns8:t>γ</ns8:t>
+                  </ns8:r>
+                </ns8:e>
+                <ns8:sub>
+                  <ns8:r>
+                    <ns8:rPr>
+                      <ns8:sty ns8:val="p"/>
+                    </ns8:rPr>
+                    <w:rPr>
+                      <w:rFonts w:ascii="Cambria Math" w:hAnsi="Cambria Math" w:eastAsia="Cambria Math" w:cs="Cambria Math"/>
+                      <w:sz w:val="18"/>
+                      <w:szCs w:val="18"/>
+                    </w:rPr>
+                    <ns8:t>A</ns8:t>
+                  </ns8:r>
+                </ns8:sub>
+              </ns8:sSub>
+              <ns8:r>
+                <ns8:rPr>
+                  <ns8:sty ns8:val="p"/>
+                </ns8:rPr>
+                <w:rPr>
+                  <w:rFonts w:ascii="Cambria Math" w:hAnsi="Cambria Math" w:eastAsia="Cambria Math" w:cs="Cambria Math"/>
+                  <w:sz w:val="18"/>
+                  <w:szCs w:val="18"/>
+                </w:rPr>
+                <ns8:t>+arccos</ns8:t>
+              </ns8:r>
+              <ns8:f>
+                <ns8:fPr/>
+                <ns8:num>
+                  <ns8:sSubSup>
+                    <ns8:sSubSupPr/>
+                    <ns8:e>
+                      <ns8:r>
+                        <ns8:rPr/>
+                        <w:rPr>
+                          <w:rFonts w:ascii="Cambria Math" w:hAnsi="Cambria Math" w:eastAsia="Cambria Math" w:cs="Cambria Math"/>
+                          <w:sz w:val="18"/>
+                          <w:szCs w:val="18"/>
+                        </w:rPr>
+                        <ns8:t>ℓ</ns8:t>
+                      </ns8:r>
+                    </ns8:e>
+                    <ns8:sub>
+                      <ns8:r>
+                        <ns8:rPr/>
+                        <w:rPr>
+                          <w:rFonts w:ascii="Cambria Math" w:hAnsi="Cambria Math" w:eastAsia="Cambria Math" w:cs="Cambria Math"/>
+                          <w:sz w:val="18"/>
+                          <w:szCs w:val="18"/>
+                        </w:rPr>
+                        <ns8:t>2</ns8:t>
+                      </ns8:r>
+                    </ns8:sub>
+                    <ns8:sup>
+                      <ns8:r>
+                        <ns8:rPr/>
+                        <w:rPr>
+                          <w:rFonts w:ascii="Cambria Math" w:hAnsi="Cambria Math" w:eastAsia="Cambria Math" w:cs="Cambria Math"/>
+                          <w:sz w:val="18"/>
+                          <w:szCs w:val="18"/>
+                        </w:rPr>
+                        <ns8:t>2</ns8:t>
+                      </ns8:r>
+                    </ns8:sup>
+                  </ns8:sSubSup>
+                  <ns8:r>
+                    <ns8:rPr>
+                      <ns8:sty ns8:val="p"/>
+                    </ns8:rPr>
+                    <w:rPr>
+                      <w:rFonts w:ascii="Cambria Math" w:hAnsi="Cambria Math" w:eastAsia="Cambria Math" w:cs="Cambria Math"/>
+                      <w:sz w:val="18"/>
+                      <w:szCs w:val="18"/>
+                    </w:rPr>
+                    <ns8:t>+</ns8:t>
+                  </ns8:r>
+                  <ns8:sSubSup>
+                    <ns8:sSubSupPr/>
+                    <ns8:e>
+                      <ns8:r>
+                        <ns8:rPr/>
+                        <w:rPr>
+                          <w:rFonts w:ascii="Cambria Math" w:hAnsi="Cambria Math" w:eastAsia="Cambria Math" w:cs="Cambria Math"/>
+                          <w:sz w:val="18"/>
+                          <w:szCs w:val="18"/>
+                        </w:rPr>
+                        <ns8:t>ρ</ns8:t>
+                      </ns8:r>
+                    </ns8:e>
+                    <ns8:sub>
+                      <ns8:r>
+                        <ns8:rPr>
+                          <ns8:sty ns8:val="p"/>
+                        </ns8:rPr>
+                        <w:rPr>
+                          <w:rFonts w:ascii="Cambria Math" w:hAnsi="Cambria Math" w:eastAsia="Cambria Math" w:cs="Cambria Math"/>
+                          <w:sz w:val="18"/>
+                          <w:szCs w:val="18"/>
+                        </w:rPr>
+                        <ns8:t>A</ns8:t>
+                      </ns8:r>
+                    </ns8:sub>
+                    <ns8:sup>
+                      <ns8:r>
+                        <ns8:rPr/>
+                        <w:rPr>
+                          <w:rFonts w:ascii="Cambria Math" w:hAnsi="Cambria Math" w:eastAsia="Cambria Math" w:cs="Cambria Math"/>
+                          <w:sz w:val="18"/>
+                          <w:szCs w:val="18"/>
+                        </w:rPr>
+                        <ns8:t>2</ns8:t>
+                      </ns8:r>
+                    </ns8:sup>
+                  </ns8:sSubSup>
+                  <ns8:r>
+                    <ns8:rPr>
+                      <ns8:sty ns8:val="p"/>
+                    </ns8:rPr>
+                    <w:rPr>
+                      <w:rFonts w:ascii="Cambria Math" w:hAnsi="Cambria Math" w:eastAsia="Cambria Math" w:cs="Cambria Math"/>
+                      <w:sz w:val="18"/>
+                      <w:szCs w:val="18"/>
+                    </w:rPr>
+                    <ns8:t>−</ns8:t>
+                  </ns8:r>
+                  <ns8:sSubSup>
+                    <ns8:sSubSupPr/>
+                    <ns8:e>
+                      <ns8:r>
+                        <ns8:rPr/>
+                        <w:rPr>
+                          <w:rFonts w:ascii="Cambria Math" w:hAnsi="Cambria Math" w:eastAsia="Cambria Math" w:cs="Cambria Math"/>
+                          <w:sz w:val="18"/>
+                          <w:szCs w:val="18"/>
+                        </w:rPr>
+                        <ns8:t>ℓ</ns8:t>
+                      </ns8:r>
+                    </ns8:e>
+                    <ns8:sub>
+                      <ns8:r>
+                        <ns8:rPr/>
+                        <w:rPr>
+                          <w:rFonts w:ascii="Cambria Math" w:hAnsi="Cambria Math" w:eastAsia="Cambria Math" w:cs="Cambria Math"/>
+                          <w:sz w:val="18"/>
+                          <w:szCs w:val="18"/>
+                        </w:rPr>
+                        <ns8:t>3</ns8:t>
+                      </ns8:r>
+                    </ns8:sub>
+                    <ns8:sup>
+                      <ns8:r>
+                        <ns8:rPr/>
+                        <w:rPr>
+                          <w:rFonts w:ascii="Cambria Math" w:hAnsi="Cambria Math" w:eastAsia="Cambria Math" w:cs="Cambria Math"/>
+                          <w:sz w:val="18"/>
+                          <w:szCs w:val="18"/>
+                        </w:rPr>
+                        <ns8:t>2</ns8:t>
+                      </ns8:r>
+                    </ns8:sup>
+                  </ns8:sSubSup>
+                </ns8:num>
+                <ns8:den>
+                  <ns8:r>
+                    <ns8:rPr/>
+                    <w:rPr>
+                      <w:rFonts w:ascii="Cambria Math" w:hAnsi="Cambria Math" w:eastAsia="Cambria Math" w:cs="Cambria Math"/>
+                      <w:sz w:val="18"/>
+                      <w:szCs w:val="18"/>
+                    </w:rPr>
+                    <ns8:t>2</ns8:t>
+                  </ns8:r>
+                  <ns8:sSub>
+                    <ns8:sSubPr/>
+                    <ns8:e>
+                      <ns8:r>
+                        <ns8:rPr/>
+                        <w:rPr>
+                          <w:rFonts w:ascii="Cambria Math" w:hAnsi="Cambria Math" w:eastAsia="Cambria Math" w:cs="Cambria Math"/>
+                          <w:sz w:val="18"/>
+                          <w:szCs w:val="18"/>
+                        </w:rPr>
+                        <ns8:t>ℓ</ns8:t>
+                      </ns8:r>
+                    </ns8:e>
+                    <ns8:sub>
+                      <ns8:r>
+                        <ns8:rPr/>
+                        <w:rPr>
+                          <w:rFonts w:ascii="Cambria Math" w:hAnsi="Cambria Math" w:eastAsia="Cambria Math" w:cs="Cambria Math"/>
+                          <w:sz w:val="18"/>
+                          <w:szCs w:val="18"/>
+                        </w:rPr>
+                        <ns8:t>2</ns8:t>
+                      </ns8:r>
+                    </ns8:sub>
+                  </ns8:sSub>
+                  <ns8:sSub>
+                    <ns8:sSubPr/>
+                    <ns8:e>
+                      <ns8:r>
+                        <ns8:rPr/>
+                        <w:rPr>
+                          <w:rFonts w:ascii="Cambria Math" w:hAnsi="Cambria Math" w:eastAsia="Cambria Math" w:cs="Cambria Math"/>
+                          <w:sz w:val="18"/>
+                          <w:szCs w:val="18"/>
+                        </w:rPr>
+                        <ns8:t>ρ</ns8:t>
+                      </ns8:r>
+                    </ns8:e>
+                    <ns8:sub>
+                      <ns8:r>
+                        <ns8:rPr>
+                          <ns8:sty ns8:val="p"/>
+                        </ns8:rPr>
+                        <w:rPr>
+                          <w:rFonts w:ascii="Cambria Math" w:hAnsi="Cambria Math" w:eastAsia="Cambria Math" w:cs="Cambria Math"/>
+                          <w:sz w:val="18"/>
+                          <w:szCs w:val="18"/>
+                        </w:rPr>
+                        <ns8:t>A</ns8:t>
+                      </ns8:r>
+                    </ns8:sub>
+                  </ns8:sSub>
+                </ns8:den>
+              </ns8:f>
+              <ns8:r>
+                <ns8:rPr>
+                  <ns8:sty ns8:val="p"/>
+                </ns8:rPr>
+                <w:rPr>
+                  <w:rFonts w:ascii="Cambria Math" w:hAnsi="Cambria Math" w:eastAsia="Cambria Math" w:cs="Cambria Math"/>
+                  <w:sz w:val="18"/>
+                  <w:szCs w:val="18"/>
+                </w:rPr>
+                <ns8:t>,</ns8:t>
+              </ns8:r>
+            </ns8:e>
+            <ns8:e>
+              <ns8:sSub>
+                <ns8:sSubPr/>
+                <ns8:e>
+                  <ns8:r>
+                    <ns8:rPr/>
+                    <w:rPr>
+                      <w:rFonts w:ascii="Cambria Math" w:hAnsi="Cambria Math" w:eastAsia="Cambria Math" w:cs="Cambria Math"/>
+                      <w:sz w:val="18"/>
+                      <w:szCs w:val="18"/>
+                    </w:rPr>
+                    <ns8:t>q</ns8:t>
+                  </ns8:r>
+                </ns8:e>
+                <ns8:sub>
+                  <ns8:r>
+                    <ns8:rPr>
+                      <ns8:sty ns8:val="p"/>
+                    </ns8:rPr>
+                    <w:rPr>
+                      <w:rFonts w:ascii="Cambria Math" w:hAnsi="Cambria Math" w:eastAsia="Cambria Math" w:cs="Cambria Math"/>
+                      <w:sz w:val="18"/>
+                      <w:szCs w:val="18"/>
+                    </w:rPr>
+                    <ns8:t>a,</ns8:t>
+                  </ns8:r>
+                  <ns8:r>
+                    <ns8:rPr/>
+                    <w:rPr>
+                      <w:rFonts w:ascii="Cambria Math" w:hAnsi="Cambria Math" w:eastAsia="Cambria Math" w:cs="Cambria Math"/>
+                      <w:sz w:val="18"/>
+                      <w:szCs w:val="18"/>
+                    </w:rPr>
+                    <ns8:t>3</ns8:t>
+                  </ns8:r>
+                </ns8:sub>
+              </ns8:sSub>
+              <ns8:r>
+                <ns8:rPr>
+                  <ns8:sty ns8:val="p"/>
+                </ns8:rPr>
+                <w:rPr>
+                  <w:rFonts w:ascii="Cambria Math" w:hAnsi="Cambria Math" w:eastAsia="Cambria Math" w:cs="Cambria Math"/>
+                  <w:sz w:val="18"/>
+                  <w:szCs w:val="18"/>
+                </w:rPr>
+                <ns8:t>=−</ns8:t>
+              </ns8:r>
+              <ns8:r>
+                <ns8:rPr/>
+                <w:rPr>
+                  <w:rFonts w:ascii="Cambria Math" w:hAnsi="Cambria Math" w:eastAsia="Cambria Math" w:cs="Cambria Math"/>
+                  <w:sz w:val="18"/>
+                  <w:szCs w:val="18"/>
+                </w:rPr>
+                <ns8:t>π</ns8:t>
+              </ns8:r>
+              <ns8:r>
+                <ns8:rPr>
+                  <ns8:sty ns8:val="p"/>
+                </ns8:rPr>
+                <w:rPr>
+                  <w:rFonts w:ascii="Cambria Math" w:hAnsi="Cambria Math" w:eastAsia="Cambria Math" w:cs="Cambria Math"/>
+                  <w:sz w:val="18"/>
+                  <w:szCs w:val="18"/>
+                </w:rPr>
+                <ns8:t>+arccos</ns8:t>
+              </ns8:r>
+              <ns8:f>
+                <ns8:fPr/>
+                <ns8:num>
+                  <ns8:sSubSup>
+                    <ns8:sSubSupPr/>
+                    <ns8:e>
+                      <ns8:r>
+                        <ns8:rPr/>
+                        <w:rPr>
+                          <w:rFonts w:ascii="Cambria Math" w:hAnsi="Cambria Math" w:eastAsia="Cambria Math" w:cs="Cambria Math"/>
+                          <w:sz w:val="18"/>
+                          <w:szCs w:val="18"/>
+                        </w:rPr>
+                        <ns8:t>ℓ</ns8:t>
+                      </ns8:r>
+                    </ns8:e>
+                    <ns8:sub>
+                      <ns8:r>
+                        <ns8:rPr/>
+                        <w:rPr>
+                          <w:rFonts w:ascii="Cambria Math" w:hAnsi="Cambria Math" w:eastAsia="Cambria Math" w:cs="Cambria Math"/>
+                          <w:sz w:val="18"/>
+                          <w:szCs w:val="18"/>
+                        </w:rPr>
+                        <ns8:t>2</ns8:t>
+                      </ns8:r>
+                    </ns8:sub>
+                    <ns8:sup>
+                      <ns8:r>
+                        <ns8:rPr/>
+                        <w:rPr>
+                          <w:rFonts w:ascii="Cambria Math" w:hAnsi="Cambria Math" w:eastAsia="Cambria Math" w:cs="Cambria Math"/>
+                          <w:sz w:val="18"/>
+                          <w:szCs w:val="18"/>
+                        </w:rPr>
+                        <ns8:t>2</ns8:t>
+                      </ns8:r>
+                    </ns8:sup>
+                  </ns8:sSubSup>
+                  <ns8:r>
+                    <ns8:rPr>
+                      <ns8:sty ns8:val="p"/>
+                    </ns8:rPr>
+                    <w:rPr>
+                      <w:rFonts w:ascii="Cambria Math" w:hAnsi="Cambria Math" w:eastAsia="Cambria Math" w:cs="Cambria Math"/>
+                      <w:sz w:val="18"/>
+                      <w:szCs w:val="18"/>
+                    </w:rPr>
+                    <ns8:t>+</ns8:t>
+                  </ns8:r>
+                  <ns8:sSubSup>
+                    <ns8:sSubSupPr/>
+                    <ns8:e>
+                      <ns8:r>
+                        <ns8:rPr/>
+                        <w:rPr>
+                          <w:rFonts w:ascii="Cambria Math" w:hAnsi="Cambria Math" w:eastAsia="Cambria Math" w:cs="Cambria Math"/>
+                          <w:sz w:val="18"/>
+                          <w:szCs w:val="18"/>
+                        </w:rPr>
+                        <ns8:t>ℓ</ns8:t>
+                      </ns8:r>
+                    </ns8:e>
+                    <ns8:sub>
+                      <ns8:r>
+                        <ns8:rPr/>
+                        <w:rPr>
+                          <w:rFonts w:ascii="Cambria Math" w:hAnsi="Cambria Math" w:eastAsia="Cambria Math" w:cs="Cambria Math"/>
+                          <w:sz w:val="18"/>
+                          <w:szCs w:val="18"/>
+                        </w:rPr>
+                        <ns8:t>3</ns8:t>
+                      </ns8:r>
+                    </ns8:sub>
+                    <ns8:sup>
+                      <ns8:r>
+                        <ns8:rPr/>
+                        <w:rPr>
+                          <w:rFonts w:ascii="Cambria Math" w:hAnsi="Cambria Math" w:eastAsia="Cambria Math" w:cs="Cambria Math"/>
+                          <w:sz w:val="18"/>
+                          <w:szCs w:val="18"/>
+                        </w:rPr>
+                        <ns8:t>2</ns8:t>
+                      </ns8:r>
+                    </ns8:sup>
+                  </ns8:sSubSup>
+                  <ns8:r>
+                    <ns8:rPr>
+                      <ns8:sty ns8:val="p"/>
+                    </ns8:rPr>
+                    <w:rPr>
+                      <w:rFonts w:ascii="Cambria Math" w:hAnsi="Cambria Math" w:eastAsia="Cambria Math" w:cs="Cambria Math"/>
+                      <w:sz w:val="18"/>
+                      <w:szCs w:val="18"/>
+                    </w:rPr>
+                    <ns8:t>−</ns8:t>
+                  </ns8:r>
+                  <ns8:sSubSup>
+                    <ns8:sSubSupPr/>
+                    <ns8:e>
+                      <ns8:r>
+                        <ns8:rPr/>
+                        <w:rPr>
+                          <w:rFonts w:ascii="Cambria Math" w:hAnsi="Cambria Math" w:eastAsia="Cambria Math" w:cs="Cambria Math"/>
+                          <w:sz w:val="18"/>
+                          <w:szCs w:val="18"/>
+                        </w:rPr>
+                        <ns8:t>ρ</ns8:t>
+                      </ns8:r>
+                    </ns8:e>
+                    <ns8:sub>
+                      <ns8:r>
+                        <ns8:rPr>
+                          <ns8:sty ns8:val="p"/>
+                        </ns8:rPr>
+                        <w:rPr>
+                          <w:rFonts w:ascii="Cambria Math" w:hAnsi="Cambria Math" w:eastAsia="Cambria Math" w:cs="Cambria Math"/>
+                          <w:sz w:val="18"/>
+                          <w:szCs w:val="18"/>
+                        </w:rPr>
+                        <ns8:t>A</ns8:t>
+                      </ns8:r>
+                    </ns8:sub>
+                    <ns8:sup>
+                      <ns8:r>
+                        <ns8:rPr/>
+                        <w:rPr>
+                          <w:rFonts w:ascii="Cambria Math" w:hAnsi="Cambria Math" w:eastAsia="Cambria Math" w:cs="Cambria Math"/>
+                          <w:sz w:val="18"/>
+                          <w:szCs w:val="18"/>
+                        </w:rPr>
+                        <ns8:t>2</ns8:t>
+                      </ns8:r>
+                    </ns8:sup>
+                  </ns8:sSubSup>
+                </ns8:num>
+                <ns8:den>
+                  <ns8:r>
+                    <ns8:rPr/>
+                    <w:rPr>
+                      <w:rFonts w:ascii="Cambria Math" w:hAnsi="Cambria Math" w:eastAsia="Cambria Math" w:cs="Cambria Math"/>
+                      <w:sz w:val="18"/>
+                      <w:szCs w:val="18"/>
+                    </w:rPr>
+                    <ns8:t>2</ns8:t>
+                  </ns8:r>
+                  <ns8:sSub>
+                    <ns8:sSubPr/>
+                    <ns8:e>
+                      <ns8:r>
+                        <ns8:rPr/>
+                        <w:rPr>
+                          <w:rFonts w:ascii="Cambria Math" w:hAnsi="Cambria Math" w:eastAsia="Cambria Math" w:cs="Cambria Math"/>
+                          <w:sz w:val="18"/>
+                          <w:szCs w:val="18"/>
+                        </w:rPr>
+                        <ns8:t>ℓ</ns8:t>
+                      </ns8:r>
+                    </ns8:e>
+                    <ns8:sub>
+                      <ns8:r>
+                        <ns8:rPr/>
+                        <w:rPr>
+                          <w:rFonts w:ascii="Cambria Math" w:hAnsi="Cambria Math" w:eastAsia="Cambria Math" w:cs="Cambria Math"/>
+                          <w:sz w:val="18"/>
+                          <w:szCs w:val="18"/>
+                        </w:rPr>
+                        <ns8:t>2</ns8:t>
+                      </ns8:r>
+                    </ns8:sub>
+                  </ns8:sSub>
+                  <ns8:sSub>
+                    <ns8:sSubPr/>
+                    <ns8:e>
+                      <ns8:r>
+                        <ns8:rPr/>
+                        <w:rPr>
+                          <w:rFonts w:ascii="Cambria Math" w:hAnsi="Cambria Math" w:eastAsia="Cambria Math" w:cs="Cambria Math"/>
+                          <w:sz w:val="18"/>
+                          <w:szCs w:val="18"/>
+                        </w:rPr>
+                        <ns8:t>ℓ</ns8:t>
+                      </ns8:r>
+                    </ns8:e>
+                    <ns8:sub>
+                      <ns8:r>
+                        <ns8:rPr/>
+                        <w:rPr>
+                          <w:rFonts w:ascii="Cambria Math" w:hAnsi="Cambria Math" w:eastAsia="Cambria Math" w:cs="Cambria Math"/>
+                          <w:sz w:val="18"/>
+                          <w:szCs w:val="18"/>
+                        </w:rPr>
+                        <ns8:t>3</ns8:t>
+                      </ns8:r>
+                    </ns8:sub>
+                  </ns8:sSub>
+                </ns8:den>
+              </ns8:f>
+              <ns8:r>
+                <ns8:rPr>
+                  <ns8:sty ns8:val="p"/>
+                </ns8:rPr>
+                <w:rPr>
+                  <w:rFonts w:ascii="Cambria Math" w:hAnsi="Cambria Math" w:eastAsia="Cambria Math" w:cs="Cambria Math"/>
+                  <w:sz w:val="18"/>
+                  <w:szCs w:val="18"/>
+                </w:rPr>
+                <ns8:t>.</ns8:t>
+              </ns8:r>
+            </ns8:e>
+          </ns8:eqArr>
+        </ns8:oMath>
+      </ns8:oMathPara>
+    </w:p>
+    <w:p>
+      <w:pPr>
+        <w:pStyle w:val="BodyText"/>
+      </w:pPr>
+      <w:r>
+        <w:rPr>
+          <w:sz w:val="19"/>
+        </w:rPr>
+        <w:t>Using the first three joint angles to form R₀₃ from the DH model, define R₃₆ = R₀₃ᵀR₀₆ = [n o a], whose columns are n, o, and a. For sin θ₅ ≠ 0, the wrist branches are:</w:t>
+      </w:r>
+    </w:p>
+    <w:p>
+      <w:pPr>
+        <w:pStyle w:val="equation"/>
+      </w:pPr>
+      <ns8:oMathPara>
+        <ns8:oMathParaPr>
+          <ns8:jc ns8:val="center"/>
+        </ns8:oMathParaPr>
+        <ns8:oMath>
+          <ns8:eqArr>
+            <ns8:eqArrPr/>
+            <ns8:e>
+              <ns8:sSubSup>
+                <ns8:sSubSupPr/>
+                <ns8:e>
+                  <ns8:r>
+                    <ns8:rPr/>
+                    <w:rPr>
+                      <w:rFonts w:ascii="Cambria Math" w:hAnsi="Cambria Math" w:eastAsia="Cambria Math" w:cs="Cambria Math"/>
+                      <w:sz w:val="18"/>
+                      <w:szCs w:val="18"/>
+                    </w:rPr>
+                    <ns8:t>θ</ns8:t>
+                  </ns8:r>
+                </ns8:e>
+                <ns8:sub>
+                  <ns8:r>
+                    <ns8:rPr/>
+                    <w:rPr>
+                      <w:rFonts w:ascii="Cambria Math" w:hAnsi="Cambria Math" w:eastAsia="Cambria Math" w:cs="Cambria Math"/>
+                      <w:sz w:val="18"/>
+                      <w:szCs w:val="18"/>
+                    </w:rPr>
+                    <ns8:t>5</ns8:t>
+                  </ns8:r>
+                </ns8:sub>
+                <ns8:sup>
+                  <ns8:r>
+                    <ns8:rPr>
+                      <ns8:sty ns8:val="p"/>
+                    </ns8:rPr>
+                    <w:rPr>
+                      <w:rFonts w:ascii="Cambria Math" w:hAnsi="Cambria Math" w:eastAsia="Cambria Math" w:cs="Cambria Math"/>
+                      <w:sz w:val="18"/>
+                      <w:szCs w:val="18"/>
+                    </w:rPr>
+                    <ns8:t>(±)</ns8:t>
+                  </ns8:r>
+                </ns8:sup>
+              </ns8:sSubSup>
+              <ns8:r>
+                <ns8:rPr>
+                  <ns8:sty ns8:val="p"/>
+                </ns8:rPr>
+                <w:rPr>
+                  <w:rFonts w:ascii="Cambria Math" w:hAnsi="Cambria Math" w:eastAsia="Cambria Math" w:cs="Cambria Math"/>
+                  <w:sz w:val="18"/>
+                  <w:szCs w:val="18"/>
+                </w:rPr>
+                <ns8:t>=±arccos(−</ns8:t>
+              </ns8:r>
+              <ns8:sSub>
+                <ns8:sSubPr/>
+                <ns8:e>
+                  <ns8:r>
+                    <ns8:rPr/>
+                    <w:rPr>
+                      <w:rFonts w:ascii="Cambria Math" w:hAnsi="Cambria Math" w:eastAsia="Cambria Math" w:cs="Cambria Math"/>
+                      <w:sz w:val="18"/>
+                      <w:szCs w:val="18"/>
+                    </w:rPr>
+                    <ns8:t>o</ns8:t>
+                  </ns8:r>
+                </ns8:e>
+                <ns8:sub>
+                  <ns8:r>
+                    <ns8:rPr/>
+                    <w:rPr>
+                      <w:rFonts w:ascii="Cambria Math" w:hAnsi="Cambria Math" w:eastAsia="Cambria Math" w:cs="Cambria Math"/>
+                      <w:sz w:val="18"/>
+                      <w:szCs w:val="18"/>
+                    </w:rPr>
+                    <ns8:t>z</ns8:t>
+                  </ns8:r>
+                </ns8:sub>
+              </ns8:sSub>
+              <ns8:r>
+                <ns8:rPr>
+                  <ns8:sty ns8:val="p"/>
+                </ns8:rPr>
+                <w:rPr>
+                  <w:rFonts w:ascii="Cambria Math" w:hAnsi="Cambria Math" w:eastAsia="Cambria Math" w:cs="Cambria Math"/>
+                  <w:sz w:val="18"/>
+                  <w:szCs w:val="18"/>
+                </w:rPr>
+                <ns8:t>),</ns8:t>
+              </ns8:r>
+            </ns8:e>
+            <ns8:e>
+              <ns8:sSubSup>
+                <ns8:sSubSupPr/>
+                <ns8:e>
+                  <ns8:r>
+                    <ns8:rPr/>
+                    <w:rPr>
+                      <w:rFonts w:ascii="Cambria Math" w:hAnsi="Cambria Math" w:eastAsia="Cambria Math" w:cs="Cambria Math"/>
+                      <w:sz w:val="18"/>
+                      <w:szCs w:val="18"/>
+                    </w:rPr>
+                    <ns8:t>θ</ns8:t>
+                  </ns8:r>
+                </ns8:e>
+                <ns8:sub>
+                  <ns8:r>
+                    <ns8:rPr/>
+                    <w:rPr>
+                      <w:rFonts w:ascii="Cambria Math" w:hAnsi="Cambria Math" w:eastAsia="Cambria Math" w:cs="Cambria Math"/>
+                      <w:sz w:val="18"/>
+                      <w:szCs w:val="18"/>
+                    </w:rPr>
+                    <ns8:t>4</ns8:t>
+                  </ns8:r>
+                </ns8:sub>
+                <ns8:sup>
+                  <ns8:r>
+                    <ns8:rPr>
+                      <ns8:sty ns8:val="p"/>
+                    </ns8:rPr>
+                    <w:rPr>
+                      <w:rFonts w:ascii="Cambria Math" w:hAnsi="Cambria Math" w:eastAsia="Cambria Math" w:cs="Cambria Math"/>
+                      <w:sz w:val="18"/>
+                      <w:szCs w:val="18"/>
+                    </w:rPr>
+                    <ns8:t>(±)</ns8:t>
+                  </ns8:r>
+                </ns8:sup>
+              </ns8:sSubSup>
+              <ns8:r>
+                <ns8:rPr>
+                  <ns8:sty ns8:val="p"/>
+                </ns8:rPr>
+                <w:rPr>
+                  <w:rFonts w:ascii="Cambria Math" w:hAnsi="Cambria Math" w:eastAsia="Cambria Math" w:cs="Cambria Math"/>
+                  <w:sz w:val="18"/>
+                  <w:szCs w:val="18"/>
+                </w:rPr>
+                <ns8:t>=atan2(</ns8:t>
+              </ns8:r>
+              <ns8:sSub>
+                <ns8:sSubPr/>
+                <ns8:e>
+                  <ns8:r>
+                    <ns8:rPr/>
+                    <w:rPr>
+                      <w:rFonts w:ascii="Cambria Math" w:hAnsi="Cambria Math" w:eastAsia="Cambria Math" w:cs="Cambria Math"/>
+                      <w:sz w:val="18"/>
+                      <w:szCs w:val="18"/>
+                    </w:rPr>
+                    <ns8:t>o</ns8:t>
+                  </ns8:r>
+                </ns8:e>
+                <ns8:sub>
+                  <ns8:r>
+                    <ns8:rPr/>
+                    <w:rPr>
+                      <w:rFonts w:ascii="Cambria Math" w:hAnsi="Cambria Math" w:eastAsia="Cambria Math" w:cs="Cambria Math"/>
+                      <w:sz w:val="18"/>
+                      <w:szCs w:val="18"/>
+                    </w:rPr>
+                    <ns8:t>y</ns8:t>
+                  </ns8:r>
+                </ns8:sub>
+              </ns8:sSub>
+              <ns8:r>
+                <ns8:rPr>
+                  <ns8:sty ns8:val="p"/>
+                </ns8:rPr>
+                <w:rPr>
+                  <w:rFonts w:ascii="Cambria Math" w:hAnsi="Cambria Math" w:eastAsia="Cambria Math" w:cs="Cambria Math"/>
+                  <w:sz w:val="18"/>
+                  <w:szCs w:val="18"/>
+                </w:rPr>
+                <ns8:t>sin</ns8:t>
+              </ns8:r>
+              <ns8:sSubSup>
+                <ns8:sSubSupPr/>
+                <ns8:e>
+                  <ns8:r>
+                    <ns8:rPr/>
+                    <w:rPr>
+                      <w:rFonts w:ascii="Cambria Math" w:hAnsi="Cambria Math" w:eastAsia="Cambria Math" w:cs="Cambria Math"/>
+                      <w:sz w:val="18"/>
+                      <w:szCs w:val="18"/>
+                    </w:rPr>
+                    <ns8:t>θ</ns8:t>
+                  </ns8:r>
+                </ns8:e>
+                <ns8:sub>
+                  <ns8:r>
+                    <ns8:rPr/>
+                    <w:rPr>
+                      <w:rFonts w:ascii="Cambria Math" w:hAnsi="Cambria Math" w:eastAsia="Cambria Math" w:cs="Cambria Math"/>
+                      <w:sz w:val="18"/>
+                      <w:szCs w:val="18"/>
+                    </w:rPr>
+                    <ns8:t>5</ns8:t>
+                  </ns8:r>
+                </ns8:sub>
+                <ns8:sup>
+                  <ns8:r>
+                    <ns8:rPr>
+                      <ns8:sty ns8:val="p"/>
+                    </ns8:rPr>
+                    <w:rPr>
+                      <w:rFonts w:ascii="Cambria Math" w:hAnsi="Cambria Math" w:eastAsia="Cambria Math" w:cs="Cambria Math"/>
+                      <w:sz w:val="18"/>
+                      <w:szCs w:val="18"/>
+                    </w:rPr>
+                    <ns8:t>(±)</ns8:t>
+                  </ns8:r>
+                </ns8:sup>
+              </ns8:sSubSup>
+              <ns8:r>
+                <ns8:rPr>
+                  <ns8:sty ns8:val="p"/>
+                </ns8:rPr>
+                <w:rPr>
+                  <w:rFonts w:ascii="Cambria Math" w:hAnsi="Cambria Math" w:eastAsia="Cambria Math" w:cs="Cambria Math"/>
+                  <w:sz w:val="18"/>
+                  <w:szCs w:val="18"/>
+                </w:rPr>
+                <ns8:t>,</ns8:t>
+              </ns8:r>
+              <ns8:sSub>
+                <ns8:sSubPr/>
+                <ns8:e>
+                  <ns8:r>
+                    <ns8:rPr/>
+                    <w:rPr>
+                      <w:rFonts w:ascii="Cambria Math" w:hAnsi="Cambria Math" w:eastAsia="Cambria Math" w:cs="Cambria Math"/>
+                      <w:sz w:val="18"/>
+                      <w:szCs w:val="18"/>
+                    </w:rPr>
+                    <ns8:t>o</ns8:t>
+                  </ns8:r>
+                </ns8:e>
+                <ns8:sub>
+                  <ns8:r>
+                    <ns8:rPr/>
+                    <w:rPr>
+                      <w:rFonts w:ascii="Cambria Math" w:hAnsi="Cambria Math" w:eastAsia="Cambria Math" w:cs="Cambria Math"/>
+                      <w:sz w:val="18"/>
+                      <w:szCs w:val="18"/>
+                    </w:rPr>
+                    <ns8:t>x</ns8:t>
+                  </ns8:r>
+                </ns8:sub>
+              </ns8:sSub>
+              <ns8:r>
+                <ns8:rPr>
+                  <ns8:sty ns8:val="p"/>
+                </ns8:rPr>
+                <w:rPr>
+                  <w:rFonts w:ascii="Cambria Math" w:hAnsi="Cambria Math" w:eastAsia="Cambria Math" w:cs="Cambria Math"/>
+                  <w:sz w:val="18"/>
+                  <w:szCs w:val="18"/>
+                </w:rPr>
+                <ns8:t>sin</ns8:t>
+              </ns8:r>
+              <ns8:sSubSup>
+                <ns8:sSubSupPr/>
+                <ns8:e>
+                  <ns8:r>
+                    <ns8:rPr/>
+                    <w:rPr>
+                      <w:rFonts w:ascii="Cambria Math" w:hAnsi="Cambria Math" w:eastAsia="Cambria Math" w:cs="Cambria Math"/>
+                      <w:sz w:val="18"/>
+                      <w:szCs w:val="18"/>
+                    </w:rPr>
+                    <ns8:t>θ</ns8:t>
+                  </ns8:r>
+                </ns8:e>
+                <ns8:sub>
+                  <ns8:r>
+                    <ns8:rPr/>
+                    <w:rPr>
+                      <w:rFonts w:ascii="Cambria Math" w:hAnsi="Cambria Math" w:eastAsia="Cambria Math" w:cs="Cambria Math"/>
+                      <w:sz w:val="18"/>
+                      <w:szCs w:val="18"/>
+                    </w:rPr>
+                    <ns8:t>5</ns8:t>
+                  </ns8:r>
+                </ns8:sub>
+                <ns8:sup>
+                  <ns8:r>
+                    <ns8:rPr>
+                      <ns8:sty ns8:val="p"/>
+                    </ns8:rPr>
+                    <w:rPr>
+                      <w:rFonts w:ascii="Cambria Math" w:hAnsi="Cambria Math" w:eastAsia="Cambria Math" w:cs="Cambria Math"/>
+                      <w:sz w:val="18"/>
+                      <w:szCs w:val="18"/>
+                    </w:rPr>
+                    <ns8:t>(±)</ns8:t>
+                  </ns8:r>
+                </ns8:sup>
+              </ns8:sSubSup>
+              <ns8:r>
+                <ns8:rPr>
+                  <ns8:sty ns8:val="p"/>
+                </ns8:rPr>
+                <w:rPr>
+                  <w:rFonts w:ascii="Cambria Math" w:hAnsi="Cambria Math" w:eastAsia="Cambria Math" w:cs="Cambria Math"/>
+                  <w:sz w:val="18"/>
+                  <w:szCs w:val="18"/>
+                </w:rPr>
+                <ns8:t>),</ns8:t>
+              </ns8:r>
+            </ns8:e>
+            <ns8:e>
+              <ns8:sSubSup>
+                <ns8:sSubSupPr/>
+                <ns8:e>
+                  <ns8:r>
+                    <ns8:rPr/>
+                    <w:rPr>
+                      <w:rFonts w:ascii="Cambria Math" w:hAnsi="Cambria Math" w:eastAsia="Cambria Math" w:cs="Cambria Math"/>
+                      <w:sz w:val="18"/>
+                      <w:szCs w:val="18"/>
+                    </w:rPr>
+                    <ns8:t>θ</ns8:t>
+                  </ns8:r>
+                </ns8:e>
+                <ns8:sub>
+                  <ns8:r>
+                    <ns8:rPr/>
+                    <w:rPr>
+                      <w:rFonts w:ascii="Cambria Math" w:hAnsi="Cambria Math" w:eastAsia="Cambria Math" w:cs="Cambria Math"/>
+                      <w:sz w:val="18"/>
+                      <w:szCs w:val="18"/>
+                    </w:rPr>
+                    <ns8:t>6</ns8:t>
+                  </ns8:r>
+                </ns8:sub>
+                <ns8:sup>
+                  <ns8:r>
+                    <ns8:rPr>
+                      <ns8:sty ns8:val="p"/>
+                    </ns8:rPr>
+                    <w:rPr>
+                      <w:rFonts w:ascii="Cambria Math" w:hAnsi="Cambria Math" w:eastAsia="Cambria Math" w:cs="Cambria Math"/>
+                      <w:sz w:val="18"/>
+                      <w:szCs w:val="18"/>
+                    </w:rPr>
+                    <ns8:t>(±)</ns8:t>
+                  </ns8:r>
+                </ns8:sup>
+              </ns8:sSubSup>
+              <ns8:r>
+                <ns8:rPr>
+                  <ns8:sty ns8:val="p"/>
+                </ns8:rPr>
+                <w:rPr>
+                  <w:rFonts w:ascii="Cambria Math" w:hAnsi="Cambria Math" w:eastAsia="Cambria Math" w:cs="Cambria Math"/>
+                  <w:sz w:val="18"/>
+                  <w:szCs w:val="18"/>
+                </w:rPr>
+                <ns8:t>=atan2(</ns8:t>
+              </ns8:r>
+              <ns8:sSub>
+                <ns8:sSubPr/>
+                <ns8:e>
+                  <ns8:r>
+                    <ns8:rPr/>
+                    <w:rPr>
+                      <w:rFonts w:ascii="Cambria Math" w:hAnsi="Cambria Math" w:eastAsia="Cambria Math" w:cs="Cambria Math"/>
+                      <w:sz w:val="18"/>
+                      <w:szCs w:val="18"/>
+                    </w:rPr>
+                    <ns8:t>a</ns8:t>
+                  </ns8:r>
+                </ns8:e>
+                <ns8:sub>
+                  <ns8:r>
+                    <ns8:rPr/>
+                    <w:rPr>
+                      <w:rFonts w:ascii="Cambria Math" w:hAnsi="Cambria Math" w:eastAsia="Cambria Math" w:cs="Cambria Math"/>
+                      <w:sz w:val="18"/>
+                      <w:szCs w:val="18"/>
+                    </w:rPr>
+                    <ns8:t>z</ns8:t>
+                  </ns8:r>
+                </ns8:sub>
+              </ns8:sSub>
+              <ns8:r>
+                <ns8:rPr>
+                  <ns8:sty ns8:val="p"/>
+                </ns8:rPr>
+                <w:rPr>
+                  <w:rFonts w:ascii="Cambria Math" w:hAnsi="Cambria Math" w:eastAsia="Cambria Math" w:cs="Cambria Math"/>
+                  <w:sz w:val="18"/>
+                  <w:szCs w:val="18"/>
+                </w:rPr>
+                <ns8:t>sin</ns8:t>
+              </ns8:r>
+              <ns8:sSubSup>
+                <ns8:sSubSupPr/>
+                <ns8:e>
+                  <ns8:r>
+                    <ns8:rPr/>
+                    <w:rPr>
+                      <w:rFonts w:ascii="Cambria Math" w:hAnsi="Cambria Math" w:eastAsia="Cambria Math" w:cs="Cambria Math"/>
+                      <w:sz w:val="18"/>
+                      <w:szCs w:val="18"/>
+                    </w:rPr>
+                    <ns8:t>θ</ns8:t>
+                  </ns8:r>
+                </ns8:e>
+                <ns8:sub>
+                  <ns8:r>
+                    <ns8:rPr/>
+                    <w:rPr>
+                      <w:rFonts w:ascii="Cambria Math" w:hAnsi="Cambria Math" w:eastAsia="Cambria Math" w:cs="Cambria Math"/>
+                      <w:sz w:val="18"/>
+                      <w:szCs w:val="18"/>
+                    </w:rPr>
+                    <ns8:t>5</ns8:t>
+                  </ns8:r>
+                </ns8:sub>
+                <ns8:sup>
+                  <ns8:r>
+                    <ns8:rPr>
+                      <ns8:sty ns8:val="p"/>
+                    </ns8:rPr>
+                    <w:rPr>
+                      <w:rFonts w:ascii="Cambria Math" w:hAnsi="Cambria Math" w:eastAsia="Cambria Math" w:cs="Cambria Math"/>
+                      <w:sz w:val="18"/>
+                      <w:szCs w:val="18"/>
+                    </w:rPr>
+                    <ns8:t>(±)</ns8:t>
+                  </ns8:r>
+                </ns8:sup>
+              </ns8:sSubSup>
+              <ns8:r>
+                <ns8:rPr>
+                  <ns8:sty ns8:val="p"/>
+                </ns8:rPr>
+                <w:rPr>
+                  <w:rFonts w:ascii="Cambria Math" w:hAnsi="Cambria Math" w:eastAsia="Cambria Math" w:cs="Cambria Math"/>
+                  <w:sz w:val="18"/>
+                  <w:szCs w:val="18"/>
+                </w:rPr>
+                <ns8:t>,</ns8:t>
+              </ns8:r>
+              <ns8:sSub>
+                <ns8:sSubPr/>
+                <ns8:e>
+                  <ns8:r>
+                    <ns8:rPr/>
+                    <w:rPr>
+                      <w:rFonts w:ascii="Cambria Math" w:hAnsi="Cambria Math" w:eastAsia="Cambria Math" w:cs="Cambria Math"/>
+                      <w:sz w:val="18"/>
+                      <w:szCs w:val="18"/>
+                    </w:rPr>
+                    <ns8:t>n</ns8:t>
+                  </ns8:r>
+                </ns8:e>
+                <ns8:sub>
+                  <ns8:r>
+                    <ns8:rPr/>
+                    <w:rPr>
+                      <w:rFonts w:ascii="Cambria Math" w:hAnsi="Cambria Math" w:eastAsia="Cambria Math" w:cs="Cambria Math"/>
+                      <w:sz w:val="18"/>
+                      <w:szCs w:val="18"/>
+                    </w:rPr>
+                    <ns8:t>z</ns8:t>
+                  </ns8:r>
+                </ns8:sub>
+              </ns8:sSub>
+              <ns8:r>
+                <ns8:rPr>
+                  <ns8:sty ns8:val="p"/>
+                </ns8:rPr>
+                <w:rPr>
+                  <w:rFonts w:ascii="Cambria Math" w:hAnsi="Cambria Math" w:eastAsia="Cambria Math" w:cs="Cambria Math"/>
+                  <w:sz w:val="18"/>
+                  <w:szCs w:val="18"/>
+                </w:rPr>
+                <ns8:t>sin</ns8:t>
+              </ns8:r>
+              <ns8:sSubSup>
+                <ns8:sSubSupPr/>
+                <ns8:e>
+                  <ns8:r>
+                    <ns8:rPr/>
+                    <w:rPr>
+                      <w:rFonts w:ascii="Cambria Math" w:hAnsi="Cambria Math" w:eastAsia="Cambria Math" w:cs="Cambria Math"/>
+                      <w:sz w:val="18"/>
+                      <w:szCs w:val="18"/>
+                    </w:rPr>
+                    <ns8:t>θ</ns8:t>
+                  </ns8:r>
+                </ns8:e>
+                <ns8:sub>
+                  <ns8:r>
+                    <ns8:rPr/>
+                    <w:rPr>
+                      <w:rFonts w:ascii="Cambria Math" w:hAnsi="Cambria Math" w:eastAsia="Cambria Math" w:cs="Cambria Math"/>
+                      <w:sz w:val="18"/>
+                      <w:szCs w:val="18"/>
+                    </w:rPr>
+                    <ns8:t>5</ns8:t>
+                  </ns8:r>
+                </ns8:sub>
+                <ns8:sup>
+                  <ns8:r>
+                    <ns8:rPr>
+                      <ns8:sty ns8:val="p"/>
+                    </ns8:rPr>
+                    <w:rPr>
+                      <w:rFonts w:ascii="Cambria Math" w:hAnsi="Cambria Math" w:eastAsia="Cambria Math" w:cs="Cambria Math"/>
+                      <w:sz w:val="18"/>
+                      <w:szCs w:val="18"/>
+                    </w:rPr>
+                    <ns8:t>(±)</ns8:t>
+                  </ns8:r>
+                </ns8:sup>
+              </ns8:sSubSup>
+              <ns8:r>
+                <ns8:rPr>
+                  <ns8:sty ns8:val="p"/>
+                </ns8:rPr>
+                <w:rPr>
+                  <w:rFonts w:ascii="Cambria Math" w:hAnsi="Cambria Math" w:eastAsia="Cambria Math" w:cs="Cambria Math"/>
+                  <w:sz w:val="18"/>
+                  <w:szCs w:val="18"/>
+                </w:rPr>
+                <ns8:t>).</ns8:t>
+              </ns8:r>
+            </ns8:e>
+          </ns8:eqArr>
+        </ns8:oMath>
+      </ns8:oMathPara>
+    </w:p>
+    <w:p>
+      <w:pPr>
+        <w:pStyle w:val="BodyText"/>
+      </w:pPr>
+      <w:r>
+        <w:rPr>
+          <w:sz w:val="19"/>
+        </w:rPr>
+        <w:t>The actual wrist joints are qₐ,j = θⱼ − θ₀,j (j = 4, 5, 6), where θ₀,j are the DH zero offsets. Forward-kinematics substitution verifies each candidate; the nearest feasible branch to the previous joint state is selected.</w:t>
+      </w:r>
+    </w:p>
+    <w:p ns2:paraId="4572C6A8" ns2:textId="77777777">
+      <w:pPr>
+        <w:pStyle w:val="Heading2"/>
+        <w:snapToGrid w:val="0"/>
+        <w:widowControl/>
+        <w:numPr>
+          <w:ilvl w:val="1"/>
+          <w:numId w:val="4"/>
+        </w:numPr>
+        <w:keepNext/>
+        <w:keepLines/>
+        <w:rPr>
+          <w:rFonts w:ascii="Times New Roman" w:hAnsi="Times New Roman" w:eastAsia="SimSun" w:cs="Times New Roman"/>
+          <w:sz w:val="20"/>
+          <w:szCs w:val="20"/>
+          <w:color w:val="000000"/>
+          <w:b w:val="0"/>
+          <w:bCs w:val="0"/>
+          <w:i w:val="1"/>
+          <w:iCs w:val="1"/>
+        </w:rPr>
+      </w:pPr>
+      <w:r>
+        <w:rPr>
+          <w:rFonts w:ascii="Times New Roman" w:hAnsi="Times New Roman" w:eastAsia="SimSun" w:cs="Times New Roman"/>
+          <w:sz w:val="20"/>
+          <w:szCs w:val="20"/>
+          <w:color w:val="000000"/>
+          <w:b w:val="0"/>
+          <w:i w:val="1"/>
+          <w:lang w:val="en-US"/>
+        </w:rPr>
         <w:t xml:space="preserve">Delta Teleoperation Controller</w:t>
       </w:r>
     </w:p>
@@ -20189,7 +21495,7 @@
           <w:i w:val="0"/>
           <w:iCs w:val="0"/>
         </w:rPr>
-        <w:t xml:space="preserve">The master uses a three-limb Delta parallel mechanism for translation and three encoder-equipped revolute joints on the moving platform for orientation input (Fig. 7). Parallelogram passive arms keep both platforms parallel, separating position and orientation. Fig. 7 identifies the Delta mechanism, three-axis handle, and rotation axes. Handle joints j1–j3 give moving-axis roll, pitch, and yaw (RPY).</w:t>
+        <w:t xml:space="preserve">The master uses a three-limb Delta parallel mechanism for translation and a three-axis handle with three encoder-equipped revolute joints on the moving platform for orientation input (Fig. 7). Parallelogram passive arms keep both platforms parallel, separating position and orientation. Fig. 7 identifies the Delta mechanism, handle, and rotation axes. After encoder zero and direction calibration, joints j1–j3 provide moving-axis roll, pitch, and yaw (RPY), respectively.</w:t>
       </w:r>
     </w:p>
     <w:p ns2:paraId="06C3F0A7" ns2:textId="77777777">
@@ -20207,7 +21513,7 @@
       <w:r>
         <w:rPr>
           <w:rFonts w:ascii="Times New Roman" w:hAnsi="Times New Roman" w:eastAsia="SimSun" w:cs="Times New Roman"/>
-          <w:sz w:val="20"/>
+          <w:sz w:val="19"/>
           <w:szCs w:val="20"/>
           <w:color w:val="000000"/>
           <w:b w:val="0"/>
@@ -20293,7 +21599,7 @@
       <w:r>
         <w:rPr>
           <w:rFonts w:ascii="Times New Roman" w:hAnsi="Times New Roman" w:eastAsia="SimSun" w:cs="Times New Roman"/>
-          <w:sz w:val="20"/>
+          <w:sz w:val="19"/>
           <w:szCs w:val="20"/>
           <w:color w:val="000000"/>
           <w:b w:val="0"/>
@@ -20319,7 +21625,7 @@
       <w:r>
         <w:rPr>
           <w:rFonts w:ascii="Times New Roman" w:hAnsi="Times New Roman" w:eastAsia="SimSun" w:cs="Times New Roman"/>
-          <w:sz w:val="20"/>
+          <w:sz w:val="19"/>
           <w:szCs w:val="20"/>
           <w:color w:val="000000"/>
           <w:b w:val="0"/>
@@ -20367,7 +21673,7 @@
       <w:r>
         <w:rPr>
           <w:rFonts w:ascii="Times New Roman" w:hAnsi="Times New Roman" w:eastAsia="SimSun" w:cs="Times New Roman"/>
-          <w:sz w:val="20"/>
+          <w:sz w:val="19"/>
           <w:szCs w:val="20"/>
           <w:color w:val="000000"/>
           <w:b w:val="0"/>
@@ -20415,7 +21721,7 @@
       <w:r>
         <w:rPr>
           <w:rFonts w:ascii="Times New Roman" w:hAnsi="Times New Roman" w:eastAsia="SimSun" w:cs="Times New Roman"/>
-          <w:sz w:val="20"/>
+          <w:sz w:val="19"/>
           <w:szCs w:val="20"/>
           <w:color w:val="000000"/>
           <w:b w:val="0"/>
@@ -20465,7 +21771,7 @@
       <w:r>
         <w:rPr>
           <w:rFonts w:ascii="Times New Roman" w:hAnsi="Times New Roman" w:eastAsia="SimSun" w:cs="Times New Roman"/>
-          <w:sz w:val="20"/>
+          <w:sz w:val="19"/>
           <w:szCs w:val="20"/>
           <w:color w:val="000000"/>
           <w:b w:val="0"/>
@@ -20513,7 +21819,7 @@
       <w:r>
         <w:rPr>
           <w:rFonts w:ascii="Times New Roman" w:hAnsi="Times New Roman" w:eastAsia="SimSun" w:cs="Times New Roman"/>
-          <w:sz w:val="20"/>
+          <w:sz w:val="19"/>
           <w:szCs w:val="20"/>
           <w:color w:val="000000"/>
           <w:b w:val="0"/>
@@ -20573,7 +21879,7 @@
       <w:r>
         <w:rPr>
           <w:rFonts w:ascii="Times New Roman" w:hAnsi="Times New Roman" w:eastAsia="SimSun" w:cs="Times New Roman"/>
-          <w:sz w:val="20"/>
+          <w:sz w:val="19"/>
           <w:szCs w:val="20"/>
           <w:color w:val="000000"/>
           <w:b w:val="0"/>
@@ -20669,7 +21975,7 @@
       <w:r>
         <w:rPr>
           <w:rFonts w:ascii="Times New Roman" w:hAnsi="Times New Roman" w:eastAsia="SimSun" w:cs="Times New Roman"/>
-          <w:sz w:val="20"/>
+          <w:sz w:val="19"/>
           <w:szCs w:val="20"/>
           <w:color w:val="000000"/>
           <w:b w:val="0"/>
@@ -20765,7 +22071,7 @@
       <w:r>
         <w:rPr>
           <w:rFonts w:ascii="Times New Roman" w:hAnsi="Times New Roman" w:eastAsia="SimSun" w:cs="Times New Roman"/>
-          <w:sz w:val="20"/>
+          <w:sz w:val="19"/>
           <w:szCs w:val="20"/>
           <w:color w:val="000000"/>
           <w:b w:val="0"/>
@@ -20813,7 +22119,7 @@
       <w:r>
         <w:rPr>
           <w:rFonts w:ascii="Times New Roman" w:hAnsi="Times New Roman" w:eastAsia="SimSun" w:cs="Times New Roman"/>
-          <w:sz w:val="20"/>
+          <w:sz w:val="19"/>
           <w:szCs w:val="20"/>
           <w:color w:val="000000"/>
           <w:b w:val="0"/>
@@ -20861,7 +22167,7 @@
       <w:r>
         <w:rPr>
           <w:rFonts w:ascii="Times New Roman" w:hAnsi="Times New Roman" w:eastAsia="SimSun" w:cs="Times New Roman"/>
-          <w:sz w:val="20"/>
+          <w:sz w:val="19"/>
           <w:szCs w:val="20"/>
           <w:color w:val="000000"/>
           <w:b w:val="0"/>
@@ -21006,7 +22312,7 @@
       <w:r>
         <w:rPr>
           <w:rFonts w:ascii="Times New Roman" w:hAnsi="Times New Roman" w:eastAsia="SimSun" w:cs="Times New Roman"/>
-          <w:sz w:val="20"/>
+          <w:sz w:val="19"/>
           <w:szCs w:val="20"/>
           <w:color w:val="000000"/>
           <w:b w:val="0"/>
@@ -21179,7 +22485,7 @@
       <w:r>
         <w:rPr>
           <w:rFonts w:ascii="Times New Roman" w:hAnsi="Times New Roman" w:eastAsia="SimSun" w:cs="Times New Roman"/>
-          <w:sz w:val="20"/>
+          <w:sz w:val="19"/>
           <w:szCs w:val="20"/>
           <w:color w:val="000000"/>
           <w:b w:val="0"/>
@@ -21236,7 +22542,7 @@
       <w:r>
         <w:rPr>
           <w:rFonts w:ascii="Times New Roman" w:hAnsi="Times New Roman" w:eastAsia="SimSun" w:cs="Times New Roman"/>
-          <w:sz w:val="20"/>
+          <w:sz w:val="19"/>
           <w:szCs w:val="20"/>
           <w:color w:val="000000"/>
           <w:b w:val="0"/>
@@ -21284,14 +22590,14 @@
       <w:r>
         <w:rPr>
           <w:rFonts w:ascii="Times New Roman" w:hAnsi="Times New Roman" w:eastAsia="SimSun" w:cs="Times New Roman"/>
-          <w:sz w:val="20"/>
+          <w:sz w:val="19"/>
           <w:szCs w:val="20"/>
           <w:color w:val="000000"/>
           <w:b w:val="0"/>
           <w:i w:val="0"/>
           <w:lang w:val="en-US"/>
         </w:rPr>
-        <w:t xml:space="preserve"> working side. Fig. 8 shows the geometry. Its symmetric single-limb view defines angles and lengths; the dashed segment is the equivalent length constraint in (20).</w:t>
+        <w:t xml:space="preserve"> working side. Fig. 8 shows the geometry. Its symmetric single-limb view defines angles and lengths; the dashed segment represents the equivalent length constraint in (19).</w:t>
       </w:r>
     </w:p>
     <w:tbl>
@@ -22378,9 +23684,9 @@
               </w:rPr>
               <w:drawing>
                 <wp:inline distT="0" distB="0" distL="0" distR="0" ns4:anchorId="21C8DD9B" ns4:editId="31EA403A">
-                  <wp:extent cx="3059430" cy="2039620"/>
+                  <wp:extent cx="2450603" cy="1633736"/>
                   <wp:effectExtent l="0" t="0" r="7620" b="8255"/>
-                  <wp:docPr id="1009" name="Fig. 8" descr="Delta 平移机构与三轴姿态手柄的机构、转轴和平行约束示意"/>
+                  <wp:docPr id="1009" name="Fig. 7" descr="Delta translation mechanism, three-axis handle, rotation axes, and parallelogram constraint."/>
                   <wp:cNvGraphicFramePr>
                     <ns5:graphicFrameLocks noChangeAspect="1"/>
                   </wp:cNvGraphicFramePr>
@@ -22420,10 +23726,6 @@
               <w:pStyle w:val="figurecaption"/>
               <w:snapToGrid w:val="0"/>
               <w:widowControl/>
-              <w:numPr>
-                <w:ilvl w:val="0"/>
-                <w:numId w:val="2"/>
-              </w:numPr>
               <w:keepLines/>
               <w:keepNext w:val="0"/>
               <w:rPr>
@@ -22447,7 +23749,7 @@
                 <w:i w:val="0"/>
                 <w:lang w:val="en-US"/>
               </w:rPr>
-              <w:t xml:space="preserve">Teleoperation master and rotation axes. (a) Delta mechanism; highlighted parallelogram links keep the platforms parallel. (b) Three-axis handle, with joints and rotation axes shown from mount to grip.</w:t>
+              <w:t xml:space="preserve">Fig. 7. Teleoperation master and rotation axes. (a) Delta mechanism; highlighted parallelogram links keep the platforms parallel. (b) Three-axis handle, with joints and rotation axes shown from mount to grip.</w:t>
             </w:r>
           </w:p>
         </w:tc>
@@ -22478,7 +23780,7 @@
       <w:r>
         <w:rPr>
           <w:rFonts w:ascii="Times New Roman" w:hAnsi="Times New Roman" w:eastAsia="SimSun" w:cs="Times New Roman"/>
-          <w:sz w:val="20"/>
+          <w:sz w:val="19"/>
           <w:szCs w:val="20"/>
           <w:color w:val="000000"/>
           <w:b w:val="0"/>
@@ -22712,7 +24014,7 @@
       <w:r>
         <w:rPr>
           <w:rFonts w:ascii="Times New Roman" w:hAnsi="Times New Roman" w:eastAsia="SimSun" w:cs="Times New Roman"/>
-          <w:sz w:val="20"/>
+          <w:sz w:val="19"/>
           <w:szCs w:val="20"/>
           <w:color w:val="000000"/>
           <w:b w:val="0"/>
@@ -23215,7 +24517,7 @@
       <w:r>
         <w:rPr>
           <w:rFonts w:ascii="Times New Roman" w:hAnsi="Times New Roman" w:eastAsia="SimSun" w:cs="Times New Roman"/>
-          <w:sz w:val="20"/>
+          <w:sz w:val="19"/>
           <w:szCs w:val="20"/>
           <w:color w:val="000000"/>
           <w:b w:val="0"/>
@@ -23623,7 +24925,7 @@
       <w:r>
         <w:rPr>
           <w:rFonts w:ascii="Times New Roman" w:hAnsi="Times New Roman" w:eastAsia="SimSun" w:cs="Times New Roman"/>
-          <w:sz w:val="20"/>
+          <w:sz w:val="19"/>
           <w:szCs w:val="20"/>
           <w:color w:val="000000"/>
           <w:b w:val="0"/>
@@ -24185,7 +25487,7 @@
       <w:r>
         <w:rPr>
           <w:rFonts w:ascii="Times New Roman" w:hAnsi="Times New Roman" w:eastAsia="SimSun" w:cs="Times New Roman"/>
-          <w:sz w:val="20"/>
+          <w:sz w:val="19"/>
           <w:szCs w:val="20"/>
           <w:color w:val="000000"/>
           <w:b w:val="0"/>
@@ -24407,7 +25709,7 @@
       <w:r>
         <w:rPr>
           <w:rFonts w:ascii="Times New Roman" w:hAnsi="Times New Roman" w:eastAsia="SimSun" w:cs="Times New Roman"/>
-          <w:sz w:val="20"/>
+          <w:sz w:val="19"/>
           <w:szCs w:val="20"/>
           <w:color w:val="000000"/>
           <w:b w:val="0"/>
@@ -25680,7 +26982,7 @@
       <w:r>
         <w:rPr>
           <w:rFonts w:ascii="Times New Roman" w:hAnsi="Times New Roman" w:eastAsia="SimSun" w:cs="Times New Roman"/>
-          <w:sz w:val="20"/>
+          <w:sz w:val="19"/>
           <w:szCs w:val="20"/>
           <w:color w:val="000000"/>
           <w:b w:val="0"/>
@@ -25731,7 +27033,7 @@
       <w:r>
         <w:rPr>
           <w:rFonts w:ascii="Times New Roman" w:hAnsi="Times New Roman" w:eastAsia="SimSun" w:cs="Times New Roman"/>
-          <w:sz w:val="20"/>
+          <w:sz w:val="19"/>
           <w:szCs w:val="20"/>
           <w:color w:val="000000"/>
           <w:b w:val="0"/>
@@ -25875,7 +27177,7 @@
       <w:r>
         <w:rPr>
           <w:rFonts w:ascii="Times New Roman" w:hAnsi="Times New Roman" w:eastAsia="SimSun" w:cs="Times New Roman"/>
-          <w:sz w:val="20"/>
+          <w:sz w:val="19"/>
           <w:szCs w:val="20"/>
           <w:color w:val="000000"/>
           <w:b w:val="0"/>
@@ -26019,7 +27321,7 @@
       <w:r>
         <w:rPr>
           <w:rFonts w:ascii="Times New Roman" w:hAnsi="Times New Roman" w:eastAsia="SimSun" w:cs="Times New Roman"/>
-          <w:sz w:val="20"/>
+          <w:sz w:val="19"/>
           <w:szCs w:val="20"/>
           <w:color w:val="000000"/>
           <w:b w:val="0"/>
@@ -26266,6 +27568,9 @@
         </ns8:r>
       </ns8:oMath>
       <w:r>
+        <w:rPr>
+          <w:sz w:val="19"/>
+        </w:rPr>
         <w:t>.</w:t>
       </w:r>
     </w:p>
@@ -26334,9 +27639,9 @@
               </w:rPr>
               <w:drawing>
                 <wp:inline distT="0" distB="0" distL="0" distR="0" ns4:anchorId="02AEBE66" ns4:editId="04CB13EB">
-                  <wp:extent cx="2202790" cy="1473098"/>
+                  <wp:extent cx="1764435" cy="1179951"/>
                   <wp:effectExtent l="0" t="0" r="0" b="0"/>
-                  <wp:docPr id="1010" name="Fig. 9" descr="Delta 三支链及单支链几何模型，基座原点位于静平台中心"/>
+                  <wp:docPr id="1010" name="Fig. 8" descr="Delta three-limb and single-limb geometry with the base origin at the fixed-platform center."/>
                   <wp:cNvGraphicFramePr>
                     <ns5:graphicFrameLocks noChangeAspect="1"/>
                   </wp:cNvGraphicFramePr>
@@ -26376,10 +27681,6 @@
               <w:pStyle w:val="figurecaption"/>
               <w:snapToGrid w:val="0"/>
               <w:widowControl/>
-              <w:numPr>
-                <w:ilvl w:val="0"/>
-                <w:numId w:val="2"/>
-              </w:numPr>
               <w:keepLines/>
               <w:keepNext w:val="0"/>
               <w:rPr>
@@ -26403,7 +27704,7 @@
                 <w:i w:val="0"/>
                 <w:lang w:val="en-US"/>
               </w:rPr>
-              <w:t xml:space="preserve">Delta geometry. (a) Three limbs and right-handed frame {D}: O is the fixed-platform center, +x points normally from moving to fixed platform, +z toward A1, and P marks the moving-platform center. Parallelogram links keep platforms parallel. (b) Symmetric limb section with radii, lengths, active-arm angle, and equivalent sphere center.</w:t>
+              <w:t xml:space="preserve">Fig. 8. Delta geometry. (a) Three limbs and right-handed frame {D}: O is the fixed-platform center, the +x axis is normal to the platform and points from the moving platform toward the fixed platform, +z toward A1, and P marks the moving-platform center. Parallelogram links keep platforms parallel. (b) Symmetric limb section with radii, lengths, active-arm angle, and equivalent sphere center.</w:t>
             </w:r>
           </w:p>
         </w:tc>
@@ -26434,7 +27735,7 @@
       <w:r>
         <w:rPr>
           <w:rFonts w:ascii="Times New Roman" w:hAnsi="Times New Roman" w:eastAsia="SimSun" w:cs="Times New Roman"/>
-          <w:sz w:val="20"/>
+          <w:sz w:val="19"/>
           <w:szCs w:val="20"/>
           <w:color w:val="000000"/>
           <w:b w:val="0"/>
@@ -26634,7 +27935,7 @@
       <w:r>
         <w:rPr>
           <w:rFonts w:ascii="Times New Roman" w:hAnsi="Times New Roman" w:eastAsia="SimSun" w:cs="Times New Roman"/>
-          <w:sz w:val="20"/>
+          <w:sz w:val="19"/>
           <w:szCs w:val="20"/>
           <w:color w:val="000000"/>
           <w:b w:val="0"/>
@@ -26890,7 +28191,7 @@
       <w:r>
         <w:rPr>
           <w:rFonts w:ascii="Times New Roman" w:hAnsi="Times New Roman" w:eastAsia="SimSun" w:cs="Times New Roman"/>
-          <w:sz w:val="20"/>
+          <w:sz w:val="19"/>
           <w:szCs w:val="20"/>
           <w:color w:val="000000"/>
           <w:b w:val="0"/>
@@ -27699,7 +29000,7 @@
       <w:r>
         <w:rPr>
           <w:rFonts w:ascii="Times New Roman" w:hAnsi="Times New Roman" w:eastAsia="SimSun" w:cs="Times New Roman"/>
-          <w:sz w:val="20"/>
+          <w:sz w:val="19"/>
           <w:szCs w:val="20"/>
           <w:color w:val="000000"/>
           <w:b w:val="0"/>
@@ -28001,7 +29302,7 @@
           <w:i w:val="0"/>
           <w:iCs w:val="0"/>
         </w:rPr>
-        <w:t xml:space="preserve"> provides master position. According to Pieper's study [9], calibrated joints j1–j3 directly specify moving-axis roll, pitch, and yaw, respectively; the corresponding angles are </w:t>
+        <w:t xml:space="preserve"> provides master position. After encoder zero and direction calibration, joints j1–j3 specify moving-axis roll, pitch, and yaw, respectively; the corresponding angles are </w:t>
       </w:r>
       <ns8:oMath>
         <ns8:d>
@@ -28815,7 +30116,7 @@
       <w:r>
         <w:rPr>
           <w:rFonts w:ascii="Times New Roman" w:hAnsi="Times New Roman" w:eastAsia="SimSun" w:cs="Times New Roman"/>
-          <w:sz w:val="20"/>
+          <w:sz w:val="19"/>
           <w:szCs w:val="20"/>
           <w:color w:val="000000"/>
           <w:b w:val="0"/>
@@ -28866,7 +30167,7 @@
       <w:r>
         <w:rPr>
           <w:rFonts w:ascii="Times New Roman" w:hAnsi="Times New Roman" w:eastAsia="SimSun" w:cs="Times New Roman"/>
-          <w:sz w:val="20"/>
+          <w:sz w:val="19"/>
           <w:szCs w:val="20"/>
           <w:color w:val="000000"/>
           <w:b w:val="0"/>
@@ -28917,7 +30218,7 @@
       <w:r>
         <w:rPr>
           <w:rFonts w:ascii="Times New Roman" w:hAnsi="Times New Roman" w:eastAsia="SimSun" w:cs="Times New Roman"/>
-          <w:sz w:val="20"/>
+          <w:sz w:val="19"/>
           <w:szCs w:val="20"/>
           <w:color w:val="000000"/>
           <w:b w:val="0"/>
@@ -28970,7 +30271,7 @@
       <w:r>
         <w:rPr>
           <w:rFonts w:ascii="Times New Roman" w:hAnsi="Times New Roman" w:eastAsia="SimSun" w:cs="Times New Roman"/>
-          <w:sz w:val="20"/>
+          <w:sz w:val="19"/>
           <w:szCs w:val="20"/>
           <w:color w:val="000000"/>
           <w:b w:val="0"/>
@@ -29021,7 +30322,7 @@
       <w:r>
         <w:rPr>
           <w:rFonts w:ascii="Times New Roman" w:hAnsi="Times New Roman" w:eastAsia="SimSun" w:cs="Times New Roman"/>
-          <w:sz w:val="20"/>
+          <w:sz w:val="19"/>
           <w:szCs w:val="20"/>
           <w:color w:val="000000"/>
           <w:b w:val="0"/>
@@ -29047,7 +30348,7 @@
       <w:r>
         <w:rPr>
           <w:rFonts w:ascii="Times New Roman" w:hAnsi="Times New Roman" w:eastAsia="SimSun" w:cs="Times New Roman"/>
-          <w:sz w:val="20"/>
+          <w:sz w:val="19"/>
           <w:szCs w:val="20"/>
           <w:color w:val="000000"/>
           <w:b w:val="0"/>
@@ -29098,7 +30399,7 @@
       <w:r>
         <w:rPr>
           <w:rFonts w:ascii="Times New Roman" w:hAnsi="Times New Roman" w:eastAsia="SimSun" w:cs="Times New Roman"/>
-          <w:sz w:val="20"/>
+          <w:sz w:val="19"/>
           <w:szCs w:val="20"/>
           <w:color w:val="000000"/>
           <w:b w:val="0"/>
@@ -29149,7 +30450,7 @@
       <w:r>
         <w:rPr>
           <w:rFonts w:ascii="Times New Roman" w:hAnsi="Times New Roman" w:eastAsia="SimSun" w:cs="Times New Roman"/>
-          <w:sz w:val="20"/>
+          <w:sz w:val="19"/>
           <w:szCs w:val="20"/>
           <w:color w:val="000000"/>
           <w:b w:val="0"/>
@@ -29697,7 +30998,7 @@
       <w:r>
         <w:rPr>
           <w:rFonts w:ascii="Times New Roman" w:hAnsi="Times New Roman" w:eastAsia="SimSun" w:cs="Times New Roman"/>
-          <w:sz w:val="20"/>
+          <w:sz w:val="19"/>
           <w:szCs w:val="20"/>
           <w:color w:val="000000"/>
           <w:b w:val="0"/>
@@ -29748,7 +31049,7 @@
       <w:r>
         <w:rPr>
           <w:rFonts w:ascii="Times New Roman" w:hAnsi="Times New Roman" w:eastAsia="SimSun" w:cs="Times New Roman"/>
-          <w:sz w:val="20"/>
+          <w:sz w:val="19"/>
           <w:szCs w:val="20"/>
           <w:color w:val="000000"/>
           <w:b w:val="0"/>
@@ -29952,7 +31253,7 @@
       <w:r>
         <w:rPr>
           <w:rFonts w:ascii="Times New Roman" w:hAnsi="Times New Roman" w:eastAsia="SimSun" w:cs="Times New Roman"/>
-          <w:sz w:val="20"/>
+          <w:sz w:val="19"/>
           <w:szCs w:val="20"/>
           <w:color w:val="000000"/>
           <w:b w:val="0"/>
@@ -30003,7 +31304,7 @@
       <w:r>
         <w:rPr>
           <w:rFonts w:ascii="Times New Roman" w:hAnsi="Times New Roman" w:eastAsia="SimSun" w:cs="Times New Roman"/>
-          <w:sz w:val="20"/>
+          <w:sz w:val="19"/>
           <w:szCs w:val="20"/>
           <w:color w:val="000000"/>
           <w:b w:val="0"/>
@@ -30054,7 +31355,7 @@
       <w:r>
         <w:rPr>
           <w:rFonts w:ascii="Times New Roman" w:hAnsi="Times New Roman" w:eastAsia="SimSun" w:cs="Times New Roman"/>
-          <w:sz w:val="20"/>
+          <w:sz w:val="19"/>
           <w:szCs w:val="20"/>
           <w:color w:val="000000"/>
           <w:b w:val="0"/>
@@ -30080,14 +31381,14 @@
       <w:r>
         <w:rPr>
           <w:rFonts w:ascii="Times New Roman" w:hAnsi="Times New Roman" w:eastAsia="SimSun" w:cs="Times New Roman"/>
-          <w:sz w:val="20"/>
+          <w:sz w:val="19"/>
           <w:szCs w:val="20"/>
           <w:color w:val="000000"/>
           <w:b w:val="0"/>
           <w:i w:val="0"/>
           <w:lang w:val="en-US"/>
         </w:rPr>
-        <w:t xml:space="preserve">Recombining (26) gives the slave end-effector target homogeneous transformation relative to its arm base:</w:t>
+        <w:t xml:space="preserve">Combining the position and orientation targets in (24) gives the slave end-effector target homogeneous transformation relative to its arm base:</w:t>
       </w:r>
     </w:p>
     <w:p>
@@ -30385,7 +31686,7 @@
       <w:r>
         <w:rPr>
           <w:rFonts w:ascii="Times New Roman" w:hAnsi="Times New Roman" w:eastAsia="SimSun" w:cs="Times New Roman"/>
-          <w:sz w:val="20"/>
+          <w:sz w:val="19"/>
           <w:szCs w:val="20"/>
           <w:color w:val="000000"/>
           <w:b w:val="0"/>
@@ -30436,7 +31737,7 @@
       <w:r>
         <w:rPr>
           <w:rFonts w:ascii="Times New Roman" w:hAnsi="Times New Roman" w:eastAsia="SimSun" w:cs="Times New Roman"/>
-          <w:sz w:val="20"/>
+          <w:sz w:val="19"/>
           <w:szCs w:val="20"/>
           <w:color w:val="000000"/>
           <w:b w:val="0"/>
@@ -30653,7 +31954,7 @@
       <w:r>
         <w:rPr>
           <w:rFonts w:ascii="Times New Roman" w:hAnsi="Times New Roman" w:eastAsia="SimSun" w:cs="Times New Roman"/>
-          <w:sz w:val="20"/>
+          <w:sz w:val="19"/>
           <w:szCs w:val="20"/>
           <w:color w:val="000000"/>
           <w:b w:val="0"/>
@@ -30713,7 +32014,7 @@
       <w:r>
         <w:rPr>
           <w:rFonts w:ascii="Times New Roman" w:hAnsi="Times New Roman" w:eastAsia="SimSun" w:cs="Times New Roman"/>
-          <w:sz w:val="20"/>
+          <w:sz w:val="19"/>
           <w:szCs w:val="20"/>
           <w:color w:val="000000"/>
           <w:b w:val="0"/>
@@ -30791,7 +32092,7 @@
               </w:rPr>
               <w:drawing>
                 <wp:inline distT="0" distB="0" distL="0" distR="0" ns4:anchorId="7DC7CF13" ns4:editId="755FFF48">
-                  <wp:extent cx="1422000" cy="1054954"/>
+                  <wp:extent cx="1139022" cy="845019"/>
                   <wp:effectExtent l="0" t="0" r="0" b="2540"/>
                   <wp:docPr id="1011" name="Fig. 9(a)" descr="(a) Forward grasp"/>
                   <wp:cNvGraphicFramePr>
@@ -30854,7 +32155,7 @@
               </w:rPr>
               <w:drawing>
                 <wp:inline distT="0" distB="0" distL="0" distR="0" ns4:anchorId="7ED153BB" ns4:editId="3F862066">
-                  <wp:extent cx="1422000" cy="1054346"/>
+                  <wp:extent cx="1139022" cy="844531"/>
                   <wp:effectExtent l="0" t="0" r="0" b="3175"/>
                   <wp:docPr id="1012" name="Fig. 9(b)" descr="(b) Rightward grasp"/>
                   <wp:cNvGraphicFramePr>
@@ -30983,7 +32284,7 @@
               </w:rPr>
               <w:drawing>
                 <wp:inline distT="0" distB="0" distL="0" distR="0" ns4:anchorId="1795BF73" ns4:editId="66DE62CF">
-                  <wp:extent cx="1422000" cy="1054346"/>
+                  <wp:extent cx="1139022" cy="844531"/>
                   <wp:effectExtent l="0" t="0" r="0" b="3175"/>
                   <wp:docPr id="1013" name="Fig. 9(c)" descr="(c) Upward tilt"/>
                   <wp:cNvGraphicFramePr>
@@ -31046,7 +32347,7 @@
               </w:rPr>
               <w:drawing>
                 <wp:inline distT="0" distB="0" distL="0" distR="0" ns4:anchorId="7C819CB3" ns4:editId="136588C0">
-                  <wp:extent cx="1422000" cy="1054346"/>
+                  <wp:extent cx="1139022" cy="844531"/>
                   <wp:effectExtent l="0" t="0" r="0" b="3175"/>
                   <wp:docPr id="1014" name="Fig. 9(d)" descr="(d) Downward tilt"/>
                   <wp:cNvGraphicFramePr>
@@ -31142,10 +32443,6 @@
               <w:pStyle w:val="figurecaption"/>
               <w:snapToGrid w:val="0"/>
               <w:widowControl/>
-              <w:numPr>
-                <w:ilvl w:val="0"/>
-                <w:numId w:val="2"/>
-              </w:numPr>
               <w:keepLines/>
               <w:keepNext w:val="0"/>
               <w:rPr>
@@ -31169,7 +32466,7 @@
                 <w:i w:val="0"/>
                 <w:lang w:val="en-US"/>
               </w:rPr>
-              <w:t xml:space="preserve">Delta-master teleoperation. (a) Forward grasp. (b) Rightward grasp. (c) Upward tilt. (d) Downward tilt. Each panel shows the operator/master and robot/arm; </w:t>
+              <w:t xml:space="preserve">Fig. 9. Delta-master teleoperation. (a) Forward grasp. (b) Rightward grasp. (c) Upward tilt. (d) Downward tilt. Each panel shows the operator/master and robot/arm;  and  denote the handle and gripper-tool frames.</w:t>
             </w:r>
             <ns8:oMath>
               <ns8:r>
@@ -31193,7 +32490,6 @@
                 <w:i w:val="0"/>
                 <w:lang w:val="en-US"/>
               </w:rPr>
-              <w:t xml:space="preserve"> and </w:t>
             </w:r>
             <ns8:oMath>
               <ns8:r>
@@ -31217,7 +32513,6 @@
                 <w:i w:val="0"/>
                 <w:lang w:val="en-US"/>
               </w:rPr>
-              <w:t xml:space="preserve"> denote the handle and gripper-tool frames.</w:t>
             </w:r>
           </w:p>
         </w:tc>
@@ -31282,7 +32577,7 @@
       <w:r>
         <w:rPr>
           <w:rFonts w:ascii="Times New Roman" w:hAnsi="Times New Roman" w:eastAsia="SimSun" w:cs="Times New Roman"/>
-          <w:sz w:val="20"/>
+          <w:sz w:val="19"/>
           <w:szCs w:val="20"/>
           <w:color w:val="000000"/>
           <w:b w:val="0"/>
@@ -31360,9 +32655,9 @@
               </w:rPr>
               <w:drawing>
                 <wp:inline distT="0" distB="0" distL="0" distR="0" ns4:anchorId="393BDBD5" ns4:editId="486D490E">
-                  <wp:extent cx="1137600" cy="850770"/>
+                  <wp:extent cx="819072" cy="612554"/>
                   <wp:effectExtent l="0" t="0" r="0" b="3175"/>
-                  <wp:docPr id="1015" name="Fig. 10(b)" descr="(b) 1.8 s"/>
+                  <wp:docPr id="1015" name="Fig. 10(a)" descr="(b) 1.8 s"/>
                   <wp:cNvGraphicFramePr>
                     <ns5:graphicFrameLocks noChangeAspect="1"/>
                   </wp:cNvGraphicFramePr>
@@ -31423,9 +32718,9 @@
               </w:rPr>
               <w:drawing>
                 <wp:inline distT="0" distB="0" distL="0" distR="0" ns4:anchorId="23986D4A" ns4:editId="29A56323">
-                  <wp:extent cx="1137600" cy="850770"/>
+                  <wp:extent cx="819072" cy="612554"/>
                   <wp:effectExtent l="0" t="0" r="0" b="3175"/>
-                  <wp:docPr id="1016" name="Fig. 10(c)" descr="(c) 2.6 s"/>
+                  <wp:docPr id="1016" name="Fig. 10(b)" descr="(c) 2.6 s"/>
                   <wp:cNvGraphicFramePr>
                     <ns5:graphicFrameLocks noChangeAspect="1"/>
                   </wp:cNvGraphicFramePr>
@@ -31606,9 +32901,9 @@
               </w:rPr>
               <w:drawing>
                 <wp:inline distT="0" distB="0" distL="0" distR="0" ns4:anchorId="48D8F27B" ns4:editId="45DB3E70">
-                  <wp:extent cx="1137600" cy="910080"/>
+                  <wp:extent cx="819072" cy="655258"/>
                   <wp:effectExtent l="0" t="0" r="0" b="1905"/>
-                  <wp:docPr id="1017" name="Fig. 10(f)" descr="(f) 5.1 s"/>
+                  <wp:docPr id="1017" name="Fig. 10(c)" descr="(f) 5.1 s"/>
                   <wp:cNvGraphicFramePr>
                     <ns5:graphicFrameLocks noChangeAspect="1"/>
                   </wp:cNvGraphicFramePr>
@@ -31669,9 +32964,9 @@
               </w:rPr>
               <w:drawing>
                 <wp:inline distT="0" distB="0" distL="0" distR="0" ns4:anchorId="06F71BCB" ns4:editId="50F1EAB3">
-                  <wp:extent cx="1137600" cy="910080"/>
+                  <wp:extent cx="819072" cy="655258"/>
                   <wp:effectExtent l="0" t="0" r="0" b="1905"/>
-                  <wp:docPr id="1018" name="Fig. 10(g)" descr="(g) 5.8 s"/>
+                  <wp:docPr id="1018" name="Fig. 10(d)" descr="(g) 5.8 s"/>
                   <wp:cNvGraphicFramePr>
                     <ns5:graphicFrameLocks noChangeAspect="1"/>
                   </wp:cNvGraphicFramePr>
@@ -31835,10 +33130,6 @@
               <w:pStyle w:val="figurecaption"/>
               <w:snapToGrid w:val="0"/>
               <w:widowControl/>
-              <w:numPr>
-                <w:ilvl w:val="0"/>
-                <w:numId w:val="2"/>
-              </w:numPr>
               <w:keepLines/>
               <w:keepNext w:val="0"/>
               <w:rPr>
@@ -31862,7 +33153,7 @@
                 <w:i w:val="0"/>
                 <w:lang w:val="en-US"/>
               </w:rPr>
-              <w:t xml:space="preserve">Two-step climbing sequence (left-to-right by row; times relative to video): (a), (b) first step; (c), (d) second step.</w:t>
+              <w:t xml:space="preserve">Fig. 10. Two-step climbing sequence (left-to-right by row; times relative to video): (a), (b) first step; (c), (d) second step.</w:t>
             </w:r>
           </w:p>
         </w:tc>
@@ -31928,14 +33219,14 @@
       <w:r>
         <w:rPr>
           <w:rFonts w:ascii="Times New Roman" w:hAnsi="Times New Roman" w:eastAsia="SimSun" w:cs="Times New Roman"/>
-          <w:sz w:val="20"/>
+          <w:sz w:val="19"/>
           <w:szCs w:val="20"/>
           <w:color w:val="000000"/>
           <w:b w:val="0"/>
           <w:i w:val="0"/>
           <w:lang w:val="en-US"/>
         </w:rPr>
-        <w:t xml:space="preserve">This paper presents structural design, kinematic mapping, and chassis model-based feedforward for a Mecanum-wheeled quadrupedal chassis, six-axis arm, and Delta heterogeneous teleoperation controller. Two-joint wheeled legs and Mecanum wheels provide support adjustment and planar mobility through single-leg virtual-work mapping and whole-body single-rigid-body force allocation. Analytical arm inverse kinematics converts end-effector targets into joint commands. Delta translation, three-encoder orientation input, and frame calibration and position scaling connect operator and robot.</w:t>
+        <w:t>This paper presents structural design, kinematic mapping, and chassis model-based feedforward for a Mecanum-wheeled quadrupedal chassis, six-axis arm, and Delta heterogeneous teleoperation controller. Two-joint wheeled legs and Mecanum wheels provide support adjustment and planar mobility through single-leg virtual-work mapping and whole-body single-rigid-body force allocation. Analytical arm inverse kinematics converts end-effector targets into joint commands. Delta translation, three-axis, three-encoder orientation input, and frame calibration and position scaling connect operator and robot.</w:t>
       </w:r>
     </w:p>
     <w:p ns2:paraId="49D98658" ns2:textId="77777777">
@@ -31953,7 +33244,7 @@
       <w:r>
         <w:rPr>
           <w:rFonts w:ascii="Times New Roman" w:hAnsi="Times New Roman" w:eastAsia="SimSun" w:cs="Times New Roman"/>
-          <w:sz w:val="20"/>
+          <w:sz w:val="19"/>
           <w:szCs w:val="20"/>
           <w:color w:val="000000"/>
           <w:b w:val="0"/>
@@ -34701,6 +35992,7 @@
     </w:pPr>
     <w:rPr>
       <w:spacing w:val="-1"/>
+      <w:sz w:val="19"/>
       <w:lang w:val="x-none" w:eastAsia="x-none"/>
     </w:rPr>
   </w:style>
@@ -34746,9 +36038,6 @@
     <w:name w:val="figure caption"/>
     <w:rsid w:val="005B0344"/>
     <w:pPr>
-      <w:numPr>
-        <w:numId w:val="2"/>
-      </w:numPr>
       <w:tabs>
         <w:tab w:val="left" w:pos="533"/>
       </w:tabs>

</xml_diff>

<commit_message>
Fit compact English paper into six pages
</commit_message>
<xml_diff>
--- a/Article5_English_IEEE_Letter_Compact.docx
+++ b/Article5_English_IEEE_Letter_Compact.docx
@@ -684,6 +684,7 @@
         <w:pStyle w:val="BodyText"/>
         <w:snapToGrid w:val="0"/>
         <w:widowControl/>
+        <w:spacing w:after="20" w:line="216" w:lineRule="auto"/>
         <w:rPr>
           <w:rFonts w:ascii="Times New Roman" w:hAnsi="Times New Roman" w:eastAsia="SimSun" w:cs="Times New Roman"/>
           <w:sz w:val="20"/>
@@ -694,7 +695,7 @@
       <w:r>
         <w:rPr>
           <w:rFonts w:ascii="Times New Roman" w:hAnsi="Times New Roman" w:eastAsia="SimSun" w:cs="Times New Roman"/>
-          <w:sz w:val="19"/>
+          <w:sz w:val="20"/>
           <w:szCs w:val="20"/>
           <w:color w:val="000000"/>
           <w:b w:val="0"/>
@@ -709,6 +710,7 @@
         <w:pStyle w:val="BodyText"/>
         <w:snapToGrid w:val="0"/>
         <w:widowControl/>
+        <w:spacing w:after="20" w:line="216" w:lineRule="auto"/>
         <w:rPr>
           <w:rFonts w:ascii="Times New Roman" w:hAnsi="Times New Roman" w:eastAsia="SimSun" w:cs="Times New Roman"/>
           <w:sz w:val="20"/>
@@ -719,7 +721,7 @@
       <w:r>
         <w:rPr>
           <w:rFonts w:ascii="Times New Roman" w:hAnsi="Times New Roman" w:eastAsia="SimSun" w:cs="Times New Roman"/>
-          <w:sz w:val="19"/>
+          <w:sz w:val="20"/>
           <w:szCs w:val="20"/>
           <w:color w:val="000000"/>
           <w:b w:val="0"/>
@@ -734,6 +736,7 @@
         <w:pStyle w:val="BodyText"/>
         <w:snapToGrid w:val="0"/>
         <w:widowControl/>
+        <w:spacing w:after="20" w:line="216" w:lineRule="auto"/>
         <w:rPr>
           <w:rFonts w:ascii="Times New Roman" w:hAnsi="Times New Roman" w:eastAsia="SimSun" w:cs="Times New Roman"/>
           <w:sz w:val="20"/>
@@ -744,7 +747,7 @@
       <w:r>
         <w:rPr>
           <w:rFonts w:ascii="Times New Roman" w:hAnsi="Times New Roman" w:eastAsia="SimSun" w:cs="Times New Roman"/>
-          <w:sz w:val="19"/>
+          <w:sz w:val="20"/>
           <w:szCs w:val="20"/>
           <w:color w:val="000000"/>
           <w:b w:val="0"/>
@@ -1199,6 +1202,7 @@
         <w:pStyle w:val="BodyText"/>
         <w:snapToGrid w:val="0"/>
         <w:widowControl/>
+        <w:spacing w:after="20" w:line="216" w:lineRule="auto"/>
         <w:rPr>
           <w:rFonts w:ascii="Times New Roman" w:hAnsi="Times New Roman" w:eastAsia="SimSun" w:cs="Times New Roman"/>
           <w:sz w:val="20"/>
@@ -1209,7 +1213,7 @@
       <w:r>
         <w:rPr>
           <w:rFonts w:ascii="Times New Roman" w:hAnsi="Times New Roman" w:eastAsia="SimSun" w:cs="Times New Roman"/>
-          <w:sz w:val="19"/>
+          <w:sz w:val="20"/>
           <w:szCs w:val="20"/>
           <w:color w:val="000000"/>
           <w:b w:val="0"/>
@@ -1224,6 +1228,7 @@
         <w:pStyle w:val="BodyText"/>
         <w:snapToGrid w:val="0"/>
         <w:widowControl/>
+        <w:spacing w:after="20" w:line="216" w:lineRule="auto"/>
         <w:rPr>
           <w:rFonts w:ascii="Times New Roman" w:hAnsi="Times New Roman" w:eastAsia="SimSun" w:cs="Times New Roman"/>
           <w:sz w:val="20"/>
@@ -1234,7 +1239,7 @@
       <w:r>
         <w:rPr>
           <w:rFonts w:ascii="Times New Roman" w:hAnsi="Times New Roman" w:eastAsia="SimSun" w:cs="Times New Roman"/>
-          <w:sz w:val="19"/>
+          <w:sz w:val="20"/>
           <w:szCs w:val="20"/>
           <w:color w:val="000000"/>
           <w:b w:val="0"/>
@@ -1249,6 +1254,7 @@
         <w:pStyle w:val="BodyText"/>
         <w:snapToGrid w:val="0"/>
         <w:widowControl/>
+        <w:spacing w:after="20" w:line="216" w:lineRule="auto"/>
         <w:rPr>
           <w:rFonts w:ascii="Times New Roman" w:hAnsi="Times New Roman" w:eastAsia="SimSun" w:cs="Times New Roman"/>
           <w:sz w:val="20"/>
@@ -1259,7 +1265,7 @@
       <w:r>
         <w:rPr>
           <w:rFonts w:ascii="Times New Roman" w:hAnsi="Times New Roman" w:eastAsia="SimSun" w:cs="Times New Roman"/>
-          <w:sz w:val="19"/>
+          <w:sz w:val="20"/>
           <w:szCs w:val="20"/>
           <w:color w:val="000000"/>
           <w:b w:val="0"/>
@@ -1422,6 +1428,7 @@
         <w:pStyle w:val="BodyText"/>
         <w:snapToGrid w:val="0"/>
         <w:widowControl/>
+        <w:spacing w:after="20" w:line="216" w:lineRule="auto"/>
         <w:rPr>
           <w:rFonts w:ascii="Times New Roman" w:hAnsi="Times New Roman" w:eastAsia="SimSun" w:cs="Times New Roman"/>
           <w:sz w:val="20"/>
@@ -1432,7 +1439,7 @@
       <w:r>
         <w:rPr>
           <w:rFonts w:ascii="Times New Roman" w:hAnsi="Times New Roman" w:eastAsia="SimSun" w:cs="Times New Roman"/>
-          <w:sz w:val="19"/>
+          <w:sz w:val="20"/>
           <w:szCs w:val="20"/>
           <w:color w:val="000000"/>
           <w:b w:val="0"/>
@@ -1458,7 +1465,7 @@
       <w:r>
         <w:rPr>
           <w:rFonts w:ascii="Times New Roman" w:hAnsi="Times New Roman" w:eastAsia="SimSun" w:cs="Times New Roman"/>
-          <w:sz w:val="19"/>
+          <w:sz w:val="20"/>
           <w:szCs w:val="20"/>
           <w:color w:val="000000"/>
           <w:b w:val="0"/>
@@ -1484,7 +1491,7 @@
       <w:r>
         <w:rPr>
           <w:rFonts w:ascii="Times New Roman" w:hAnsi="Times New Roman" w:eastAsia="SimSun" w:cs="Times New Roman"/>
-          <w:sz w:val="19"/>
+          <w:sz w:val="20"/>
           <w:szCs w:val="20"/>
           <w:color w:val="000000"/>
           <w:b w:val="0"/>
@@ -1625,7 +1632,7 @@
       <w:r>
         <w:rPr>
           <w:rFonts w:ascii="Times New Roman" w:hAnsi="Times New Roman" w:eastAsia="SimSun" w:cs="Times New Roman"/>
-          <w:sz w:val="19"/>
+          <w:sz w:val="20"/>
           <w:szCs w:val="20"/>
           <w:color w:val="000000"/>
           <w:b w:val="0"/>
@@ -1648,7 +1655,7 @@
       <w:r>
         <w:rPr>
           <w:rFonts w:ascii="Times New Roman" w:hAnsi="Times New Roman" w:eastAsia="SimSun" w:cs="Times New Roman"/>
-          <w:sz w:val="19"/>
+          <w:sz w:val="20"/>
           <w:szCs w:val="20"/>
           <w:color w:val="000000"/>
           <w:b w:val="0"/>
@@ -1696,7 +1703,7 @@
       <w:r>
         <w:rPr>
           <w:rFonts w:ascii="Times New Roman" w:hAnsi="Times New Roman" w:eastAsia="SimSun" w:cs="Times New Roman"/>
-          <w:sz w:val="19"/>
+          <w:sz w:val="20"/>
           <w:szCs w:val="20"/>
           <w:color w:val="000000"/>
           <w:b w:val="0"/>
@@ -1747,7 +1754,7 @@
       <w:r>
         <w:rPr>
           <w:rFonts w:ascii="Times New Roman" w:hAnsi="Times New Roman" w:eastAsia="SimSun" w:cs="Times New Roman"/>
-          <w:sz w:val="19"/>
+          <w:sz w:val="20"/>
           <w:szCs w:val="20"/>
           <w:color w:val="000000"/>
           <w:b w:val="0"/>
@@ -1798,7 +1805,7 @@
       <w:r>
         <w:rPr>
           <w:rFonts w:ascii="Times New Roman" w:hAnsi="Times New Roman" w:eastAsia="SimSun" w:cs="Times New Roman"/>
-          <w:sz w:val="19"/>
+          <w:sz w:val="20"/>
           <w:szCs w:val="20"/>
           <w:color w:val="000000"/>
           <w:b w:val="0"/>
@@ -1824,7 +1831,7 @@
       <w:r>
         <w:rPr>
           <w:rFonts w:ascii="Times New Roman" w:hAnsi="Times New Roman" w:eastAsia="SimSun" w:cs="Times New Roman"/>
-          <w:sz w:val="19"/>
+          <w:sz w:val="20"/>
           <w:szCs w:val="20"/>
           <w:color w:val="000000"/>
           <w:b w:val="0"/>
@@ -1850,7 +1857,7 @@
       <w:r>
         <w:rPr>
           <w:rFonts w:ascii="Times New Roman" w:hAnsi="Times New Roman" w:eastAsia="SimSun" w:cs="Times New Roman"/>
-          <w:sz w:val="19"/>
+          <w:sz w:val="20"/>
           <w:szCs w:val="20"/>
           <w:color w:val="000000"/>
           <w:b w:val="0"/>
@@ -1876,7 +1883,7 @@
       <w:r>
         <w:rPr>
           <w:rFonts w:ascii="Times New Roman" w:hAnsi="Times New Roman" w:eastAsia="SimSun" w:cs="Times New Roman"/>
-          <w:sz w:val="19"/>
+          <w:sz w:val="20"/>
           <w:szCs w:val="20"/>
           <w:color w:val="000000"/>
           <w:b w:val="0"/>
@@ -2025,7 +2032,7 @@
       <w:r>
         <w:rPr>
           <w:rFonts w:ascii="Times New Roman" w:hAnsi="Times New Roman" w:eastAsia="SimSun" w:cs="Times New Roman"/>
-          <w:sz w:val="19"/>
+          <w:sz w:val="20"/>
           <w:szCs w:val="20"/>
           <w:color w:val="000000"/>
           <w:b w:val="0"/>
@@ -2040,6 +2047,7 @@
         <w:pStyle w:val="BodyText"/>
         <w:snapToGrid w:val="0"/>
         <w:widowControl/>
+        <w:spacing w:after="20" w:line="216" w:lineRule="auto"/>
         <w:rPr>
           <w:rFonts w:ascii="Times New Roman" w:hAnsi="Times New Roman" w:eastAsia="SimSun" w:cs="Times New Roman"/>
           <w:sz w:val="20"/>
@@ -2050,7 +2058,7 @@
       <w:r>
         <w:rPr>
           <w:rFonts w:ascii="Times New Roman" w:hAnsi="Times New Roman" w:eastAsia="SimSun" w:cs="Times New Roman"/>
-          <w:sz w:val="19"/>
+          <w:sz w:val="20"/>
           <w:szCs w:val="20"/>
           <w:color w:val="000000"/>
           <w:b w:val="0"/>
@@ -2076,7 +2084,7 @@
       <w:r>
         <w:rPr>
           <w:rFonts w:ascii="Times New Roman" w:hAnsi="Times New Roman" w:eastAsia="SimSun" w:cs="Times New Roman"/>
-          <w:sz w:val="19"/>
+          <w:sz w:val="20"/>
           <w:szCs w:val="20"/>
           <w:color w:val="000000"/>
           <w:b w:val="0"/>
@@ -2102,7 +2110,7 @@
       <w:r>
         <w:rPr>
           <w:rFonts w:ascii="Times New Roman" w:hAnsi="Times New Roman" w:eastAsia="SimSun" w:cs="Times New Roman"/>
-          <w:sz w:val="19"/>
+          <w:sz w:val="20"/>
           <w:szCs w:val="20"/>
           <w:color w:val="000000"/>
           <w:b w:val="0"/>
@@ -2125,7 +2133,7 @@
       <w:r>
         <w:rPr>
           <w:rFonts w:ascii="Times New Roman" w:hAnsi="Times New Roman" w:eastAsia="SimSun" w:cs="Times New Roman"/>
-          <w:sz w:val="19"/>
+          <w:sz w:val="20"/>
           <w:szCs w:val="20"/>
           <w:color w:val="000000"/>
           <w:b w:val="0"/>
@@ -2148,7 +2156,7 @@
       <w:r>
         <w:rPr>
           <w:rFonts w:ascii="Times New Roman" w:hAnsi="Times New Roman" w:eastAsia="SimSun" w:cs="Times New Roman"/>
-          <w:sz w:val="19"/>
+          <w:sz w:val="20"/>
           <w:szCs w:val="20"/>
           <w:color w:val="000000"/>
           <w:b w:val="0"/>
@@ -2171,7 +2179,7 @@
       <w:r>
         <w:rPr>
           <w:rFonts w:ascii="Times New Roman" w:hAnsi="Times New Roman" w:eastAsia="SimSun" w:cs="Times New Roman"/>
-          <w:sz w:val="19"/>
+          <w:sz w:val="20"/>
           <w:szCs w:val="20"/>
           <w:color w:val="000000"/>
           <w:b w:val="0"/>
@@ -2243,7 +2251,7 @@
       <w:r>
         <w:rPr>
           <w:rFonts w:ascii="Times New Roman" w:hAnsi="Times New Roman" w:eastAsia="SimSun" w:cs="Times New Roman"/>
-          <w:sz w:val="19"/>
+          <w:sz w:val="20"/>
           <w:szCs w:val="20"/>
           <w:color w:val="000000"/>
           <w:b w:val="0"/>
@@ -2266,7 +2274,7 @@
       <w:r>
         <w:rPr>
           <w:rFonts w:ascii="Times New Roman" w:hAnsi="Times New Roman" w:eastAsia="SimSun" w:cs="Times New Roman"/>
-          <w:sz w:val="19"/>
+          <w:sz w:val="20"/>
           <w:szCs w:val="20"/>
           <w:color w:val="000000"/>
           <w:b w:val="0"/>
@@ -2289,7 +2297,7 @@
       <w:r>
         <w:rPr>
           <w:rFonts w:ascii="Times New Roman" w:hAnsi="Times New Roman" w:eastAsia="SimSun" w:cs="Times New Roman"/>
-          <w:sz w:val="19"/>
+          <w:sz w:val="20"/>
           <w:szCs w:val="20"/>
           <w:color w:val="000000"/>
           <w:b w:val="0"/>
@@ -2340,7 +2348,7 @@
       <w:r>
         <w:rPr>
           <w:rFonts w:ascii="Times New Roman" w:hAnsi="Times New Roman" w:eastAsia="SimSun" w:cs="Times New Roman"/>
-          <w:sz w:val="19"/>
+          <w:sz w:val="20"/>
           <w:szCs w:val="20"/>
           <w:color w:val="000000"/>
           <w:b w:val="0"/>
@@ -2355,6 +2363,7 @@
         <w:pStyle w:val="BodyText"/>
         <w:snapToGrid w:val="0"/>
         <w:widowControl/>
+        <w:spacing w:after="20" w:line="216" w:lineRule="auto"/>
         <w:rPr>
           <w:rFonts w:ascii="Times New Roman" w:hAnsi="Times New Roman" w:eastAsia="SimSun" w:cs="Times New Roman"/>
           <w:sz w:val="20"/>
@@ -2365,7 +2374,7 @@
       <w:r>
         <w:rPr>
           <w:rFonts w:ascii="Times New Roman" w:hAnsi="Times New Roman" w:eastAsia="SimSun" w:cs="Times New Roman"/>
-          <w:sz w:val="19"/>
+          <w:sz w:val="20"/>
           <w:szCs w:val="20"/>
           <w:color w:val="000000"/>
           <w:b w:val="0"/>
@@ -2476,6 +2485,7 @@
         <w:pStyle w:val="BodyText"/>
         <w:snapToGrid w:val="0"/>
         <w:widowControl/>
+        <w:spacing w:after="20" w:line="216" w:lineRule="auto"/>
         <w:rPr>
           <w:rFonts w:ascii="Times New Roman" w:hAnsi="Times New Roman" w:eastAsia="SimSun" w:cs="Times New Roman"/>
           <w:sz w:val="20"/>
@@ -2486,7 +2496,7 @@
       <w:r>
         <w:rPr>
           <w:rFonts w:ascii="Times New Roman" w:hAnsi="Times New Roman" w:eastAsia="SimSun" w:cs="Times New Roman"/>
-          <w:sz w:val="19"/>
+          <w:sz w:val="20"/>
           <w:szCs w:val="20"/>
           <w:color w:val="000000"/>
           <w:b w:val="0"/>
@@ -4597,6 +4607,7 @@
         <w:pStyle w:val="BodyText"/>
         <w:snapToGrid w:val="0"/>
         <w:widowControl/>
+        <w:spacing w:after="20" w:line="216" w:lineRule="auto"/>
         <w:rPr>
           <w:rFonts w:ascii="Times New Roman" w:hAnsi="Times New Roman" w:eastAsia="SimSun" w:cs="Times New Roman"/>
           <w:sz w:val="20"/>
@@ -4608,7 +4619,7 @@
       <w:r>
         <w:rPr>
           <w:rFonts w:ascii="Times New Roman" w:hAnsi="Times New Roman" w:eastAsia="SimSun" w:cs="Times New Roman"/>
-          <w:sz w:val="19"/>
+          <w:sz w:val="20"/>
           <w:szCs w:val="20"/>
           <w:color w:val="000000"/>
           <w:b w:val="0"/>
@@ -5341,6 +5352,7 @@
         <w:pStyle w:val="BodyText"/>
         <w:snapToGrid w:val="0"/>
         <w:widowControl/>
+        <w:spacing w:after="20" w:line="216" w:lineRule="auto"/>
         <w:rPr>
           <w:rFonts w:ascii="Times New Roman" w:hAnsi="Times New Roman" w:eastAsia="SimSun" w:cs="Times New Roman"/>
           <w:sz w:val="20"/>
@@ -5352,7 +5364,7 @@
       <w:r>
         <w:rPr>
           <w:rFonts w:ascii="Times New Roman" w:hAnsi="Times New Roman" w:eastAsia="SimSun" w:cs="Times New Roman"/>
-          <w:sz w:val="19"/>
+          <w:sz w:val="20"/>
           <w:szCs w:val="20"/>
           <w:color w:val="000000"/>
           <w:b w:val="0"/>
@@ -6097,6 +6109,7 @@
         <w:pStyle w:val="BodyText"/>
         <w:snapToGrid w:val="0"/>
         <w:widowControl/>
+        <w:spacing w:after="20" w:line="216" w:lineRule="auto"/>
         <w:rPr>
           <w:rFonts w:ascii="Times New Roman" w:hAnsi="Times New Roman" w:eastAsia="SimSun" w:cs="Times New Roman"/>
           <w:sz w:val="20"/>
@@ -6108,7 +6121,7 @@
       <w:r>
         <w:rPr>
           <w:rFonts w:ascii="Times New Roman" w:hAnsi="Times New Roman" w:eastAsia="SimSun" w:cs="Times New Roman"/>
-          <w:sz w:val="19"/>
+          <w:sz w:val="20"/>
           <w:szCs w:val="20"/>
           <w:color w:val="000000"/>
           <w:b w:val="0"/>
@@ -6257,7 +6270,7 @@
       <w:r>
         <w:rPr>
           <w:rFonts w:ascii="Times New Roman" w:hAnsi="Times New Roman" w:eastAsia="SimSun" w:cs="Times New Roman"/>
-          <w:sz w:val="19"/>
+          <w:sz w:val="20"/>
           <w:szCs w:val="20"/>
           <w:color w:val="000000"/>
           <w:b w:val="0"/>
@@ -6913,6 +6926,7 @@
         <w:pStyle w:val="BodyText"/>
         <w:snapToGrid w:val="0"/>
         <w:widowControl/>
+        <w:spacing w:after="20" w:line="216" w:lineRule="auto"/>
         <w:rPr>
           <w:rFonts w:ascii="Times New Roman" w:hAnsi="Times New Roman" w:eastAsia="SimSun" w:cs="Times New Roman"/>
           <w:sz w:val="20"/>
@@ -6923,7 +6937,7 @@
       <w:r>
         <w:rPr>
           <w:rFonts w:ascii="Times New Roman" w:hAnsi="Times New Roman" w:eastAsia="SimSun" w:cs="Times New Roman"/>
-          <w:sz w:val="19"/>
+          <w:sz w:val="20"/>
           <w:szCs w:val="20"/>
           <w:color w:val="000000"/>
           <w:b w:val="0"/>
@@ -7189,7 +7203,7 @@
       <w:r>
         <w:rPr>
           <w:rFonts w:ascii="Times New Roman" w:hAnsi="Times New Roman" w:eastAsia="SimSun" w:cs="Times New Roman"/>
-          <w:sz w:val="19"/>
+          <w:sz w:val="20"/>
           <w:szCs w:val="20"/>
           <w:color w:val="000000"/>
           <w:b w:val="0"/>
@@ -7266,7 +7280,7 @@
       <w:r>
         <w:rPr>
           <w:rFonts w:ascii="Times New Roman" w:hAnsi="Times New Roman" w:eastAsia="SimSun" w:cs="Times New Roman"/>
-          <w:sz w:val="19"/>
+          <w:sz w:val="20"/>
           <w:szCs w:val="20"/>
           <w:color w:val="000000"/>
           <w:b w:val="0"/>
@@ -7342,6 +7356,7 @@
         <w:pStyle w:val="BodyText"/>
         <w:snapToGrid w:val="0"/>
         <w:widowControl/>
+        <w:spacing w:after="20" w:line="216" w:lineRule="auto"/>
         <w:rPr>
           <w:rFonts w:ascii="Times New Roman" w:hAnsi="Times New Roman" w:eastAsia="SimSun" w:cs="Times New Roman"/>
           <w:sz w:val="20"/>
@@ -7353,7 +7368,7 @@
       <w:r>
         <w:rPr>
           <w:rFonts w:ascii="Times New Roman" w:hAnsi="Times New Roman" w:eastAsia="SimSun" w:cs="Times New Roman"/>
-          <w:sz w:val="19"/>
+          <w:sz w:val="20"/>
           <w:szCs w:val="20"/>
           <w:color w:val="000000"/>
           <w:b w:val="0"/>
@@ -7401,7 +7416,7 @@
       <w:r>
         <w:rPr>
           <w:rFonts w:ascii="Times New Roman" w:hAnsi="Times New Roman" w:eastAsia="SimSun" w:cs="Times New Roman"/>
-          <w:sz w:val="19"/>
+          <w:sz w:val="20"/>
           <w:szCs w:val="20"/>
           <w:color w:val="000000"/>
           <w:b w:val="0"/>
@@ -7536,7 +7551,7 @@
       <w:r>
         <w:rPr>
           <w:rFonts w:ascii="Times New Roman" w:hAnsi="Times New Roman" w:eastAsia="SimSun" w:cs="Times New Roman"/>
-          <w:sz w:val="19"/>
+          <w:sz w:val="20"/>
           <w:szCs w:val="20"/>
           <w:color w:val="000000"/>
           <w:b w:val="0"/>
@@ -7584,7 +7599,7 @@
       <w:r>
         <w:rPr>
           <w:rFonts w:ascii="Times New Roman" w:hAnsi="Times New Roman" w:eastAsia="SimSun" w:cs="Times New Roman"/>
-          <w:sz w:val="19"/>
+          <w:sz w:val="20"/>
           <w:szCs w:val="20"/>
           <w:color w:val="000000"/>
           <w:b w:val="0"/>
@@ -7635,7 +7650,7 @@
       <w:r>
         <w:rPr>
           <w:rFonts w:ascii="Times New Roman" w:hAnsi="Times New Roman" w:eastAsia="SimSun" w:cs="Times New Roman"/>
-          <w:sz w:val="19"/>
+          <w:sz w:val="20"/>
           <w:szCs w:val="20"/>
           <w:color w:val="000000"/>
           <w:b w:val="0"/>
@@ -7777,7 +7792,7 @@
       <w:r>
         <w:rPr>
           <w:rFonts w:ascii="Times New Roman" w:hAnsi="Times New Roman" w:eastAsia="SimSun" w:cs="Times New Roman"/>
-          <w:sz w:val="19"/>
+          <w:sz w:val="20"/>
           <w:szCs w:val="20"/>
           <w:color w:val="000000"/>
           <w:b w:val="0"/>
@@ -8487,6 +8502,7 @@
         <w:pStyle w:val="BodyText"/>
         <w:snapToGrid w:val="0"/>
         <w:widowControl/>
+        <w:spacing w:after="20" w:line="216" w:lineRule="auto"/>
         <w:rPr>
           <w:rFonts w:ascii="Times New Roman" w:hAnsi="Times New Roman" w:eastAsia="SimSun" w:cs="Times New Roman"/>
           <w:sz w:val="20"/>
@@ -8498,7 +8514,7 @@
       <w:r>
         <w:rPr>
           <w:rFonts w:ascii="Times New Roman" w:hAnsi="Times New Roman" w:eastAsia="SimSun" w:cs="Times New Roman"/>
-          <w:sz w:val="19"/>
+          <w:sz w:val="20"/>
           <w:szCs w:val="20"/>
           <w:color w:val="000000"/>
           <w:b w:val="0"/>
@@ -8543,7 +8559,7 @@
       <w:r>
         <w:rPr>
           <w:rFonts w:ascii="Times New Roman" w:hAnsi="Times New Roman" w:eastAsia="SimSun" w:cs="Times New Roman"/>
-          <w:sz w:val="19"/>
+          <w:sz w:val="20"/>
           <w:szCs w:val="20"/>
           <w:color w:val="000000"/>
           <w:b w:val="0"/>
@@ -8591,7 +8607,7 @@
       <w:r>
         <w:rPr>
           <w:rFonts w:ascii="Times New Roman" w:hAnsi="Times New Roman" w:eastAsia="SimSun" w:cs="Times New Roman"/>
-          <w:sz w:val="19"/>
+          <w:sz w:val="20"/>
           <w:szCs w:val="20"/>
           <w:color w:val="000000"/>
           <w:b w:val="0"/>
@@ -8733,7 +8749,7 @@
       <w:r>
         <w:rPr>
           <w:rFonts w:ascii="Times New Roman" w:hAnsi="Times New Roman" w:eastAsia="SimSun" w:cs="Times New Roman"/>
-          <w:sz w:val="19"/>
+          <w:sz w:val="20"/>
           <w:szCs w:val="20"/>
           <w:color w:val="000000"/>
           <w:b w:val="0"/>
@@ -8860,7 +8876,7 @@
       <w:r>
         <w:rPr>
           <w:rFonts w:ascii="Times New Roman" w:hAnsi="Times New Roman" w:eastAsia="SimSun" w:cs="Times New Roman"/>
-          <w:sz w:val="19"/>
+          <w:sz w:val="20"/>
           <w:szCs w:val="20"/>
           <w:color w:val="000000"/>
           <w:b w:val="0"/>
@@ -9337,6 +9353,7 @@
         <w:pStyle w:val="BodyText"/>
         <w:snapToGrid w:val="0"/>
         <w:widowControl/>
+        <w:spacing w:after="20" w:line="216" w:lineRule="auto"/>
         <w:rPr>
           <w:rFonts w:ascii="Times New Roman" w:hAnsi="Times New Roman" w:eastAsia="SimSun" w:cs="Times New Roman"/>
           <w:sz w:val="20"/>
@@ -9348,7 +9365,7 @@
       <w:r>
         <w:rPr>
           <w:rFonts w:ascii="Times New Roman" w:hAnsi="Times New Roman" w:eastAsia="SimSun" w:cs="Times New Roman"/>
-          <w:sz w:val="19"/>
+          <w:sz w:val="20"/>
           <w:szCs w:val="20"/>
           <w:color w:val="000000"/>
           <w:b w:val="0"/>
@@ -9440,7 +9457,7 @@
       <w:r>
         <w:rPr>
           <w:rFonts w:ascii="Times New Roman" w:hAnsi="Times New Roman" w:eastAsia="SimSun" w:cs="Times New Roman"/>
-          <w:sz w:val="19"/>
+          <w:sz w:val="20"/>
           <w:szCs w:val="20"/>
           <w:color w:val="000000"/>
           <w:b w:val="0"/>
@@ -9748,6 +9765,7 @@
         <w:pStyle w:val="BodyText"/>
         <w:snapToGrid w:val="0"/>
         <w:widowControl/>
+        <w:spacing w:after="20" w:line="216" w:lineRule="auto"/>
         <w:rPr>
           <w:rFonts w:ascii="Times New Roman" w:hAnsi="Times New Roman" w:eastAsia="SimSun" w:cs="Times New Roman"/>
           <w:sz w:val="20"/>
@@ -9759,7 +9777,7 @@
       <w:r>
         <w:rPr>
           <w:rFonts w:ascii="Times New Roman" w:hAnsi="Times New Roman" w:eastAsia="SimSun" w:cs="Times New Roman"/>
-          <w:sz w:val="19"/>
+          <w:sz w:val="20"/>
           <w:szCs w:val="20"/>
           <w:color w:val="000000"/>
           <w:b w:val="0"/>
@@ -10142,6 +10160,7 @@
         <w:pStyle w:val="BodyText"/>
         <w:snapToGrid w:val="0"/>
         <w:widowControl/>
+        <w:spacing w:after="20" w:line="216" w:lineRule="auto"/>
         <w:rPr>
           <w:rFonts w:ascii="Times New Roman" w:hAnsi="Times New Roman" w:eastAsia="SimSun" w:cs="Times New Roman"/>
           <w:sz w:val="20"/>
@@ -10152,7 +10171,7 @@
       <w:r>
         <w:rPr>
           <w:rFonts w:ascii="Times New Roman" w:hAnsi="Times New Roman" w:eastAsia="SimSun" w:cs="Times New Roman"/>
-          <w:sz w:val="19"/>
+          <w:sz w:val="20"/>
           <w:szCs w:val="20"/>
           <w:color w:val="000000"/>
           <w:b w:val="0"/>
@@ -10374,6 +10393,7 @@
         <w:pStyle w:val="BodyText"/>
         <w:snapToGrid w:val="0"/>
         <w:widowControl/>
+        <w:spacing w:after="20" w:line="216" w:lineRule="auto"/>
         <w:rPr>
           <w:rFonts w:ascii="Times New Roman" w:hAnsi="Times New Roman" w:eastAsia="SimSun" w:cs="Times New Roman"/>
           <w:sz w:val="20"/>
@@ -10385,7 +10405,7 @@
       <w:r>
         <w:rPr>
           <w:rFonts w:ascii="Times New Roman" w:hAnsi="Times New Roman" w:eastAsia="SimSun" w:cs="Times New Roman"/>
-          <w:sz w:val="19"/>
+          <w:sz w:val="20"/>
           <w:szCs w:val="20"/>
           <w:color w:val="000000"/>
           <w:b w:val="0"/>
@@ -10436,7 +10456,7 @@
       <w:r>
         <w:rPr>
           <w:rFonts w:ascii="Times New Roman" w:hAnsi="Times New Roman" w:eastAsia="SimSun" w:cs="Times New Roman"/>
-          <w:sz w:val="19"/>
+          <w:sz w:val="20"/>
           <w:szCs w:val="20"/>
           <w:color w:val="000000"/>
           <w:b w:val="0"/>
@@ -10487,7 +10507,7 @@
       <w:r>
         <w:rPr>
           <w:rFonts w:ascii="Times New Roman" w:hAnsi="Times New Roman" w:eastAsia="SimSun" w:cs="Times New Roman"/>
-          <w:sz w:val="19"/>
+          <w:sz w:val="20"/>
           <w:szCs w:val="20"/>
           <w:color w:val="000000"/>
           <w:b w:val="0"/>
@@ -10538,7 +10558,7 @@
       <w:r>
         <w:rPr>
           <w:rFonts w:ascii="Times New Roman" w:hAnsi="Times New Roman" w:eastAsia="SimSun" w:cs="Times New Roman"/>
-          <w:sz w:val="19"/>
+          <w:sz w:val="20"/>
           <w:szCs w:val="20"/>
           <w:color w:val="000000"/>
           <w:b w:val="0"/>
@@ -10564,7 +10584,7 @@
       <w:r>
         <w:rPr>
           <w:rFonts w:ascii="Times New Roman" w:hAnsi="Times New Roman" w:eastAsia="SimSun" w:cs="Times New Roman"/>
-          <w:sz w:val="19"/>
+          <w:sz w:val="20"/>
           <w:szCs w:val="20"/>
           <w:color w:val="000000"/>
           <w:b w:val="0"/>
@@ -10871,6 +10891,7 @@
         <w:pStyle w:val="BodyText"/>
         <w:snapToGrid w:val="0"/>
         <w:widowControl/>
+        <w:spacing w:after="20" w:line="216" w:lineRule="auto"/>
         <w:rPr>
           <w:rFonts w:ascii="Times New Roman" w:hAnsi="Times New Roman" w:eastAsia="SimSun" w:cs="Times New Roman"/>
           <w:sz w:val="20"/>
@@ -10882,7 +10903,7 @@
       <w:r>
         <w:rPr>
           <w:rFonts w:ascii="Times New Roman" w:hAnsi="Times New Roman" w:eastAsia="SimSun" w:cs="Times New Roman"/>
-          <w:sz w:val="19"/>
+          <w:sz w:val="20"/>
           <w:szCs w:val="20"/>
           <w:color w:val="000000"/>
           <w:b w:val="0"/>
@@ -10933,7 +10954,7 @@
       <w:r>
         <w:rPr>
           <w:rFonts w:ascii="Times New Roman" w:hAnsi="Times New Roman" w:eastAsia="SimSun" w:cs="Times New Roman"/>
-          <w:sz w:val="19"/>
+          <w:sz w:val="20"/>
           <w:szCs w:val="20"/>
           <w:color w:val="000000"/>
           <w:b w:val="0"/>
@@ -10984,7 +11005,7 @@
       <w:r>
         <w:rPr>
           <w:rFonts w:ascii="Times New Roman" w:hAnsi="Times New Roman" w:eastAsia="SimSun" w:cs="Times New Roman"/>
-          <w:sz w:val="19"/>
+          <w:sz w:val="20"/>
           <w:szCs w:val="20"/>
           <w:color w:val="000000"/>
           <w:b w:val="0"/>
@@ -11521,6 +11542,7 @@
         <w:pStyle w:val="BodyText"/>
         <w:snapToGrid w:val="0"/>
         <w:widowControl/>
+        <w:spacing w:after="20" w:line="216" w:lineRule="auto"/>
         <w:rPr>
           <w:rFonts w:ascii="Times New Roman" w:hAnsi="Times New Roman" w:eastAsia="SimSun" w:cs="Times New Roman"/>
           <w:sz w:val="20"/>
@@ -11531,7 +11553,7 @@
       <w:r>
         <w:rPr>
           <w:rFonts w:ascii="Times New Roman" w:hAnsi="Times New Roman" w:eastAsia="SimSun" w:cs="Times New Roman"/>
-          <w:sz w:val="19"/>
+          <w:sz w:val="20"/>
           <w:szCs w:val="20"/>
           <w:color w:val="000000"/>
           <w:b w:val="0"/>
@@ -11582,7 +11604,7 @@
       <w:r>
         <w:rPr>
           <w:rFonts w:ascii="Times New Roman" w:hAnsi="Times New Roman" w:eastAsia="SimSun" w:cs="Times New Roman"/>
-          <w:sz w:val="19"/>
+          <w:sz w:val="20"/>
           <w:szCs w:val="20"/>
           <w:color w:val="000000"/>
           <w:b w:val="0"/>
@@ -11633,7 +11655,7 @@
       <w:r>
         <w:rPr>
           <w:rFonts w:ascii="Times New Roman" w:hAnsi="Times New Roman" w:eastAsia="SimSun" w:cs="Times New Roman"/>
-          <w:sz w:val="19"/>
+          <w:sz w:val="20"/>
           <w:szCs w:val="20"/>
           <w:color w:val="000000"/>
           <w:b w:val="0"/>
@@ -11696,7 +11718,7 @@
       <w:r>
         <w:rPr>
           <w:rFonts w:ascii="Times New Roman" w:hAnsi="Times New Roman" w:eastAsia="SimSun" w:cs="Times New Roman"/>
-          <w:sz w:val="19"/>
+          <w:sz w:val="20"/>
           <w:szCs w:val="20"/>
           <w:color w:val="000000"/>
           <w:b w:val="0"/>
@@ -11711,6 +11733,7 @@
         <w:pStyle w:val="BodyText"/>
         <w:snapToGrid w:val="0"/>
         <w:widowControl/>
+        <w:spacing w:after="20" w:line="216" w:lineRule="auto"/>
         <w:rPr>
           <w:rFonts w:ascii="Times New Roman" w:hAnsi="Times New Roman" w:eastAsia="SimSun" w:cs="Times New Roman"/>
           <w:sz w:val="20"/>
@@ -11722,7 +11745,7 @@
       <w:r>
         <w:rPr>
           <w:rFonts w:ascii="Times New Roman" w:hAnsi="Times New Roman" w:eastAsia="SimSun" w:cs="Times New Roman"/>
-          <w:sz w:val="19"/>
+          <w:sz w:val="20"/>
           <w:szCs w:val="20"/>
           <w:color w:val="000000"/>
           <w:b w:val="0"/>
@@ -12113,6 +12136,7 @@
         <w:pStyle w:val="BodyText"/>
         <w:snapToGrid w:val="0"/>
         <w:widowControl/>
+        <w:spacing w:after="20" w:line="216" w:lineRule="auto"/>
         <w:rPr>
           <w:rFonts w:ascii="Times New Roman" w:hAnsi="Times New Roman" w:eastAsia="SimSun" w:cs="Times New Roman"/>
           <w:sz w:val="20"/>
@@ -12123,7 +12147,7 @@
       <w:r>
         <w:rPr>
           <w:rFonts w:ascii="Times New Roman" w:hAnsi="Times New Roman" w:eastAsia="SimSun" w:cs="Times New Roman"/>
-          <w:sz w:val="19"/>
+          <w:sz w:val="20"/>
           <w:szCs w:val="20"/>
           <w:color w:val="000000"/>
           <w:b w:val="0"/>
@@ -12183,7 +12207,7 @@
       <w:r>
         <w:rPr>
           <w:rFonts w:ascii="Times New Roman" w:hAnsi="Times New Roman" w:eastAsia="SimSun" w:cs="Times New Roman"/>
-          <w:sz w:val="19"/>
+          <w:sz w:val="20"/>
           <w:szCs w:val="20"/>
           <w:color w:val="000000"/>
           <w:b w:val="0"/>
@@ -12234,7 +12258,7 @@
       <w:r>
         <w:rPr>
           <w:rFonts w:ascii="Times New Roman" w:hAnsi="Times New Roman" w:eastAsia="SimSun" w:cs="Times New Roman"/>
-          <w:sz w:val="19"/>
+          <w:sz w:val="20"/>
           <w:szCs w:val="20"/>
           <w:color w:val="000000"/>
           <w:b w:val="0"/>
@@ -12285,7 +12309,7 @@
       <w:r>
         <w:rPr>
           <w:rFonts w:ascii="Times New Roman" w:hAnsi="Times New Roman" w:eastAsia="SimSun" w:cs="Times New Roman"/>
-          <w:sz w:val="19"/>
+          <w:sz w:val="20"/>
           <w:szCs w:val="20"/>
           <w:color w:val="000000"/>
           <w:b w:val="0"/>
@@ -12333,7 +12357,7 @@
       <w:r>
         <w:rPr>
           <w:rFonts w:ascii="Times New Roman" w:hAnsi="Times New Roman" w:eastAsia="SimSun" w:cs="Times New Roman"/>
-          <w:sz w:val="19"/>
+          <w:sz w:val="20"/>
           <w:szCs w:val="20"/>
           <w:color w:val="000000"/>
           <w:b w:val="0"/>
@@ -12384,7 +12408,7 @@
       <w:r>
         <w:rPr>
           <w:rFonts w:ascii="Times New Roman" w:hAnsi="Times New Roman" w:eastAsia="SimSun" w:cs="Times New Roman"/>
-          <w:sz w:val="19"/>
+          <w:sz w:val="20"/>
           <w:szCs w:val="20"/>
           <w:color w:val="000000"/>
           <w:b w:val="0"/>
@@ -12449,7 +12473,7 @@
       <w:r>
         <w:rPr>
           <w:rFonts w:ascii="Times New Roman" w:hAnsi="Times New Roman" w:eastAsia="SimSun" w:cs="Times New Roman"/>
-          <w:sz w:val="19"/>
+          <w:sz w:val="20"/>
           <w:szCs w:val="20"/>
           <w:color w:val="000000"/>
           <w:b w:val="0"/>
@@ -12511,7 +12535,7 @@
       <w:r>
         <w:rPr>
           <w:rFonts w:ascii="Times New Roman" w:hAnsi="Times New Roman" w:eastAsia="SimSun" w:cs="Times New Roman"/>
-          <w:sz w:val="19"/>
+          <w:sz w:val="20"/>
           <w:szCs w:val="20"/>
           <w:color w:val="000000"/>
           <w:b w:val="0"/>
@@ -12635,7 +12659,7 @@
       <w:r>
         <w:rPr>
           <w:rFonts w:ascii="Times New Roman" w:hAnsi="Times New Roman" w:eastAsia="SimSun" w:cs="Times New Roman"/>
-          <w:sz w:val="19"/>
+          <w:sz w:val="20"/>
           <w:szCs w:val="20"/>
           <w:color w:val="000000"/>
           <w:b w:val="0"/>
@@ -12650,6 +12674,7 @@
         <w:pStyle w:val="BodyText"/>
         <w:snapToGrid w:val="0"/>
         <w:widowControl/>
+        <w:spacing w:after="20" w:line="216" w:lineRule="auto"/>
         <w:rPr>
           <w:rFonts w:ascii="Times New Roman" w:hAnsi="Times New Roman" w:eastAsia="SimSun" w:cs="Times New Roman"/>
           <w:sz w:val="20"/>
@@ -12661,7 +12686,7 @@
       <w:r>
         <w:rPr>
           <w:rFonts w:ascii="Times New Roman" w:hAnsi="Times New Roman" w:eastAsia="SimSun" w:cs="Times New Roman"/>
-          <w:sz w:val="19"/>
+          <w:sz w:val="20"/>
           <w:szCs w:val="20"/>
           <w:color w:val="000000"/>
           <w:b w:val="0"/>
@@ -13166,6 +13191,7 @@
         <w:pStyle w:val="BodyText"/>
         <w:snapToGrid w:val="0"/>
         <w:widowControl/>
+        <w:spacing w:after="20" w:line="216" w:lineRule="auto"/>
         <w:rPr>
           <w:rFonts w:ascii="Times New Roman" w:hAnsi="Times New Roman" w:eastAsia="SimSun" w:cs="Times New Roman"/>
           <w:sz w:val="20"/>
@@ -13176,7 +13202,7 @@
       <w:r>
         <w:rPr>
           <w:rFonts w:ascii="Times New Roman" w:hAnsi="Times New Roman" w:eastAsia="SimSun" w:cs="Times New Roman"/>
-          <w:sz w:val="19"/>
+          <w:sz w:val="20"/>
           <w:szCs w:val="20"/>
           <w:color w:val="000000"/>
           <w:b w:val="0"/>
@@ -13395,7 +13421,7 @@
       <w:r>
         <w:rPr>
           <w:rFonts w:ascii="Times New Roman" w:hAnsi="Times New Roman" w:eastAsia="SimSun" w:cs="Times New Roman"/>
-          <w:sz w:val="19"/>
+          <w:sz w:val="20"/>
           <w:szCs w:val="20"/>
           <w:color w:val="000000"/>
           <w:b w:val="0"/>
@@ -13446,7 +13472,7 @@
       <w:r>
         <w:rPr>
           <w:rFonts w:ascii="Times New Roman" w:hAnsi="Times New Roman" w:eastAsia="SimSun" w:cs="Times New Roman"/>
-          <w:sz w:val="19"/>
+          <w:sz w:val="20"/>
           <w:szCs w:val="20"/>
           <w:color w:val="000000"/>
           <w:b w:val="0"/>
@@ -13826,6 +13852,7 @@
         <w:pStyle w:val="BodyText"/>
         <w:snapToGrid w:val="0"/>
         <w:widowControl/>
+        <w:spacing w:after="20" w:line="216" w:lineRule="auto"/>
         <w:rPr>
           <w:rFonts w:ascii="Times New Roman" w:hAnsi="Times New Roman" w:eastAsia="SimSun" w:cs="Times New Roman"/>
           <w:sz w:val="20"/>
@@ -13837,7 +13864,7 @@
       <w:r>
         <w:rPr>
           <w:rFonts w:ascii="Times New Roman" w:hAnsi="Times New Roman" w:eastAsia="SimSun" w:cs="Times New Roman"/>
-          <w:sz w:val="19"/>
+          <w:sz w:val="20"/>
           <w:szCs w:val="20"/>
           <w:color w:val="000000"/>
           <w:b w:val="0"/>
@@ -13863,7 +13890,7 @@
       <w:r>
         <w:rPr>
           <w:rFonts w:ascii="Times New Roman" w:hAnsi="Times New Roman" w:eastAsia="SimSun" w:cs="Times New Roman"/>
-          <w:sz w:val="19"/>
+          <w:sz w:val="20"/>
           <w:szCs w:val="20"/>
           <w:color w:val="000000"/>
           <w:b w:val="0"/>
@@ -13901,7 +13928,7 @@
       <w:r>
         <w:rPr>
           <w:rFonts w:ascii="Times New Roman" w:hAnsi="Times New Roman" w:eastAsia="SimSun" w:cs="Times New Roman"/>
-          <w:sz w:val="19"/>
+          <w:sz w:val="20"/>
           <w:szCs w:val="20"/>
           <w:color w:val="000000"/>
           <w:b w:val="0"/>
@@ -13952,7 +13979,7 @@
       <w:r>
         <w:rPr>
           <w:rFonts w:ascii="Times New Roman" w:hAnsi="Times New Roman" w:eastAsia="SimSun" w:cs="Times New Roman"/>
-          <w:sz w:val="19"/>
+          <w:sz w:val="20"/>
           <w:szCs w:val="20"/>
           <w:color w:val="000000"/>
           <w:b w:val="0"/>
@@ -14142,7 +14169,7 @@
       <w:r>
         <w:rPr>
           <w:rFonts w:ascii="Times New Roman" w:hAnsi="Times New Roman" w:eastAsia="SimSun" w:cs="Times New Roman"/>
-          <w:sz w:val="19"/>
+          <w:sz w:val="20"/>
           <w:szCs w:val="20"/>
           <w:color w:val="000000"/>
           <w:b w:val="0"/>
@@ -15535,6 +15562,7 @@
         <w:pStyle w:val="BodyText"/>
         <w:snapToGrid w:val="0"/>
         <w:widowControl/>
+        <w:spacing w:after="20" w:line="216" w:lineRule="auto"/>
         <w:rPr>
           <w:rFonts w:ascii="Times New Roman" w:hAnsi="Times New Roman" w:eastAsia="SimSun" w:cs="Times New Roman"/>
           <w:sz w:val="20"/>
@@ -15546,7 +15574,7 @@
       <w:r>
         <w:rPr>
           <w:rFonts w:ascii="Times New Roman" w:hAnsi="Times New Roman" w:eastAsia="SimSun" w:cs="Times New Roman"/>
-          <w:sz w:val="19"/>
+          <w:sz w:val="20"/>
           <w:szCs w:val="20"/>
           <w:color w:val="000000"/>
           <w:b w:val="0"/>
@@ -15572,7 +15600,7 @@
       <w:r>
         <w:rPr>
           <w:rFonts w:ascii="Times New Roman" w:hAnsi="Times New Roman" w:eastAsia="SimSun" w:cs="Times New Roman"/>
-          <w:sz w:val="19"/>
+          <w:sz w:val="20"/>
           <w:szCs w:val="20"/>
           <w:color w:val="000000"/>
           <w:b w:val="0"/>
@@ -15623,7 +15651,7 @@
       <w:r>
         <w:rPr>
           <w:rFonts w:ascii="Times New Roman" w:hAnsi="Times New Roman" w:eastAsia="SimSun" w:cs="Times New Roman"/>
-          <w:sz w:val="19"/>
+          <w:sz w:val="20"/>
           <w:szCs w:val="20"/>
           <w:color w:val="000000"/>
           <w:b w:val="0"/>
@@ -15674,7 +15702,7 @@
       <w:r>
         <w:rPr>
           <w:rFonts w:ascii="Times New Roman" w:hAnsi="Times New Roman" w:eastAsia="SimSun" w:cs="Times New Roman"/>
-          <w:sz w:val="19"/>
+          <w:sz w:val="20"/>
           <w:szCs w:val="20"/>
           <w:color w:val="000000"/>
           <w:b w:val="0"/>
@@ -15848,6 +15876,7 @@
         <w:pStyle w:val="BodyText"/>
         <w:snapToGrid w:val="0"/>
         <w:widowControl/>
+        <w:spacing w:after="20" w:line="216" w:lineRule="auto"/>
         <w:rPr>
           <w:rFonts w:ascii="Times New Roman" w:hAnsi="Times New Roman" w:eastAsia="SimSun" w:cs="Times New Roman"/>
           <w:sz w:val="20"/>
@@ -15859,7 +15888,7 @@
       <w:r>
         <w:rPr>
           <w:rFonts w:ascii="Times New Roman" w:hAnsi="Times New Roman" w:eastAsia="SimSun" w:cs="Times New Roman"/>
-          <w:sz w:val="19"/>
+          <w:sz w:val="20"/>
           <w:szCs w:val="20"/>
           <w:color w:val="000000"/>
           <w:b w:val="0"/>
@@ -15963,7 +15992,7 @@
       <w:r>
         <w:rPr>
           <w:rFonts w:ascii="Times New Roman" w:hAnsi="Times New Roman" w:eastAsia="SimSun" w:cs="Times New Roman"/>
-          <w:sz w:val="19"/>
+          <w:sz w:val="20"/>
           <w:szCs w:val="20"/>
           <w:color w:val="000000"/>
           <w:b w:val="0"/>
@@ -16064,7 +16093,7 @@
       <w:r>
         <w:rPr>
           <w:rFonts w:ascii="Times New Roman" w:hAnsi="Times New Roman" w:eastAsia="SimSun" w:cs="Times New Roman"/>
-          <w:sz w:val="19"/>
+          <w:sz w:val="20"/>
           <w:szCs w:val="20"/>
           <w:color w:val="000000"/>
           <w:b w:val="0"/>
@@ -16483,6 +16512,7 @@
         <w:pStyle w:val="BodyText"/>
         <w:snapToGrid w:val="0"/>
         <w:widowControl/>
+        <w:spacing w:after="20" w:line="216" w:lineRule="auto"/>
         <w:rPr>
           <w:rFonts w:ascii="Times New Roman" w:hAnsi="Times New Roman" w:eastAsia="SimSun" w:cs="Times New Roman"/>
           <w:sz w:val="20"/>
@@ -16493,7 +16523,7 @@
       <w:r>
         <w:rPr>
           <w:rFonts w:ascii="Times New Roman" w:hAnsi="Times New Roman" w:eastAsia="SimSun" w:cs="Times New Roman"/>
-          <w:sz w:val="19"/>
+          <w:sz w:val="20"/>
           <w:szCs w:val="20"/>
           <w:color w:val="000000"/>
           <w:b w:val="0"/>
@@ -16519,7 +16549,7 @@
       <w:r>
         <w:rPr>
           <w:rFonts w:ascii="Times New Roman" w:hAnsi="Times New Roman" w:eastAsia="SimSun" w:cs="Times New Roman"/>
-          <w:sz w:val="19"/>
+          <w:sz w:val="20"/>
           <w:szCs w:val="20"/>
           <w:color w:val="000000"/>
           <w:b w:val="0"/>
@@ -17672,6 +17702,7 @@
         <w:pStyle w:val="BodyText"/>
         <w:snapToGrid w:val="0"/>
         <w:widowControl/>
+        <w:spacing w:after="20" w:line="216" w:lineRule="auto"/>
         <w:rPr>
           <w:rFonts w:ascii="Times New Roman" w:hAnsi="Times New Roman" w:eastAsia="SimSun" w:cs="Times New Roman"/>
           <w:sz w:val="20"/>
@@ -17682,7 +17713,7 @@
       <w:r>
         <w:rPr>
           <w:rFonts w:ascii="Times New Roman" w:hAnsi="Times New Roman" w:eastAsia="SimSun" w:cs="Times New Roman"/>
-          <w:sz w:val="19"/>
+          <w:sz w:val="20"/>
           <w:szCs w:val="20"/>
           <w:color w:val="000000"/>
           <w:b w:val="0"/>
@@ -17705,7 +17736,7 @@
       <w:r>
         <w:rPr>
           <w:rFonts w:ascii="Times New Roman" w:hAnsi="Times New Roman" w:eastAsia="SimSun" w:cs="Times New Roman"/>
-          <w:sz w:val="19"/>
+          <w:sz w:val="20"/>
           <w:szCs w:val="20"/>
           <w:color w:val="000000"/>
           <w:b w:val="0"/>
@@ -17765,7 +17796,7 @@
       <w:r>
         <w:rPr>
           <w:rFonts w:ascii="Times New Roman" w:hAnsi="Times New Roman" w:eastAsia="SimSun" w:cs="Times New Roman"/>
-          <w:sz w:val="19"/>
+          <w:sz w:val="20"/>
           <w:szCs w:val="20"/>
           <w:color w:val="000000"/>
           <w:b w:val="0"/>
@@ -17850,7 +17881,7 @@
       <w:r>
         <w:rPr>
           <w:rFonts w:ascii="Times New Roman" w:hAnsi="Times New Roman" w:eastAsia="SimSun" w:cs="Times New Roman"/>
-          <w:sz w:val="19"/>
+          <w:sz w:val="20"/>
           <w:szCs w:val="20"/>
           <w:color w:val="000000"/>
           <w:b w:val="0"/>
@@ -17932,7 +17963,7 @@
       <w:r>
         <w:rPr>
           <w:rFonts w:ascii="Times New Roman" w:hAnsi="Times New Roman" w:eastAsia="SimSun" w:cs="Times New Roman"/>
-          <w:sz w:val="19"/>
+          <w:sz w:val="20"/>
           <w:szCs w:val="20"/>
           <w:color w:val="000000"/>
           <w:b w:val="0"/>
@@ -18004,7 +18035,7 @@
       <w:r>
         <w:rPr>
           <w:rFonts w:ascii="Times New Roman" w:hAnsi="Times New Roman" w:eastAsia="SimSun" w:cs="Times New Roman"/>
-          <w:sz w:val="19"/>
+          <w:sz w:val="20"/>
           <w:szCs w:val="20"/>
           <w:color w:val="000000"/>
           <w:b w:val="0"/>
@@ -18101,7 +18132,7 @@
       <w:r>
         <w:rPr>
           <w:rFonts w:ascii="Times New Roman" w:hAnsi="Times New Roman" w:eastAsia="SimSun" w:cs="Times New Roman"/>
-          <w:sz w:val="19"/>
+          <w:sz w:val="20"/>
           <w:szCs w:val="20"/>
           <w:color w:val="000000"/>
           <w:b w:val="0"/>
@@ -18116,6 +18147,7 @@
         <w:pStyle w:val="BodyText"/>
         <w:snapToGrid w:val="0"/>
         <w:widowControl/>
+        <w:spacing w:after="20" w:line="216" w:lineRule="auto"/>
         <w:rPr>
           <w:rFonts w:ascii="Times New Roman" w:hAnsi="Times New Roman" w:eastAsia="SimSun" w:cs="Times New Roman"/>
           <w:sz w:val="20"/>
@@ -18126,7 +18158,7 @@
       <w:r>
         <w:rPr>
           <w:rFonts w:ascii="Times New Roman" w:hAnsi="Times New Roman" w:eastAsia="SimSun" w:cs="Times New Roman"/>
-          <w:sz w:val="19"/>
+          <w:sz w:val="20"/>
           <w:szCs w:val="20"/>
           <w:color w:val="000000"/>
           <w:b w:val="0"/>
@@ -18183,7 +18215,7 @@
       <w:r>
         <w:rPr>
           <w:rFonts w:ascii="Times New Roman" w:hAnsi="Times New Roman" w:eastAsia="SimSun" w:cs="Times New Roman"/>
-          <w:sz w:val="19"/>
+          <w:sz w:val="20"/>
           <w:szCs w:val="20"/>
           <w:color w:val="000000"/>
           <w:b w:val="0"/>
@@ -18240,7 +18272,7 @@
       <w:r>
         <w:rPr>
           <w:rFonts w:ascii="Times New Roman" w:hAnsi="Times New Roman" w:eastAsia="SimSun" w:cs="Times New Roman"/>
-          <w:sz w:val="19"/>
+          <w:sz w:val="20"/>
           <w:szCs w:val="20"/>
           <w:color w:val="000000"/>
           <w:b w:val="0"/>
@@ -18334,7 +18366,7 @@
       <w:r>
         <w:rPr>
           <w:rFonts w:ascii="Times New Roman" w:hAnsi="Times New Roman" w:eastAsia="SimSun" w:cs="Times New Roman"/>
-          <w:sz w:val="19"/>
+          <w:sz w:val="20"/>
           <w:szCs w:val="20"/>
           <w:color w:val="000000"/>
           <w:b w:val="0"/>
@@ -18416,7 +18448,7 @@
       <w:r>
         <w:rPr>
           <w:rFonts w:ascii="Times New Roman" w:hAnsi="Times New Roman" w:eastAsia="SimSun" w:cs="Times New Roman"/>
-          <w:sz w:val="19"/>
+          <w:sz w:val="20"/>
           <w:szCs w:val="20"/>
           <w:color w:val="000000"/>
           <w:b w:val="0"/>
@@ -18507,7 +18539,7 @@
       <w:r>
         <w:rPr>
           <w:rFonts w:ascii="Times New Roman" w:hAnsi="Times New Roman" w:eastAsia="SimSun" w:cs="Times New Roman"/>
-          <w:sz w:val="19"/>
+          <w:sz w:val="20"/>
           <w:szCs w:val="20"/>
           <w:color w:val="000000"/>
           <w:b w:val="0"/>
@@ -18522,6 +18554,7 @@
         <w:pStyle w:val="BodyText"/>
         <w:snapToGrid w:val="0"/>
         <w:widowControl/>
+        <w:spacing w:after="20" w:line="216" w:lineRule="auto"/>
         <w:rPr>
           <w:rFonts w:ascii="Times New Roman" w:hAnsi="Times New Roman" w:eastAsia="SimSun" w:cs="Times New Roman"/>
           <w:sz w:val="20"/>
@@ -18533,7 +18566,7 @@
       <w:r>
         <w:rPr>
           <w:rFonts w:ascii="Times New Roman" w:hAnsi="Times New Roman" w:eastAsia="SimSun" w:cs="Times New Roman"/>
-          <w:sz w:val="19"/>
+          <w:sz w:val="20"/>
           <w:szCs w:val="20"/>
           <w:color w:val="000000"/>
           <w:b w:val="0"/>
@@ -18581,7 +18614,7 @@
       <w:r>
         <w:rPr>
           <w:rFonts w:ascii="Times New Roman" w:hAnsi="Times New Roman" w:eastAsia="SimSun" w:cs="Times New Roman"/>
-          <w:sz w:val="19"/>
+          <w:sz w:val="20"/>
           <w:szCs w:val="20"/>
           <w:color w:val="000000"/>
           <w:b w:val="0"/>
@@ -18638,7 +18671,7 @@
       <w:r>
         <w:rPr>
           <w:rFonts w:ascii="Times New Roman" w:hAnsi="Times New Roman" w:eastAsia="SimSun" w:cs="Times New Roman"/>
-          <w:sz w:val="19"/>
+          <w:sz w:val="20"/>
           <w:szCs w:val="20"/>
           <w:color w:val="000000"/>
           <w:b w:val="0"/>
@@ -18695,7 +18728,7 @@
       <w:r>
         <w:rPr>
           <w:rFonts w:ascii="Times New Roman" w:hAnsi="Times New Roman" w:eastAsia="SimSun" w:cs="Times New Roman"/>
-          <w:sz w:val="19"/>
+          <w:sz w:val="20"/>
           <w:szCs w:val="20"/>
           <w:color w:val="000000"/>
           <w:b w:val="0"/>
@@ -18743,7 +18776,7 @@
       <w:r>
         <w:rPr>
           <w:rFonts w:ascii="Times New Roman" w:hAnsi="Times New Roman" w:eastAsia="SimSun" w:cs="Times New Roman"/>
-          <w:sz w:val="19"/>
+          <w:sz w:val="20"/>
           <w:szCs w:val="20"/>
           <w:color w:val="000000"/>
           <w:b w:val="0"/>
@@ -18791,7 +18824,7 @@
       <w:r>
         <w:rPr>
           <w:rFonts w:ascii="Times New Roman" w:hAnsi="Times New Roman" w:eastAsia="SimSun" w:cs="Times New Roman"/>
-          <w:sz w:val="19"/>
+          <w:sz w:val="20"/>
           <w:szCs w:val="20"/>
           <w:color w:val="000000"/>
           <w:b w:val="0"/>
@@ -19299,6 +19332,7 @@
         <w:pStyle w:val="BodyText"/>
         <w:snapToGrid w:val="0"/>
         <w:widowControl/>
+        <w:spacing w:after="20" w:line="216" w:lineRule="auto"/>
         <w:rPr>
           <w:rFonts w:ascii="Times New Roman" w:hAnsi="Times New Roman" w:eastAsia="SimSun" w:cs="Times New Roman"/>
           <w:sz w:val="20"/>
@@ -19309,7 +19343,7 @@
       <w:r>
         <w:rPr>
           <w:rFonts w:ascii="Times New Roman" w:hAnsi="Times New Roman" w:eastAsia="SimSun" w:cs="Times New Roman"/>
-          <w:sz w:val="19"/>
+          <w:sz w:val="20"/>
           <w:szCs w:val="20"/>
           <w:color w:val="000000"/>
           <w:b w:val="0"/>
@@ -19359,7 +19393,7 @@
       <w:r>
         <w:rPr>
           <w:rFonts w:ascii="Times New Roman" w:hAnsi="Times New Roman" w:eastAsia="SimSun" w:cs="Times New Roman"/>
-          <w:sz w:val="19"/>
+          <w:sz w:val="20"/>
           <w:szCs w:val="20"/>
           <w:color w:val="000000"/>
           <w:b w:val="0"/>
@@ -19429,7 +19463,7 @@
       <w:r>
         <w:rPr>
           <w:rFonts w:ascii="Times New Roman" w:hAnsi="Times New Roman" w:eastAsia="SimSun" w:cs="Times New Roman"/>
-          <w:sz w:val="19"/>
+          <w:sz w:val="20"/>
           <w:szCs w:val="20"/>
           <w:color w:val="000000"/>
           <w:b w:val="0"/>
@@ -19452,7 +19486,7 @@
       <w:r>
         <w:rPr>
           <w:rFonts w:ascii="Times New Roman" w:hAnsi="Times New Roman" w:eastAsia="SimSun" w:cs="Times New Roman"/>
-          <w:sz w:val="19"/>
+          <w:sz w:val="20"/>
           <w:szCs w:val="20"/>
           <w:color w:val="000000"/>
           <w:b w:val="0"/>
@@ -19497,7 +19531,7 @@
       <w:r>
         <w:rPr>
           <w:rFonts w:ascii="Times New Roman" w:hAnsi="Times New Roman" w:eastAsia="SimSun" w:cs="Times New Roman"/>
-          <w:sz w:val="19"/>
+          <w:sz w:val="20"/>
           <w:szCs w:val="20"/>
           <w:color w:val="000000"/>
           <w:b w:val="0"/>
@@ -19542,7 +19576,7 @@
       <w:r>
         <w:rPr>
           <w:rFonts w:ascii="Times New Roman" w:hAnsi="Times New Roman" w:eastAsia="SimSun" w:cs="Times New Roman"/>
-          <w:sz w:val="19"/>
+          <w:sz w:val="20"/>
           <w:szCs w:val="20"/>
           <w:color w:val="000000"/>
           <w:b w:val="0"/>
@@ -19587,7 +19621,7 @@
       <w:r>
         <w:rPr>
           <w:rFonts w:ascii="Times New Roman" w:hAnsi="Times New Roman" w:eastAsia="SimSun" w:cs="Times New Roman"/>
-          <w:sz w:val="19"/>
+          <w:sz w:val="20"/>
           <w:szCs w:val="20"/>
           <w:color w:val="000000"/>
           <w:b w:val="0"/>
@@ -19632,7 +19666,7 @@
       <w:r>
         <w:rPr>
           <w:rFonts w:ascii="Times New Roman" w:hAnsi="Times New Roman" w:eastAsia="SimSun" w:cs="Times New Roman"/>
-          <w:sz w:val="19"/>
+          <w:sz w:val="20"/>
           <w:szCs w:val="20"/>
           <w:color w:val="000000"/>
           <w:b w:val="0"/>
@@ -19655,7 +19689,7 @@
       <w:r>
         <w:rPr>
           <w:rFonts w:ascii="Times New Roman" w:hAnsi="Times New Roman" w:eastAsia="SimSun" w:cs="Times New Roman"/>
-          <w:sz w:val="19"/>
+          <w:sz w:val="20"/>
           <w:szCs w:val="20"/>
           <w:color w:val="000000"/>
           <w:b w:val="0"/>
@@ -19703,7 +19737,7 @@
       <w:r>
         <w:rPr>
           <w:rFonts w:ascii="Times New Roman" w:hAnsi="Times New Roman" w:eastAsia="SimSun" w:cs="Times New Roman"/>
-          <w:sz w:val="19"/>
+          <w:sz w:val="20"/>
           <w:szCs w:val="20"/>
           <w:color w:val="000000"/>
           <w:b w:val="0"/>
@@ -19751,7 +19785,7 @@
       <w:r>
         <w:rPr>
           <w:rFonts w:ascii="Times New Roman" w:hAnsi="Times New Roman" w:eastAsia="SimSun" w:cs="Times New Roman"/>
-          <w:sz w:val="19"/>
+          <w:sz w:val="20"/>
           <w:szCs w:val="20"/>
           <w:color w:val="000000"/>
           <w:b w:val="0"/>
@@ -19802,7 +19836,7 @@
       <w:r>
         <w:rPr>
           <w:rFonts w:ascii="Times New Roman" w:hAnsi="Times New Roman" w:eastAsia="SimSun" w:cs="Times New Roman"/>
-          <w:sz w:val="19"/>
+          <w:sz w:val="20"/>
           <w:szCs w:val="20"/>
           <w:color w:val="000000"/>
           <w:b w:val="0"/>
@@ -19847,7 +19881,7 @@
       <w:r>
         <w:rPr>
           <w:rFonts w:ascii="Times New Roman" w:hAnsi="Times New Roman" w:eastAsia="SimSun" w:cs="Times New Roman"/>
-          <w:sz w:val="19"/>
+          <w:sz w:val="20"/>
           <w:szCs w:val="20"/>
           <w:color w:val="000000"/>
           <w:b w:val="0"/>
@@ -19917,7 +19951,7 @@
       <w:r>
         <w:rPr>
           <w:rFonts w:ascii="Times New Roman" w:hAnsi="Times New Roman" w:eastAsia="SimSun" w:cs="Times New Roman"/>
-          <w:sz w:val="19"/>
+          <w:sz w:val="20"/>
           <w:szCs w:val="20"/>
           <w:color w:val="000000"/>
           <w:b w:val="0"/>
@@ -20112,10 +20146,11 @@
     <w:p>
       <w:pPr>
         <w:pStyle w:val="BodyText"/>
+        <w:spacing w:after="20" w:line="216" w:lineRule="auto"/>
       </w:pPr>
       <w:r>
         <w:rPr>
-          <w:sz w:val="19"/>
+          <w:sz w:val="20"/>
         </w:rPr>
         <w:t>Following Pieper’s analytical solution for a six-axis arm with a spherical wrist [9], the inverse kinematics separates wrist-center positioning from wrist orientation. Given the end-effector target p₀₆ and orientation R₀₆ in frame {0}, the wrist center is pW = p₀₆ − d₆R₀₆eᵧ, where eᵧ is the tool-frame +y unit vector and d₆ is the tool offset. Let ρW = √(xW² + yW²), ρA = √((ρW − a₁)² + (zW − d₁)²), γA = atan2(zW − d₁, ρW − a₁), ℓ₂ = a₂, and ℓ₃ = d₄. Here a₁, d₁, a₂, and d₄ are DH geometric parameters; d₄ locates the wrist center along z₃. The selected arm branch is:</w:t>
       </w:r>
@@ -20839,10 +20874,11 @@
     <w:p>
       <w:pPr>
         <w:pStyle w:val="BodyText"/>
+        <w:spacing w:after="20" w:line="216" w:lineRule="auto"/>
       </w:pPr>
       <w:r>
         <w:rPr>
-          <w:sz w:val="19"/>
+          <w:sz w:val="20"/>
         </w:rPr>
         <w:t>Using the first three joint angles to form R₀₃ from the DH model, define R₃₆ = R₀₃ᵀR₀₆ = [n o a], whose columns are n, o, and a. For sin θ₅ ≠ 0, the wrist branches are:</w:t>
       </w:r>
@@ -21394,10 +21430,11 @@
     <w:p>
       <w:pPr>
         <w:pStyle w:val="BodyText"/>
+        <w:spacing w:after="20" w:line="216" w:lineRule="auto"/>
       </w:pPr>
       <w:r>
         <w:rPr>
-          <w:sz w:val="19"/>
+          <w:sz w:val="20"/>
         </w:rPr>
         <w:t>The actual wrist joints are qₐ,j = θⱼ − θ₀,j (j = 4, 5, 6), where θ₀,j are the DH zero offsets. Forward-kinematics substitution verifies each candidate; the nearest feasible branch to the previous joint state is selected.</w:t>
       </w:r>
@@ -21503,6 +21540,7 @@
         <w:pStyle w:val="BodyText"/>
         <w:snapToGrid w:val="0"/>
         <w:widowControl/>
+        <w:spacing w:after="20" w:line="216" w:lineRule="auto"/>
         <w:rPr>
           <w:rFonts w:ascii="Times New Roman" w:hAnsi="Times New Roman" w:eastAsia="SimSun" w:cs="Times New Roman"/>
           <w:sz w:val="20"/>
@@ -21513,7 +21551,7 @@
       <w:r>
         <w:rPr>
           <w:rFonts w:ascii="Times New Roman" w:hAnsi="Times New Roman" w:eastAsia="SimSun" w:cs="Times New Roman"/>
-          <w:sz w:val="19"/>
+          <w:sz w:val="20"/>
           <w:szCs w:val="20"/>
           <w:color w:val="000000"/>
           <w:b w:val="0"/>
@@ -21589,6 +21627,7 @@
         <w:pStyle w:val="BodyText"/>
         <w:snapToGrid w:val="0"/>
         <w:widowControl/>
+        <w:spacing w:after="20" w:line="216" w:lineRule="auto"/>
         <w:rPr>
           <w:rFonts w:ascii="Times New Roman" w:hAnsi="Times New Roman" w:eastAsia="SimSun" w:cs="Times New Roman"/>
           <w:sz w:val="20"/>
@@ -21599,7 +21638,7 @@
       <w:r>
         <w:rPr>
           <w:rFonts w:ascii="Times New Roman" w:hAnsi="Times New Roman" w:eastAsia="SimSun" w:cs="Times New Roman"/>
-          <w:sz w:val="19"/>
+          <w:sz w:val="20"/>
           <w:szCs w:val="20"/>
           <w:color w:val="000000"/>
           <w:b w:val="0"/>
@@ -21625,7 +21664,7 @@
       <w:r>
         <w:rPr>
           <w:rFonts w:ascii="Times New Roman" w:hAnsi="Times New Roman" w:eastAsia="SimSun" w:cs="Times New Roman"/>
-          <w:sz w:val="19"/>
+          <w:sz w:val="20"/>
           <w:szCs w:val="20"/>
           <w:color w:val="000000"/>
           <w:b w:val="0"/>
@@ -21673,7 +21712,7 @@
       <w:r>
         <w:rPr>
           <w:rFonts w:ascii="Times New Roman" w:hAnsi="Times New Roman" w:eastAsia="SimSun" w:cs="Times New Roman"/>
-          <w:sz w:val="19"/>
+          <w:sz w:val="20"/>
           <w:szCs w:val="20"/>
           <w:color w:val="000000"/>
           <w:b w:val="0"/>
@@ -21721,7 +21760,7 @@
       <w:r>
         <w:rPr>
           <w:rFonts w:ascii="Times New Roman" w:hAnsi="Times New Roman" w:eastAsia="SimSun" w:cs="Times New Roman"/>
-          <w:sz w:val="19"/>
+          <w:sz w:val="20"/>
           <w:szCs w:val="20"/>
           <w:color w:val="000000"/>
           <w:b w:val="0"/>
@@ -21771,7 +21810,7 @@
       <w:r>
         <w:rPr>
           <w:rFonts w:ascii="Times New Roman" w:hAnsi="Times New Roman" w:eastAsia="SimSun" w:cs="Times New Roman"/>
-          <w:sz w:val="19"/>
+          <w:sz w:val="20"/>
           <w:szCs w:val="20"/>
           <w:color w:val="000000"/>
           <w:b w:val="0"/>
@@ -21819,7 +21858,7 @@
       <w:r>
         <w:rPr>
           <w:rFonts w:ascii="Times New Roman" w:hAnsi="Times New Roman" w:eastAsia="SimSun" w:cs="Times New Roman"/>
-          <w:sz w:val="19"/>
+          <w:sz w:val="20"/>
           <w:szCs w:val="20"/>
           <w:color w:val="000000"/>
           <w:b w:val="0"/>
@@ -21879,7 +21918,7 @@
       <w:r>
         <w:rPr>
           <w:rFonts w:ascii="Times New Roman" w:hAnsi="Times New Roman" w:eastAsia="SimSun" w:cs="Times New Roman"/>
-          <w:sz w:val="19"/>
+          <w:sz w:val="20"/>
           <w:szCs w:val="20"/>
           <w:color w:val="000000"/>
           <w:b w:val="0"/>
@@ -21975,7 +22014,7 @@
       <w:r>
         <w:rPr>
           <w:rFonts w:ascii="Times New Roman" w:hAnsi="Times New Roman" w:eastAsia="SimSun" w:cs="Times New Roman"/>
-          <w:sz w:val="19"/>
+          <w:sz w:val="20"/>
           <w:szCs w:val="20"/>
           <w:color w:val="000000"/>
           <w:b w:val="0"/>
@@ -22071,7 +22110,7 @@
       <w:r>
         <w:rPr>
           <w:rFonts w:ascii="Times New Roman" w:hAnsi="Times New Roman" w:eastAsia="SimSun" w:cs="Times New Roman"/>
-          <w:sz w:val="19"/>
+          <w:sz w:val="20"/>
           <w:szCs w:val="20"/>
           <w:color w:val="000000"/>
           <w:b w:val="0"/>
@@ -22119,7 +22158,7 @@
       <w:r>
         <w:rPr>
           <w:rFonts w:ascii="Times New Roman" w:hAnsi="Times New Roman" w:eastAsia="SimSun" w:cs="Times New Roman"/>
-          <w:sz w:val="19"/>
+          <w:sz w:val="20"/>
           <w:szCs w:val="20"/>
           <w:color w:val="000000"/>
           <w:b w:val="0"/>
@@ -22167,7 +22206,7 @@
       <w:r>
         <w:rPr>
           <w:rFonts w:ascii="Times New Roman" w:hAnsi="Times New Roman" w:eastAsia="SimSun" w:cs="Times New Roman"/>
-          <w:sz w:val="19"/>
+          <w:sz w:val="20"/>
           <w:szCs w:val="20"/>
           <w:color w:val="000000"/>
           <w:b w:val="0"/>
@@ -22312,7 +22351,7 @@
       <w:r>
         <w:rPr>
           <w:rFonts w:ascii="Times New Roman" w:hAnsi="Times New Roman" w:eastAsia="SimSun" w:cs="Times New Roman"/>
-          <w:sz w:val="19"/>
+          <w:sz w:val="20"/>
           <w:szCs w:val="20"/>
           <w:color w:val="000000"/>
           <w:b w:val="0"/>
@@ -22485,7 +22524,7 @@
       <w:r>
         <w:rPr>
           <w:rFonts w:ascii="Times New Roman" w:hAnsi="Times New Roman" w:eastAsia="SimSun" w:cs="Times New Roman"/>
-          <w:sz w:val="19"/>
+          <w:sz w:val="20"/>
           <w:szCs w:val="20"/>
           <w:color w:val="000000"/>
           <w:b w:val="0"/>
@@ -22542,7 +22581,7 @@
       <w:r>
         <w:rPr>
           <w:rFonts w:ascii="Times New Roman" w:hAnsi="Times New Roman" w:eastAsia="SimSun" w:cs="Times New Roman"/>
-          <w:sz w:val="19"/>
+          <w:sz w:val="20"/>
           <w:szCs w:val="20"/>
           <w:color w:val="000000"/>
           <w:b w:val="0"/>
@@ -22590,7 +22629,7 @@
       <w:r>
         <w:rPr>
           <w:rFonts w:ascii="Times New Roman" w:hAnsi="Times New Roman" w:eastAsia="SimSun" w:cs="Times New Roman"/>
-          <w:sz w:val="19"/>
+          <w:sz w:val="20"/>
           <w:szCs w:val="20"/>
           <w:color w:val="000000"/>
           <w:b w:val="0"/>
@@ -23769,6 +23808,7 @@
         <w:pStyle w:val="BodyText"/>
         <w:snapToGrid w:val="0"/>
         <w:widowControl/>
+        <w:spacing w:after="20" w:line="216" w:lineRule="auto"/>
         <w:rPr>
           <w:rFonts w:ascii="Times New Roman" w:hAnsi="Times New Roman" w:eastAsia="SimSun" w:cs="Times New Roman"/>
           <w:sz w:val="20"/>
@@ -23780,7 +23820,7 @@
       <w:r>
         <w:rPr>
           <w:rFonts w:ascii="Times New Roman" w:hAnsi="Times New Roman" w:eastAsia="SimSun" w:cs="Times New Roman"/>
-          <w:sz w:val="19"/>
+          <w:sz w:val="20"/>
           <w:szCs w:val="20"/>
           <w:color w:val="000000"/>
           <w:b w:val="0"/>
@@ -24014,7 +24054,7 @@
       <w:r>
         <w:rPr>
           <w:rFonts w:ascii="Times New Roman" w:hAnsi="Times New Roman" w:eastAsia="SimSun" w:cs="Times New Roman"/>
-          <w:sz w:val="19"/>
+          <w:sz w:val="20"/>
           <w:szCs w:val="20"/>
           <w:color w:val="000000"/>
           <w:b w:val="0"/>
@@ -24506,6 +24546,7 @@
         <w:pStyle w:val="BodyText"/>
         <w:snapToGrid w:val="0"/>
         <w:widowControl/>
+        <w:spacing w:after="20" w:line="216" w:lineRule="auto"/>
         <w:rPr>
           <w:rFonts w:ascii="Times New Roman" w:hAnsi="Times New Roman" w:eastAsia="SimSun" w:cs="Times New Roman"/>
           <w:sz w:val="20"/>
@@ -24517,7 +24558,7 @@
       <w:r>
         <w:rPr>
           <w:rFonts w:ascii="Times New Roman" w:hAnsi="Times New Roman" w:eastAsia="SimSun" w:cs="Times New Roman"/>
-          <w:sz w:val="19"/>
+          <w:sz w:val="20"/>
           <w:szCs w:val="20"/>
           <w:color w:val="000000"/>
           <w:b w:val="0"/>
@@ -24914,6 +24955,7 @@
         <w:pStyle w:val="BodyText"/>
         <w:snapToGrid w:val="0"/>
         <w:widowControl/>
+        <w:spacing w:after="20" w:line="216" w:lineRule="auto"/>
         <w:rPr>
           <w:rFonts w:ascii="Times New Roman" w:hAnsi="Times New Roman" w:eastAsia="SimSun" w:cs="Times New Roman"/>
           <w:sz w:val="20"/>
@@ -24925,7 +24967,7 @@
       <w:r>
         <w:rPr>
           <w:rFonts w:ascii="Times New Roman" w:hAnsi="Times New Roman" w:eastAsia="SimSun" w:cs="Times New Roman"/>
-          <w:sz w:val="19"/>
+          <w:sz w:val="20"/>
           <w:szCs w:val="20"/>
           <w:color w:val="000000"/>
           <w:b w:val="0"/>
@@ -25476,6 +25518,7 @@
         <w:pStyle w:val="BodyText"/>
         <w:snapToGrid w:val="0"/>
         <w:widowControl/>
+        <w:spacing w:after="20" w:line="216" w:lineRule="auto"/>
         <w:rPr>
           <w:rFonts w:ascii="Times New Roman" w:hAnsi="Times New Roman" w:eastAsia="SimSun" w:cs="Times New Roman"/>
           <w:sz w:val="20"/>
@@ -25487,7 +25530,7 @@
       <w:r>
         <w:rPr>
           <w:rFonts w:ascii="Times New Roman" w:hAnsi="Times New Roman" w:eastAsia="SimSun" w:cs="Times New Roman"/>
-          <w:sz w:val="19"/>
+          <w:sz w:val="20"/>
           <w:szCs w:val="20"/>
           <w:color w:val="000000"/>
           <w:b w:val="0"/>
@@ -25709,7 +25752,7 @@
       <w:r>
         <w:rPr>
           <w:rFonts w:ascii="Times New Roman" w:hAnsi="Times New Roman" w:eastAsia="SimSun" w:cs="Times New Roman"/>
-          <w:sz w:val="19"/>
+          <w:sz w:val="20"/>
           <w:szCs w:val="20"/>
           <w:color w:val="000000"/>
           <w:b w:val="0"/>
@@ -26972,6 +27015,7 @@
         <w:pStyle w:val="BodyText"/>
         <w:snapToGrid w:val="0"/>
         <w:widowControl/>
+        <w:spacing w:after="20" w:line="216" w:lineRule="auto"/>
         <w:rPr>
           <w:rFonts w:ascii="Times New Roman" w:hAnsi="Times New Roman" w:eastAsia="SimSun" w:cs="Times New Roman"/>
           <w:sz w:val="20"/>
@@ -26982,7 +27026,7 @@
       <w:r>
         <w:rPr>
           <w:rFonts w:ascii="Times New Roman" w:hAnsi="Times New Roman" w:eastAsia="SimSun" w:cs="Times New Roman"/>
-          <w:sz w:val="19"/>
+          <w:sz w:val="20"/>
           <w:szCs w:val="20"/>
           <w:color w:val="000000"/>
           <w:b w:val="0"/>
@@ -27033,7 +27077,7 @@
       <w:r>
         <w:rPr>
           <w:rFonts w:ascii="Times New Roman" w:hAnsi="Times New Roman" w:eastAsia="SimSun" w:cs="Times New Roman"/>
-          <w:sz w:val="19"/>
+          <w:sz w:val="20"/>
           <w:szCs w:val="20"/>
           <w:color w:val="000000"/>
           <w:b w:val="0"/>
@@ -27177,7 +27221,7 @@
       <w:r>
         <w:rPr>
           <w:rFonts w:ascii="Times New Roman" w:hAnsi="Times New Roman" w:eastAsia="SimSun" w:cs="Times New Roman"/>
-          <w:sz w:val="19"/>
+          <w:sz w:val="20"/>
           <w:szCs w:val="20"/>
           <w:color w:val="000000"/>
           <w:b w:val="0"/>
@@ -27321,7 +27365,7 @@
       <w:r>
         <w:rPr>
           <w:rFonts w:ascii="Times New Roman" w:hAnsi="Times New Roman" w:eastAsia="SimSun" w:cs="Times New Roman"/>
-          <w:sz w:val="19"/>
+          <w:sz w:val="20"/>
           <w:szCs w:val="20"/>
           <w:color w:val="000000"/>
           <w:b w:val="0"/>
@@ -27569,7 +27613,7 @@
       </ns8:oMath>
       <w:r>
         <w:rPr>
-          <w:sz w:val="19"/>
+          <w:sz w:val="20"/>
         </w:rPr>
         <w:t>.</w:t>
       </w:r>
@@ -27724,6 +27768,7 @@
         <w:pStyle w:val="BodyText"/>
         <w:snapToGrid w:val="0"/>
         <w:widowControl/>
+        <w:spacing w:after="20" w:line="216" w:lineRule="auto"/>
         <w:rPr>
           <w:rFonts w:ascii="Times New Roman" w:hAnsi="Times New Roman" w:eastAsia="SimSun" w:cs="Times New Roman"/>
           <w:sz w:val="20"/>
@@ -27735,7 +27780,7 @@
       <w:r>
         <w:rPr>
           <w:rFonts w:ascii="Times New Roman" w:hAnsi="Times New Roman" w:eastAsia="SimSun" w:cs="Times New Roman"/>
-          <w:sz w:val="19"/>
+          <w:sz w:val="20"/>
           <w:szCs w:val="20"/>
           <w:color w:val="000000"/>
           <w:b w:val="0"/>
@@ -27935,7 +27980,7 @@
       <w:r>
         <w:rPr>
           <w:rFonts w:ascii="Times New Roman" w:hAnsi="Times New Roman" w:eastAsia="SimSun" w:cs="Times New Roman"/>
-          <w:sz w:val="19"/>
+          <w:sz w:val="20"/>
           <w:szCs w:val="20"/>
           <w:color w:val="000000"/>
           <w:b w:val="0"/>
@@ -28191,7 +28236,7 @@
       <w:r>
         <w:rPr>
           <w:rFonts w:ascii="Times New Roman" w:hAnsi="Times New Roman" w:eastAsia="SimSun" w:cs="Times New Roman"/>
-          <w:sz w:val="19"/>
+          <w:sz w:val="20"/>
           <w:szCs w:val="20"/>
           <w:color w:val="000000"/>
           <w:b w:val="0"/>
@@ -28990,6 +29035,7 @@
         <w:pStyle w:val="BodyText"/>
         <w:snapToGrid w:val="0"/>
         <w:widowControl/>
+        <w:spacing w:after="20" w:line="216" w:lineRule="auto"/>
         <w:rPr>
           <w:rFonts w:ascii="Times New Roman" w:hAnsi="Times New Roman" w:eastAsia="SimSun" w:cs="Times New Roman"/>
           <w:sz w:val="20"/>
@@ -29000,7 +29046,7 @@
       <w:r>
         <w:rPr>
           <w:rFonts w:ascii="Times New Roman" w:hAnsi="Times New Roman" w:eastAsia="SimSun" w:cs="Times New Roman"/>
-          <w:sz w:val="19"/>
+          <w:sz w:val="20"/>
           <w:szCs w:val="20"/>
           <w:color w:val="000000"/>
           <w:b w:val="0"/>
@@ -30106,6 +30152,7 @@
         <w:pStyle w:val="BodyText"/>
         <w:snapToGrid w:val="0"/>
         <w:widowControl/>
+        <w:spacing w:after="20" w:line="216" w:lineRule="auto"/>
         <w:rPr>
           <w:rFonts w:ascii="Times New Roman" w:hAnsi="Times New Roman" w:eastAsia="SimSun" w:cs="Times New Roman"/>
           <w:sz w:val="20"/>
@@ -30116,7 +30163,7 @@
       <w:r>
         <w:rPr>
           <w:rFonts w:ascii="Times New Roman" w:hAnsi="Times New Roman" w:eastAsia="SimSun" w:cs="Times New Roman"/>
-          <w:sz w:val="19"/>
+          <w:sz w:val="20"/>
           <w:szCs w:val="20"/>
           <w:color w:val="000000"/>
           <w:b w:val="0"/>
@@ -30167,7 +30214,7 @@
       <w:r>
         <w:rPr>
           <w:rFonts w:ascii="Times New Roman" w:hAnsi="Times New Roman" w:eastAsia="SimSun" w:cs="Times New Roman"/>
-          <w:sz w:val="19"/>
+          <w:sz w:val="20"/>
           <w:szCs w:val="20"/>
           <w:color w:val="000000"/>
           <w:b w:val="0"/>
@@ -30218,7 +30265,7 @@
       <w:r>
         <w:rPr>
           <w:rFonts w:ascii="Times New Roman" w:hAnsi="Times New Roman" w:eastAsia="SimSun" w:cs="Times New Roman"/>
-          <w:sz w:val="19"/>
+          <w:sz w:val="20"/>
           <w:szCs w:val="20"/>
           <w:color w:val="000000"/>
           <w:b w:val="0"/>
@@ -30271,7 +30318,7 @@
       <w:r>
         <w:rPr>
           <w:rFonts w:ascii="Times New Roman" w:hAnsi="Times New Roman" w:eastAsia="SimSun" w:cs="Times New Roman"/>
-          <w:sz w:val="19"/>
+          <w:sz w:val="20"/>
           <w:szCs w:val="20"/>
           <w:color w:val="000000"/>
           <w:b w:val="0"/>
@@ -30322,7 +30369,7 @@
       <w:r>
         <w:rPr>
           <w:rFonts w:ascii="Times New Roman" w:hAnsi="Times New Roman" w:eastAsia="SimSun" w:cs="Times New Roman"/>
-          <w:sz w:val="19"/>
+          <w:sz w:val="20"/>
           <w:szCs w:val="20"/>
           <w:color w:val="000000"/>
           <w:b w:val="0"/>
@@ -30337,6 +30384,7 @@
         <w:pStyle w:val="BodyText"/>
         <w:snapToGrid w:val="0"/>
         <w:widowControl/>
+        <w:spacing w:after="20" w:line="216" w:lineRule="auto"/>
         <w:rPr>
           <w:rFonts w:ascii="Times New Roman" w:hAnsi="Times New Roman" w:eastAsia="SimSun" w:cs="Times New Roman"/>
           <w:sz w:val="20"/>
@@ -30348,7 +30396,7 @@
       <w:r>
         <w:rPr>
           <w:rFonts w:ascii="Times New Roman" w:hAnsi="Times New Roman" w:eastAsia="SimSun" w:cs="Times New Roman"/>
-          <w:sz w:val="19"/>
+          <w:sz w:val="20"/>
           <w:szCs w:val="20"/>
           <w:color w:val="000000"/>
           <w:b w:val="0"/>
@@ -30399,7 +30447,7 @@
       <w:r>
         <w:rPr>
           <w:rFonts w:ascii="Times New Roman" w:hAnsi="Times New Roman" w:eastAsia="SimSun" w:cs="Times New Roman"/>
-          <w:sz w:val="19"/>
+          <w:sz w:val="20"/>
           <w:szCs w:val="20"/>
           <w:color w:val="000000"/>
           <w:b w:val="0"/>
@@ -30450,7 +30498,7 @@
       <w:r>
         <w:rPr>
           <w:rFonts w:ascii="Times New Roman" w:hAnsi="Times New Roman" w:eastAsia="SimSun" w:cs="Times New Roman"/>
-          <w:sz w:val="19"/>
+          <w:sz w:val="20"/>
           <w:szCs w:val="20"/>
           <w:color w:val="000000"/>
           <w:b w:val="0"/>
@@ -30988,6 +31036,7 @@
         <w:pStyle w:val="BodyText"/>
         <w:snapToGrid w:val="0"/>
         <w:widowControl/>
+        <w:spacing w:after="20" w:line="216" w:lineRule="auto"/>
         <w:rPr>
           <w:rFonts w:ascii="Times New Roman" w:hAnsi="Times New Roman" w:eastAsia="SimSun" w:cs="Times New Roman"/>
           <w:sz w:val="20"/>
@@ -30998,7 +31047,7 @@
       <w:r>
         <w:rPr>
           <w:rFonts w:ascii="Times New Roman" w:hAnsi="Times New Roman" w:eastAsia="SimSun" w:cs="Times New Roman"/>
-          <w:sz w:val="19"/>
+          <w:sz w:val="20"/>
           <w:szCs w:val="20"/>
           <w:color w:val="000000"/>
           <w:b w:val="0"/>
@@ -31049,7 +31098,7 @@
       <w:r>
         <w:rPr>
           <w:rFonts w:ascii="Times New Roman" w:hAnsi="Times New Roman" w:eastAsia="SimSun" w:cs="Times New Roman"/>
-          <w:sz w:val="19"/>
+          <w:sz w:val="20"/>
           <w:szCs w:val="20"/>
           <w:color w:val="000000"/>
           <w:b w:val="0"/>
@@ -31253,7 +31302,7 @@
       <w:r>
         <w:rPr>
           <w:rFonts w:ascii="Times New Roman" w:hAnsi="Times New Roman" w:eastAsia="SimSun" w:cs="Times New Roman"/>
-          <w:sz w:val="19"/>
+          <w:sz w:val="20"/>
           <w:szCs w:val="20"/>
           <w:color w:val="000000"/>
           <w:b w:val="0"/>
@@ -31304,7 +31353,7 @@
       <w:r>
         <w:rPr>
           <w:rFonts w:ascii="Times New Roman" w:hAnsi="Times New Roman" w:eastAsia="SimSun" w:cs="Times New Roman"/>
-          <w:sz w:val="19"/>
+          <w:sz w:val="20"/>
           <w:szCs w:val="20"/>
           <w:color w:val="000000"/>
           <w:b w:val="0"/>
@@ -31355,7 +31404,7 @@
       <w:r>
         <w:rPr>
           <w:rFonts w:ascii="Times New Roman" w:hAnsi="Times New Roman" w:eastAsia="SimSun" w:cs="Times New Roman"/>
-          <w:sz w:val="19"/>
+          <w:sz w:val="20"/>
           <w:szCs w:val="20"/>
           <w:color w:val="000000"/>
           <w:b w:val="0"/>
@@ -31370,6 +31419,7 @@
         <w:pStyle w:val="BodyText"/>
         <w:snapToGrid w:val="0"/>
         <w:widowControl/>
+        <w:spacing w:after="20" w:line="216" w:lineRule="auto"/>
         <w:rPr>
           <w:rFonts w:ascii="Times New Roman" w:hAnsi="Times New Roman" w:eastAsia="SimSun" w:cs="Times New Roman"/>
           <w:sz w:val="20"/>
@@ -31381,7 +31431,7 @@
       <w:r>
         <w:rPr>
           <w:rFonts w:ascii="Times New Roman" w:hAnsi="Times New Roman" w:eastAsia="SimSun" w:cs="Times New Roman"/>
-          <w:sz w:val="19"/>
+          <w:sz w:val="20"/>
           <w:szCs w:val="20"/>
           <w:color w:val="000000"/>
           <w:b w:val="0"/>
@@ -31675,6 +31725,7 @@
         <w:pStyle w:val="BodyText"/>
         <w:snapToGrid w:val="0"/>
         <w:widowControl/>
+        <w:spacing w:after="20" w:line="216" w:lineRule="auto"/>
         <w:rPr>
           <w:rFonts w:ascii="Times New Roman" w:hAnsi="Times New Roman" w:eastAsia="SimSun" w:cs="Times New Roman"/>
           <w:sz w:val="20"/>
@@ -31686,7 +31737,7 @@
       <w:r>
         <w:rPr>
           <w:rFonts w:ascii="Times New Roman" w:hAnsi="Times New Roman" w:eastAsia="SimSun" w:cs="Times New Roman"/>
-          <w:sz w:val="19"/>
+          <w:sz w:val="20"/>
           <w:szCs w:val="20"/>
           <w:color w:val="000000"/>
           <w:b w:val="0"/>
@@ -31737,7 +31788,7 @@
       <w:r>
         <w:rPr>
           <w:rFonts w:ascii="Times New Roman" w:hAnsi="Times New Roman" w:eastAsia="SimSun" w:cs="Times New Roman"/>
-          <w:sz w:val="19"/>
+          <w:sz w:val="20"/>
           <w:szCs w:val="20"/>
           <w:color w:val="000000"/>
           <w:b w:val="0"/>
@@ -31944,6 +31995,7 @@
         <w:pStyle w:val="BodyText"/>
         <w:snapToGrid w:val="0"/>
         <w:widowControl/>
+        <w:spacing w:after="20" w:line="216" w:lineRule="auto"/>
         <w:rPr>
           <w:rFonts w:ascii="Times New Roman" w:hAnsi="Times New Roman" w:eastAsia="SimSun" w:cs="Times New Roman"/>
           <w:sz w:val="20"/>
@@ -31954,7 +32006,7 @@
       <w:r>
         <w:rPr>
           <w:rFonts w:ascii="Times New Roman" w:hAnsi="Times New Roman" w:eastAsia="SimSun" w:cs="Times New Roman"/>
-          <w:sz w:val="19"/>
+          <w:sz w:val="20"/>
           <w:szCs w:val="20"/>
           <w:color w:val="000000"/>
           <w:b w:val="0"/>
@@ -32004,6 +32056,7 @@
         <w:pStyle w:val="BodyText"/>
         <w:snapToGrid w:val="0"/>
         <w:widowControl/>
+        <w:spacing w:after="20" w:line="216" w:lineRule="auto"/>
         <w:rPr>
           <w:rFonts w:ascii="Times New Roman" w:hAnsi="Times New Roman" w:eastAsia="SimSun" w:cs="Times New Roman"/>
           <w:sz w:val="20"/>
@@ -32014,7 +32067,7 @@
       <w:r>
         <w:rPr>
           <w:rFonts w:ascii="Times New Roman" w:hAnsi="Times New Roman" w:eastAsia="SimSun" w:cs="Times New Roman"/>
-          <w:sz w:val="19"/>
+          <w:sz w:val="20"/>
           <w:szCs w:val="20"/>
           <w:color w:val="000000"/>
           <w:b w:val="0"/>
@@ -32567,6 +32620,7 @@
         <w:pStyle w:val="BodyText"/>
         <w:snapToGrid w:val="0"/>
         <w:widowControl/>
+        <w:spacing w:after="20" w:line="216" w:lineRule="auto"/>
         <w:rPr>
           <w:rFonts w:ascii="Times New Roman" w:hAnsi="Times New Roman" w:eastAsia="SimSun" w:cs="Times New Roman"/>
           <w:sz w:val="20"/>
@@ -32577,7 +32631,7 @@
       <w:r>
         <w:rPr>
           <w:rFonts w:ascii="Times New Roman" w:hAnsi="Times New Roman" w:eastAsia="SimSun" w:cs="Times New Roman"/>
-          <w:sz w:val="19"/>
+          <w:sz w:val="20"/>
           <w:szCs w:val="20"/>
           <w:color w:val="000000"/>
           <w:b w:val="0"/>
@@ -33209,6 +33263,7 @@
         <w:pStyle w:val="BodyText"/>
         <w:snapToGrid w:val="0"/>
         <w:widowControl/>
+        <w:spacing w:after="20" w:line="216" w:lineRule="auto"/>
         <w:rPr>
           <w:rFonts w:ascii="Times New Roman" w:hAnsi="Times New Roman" w:eastAsia="SimSun" w:cs="Times New Roman"/>
           <w:sz w:val="20"/>
@@ -33219,7 +33274,7 @@
       <w:r>
         <w:rPr>
           <w:rFonts w:ascii="Times New Roman" w:hAnsi="Times New Roman" w:eastAsia="SimSun" w:cs="Times New Roman"/>
-          <w:sz w:val="19"/>
+          <w:sz w:val="20"/>
           <w:szCs w:val="20"/>
           <w:color w:val="000000"/>
           <w:b w:val="0"/>
@@ -33234,6 +33289,7 @@
         <w:pStyle w:val="BodyText"/>
         <w:snapToGrid w:val="0"/>
         <w:widowControl/>
+        <w:spacing w:after="20" w:line="216" w:lineRule="auto"/>
         <w:rPr>
           <w:rFonts w:ascii="Times New Roman" w:hAnsi="Times New Roman" w:eastAsia="SimSun" w:cs="Times New Roman"/>
           <w:sz w:val="20"/>
@@ -33244,7 +33300,7 @@
       <w:r>
         <w:rPr>
           <w:rFonts w:ascii="Times New Roman" w:hAnsi="Times New Roman" w:eastAsia="SimSun" w:cs="Times New Roman"/>
-          <w:sz w:val="19"/>
+          <w:sz w:val="20"/>
           <w:szCs w:val="20"/>
           <w:color w:val="000000"/>
           <w:b w:val="0"/>
@@ -33296,6 +33352,7 @@
           <w:numId w:val="8"/>
         </w:numPr>
         <w:keepLines/>
+        <w:spacing w:after="0" w:line="216" w:lineRule="auto"/>
         <w:ind w:left="360" w:hanging="360"/>
         <w:rPr>
           <w:rFonts w:ascii="Times New Roman" w:hAnsi="Times New Roman" w:eastAsia="SimSun" w:cs="Times New Roman"/>
@@ -33416,6 +33473,7 @@
           <w:numId w:val="8"/>
         </w:numPr>
         <w:keepLines/>
+        <w:spacing w:after="0" w:line="216" w:lineRule="auto"/>
         <w:ind w:left="360" w:hanging="360"/>
         <w:rPr>
           <w:rFonts w:ascii="Times New Roman" w:hAnsi="Times New Roman" w:eastAsia="SimSun" w:cs="Times New Roman"/>
@@ -33508,6 +33566,7 @@
           <w:numId w:val="8"/>
         </w:numPr>
         <w:keepLines/>
+        <w:spacing w:after="0" w:line="216" w:lineRule="auto"/>
         <w:ind w:left="360" w:hanging="360"/>
         <w:rPr>
           <w:rFonts w:ascii="Times New Roman" w:hAnsi="Times New Roman" w:eastAsia="SimSun" w:cs="Times New Roman"/>
@@ -33600,6 +33659,7 @@
           <w:numId w:val="8"/>
         </w:numPr>
         <w:keepLines/>
+        <w:spacing w:after="0" w:line="216" w:lineRule="auto"/>
         <w:ind w:left="360" w:hanging="360"/>
         <w:rPr>
           <w:rFonts w:ascii="Times New Roman" w:hAnsi="Times New Roman" w:eastAsia="SimSun" w:cs="Times New Roman"/>
@@ -33664,6 +33724,7 @@
           <w:numId w:val="8"/>
         </w:numPr>
         <w:keepLines/>
+        <w:spacing w:after="0" w:line="216" w:lineRule="auto"/>
         <w:ind w:left="360" w:hanging="360"/>
         <w:rPr>
           <w:rFonts w:ascii="Times New Roman" w:hAnsi="Times New Roman" w:eastAsia="SimSun" w:cs="Times New Roman"/>
@@ -33728,6 +33789,7 @@
           <w:numId w:val="8"/>
         </w:numPr>
         <w:keepLines/>
+        <w:spacing w:after="0" w:line="216" w:lineRule="auto"/>
         <w:ind w:left="360" w:hanging="360"/>
         <w:rPr>
           <w:rFonts w:ascii="Times New Roman" w:hAnsi="Times New Roman" w:eastAsia="SimSun" w:cs="Times New Roman"/>
@@ -33764,6 +33826,7 @@
           <w:numId w:val="8"/>
         </w:numPr>
         <w:keepLines/>
+        <w:spacing w:after="0" w:line="216" w:lineRule="auto"/>
         <w:ind w:left="360" w:hanging="360"/>
         <w:rPr>
           <w:rFonts w:ascii="Times New Roman" w:hAnsi="Times New Roman" w:eastAsia="SimSun" w:cs="Times New Roman"/>
@@ -33828,6 +33891,7 @@
           <w:numId w:val="8"/>
         </w:numPr>
         <w:keepLines/>
+        <w:spacing w:after="0" w:line="216" w:lineRule="auto"/>
         <w:ind w:left="360" w:hanging="360"/>
         <w:rPr>
           <w:rFonts w:ascii="Times New Roman" w:hAnsi="Times New Roman" w:eastAsia="SimSun" w:cs="Times New Roman"/>
@@ -33920,6 +33984,7 @@
           <w:numId w:val="8"/>
         </w:numPr>
         <w:keepLines/>
+        <w:spacing w:after="0" w:line="216" w:lineRule="auto"/>
         <w:ind w:left="360" w:hanging="360"/>
         <w:rPr>
           <w:rFonts w:ascii="Times New Roman" w:hAnsi="Times New Roman" w:eastAsia="SimSun" w:cs="Times New Roman"/>
@@ -35986,13 +36051,13 @@
       <w:tabs>
         <w:tab w:val="left" w:pos="288"/>
       </w:tabs>
-      <w:spacing w:after="40" w:line="216" w:lineRule="auto"/>
+      <w:spacing w:after="20" w:line="216" w:lineRule="auto"/>
       <w:ind w:firstLine="288"/>
       <w:jc w:val="both"/>
     </w:pPr>
     <w:rPr>
       <w:spacing w:val="-1"/>
-      <w:sz w:val="19"/>
+      <w:sz w:val="20"/>
       <w:lang w:val="x-none" w:eastAsia="x-none"/>
     </w:rPr>
   </w:style>

</xml_diff>

<commit_message>
Place Fig. 1 at the top of the right column
</commit_message>
<xml_diff>
--- a/Article5_English_IEEE_Letter_Compact.docx
+++ b/Article5_English_IEEE_Letter_Compact.docx
@@ -684,7 +684,7 @@
         <w:pStyle w:val="BodyText"/>
         <w:snapToGrid w:val="0"/>
         <w:widowControl/>
-        <w:spacing w:after="20" w:line="216" w:lineRule="auto"/>
+        <w:spacing w:after="16" w:line="211" w:lineRule="auto"/>
         <w:rPr>
           <w:rFonts w:ascii="Times New Roman" w:hAnsi="Times New Roman" w:eastAsia="SimSun" w:cs="Times New Roman"/>
           <w:sz w:val="20"/>
@@ -695,7 +695,7 @@
       <w:r>
         <w:rPr>
           <w:rFonts w:ascii="Times New Roman" w:hAnsi="Times New Roman" w:eastAsia="SimSun" w:cs="Times New Roman"/>
-          <w:sz w:val="20"/>
+          <w:sz w:val="19"/>
           <w:szCs w:val="20"/>
           <w:color w:val="000000"/>
           <w:b w:val="0"/>
@@ -710,7 +710,7 @@
         <w:pStyle w:val="BodyText"/>
         <w:snapToGrid w:val="0"/>
         <w:widowControl/>
-        <w:spacing w:after="20" w:line="216" w:lineRule="auto"/>
+        <w:spacing w:after="16" w:line="211" w:lineRule="auto"/>
         <w:rPr>
           <w:rFonts w:ascii="Times New Roman" w:hAnsi="Times New Roman" w:eastAsia="SimSun" w:cs="Times New Roman"/>
           <w:sz w:val="20"/>
@@ -721,7 +721,7 @@
       <w:r>
         <w:rPr>
           <w:rFonts w:ascii="Times New Roman" w:hAnsi="Times New Roman" w:eastAsia="SimSun" w:cs="Times New Roman"/>
-          <w:sz w:val="20"/>
+          <w:sz w:val="19"/>
           <w:szCs w:val="20"/>
           <w:color w:val="000000"/>
           <w:b w:val="0"/>
@@ -736,7 +736,7 @@
         <w:pStyle w:val="BodyText"/>
         <w:snapToGrid w:val="0"/>
         <w:widowControl/>
-        <w:spacing w:after="20" w:line="216" w:lineRule="auto"/>
+        <w:spacing w:after="16" w:line="211" w:lineRule="auto"/>
         <w:rPr>
           <w:rFonts w:ascii="Times New Roman" w:hAnsi="Times New Roman" w:eastAsia="SimSun" w:cs="Times New Roman"/>
           <w:sz w:val="20"/>
@@ -747,7 +747,7 @@
       <w:r>
         <w:rPr>
           <w:rFonts w:ascii="Times New Roman" w:hAnsi="Times New Roman" w:eastAsia="SimSun" w:cs="Times New Roman"/>
-          <w:sz w:val="20"/>
+          <w:sz w:val="19"/>
           <w:szCs w:val="20"/>
           <w:color w:val="000000"/>
           <w:b w:val="0"/>
@@ -793,15 +793,37 @@
         <w:t xml:space="preserve">Proposed Method</w:t>
       </w:r>
     </w:p>
+    <w:p ns2:paraId="5167A082" ns2:textId="77777777">
+      <w:pPr>
+        <w:pStyle w:val="BodyText"/>
+        <w:snapToGrid w:val="0"/>
+        <w:widowControl/>
+        <w:spacing w:after="16" w:line="211" w:lineRule="auto"/>
+        <w:rPr>
+          <w:rFonts w:ascii="Times New Roman" w:hAnsi="Times New Roman" w:eastAsia="SimSun" w:cs="Times New Roman"/>
+          <w:sz w:val="20"/>
+          <w:szCs w:val="20"/>
+          <w:color w:val="000000"/>
+        </w:rPr>
+      </w:pPr>
+      <w:r>
+        <w:rPr>
+          <w:rFonts w:ascii="Times New Roman" w:hAnsi="Times New Roman" w:eastAsia="SimSun" w:cs="Times New Roman"/>
+          <w:sz w:val="19"/>
+          <w:szCs w:val="20"/>
+          <w:color w:val="000000"/>
+          <w:b w:val="0"/>
+          <w:i w:val="0"/>
+          <w:lang w:val="en-US"/>
+        </w:rPr>
+        <w:t xml:space="preserve">Figure 1 shows the chassis, arm, Delta master, and principal coordinate frames. The robot has a 12-degree-of-freedom chassis, a six-revolute-joint arm, and a one-degree-of-freedom gripper (19 active degrees of freedom total); the master provides three translational and three orientation-input degrees of freedom.</w:t>
+      </w:r>
+    </w:p>
     <w:p ns2:paraId="794118F6" ns2:textId="77777777">
       <w:pPr>
-        <w:pStyle w:val="Heading2"/>
+        <w:pStyle w:val="Normal"/>
         <w:snapToGrid w:val="0"/>
         <w:widowControl/>
-        <w:numPr>
-          <w:ilvl w:val="1"/>
-          <w:numId w:val="4"/>
-        </w:numPr>
         <w:keepNext/>
         <w:keepLines/>
         <w:rPr>
@@ -827,10 +849,12 @@
         </w:rPr>
         <w:t xml:space="preserve">System Architecture and Notation</w:t>
       </w:r>
+      <w:r>
+        <w:br w:type="column"/>
+      </w:r>
     </w:p>
     <w:tbl>
       <w:tblPr>
-        <w:tblpPr w:leftFromText="0" w:rightFromText="0" w:topFromText="120" w:bottomFromText="120" w:vertAnchor="margin" w:horzAnchor="margin" w:tblpXSpec="right" w:tblpY="5600"/>
         <w:tblOverlap w:val="never"/>
         <w:tblW w:w="5033" w:type="dxa"/>
         <w:tblLayout w:type="fixed"/>
@@ -1197,38 +1221,12 @@
         </w:rPr>
       </w:pPr>
     </w:p>
-    <w:p ns2:paraId="5167A082" ns2:textId="77777777">
-      <w:pPr>
-        <w:pStyle w:val="BodyText"/>
-        <w:snapToGrid w:val="0"/>
-        <w:widowControl/>
-        <w:spacing w:after="20" w:line="216" w:lineRule="auto"/>
-        <w:rPr>
-          <w:rFonts w:ascii="Times New Roman" w:hAnsi="Times New Roman" w:eastAsia="SimSun" w:cs="Times New Roman"/>
-          <w:sz w:val="20"/>
-          <w:szCs w:val="20"/>
-          <w:color w:val="000000"/>
-        </w:rPr>
-      </w:pPr>
-      <w:r>
-        <w:rPr>
-          <w:rFonts w:ascii="Times New Roman" w:hAnsi="Times New Roman" w:eastAsia="SimSun" w:cs="Times New Roman"/>
-          <w:sz w:val="20"/>
-          <w:szCs w:val="20"/>
-          <w:color w:val="000000"/>
-          <w:b w:val="0"/>
-          <w:i w:val="0"/>
-          <w:lang w:val="en-US"/>
-        </w:rPr>
-        <w:t xml:space="preserve">Figure 1 shows the chassis, arm, Delta master, and principal coordinate frames. The robot has a 12-degree-of-freedom chassis, a six-revolute-joint arm, and a one-degree-of-freedom gripper (19 active degrees of freedom total); the master provides three translational and three orientation-input degrees of freedom.</w:t>
-      </w:r>
-    </w:p>
     <w:p ns2:paraId="642FC0A6" ns2:textId="77777777">
       <w:pPr>
         <w:pStyle w:val="BodyText"/>
         <w:snapToGrid w:val="0"/>
         <w:widowControl/>
-        <w:spacing w:after="20" w:line="216" w:lineRule="auto"/>
+        <w:spacing w:after="16" w:line="211" w:lineRule="auto"/>
         <w:rPr>
           <w:rFonts w:ascii="Times New Roman" w:hAnsi="Times New Roman" w:eastAsia="SimSun" w:cs="Times New Roman"/>
           <w:sz w:val="20"/>
@@ -1239,7 +1237,7 @@
       <w:r>
         <w:rPr>
           <w:rFonts w:ascii="Times New Roman" w:hAnsi="Times New Roman" w:eastAsia="SimSun" w:cs="Times New Roman"/>
-          <w:sz w:val="20"/>
+          <w:sz w:val="19"/>
           <w:szCs w:val="20"/>
           <w:color w:val="000000"/>
           <w:b w:val="0"/>
@@ -1254,7 +1252,7 @@
         <w:pStyle w:val="BodyText"/>
         <w:snapToGrid w:val="0"/>
         <w:widowControl/>
-        <w:spacing w:after="20" w:line="216" w:lineRule="auto"/>
+        <w:spacing w:after="16" w:line="211" w:lineRule="auto"/>
         <w:rPr>
           <w:rFonts w:ascii="Times New Roman" w:hAnsi="Times New Roman" w:eastAsia="SimSun" w:cs="Times New Roman"/>
           <w:sz w:val="20"/>
@@ -1265,7 +1263,7 @@
       <w:r>
         <w:rPr>
           <w:rFonts w:ascii="Times New Roman" w:hAnsi="Times New Roman" w:eastAsia="SimSun" w:cs="Times New Roman"/>
-          <w:sz w:val="20"/>
+          <w:sz w:val="19"/>
           <w:szCs w:val="20"/>
           <w:color w:val="000000"/>
           <w:b w:val="0"/>
@@ -1428,7 +1426,7 @@
         <w:pStyle w:val="BodyText"/>
         <w:snapToGrid w:val="0"/>
         <w:widowControl/>
-        <w:spacing w:after="20" w:line="216" w:lineRule="auto"/>
+        <w:spacing w:after="16" w:line="211" w:lineRule="auto"/>
         <w:rPr>
           <w:rFonts w:ascii="Times New Roman" w:hAnsi="Times New Roman" w:eastAsia="SimSun" w:cs="Times New Roman"/>
           <w:sz w:val="20"/>
@@ -1439,7 +1437,7 @@
       <w:r>
         <w:rPr>
           <w:rFonts w:ascii="Times New Roman" w:hAnsi="Times New Roman" w:eastAsia="SimSun" w:cs="Times New Roman"/>
-          <w:sz w:val="20"/>
+          <w:sz w:val="19"/>
           <w:szCs w:val="20"/>
           <w:color w:val="000000"/>
           <w:b w:val="0"/>
@@ -1465,7 +1463,7 @@
       <w:r>
         <w:rPr>
           <w:rFonts w:ascii="Times New Roman" w:hAnsi="Times New Roman" w:eastAsia="SimSun" w:cs="Times New Roman"/>
-          <w:sz w:val="20"/>
+          <w:sz w:val="19"/>
           <w:szCs w:val="20"/>
           <w:color w:val="000000"/>
           <w:b w:val="0"/>
@@ -1491,7 +1489,7 @@
       <w:r>
         <w:rPr>
           <w:rFonts w:ascii="Times New Roman" w:hAnsi="Times New Roman" w:eastAsia="SimSun" w:cs="Times New Roman"/>
-          <w:sz w:val="20"/>
+          <w:sz w:val="19"/>
           <w:szCs w:val="20"/>
           <w:color w:val="000000"/>
           <w:b w:val="0"/>
@@ -1632,7 +1630,7 @@
       <w:r>
         <w:rPr>
           <w:rFonts w:ascii="Times New Roman" w:hAnsi="Times New Roman" w:eastAsia="SimSun" w:cs="Times New Roman"/>
-          <w:sz w:val="20"/>
+          <w:sz w:val="19"/>
           <w:szCs w:val="20"/>
           <w:color w:val="000000"/>
           <w:b w:val="0"/>
@@ -1655,7 +1653,7 @@
       <w:r>
         <w:rPr>
           <w:rFonts w:ascii="Times New Roman" w:hAnsi="Times New Roman" w:eastAsia="SimSun" w:cs="Times New Roman"/>
-          <w:sz w:val="20"/>
+          <w:sz w:val="19"/>
           <w:szCs w:val="20"/>
           <w:color w:val="000000"/>
           <w:b w:val="0"/>
@@ -1703,7 +1701,7 @@
       <w:r>
         <w:rPr>
           <w:rFonts w:ascii="Times New Roman" w:hAnsi="Times New Roman" w:eastAsia="SimSun" w:cs="Times New Roman"/>
-          <w:sz w:val="20"/>
+          <w:sz w:val="19"/>
           <w:szCs w:val="20"/>
           <w:color w:val="000000"/>
           <w:b w:val="0"/>
@@ -1754,7 +1752,7 @@
       <w:r>
         <w:rPr>
           <w:rFonts w:ascii="Times New Roman" w:hAnsi="Times New Roman" w:eastAsia="SimSun" w:cs="Times New Roman"/>
-          <w:sz w:val="20"/>
+          <w:sz w:val="19"/>
           <w:szCs w:val="20"/>
           <w:color w:val="000000"/>
           <w:b w:val="0"/>
@@ -1805,7 +1803,7 @@
       <w:r>
         <w:rPr>
           <w:rFonts w:ascii="Times New Roman" w:hAnsi="Times New Roman" w:eastAsia="SimSun" w:cs="Times New Roman"/>
-          <w:sz w:val="20"/>
+          <w:sz w:val="19"/>
           <w:szCs w:val="20"/>
           <w:color w:val="000000"/>
           <w:b w:val="0"/>
@@ -1831,7 +1829,7 @@
       <w:r>
         <w:rPr>
           <w:rFonts w:ascii="Times New Roman" w:hAnsi="Times New Roman" w:eastAsia="SimSun" w:cs="Times New Roman"/>
-          <w:sz w:val="20"/>
+          <w:sz w:val="19"/>
           <w:szCs w:val="20"/>
           <w:color w:val="000000"/>
           <w:b w:val="0"/>
@@ -1857,7 +1855,7 @@
       <w:r>
         <w:rPr>
           <w:rFonts w:ascii="Times New Roman" w:hAnsi="Times New Roman" w:eastAsia="SimSun" w:cs="Times New Roman"/>
-          <w:sz w:val="20"/>
+          <w:sz w:val="19"/>
           <w:szCs w:val="20"/>
           <w:color w:val="000000"/>
           <w:b w:val="0"/>
@@ -1883,7 +1881,7 @@
       <w:r>
         <w:rPr>
           <w:rFonts w:ascii="Times New Roman" w:hAnsi="Times New Roman" w:eastAsia="SimSun" w:cs="Times New Roman"/>
-          <w:sz w:val="20"/>
+          <w:sz w:val="19"/>
           <w:szCs w:val="20"/>
           <w:color w:val="000000"/>
           <w:b w:val="0"/>
@@ -2032,7 +2030,7 @@
       <w:r>
         <w:rPr>
           <w:rFonts w:ascii="Times New Roman" w:hAnsi="Times New Roman" w:eastAsia="SimSun" w:cs="Times New Roman"/>
-          <w:sz w:val="20"/>
+          <w:sz w:val="19"/>
           <w:szCs w:val="20"/>
           <w:color w:val="000000"/>
           <w:b w:val="0"/>
@@ -2047,7 +2045,7 @@
         <w:pStyle w:val="BodyText"/>
         <w:snapToGrid w:val="0"/>
         <w:widowControl/>
-        <w:spacing w:after="20" w:line="216" w:lineRule="auto"/>
+        <w:spacing w:after="16" w:line="211" w:lineRule="auto"/>
         <w:rPr>
           <w:rFonts w:ascii="Times New Roman" w:hAnsi="Times New Roman" w:eastAsia="SimSun" w:cs="Times New Roman"/>
           <w:sz w:val="20"/>
@@ -2058,7 +2056,7 @@
       <w:r>
         <w:rPr>
           <w:rFonts w:ascii="Times New Roman" w:hAnsi="Times New Roman" w:eastAsia="SimSun" w:cs="Times New Roman"/>
-          <w:sz w:val="20"/>
+          <w:sz w:val="19"/>
           <w:szCs w:val="20"/>
           <w:color w:val="000000"/>
           <w:b w:val="0"/>
@@ -2084,7 +2082,7 @@
       <w:r>
         <w:rPr>
           <w:rFonts w:ascii="Times New Roman" w:hAnsi="Times New Roman" w:eastAsia="SimSun" w:cs="Times New Roman"/>
-          <w:sz w:val="20"/>
+          <w:sz w:val="19"/>
           <w:szCs w:val="20"/>
           <w:color w:val="000000"/>
           <w:b w:val="0"/>
@@ -2110,7 +2108,7 @@
       <w:r>
         <w:rPr>
           <w:rFonts w:ascii="Times New Roman" w:hAnsi="Times New Roman" w:eastAsia="SimSun" w:cs="Times New Roman"/>
-          <w:sz w:val="20"/>
+          <w:sz w:val="19"/>
           <w:szCs w:val="20"/>
           <w:color w:val="000000"/>
           <w:b w:val="0"/>
@@ -2133,7 +2131,7 @@
       <w:r>
         <w:rPr>
           <w:rFonts w:ascii="Times New Roman" w:hAnsi="Times New Roman" w:eastAsia="SimSun" w:cs="Times New Roman"/>
-          <w:sz w:val="20"/>
+          <w:sz w:val="19"/>
           <w:szCs w:val="20"/>
           <w:color w:val="000000"/>
           <w:b w:val="0"/>
@@ -2156,7 +2154,7 @@
       <w:r>
         <w:rPr>
           <w:rFonts w:ascii="Times New Roman" w:hAnsi="Times New Roman" w:eastAsia="SimSun" w:cs="Times New Roman"/>
-          <w:sz w:val="20"/>
+          <w:sz w:val="19"/>
           <w:szCs w:val="20"/>
           <w:color w:val="000000"/>
           <w:b w:val="0"/>
@@ -2179,7 +2177,7 @@
       <w:r>
         <w:rPr>
           <w:rFonts w:ascii="Times New Roman" w:hAnsi="Times New Roman" w:eastAsia="SimSun" w:cs="Times New Roman"/>
-          <w:sz w:val="20"/>
+          <w:sz w:val="19"/>
           <w:szCs w:val="20"/>
           <w:color w:val="000000"/>
           <w:b w:val="0"/>
@@ -2251,7 +2249,7 @@
       <w:r>
         <w:rPr>
           <w:rFonts w:ascii="Times New Roman" w:hAnsi="Times New Roman" w:eastAsia="SimSun" w:cs="Times New Roman"/>
-          <w:sz w:val="20"/>
+          <w:sz w:val="19"/>
           <w:szCs w:val="20"/>
           <w:color w:val="000000"/>
           <w:b w:val="0"/>
@@ -2274,7 +2272,7 @@
       <w:r>
         <w:rPr>
           <w:rFonts w:ascii="Times New Roman" w:hAnsi="Times New Roman" w:eastAsia="SimSun" w:cs="Times New Roman"/>
-          <w:sz w:val="20"/>
+          <w:sz w:val="19"/>
           <w:szCs w:val="20"/>
           <w:color w:val="000000"/>
           <w:b w:val="0"/>
@@ -2297,7 +2295,7 @@
       <w:r>
         <w:rPr>
           <w:rFonts w:ascii="Times New Roman" w:hAnsi="Times New Roman" w:eastAsia="SimSun" w:cs="Times New Roman"/>
-          <w:sz w:val="20"/>
+          <w:sz w:val="19"/>
           <w:szCs w:val="20"/>
           <w:color w:val="000000"/>
           <w:b w:val="0"/>
@@ -2348,7 +2346,7 @@
       <w:r>
         <w:rPr>
           <w:rFonts w:ascii="Times New Roman" w:hAnsi="Times New Roman" w:eastAsia="SimSun" w:cs="Times New Roman"/>
-          <w:sz w:val="20"/>
+          <w:sz w:val="19"/>
           <w:szCs w:val="20"/>
           <w:color w:val="000000"/>
           <w:b w:val="0"/>
@@ -2363,7 +2361,7 @@
         <w:pStyle w:val="BodyText"/>
         <w:snapToGrid w:val="0"/>
         <w:widowControl/>
-        <w:spacing w:after="20" w:line="216" w:lineRule="auto"/>
+        <w:spacing w:after="16" w:line="211" w:lineRule="auto"/>
         <w:rPr>
           <w:rFonts w:ascii="Times New Roman" w:hAnsi="Times New Roman" w:eastAsia="SimSun" w:cs="Times New Roman"/>
           <w:sz w:val="20"/>
@@ -2374,7 +2372,7 @@
       <w:r>
         <w:rPr>
           <w:rFonts w:ascii="Times New Roman" w:hAnsi="Times New Roman" w:eastAsia="SimSun" w:cs="Times New Roman"/>
-          <w:sz w:val="20"/>
+          <w:sz w:val="19"/>
           <w:szCs w:val="20"/>
           <w:color w:val="000000"/>
           <w:b w:val="0"/>
@@ -2485,7 +2483,7 @@
         <w:pStyle w:val="BodyText"/>
         <w:snapToGrid w:val="0"/>
         <w:widowControl/>
-        <w:spacing w:after="20" w:line="216" w:lineRule="auto"/>
+        <w:spacing w:after="16" w:line="211" w:lineRule="auto"/>
         <w:rPr>
           <w:rFonts w:ascii="Times New Roman" w:hAnsi="Times New Roman" w:eastAsia="SimSun" w:cs="Times New Roman"/>
           <w:sz w:val="20"/>
@@ -2496,7 +2494,7 @@
       <w:r>
         <w:rPr>
           <w:rFonts w:ascii="Times New Roman" w:hAnsi="Times New Roman" w:eastAsia="SimSun" w:cs="Times New Roman"/>
-          <w:sz w:val="20"/>
+          <w:sz w:val="19"/>
           <w:szCs w:val="20"/>
           <w:color w:val="000000"/>
           <w:b w:val="0"/>
@@ -4607,7 +4605,7 @@
         <w:pStyle w:val="BodyText"/>
         <w:snapToGrid w:val="0"/>
         <w:widowControl/>
-        <w:spacing w:after="20" w:line="216" w:lineRule="auto"/>
+        <w:spacing w:after="16" w:line="211" w:lineRule="auto"/>
         <w:rPr>
           <w:rFonts w:ascii="Times New Roman" w:hAnsi="Times New Roman" w:eastAsia="SimSun" w:cs="Times New Roman"/>
           <w:sz w:val="20"/>
@@ -4619,7 +4617,7 @@
       <w:r>
         <w:rPr>
           <w:rFonts w:ascii="Times New Roman" w:hAnsi="Times New Roman" w:eastAsia="SimSun" w:cs="Times New Roman"/>
-          <w:sz w:val="20"/>
+          <w:sz w:val="19"/>
           <w:szCs w:val="20"/>
           <w:color w:val="000000"/>
           <w:b w:val="0"/>
@@ -5352,7 +5350,7 @@
         <w:pStyle w:val="BodyText"/>
         <w:snapToGrid w:val="0"/>
         <w:widowControl/>
-        <w:spacing w:after="20" w:line="216" w:lineRule="auto"/>
+        <w:spacing w:after="16" w:line="211" w:lineRule="auto"/>
         <w:rPr>
           <w:rFonts w:ascii="Times New Roman" w:hAnsi="Times New Roman" w:eastAsia="SimSun" w:cs="Times New Roman"/>
           <w:sz w:val="20"/>
@@ -5364,7 +5362,7 @@
       <w:r>
         <w:rPr>
           <w:rFonts w:ascii="Times New Roman" w:hAnsi="Times New Roman" w:eastAsia="SimSun" w:cs="Times New Roman"/>
-          <w:sz w:val="20"/>
+          <w:sz w:val="19"/>
           <w:szCs w:val="20"/>
           <w:color w:val="000000"/>
           <w:b w:val="0"/>
@@ -6109,7 +6107,7 @@
         <w:pStyle w:val="BodyText"/>
         <w:snapToGrid w:val="0"/>
         <w:widowControl/>
-        <w:spacing w:after="20" w:line="216" w:lineRule="auto"/>
+        <w:spacing w:after="16" w:line="211" w:lineRule="auto"/>
         <w:rPr>
           <w:rFonts w:ascii="Times New Roman" w:hAnsi="Times New Roman" w:eastAsia="SimSun" w:cs="Times New Roman"/>
           <w:sz w:val="20"/>
@@ -6121,7 +6119,7 @@
       <w:r>
         <w:rPr>
           <w:rFonts w:ascii="Times New Roman" w:hAnsi="Times New Roman" w:eastAsia="SimSun" w:cs="Times New Roman"/>
-          <w:sz w:val="20"/>
+          <w:sz w:val="19"/>
           <w:szCs w:val="20"/>
           <w:color w:val="000000"/>
           <w:b w:val="0"/>
@@ -6270,7 +6268,7 @@
       <w:r>
         <w:rPr>
           <w:rFonts w:ascii="Times New Roman" w:hAnsi="Times New Roman" w:eastAsia="SimSun" w:cs="Times New Roman"/>
-          <w:sz w:val="20"/>
+          <w:sz w:val="19"/>
           <w:szCs w:val="20"/>
           <w:color w:val="000000"/>
           <w:b w:val="0"/>
@@ -6926,7 +6924,7 @@
         <w:pStyle w:val="BodyText"/>
         <w:snapToGrid w:val="0"/>
         <w:widowControl/>
-        <w:spacing w:after="20" w:line="216" w:lineRule="auto"/>
+        <w:spacing w:after="16" w:line="211" w:lineRule="auto"/>
         <w:rPr>
           <w:rFonts w:ascii="Times New Roman" w:hAnsi="Times New Roman" w:eastAsia="SimSun" w:cs="Times New Roman"/>
           <w:sz w:val="20"/>
@@ -6937,7 +6935,7 @@
       <w:r>
         <w:rPr>
           <w:rFonts w:ascii="Times New Roman" w:hAnsi="Times New Roman" w:eastAsia="SimSun" w:cs="Times New Roman"/>
-          <w:sz w:val="20"/>
+          <w:sz w:val="19"/>
           <w:szCs w:val="20"/>
           <w:color w:val="000000"/>
           <w:b w:val="0"/>
@@ -7203,7 +7201,7 @@
       <w:r>
         <w:rPr>
           <w:rFonts w:ascii="Times New Roman" w:hAnsi="Times New Roman" w:eastAsia="SimSun" w:cs="Times New Roman"/>
-          <w:sz w:val="20"/>
+          <w:sz w:val="19"/>
           <w:szCs w:val="20"/>
           <w:color w:val="000000"/>
           <w:b w:val="0"/>
@@ -7280,7 +7278,7 @@
       <w:r>
         <w:rPr>
           <w:rFonts w:ascii="Times New Roman" w:hAnsi="Times New Roman" w:eastAsia="SimSun" w:cs="Times New Roman"/>
-          <w:sz w:val="20"/>
+          <w:sz w:val="19"/>
           <w:szCs w:val="20"/>
           <w:color w:val="000000"/>
           <w:b w:val="0"/>
@@ -7356,7 +7354,7 @@
         <w:pStyle w:val="BodyText"/>
         <w:snapToGrid w:val="0"/>
         <w:widowControl/>
-        <w:spacing w:after="20" w:line="216" w:lineRule="auto"/>
+        <w:spacing w:after="16" w:line="211" w:lineRule="auto"/>
         <w:rPr>
           <w:rFonts w:ascii="Times New Roman" w:hAnsi="Times New Roman" w:eastAsia="SimSun" w:cs="Times New Roman"/>
           <w:sz w:val="20"/>
@@ -7368,7 +7366,7 @@
       <w:r>
         <w:rPr>
           <w:rFonts w:ascii="Times New Roman" w:hAnsi="Times New Roman" w:eastAsia="SimSun" w:cs="Times New Roman"/>
-          <w:sz w:val="20"/>
+          <w:sz w:val="19"/>
           <w:szCs w:val="20"/>
           <w:color w:val="000000"/>
           <w:b w:val="0"/>
@@ -7416,7 +7414,7 @@
       <w:r>
         <w:rPr>
           <w:rFonts w:ascii="Times New Roman" w:hAnsi="Times New Roman" w:eastAsia="SimSun" w:cs="Times New Roman"/>
-          <w:sz w:val="20"/>
+          <w:sz w:val="19"/>
           <w:szCs w:val="20"/>
           <w:color w:val="000000"/>
           <w:b w:val="0"/>
@@ -7551,7 +7549,7 @@
       <w:r>
         <w:rPr>
           <w:rFonts w:ascii="Times New Roman" w:hAnsi="Times New Roman" w:eastAsia="SimSun" w:cs="Times New Roman"/>
-          <w:sz w:val="20"/>
+          <w:sz w:val="19"/>
           <w:szCs w:val="20"/>
           <w:color w:val="000000"/>
           <w:b w:val="0"/>
@@ -7599,7 +7597,7 @@
       <w:r>
         <w:rPr>
           <w:rFonts w:ascii="Times New Roman" w:hAnsi="Times New Roman" w:eastAsia="SimSun" w:cs="Times New Roman"/>
-          <w:sz w:val="20"/>
+          <w:sz w:val="19"/>
           <w:szCs w:val="20"/>
           <w:color w:val="000000"/>
           <w:b w:val="0"/>
@@ -7650,7 +7648,7 @@
       <w:r>
         <w:rPr>
           <w:rFonts w:ascii="Times New Roman" w:hAnsi="Times New Roman" w:eastAsia="SimSun" w:cs="Times New Roman"/>
-          <w:sz w:val="20"/>
+          <w:sz w:val="19"/>
           <w:szCs w:val="20"/>
           <w:color w:val="000000"/>
           <w:b w:val="0"/>
@@ -7792,7 +7790,7 @@
       <w:r>
         <w:rPr>
           <w:rFonts w:ascii="Times New Roman" w:hAnsi="Times New Roman" w:eastAsia="SimSun" w:cs="Times New Roman"/>
-          <w:sz w:val="20"/>
+          <w:sz w:val="19"/>
           <w:szCs w:val="20"/>
           <w:color w:val="000000"/>
           <w:b w:val="0"/>
@@ -8502,7 +8500,7 @@
         <w:pStyle w:val="BodyText"/>
         <w:snapToGrid w:val="0"/>
         <w:widowControl/>
-        <w:spacing w:after="20" w:line="216" w:lineRule="auto"/>
+        <w:spacing w:after="16" w:line="211" w:lineRule="auto"/>
         <w:rPr>
           <w:rFonts w:ascii="Times New Roman" w:hAnsi="Times New Roman" w:eastAsia="SimSun" w:cs="Times New Roman"/>
           <w:sz w:val="20"/>
@@ -8514,7 +8512,7 @@
       <w:r>
         <w:rPr>
           <w:rFonts w:ascii="Times New Roman" w:hAnsi="Times New Roman" w:eastAsia="SimSun" w:cs="Times New Roman"/>
-          <w:sz w:val="20"/>
+          <w:sz w:val="19"/>
           <w:szCs w:val="20"/>
           <w:color w:val="000000"/>
           <w:b w:val="0"/>
@@ -8559,7 +8557,7 @@
       <w:r>
         <w:rPr>
           <w:rFonts w:ascii="Times New Roman" w:hAnsi="Times New Roman" w:eastAsia="SimSun" w:cs="Times New Roman"/>
-          <w:sz w:val="20"/>
+          <w:sz w:val="19"/>
           <w:szCs w:val="20"/>
           <w:color w:val="000000"/>
           <w:b w:val="0"/>
@@ -8607,7 +8605,7 @@
       <w:r>
         <w:rPr>
           <w:rFonts w:ascii="Times New Roman" w:hAnsi="Times New Roman" w:eastAsia="SimSun" w:cs="Times New Roman"/>
-          <w:sz w:val="20"/>
+          <w:sz w:val="19"/>
           <w:szCs w:val="20"/>
           <w:color w:val="000000"/>
           <w:b w:val="0"/>
@@ -8749,7 +8747,7 @@
       <w:r>
         <w:rPr>
           <w:rFonts w:ascii="Times New Roman" w:hAnsi="Times New Roman" w:eastAsia="SimSun" w:cs="Times New Roman"/>
-          <w:sz w:val="20"/>
+          <w:sz w:val="19"/>
           <w:szCs w:val="20"/>
           <w:color w:val="000000"/>
           <w:b w:val="0"/>
@@ -8876,7 +8874,7 @@
       <w:r>
         <w:rPr>
           <w:rFonts w:ascii="Times New Roman" w:hAnsi="Times New Roman" w:eastAsia="SimSun" w:cs="Times New Roman"/>
-          <w:sz w:val="20"/>
+          <w:sz w:val="19"/>
           <w:szCs w:val="20"/>
           <w:color w:val="000000"/>
           <w:b w:val="0"/>
@@ -9353,7 +9351,7 @@
         <w:pStyle w:val="BodyText"/>
         <w:snapToGrid w:val="0"/>
         <w:widowControl/>
-        <w:spacing w:after="20" w:line="216" w:lineRule="auto"/>
+        <w:spacing w:after="16" w:line="211" w:lineRule="auto"/>
         <w:rPr>
           <w:rFonts w:ascii="Times New Roman" w:hAnsi="Times New Roman" w:eastAsia="SimSun" w:cs="Times New Roman"/>
           <w:sz w:val="20"/>
@@ -9365,7 +9363,7 @@
       <w:r>
         <w:rPr>
           <w:rFonts w:ascii="Times New Roman" w:hAnsi="Times New Roman" w:eastAsia="SimSun" w:cs="Times New Roman"/>
-          <w:sz w:val="20"/>
+          <w:sz w:val="19"/>
           <w:szCs w:val="20"/>
           <w:color w:val="000000"/>
           <w:b w:val="0"/>
@@ -9457,7 +9455,7 @@
       <w:r>
         <w:rPr>
           <w:rFonts w:ascii="Times New Roman" w:hAnsi="Times New Roman" w:eastAsia="SimSun" w:cs="Times New Roman"/>
-          <w:sz w:val="20"/>
+          <w:sz w:val="19"/>
           <w:szCs w:val="20"/>
           <w:color w:val="000000"/>
           <w:b w:val="0"/>
@@ -9765,7 +9763,7 @@
         <w:pStyle w:val="BodyText"/>
         <w:snapToGrid w:val="0"/>
         <w:widowControl/>
-        <w:spacing w:after="20" w:line="216" w:lineRule="auto"/>
+        <w:spacing w:after="16" w:line="211" w:lineRule="auto"/>
         <w:rPr>
           <w:rFonts w:ascii="Times New Roman" w:hAnsi="Times New Roman" w:eastAsia="SimSun" w:cs="Times New Roman"/>
           <w:sz w:val="20"/>
@@ -9777,7 +9775,7 @@
       <w:r>
         <w:rPr>
           <w:rFonts w:ascii="Times New Roman" w:hAnsi="Times New Roman" w:eastAsia="SimSun" w:cs="Times New Roman"/>
-          <w:sz w:val="20"/>
+          <w:sz w:val="19"/>
           <w:szCs w:val="20"/>
           <w:color w:val="000000"/>
           <w:b w:val="0"/>
@@ -10160,7 +10158,7 @@
         <w:pStyle w:val="BodyText"/>
         <w:snapToGrid w:val="0"/>
         <w:widowControl/>
-        <w:spacing w:after="20" w:line="216" w:lineRule="auto"/>
+        <w:spacing w:after="16" w:line="211" w:lineRule="auto"/>
         <w:rPr>
           <w:rFonts w:ascii="Times New Roman" w:hAnsi="Times New Roman" w:eastAsia="SimSun" w:cs="Times New Roman"/>
           <w:sz w:val="20"/>
@@ -10171,7 +10169,7 @@
       <w:r>
         <w:rPr>
           <w:rFonts w:ascii="Times New Roman" w:hAnsi="Times New Roman" w:eastAsia="SimSun" w:cs="Times New Roman"/>
-          <w:sz w:val="20"/>
+          <w:sz w:val="19"/>
           <w:szCs w:val="20"/>
           <w:color w:val="000000"/>
           <w:b w:val="0"/>
@@ -10393,7 +10391,7 @@
         <w:pStyle w:val="BodyText"/>
         <w:snapToGrid w:val="0"/>
         <w:widowControl/>
-        <w:spacing w:after="20" w:line="216" w:lineRule="auto"/>
+        <w:spacing w:after="16" w:line="211" w:lineRule="auto"/>
         <w:rPr>
           <w:rFonts w:ascii="Times New Roman" w:hAnsi="Times New Roman" w:eastAsia="SimSun" w:cs="Times New Roman"/>
           <w:sz w:val="20"/>
@@ -10405,7 +10403,7 @@
       <w:r>
         <w:rPr>
           <w:rFonts w:ascii="Times New Roman" w:hAnsi="Times New Roman" w:eastAsia="SimSun" w:cs="Times New Roman"/>
-          <w:sz w:val="20"/>
+          <w:sz w:val="19"/>
           <w:szCs w:val="20"/>
           <w:color w:val="000000"/>
           <w:b w:val="0"/>
@@ -10456,7 +10454,7 @@
       <w:r>
         <w:rPr>
           <w:rFonts w:ascii="Times New Roman" w:hAnsi="Times New Roman" w:eastAsia="SimSun" w:cs="Times New Roman"/>
-          <w:sz w:val="20"/>
+          <w:sz w:val="19"/>
           <w:szCs w:val="20"/>
           <w:color w:val="000000"/>
           <w:b w:val="0"/>
@@ -10507,7 +10505,7 @@
       <w:r>
         <w:rPr>
           <w:rFonts w:ascii="Times New Roman" w:hAnsi="Times New Roman" w:eastAsia="SimSun" w:cs="Times New Roman"/>
-          <w:sz w:val="20"/>
+          <w:sz w:val="19"/>
           <w:szCs w:val="20"/>
           <w:color w:val="000000"/>
           <w:b w:val="0"/>
@@ -10558,7 +10556,7 @@
       <w:r>
         <w:rPr>
           <w:rFonts w:ascii="Times New Roman" w:hAnsi="Times New Roman" w:eastAsia="SimSun" w:cs="Times New Roman"/>
-          <w:sz w:val="20"/>
+          <w:sz w:val="19"/>
           <w:szCs w:val="20"/>
           <w:color w:val="000000"/>
           <w:b w:val="0"/>
@@ -10584,7 +10582,7 @@
       <w:r>
         <w:rPr>
           <w:rFonts w:ascii="Times New Roman" w:hAnsi="Times New Roman" w:eastAsia="SimSun" w:cs="Times New Roman"/>
-          <w:sz w:val="20"/>
+          <w:sz w:val="19"/>
           <w:szCs w:val="20"/>
           <w:color w:val="000000"/>
           <w:b w:val="0"/>
@@ -10891,7 +10889,7 @@
         <w:pStyle w:val="BodyText"/>
         <w:snapToGrid w:val="0"/>
         <w:widowControl/>
-        <w:spacing w:after="20" w:line="216" w:lineRule="auto"/>
+        <w:spacing w:after="16" w:line="211" w:lineRule="auto"/>
         <w:rPr>
           <w:rFonts w:ascii="Times New Roman" w:hAnsi="Times New Roman" w:eastAsia="SimSun" w:cs="Times New Roman"/>
           <w:sz w:val="20"/>
@@ -10903,7 +10901,7 @@
       <w:r>
         <w:rPr>
           <w:rFonts w:ascii="Times New Roman" w:hAnsi="Times New Roman" w:eastAsia="SimSun" w:cs="Times New Roman"/>
-          <w:sz w:val="20"/>
+          <w:sz w:val="19"/>
           <w:szCs w:val="20"/>
           <w:color w:val="000000"/>
           <w:b w:val="0"/>
@@ -10954,7 +10952,7 @@
       <w:r>
         <w:rPr>
           <w:rFonts w:ascii="Times New Roman" w:hAnsi="Times New Roman" w:eastAsia="SimSun" w:cs="Times New Roman"/>
-          <w:sz w:val="20"/>
+          <w:sz w:val="19"/>
           <w:szCs w:val="20"/>
           <w:color w:val="000000"/>
           <w:b w:val="0"/>
@@ -11005,7 +11003,7 @@
       <w:r>
         <w:rPr>
           <w:rFonts w:ascii="Times New Roman" w:hAnsi="Times New Roman" w:eastAsia="SimSun" w:cs="Times New Roman"/>
-          <w:sz w:val="20"/>
+          <w:sz w:val="19"/>
           <w:szCs w:val="20"/>
           <w:color w:val="000000"/>
           <w:b w:val="0"/>
@@ -11542,7 +11540,7 @@
         <w:pStyle w:val="BodyText"/>
         <w:snapToGrid w:val="0"/>
         <w:widowControl/>
-        <w:spacing w:after="20" w:line="216" w:lineRule="auto"/>
+        <w:spacing w:after="16" w:line="211" w:lineRule="auto"/>
         <w:rPr>
           <w:rFonts w:ascii="Times New Roman" w:hAnsi="Times New Roman" w:eastAsia="SimSun" w:cs="Times New Roman"/>
           <w:sz w:val="20"/>
@@ -11553,7 +11551,7 @@
       <w:r>
         <w:rPr>
           <w:rFonts w:ascii="Times New Roman" w:hAnsi="Times New Roman" w:eastAsia="SimSun" w:cs="Times New Roman"/>
-          <w:sz w:val="20"/>
+          <w:sz w:val="19"/>
           <w:szCs w:val="20"/>
           <w:color w:val="000000"/>
           <w:b w:val="0"/>
@@ -11604,7 +11602,7 @@
       <w:r>
         <w:rPr>
           <w:rFonts w:ascii="Times New Roman" w:hAnsi="Times New Roman" w:eastAsia="SimSun" w:cs="Times New Roman"/>
-          <w:sz w:val="20"/>
+          <w:sz w:val="19"/>
           <w:szCs w:val="20"/>
           <w:color w:val="000000"/>
           <w:b w:val="0"/>
@@ -11655,7 +11653,7 @@
       <w:r>
         <w:rPr>
           <w:rFonts w:ascii="Times New Roman" w:hAnsi="Times New Roman" w:eastAsia="SimSun" w:cs="Times New Roman"/>
-          <w:sz w:val="20"/>
+          <w:sz w:val="19"/>
           <w:szCs w:val="20"/>
           <w:color w:val="000000"/>
           <w:b w:val="0"/>
@@ -11718,7 +11716,7 @@
       <w:r>
         <w:rPr>
           <w:rFonts w:ascii="Times New Roman" w:hAnsi="Times New Roman" w:eastAsia="SimSun" w:cs="Times New Roman"/>
-          <w:sz w:val="20"/>
+          <w:sz w:val="19"/>
           <w:szCs w:val="20"/>
           <w:color w:val="000000"/>
           <w:b w:val="0"/>
@@ -11733,7 +11731,7 @@
         <w:pStyle w:val="BodyText"/>
         <w:snapToGrid w:val="0"/>
         <w:widowControl/>
-        <w:spacing w:after="20" w:line="216" w:lineRule="auto"/>
+        <w:spacing w:after="16" w:line="211" w:lineRule="auto"/>
         <w:rPr>
           <w:rFonts w:ascii="Times New Roman" w:hAnsi="Times New Roman" w:eastAsia="SimSun" w:cs="Times New Roman"/>
           <w:sz w:val="20"/>
@@ -11745,7 +11743,7 @@
       <w:r>
         <w:rPr>
           <w:rFonts w:ascii="Times New Roman" w:hAnsi="Times New Roman" w:eastAsia="SimSun" w:cs="Times New Roman"/>
-          <w:sz w:val="20"/>
+          <w:sz w:val="19"/>
           <w:szCs w:val="20"/>
           <w:color w:val="000000"/>
           <w:b w:val="0"/>
@@ -12136,7 +12134,7 @@
         <w:pStyle w:val="BodyText"/>
         <w:snapToGrid w:val="0"/>
         <w:widowControl/>
-        <w:spacing w:after="20" w:line="216" w:lineRule="auto"/>
+        <w:spacing w:after="16" w:line="211" w:lineRule="auto"/>
         <w:rPr>
           <w:rFonts w:ascii="Times New Roman" w:hAnsi="Times New Roman" w:eastAsia="SimSun" w:cs="Times New Roman"/>
           <w:sz w:val="20"/>
@@ -12147,7 +12145,7 @@
       <w:r>
         <w:rPr>
           <w:rFonts w:ascii="Times New Roman" w:hAnsi="Times New Roman" w:eastAsia="SimSun" w:cs="Times New Roman"/>
-          <w:sz w:val="20"/>
+          <w:sz w:val="19"/>
           <w:szCs w:val="20"/>
           <w:color w:val="000000"/>
           <w:b w:val="0"/>
@@ -12207,7 +12205,7 @@
       <w:r>
         <w:rPr>
           <w:rFonts w:ascii="Times New Roman" w:hAnsi="Times New Roman" w:eastAsia="SimSun" w:cs="Times New Roman"/>
-          <w:sz w:val="20"/>
+          <w:sz w:val="19"/>
           <w:szCs w:val="20"/>
           <w:color w:val="000000"/>
           <w:b w:val="0"/>
@@ -12258,7 +12256,7 @@
       <w:r>
         <w:rPr>
           <w:rFonts w:ascii="Times New Roman" w:hAnsi="Times New Roman" w:eastAsia="SimSun" w:cs="Times New Roman"/>
-          <w:sz w:val="20"/>
+          <w:sz w:val="19"/>
           <w:szCs w:val="20"/>
           <w:color w:val="000000"/>
           <w:b w:val="0"/>
@@ -12309,7 +12307,7 @@
       <w:r>
         <w:rPr>
           <w:rFonts w:ascii="Times New Roman" w:hAnsi="Times New Roman" w:eastAsia="SimSun" w:cs="Times New Roman"/>
-          <w:sz w:val="20"/>
+          <w:sz w:val="19"/>
           <w:szCs w:val="20"/>
           <w:color w:val="000000"/>
           <w:b w:val="0"/>
@@ -12357,7 +12355,7 @@
       <w:r>
         <w:rPr>
           <w:rFonts w:ascii="Times New Roman" w:hAnsi="Times New Roman" w:eastAsia="SimSun" w:cs="Times New Roman"/>
-          <w:sz w:val="20"/>
+          <w:sz w:val="19"/>
           <w:szCs w:val="20"/>
           <w:color w:val="000000"/>
           <w:b w:val="0"/>
@@ -12408,7 +12406,7 @@
       <w:r>
         <w:rPr>
           <w:rFonts w:ascii="Times New Roman" w:hAnsi="Times New Roman" w:eastAsia="SimSun" w:cs="Times New Roman"/>
-          <w:sz w:val="20"/>
+          <w:sz w:val="19"/>
           <w:szCs w:val="20"/>
           <w:color w:val="000000"/>
           <w:b w:val="0"/>
@@ -12473,7 +12471,7 @@
       <w:r>
         <w:rPr>
           <w:rFonts w:ascii="Times New Roman" w:hAnsi="Times New Roman" w:eastAsia="SimSun" w:cs="Times New Roman"/>
-          <w:sz w:val="20"/>
+          <w:sz w:val="19"/>
           <w:szCs w:val="20"/>
           <w:color w:val="000000"/>
           <w:b w:val="0"/>
@@ -12535,7 +12533,7 @@
       <w:r>
         <w:rPr>
           <w:rFonts w:ascii="Times New Roman" w:hAnsi="Times New Roman" w:eastAsia="SimSun" w:cs="Times New Roman"/>
-          <w:sz w:val="20"/>
+          <w:sz w:val="19"/>
           <w:szCs w:val="20"/>
           <w:color w:val="000000"/>
           <w:b w:val="0"/>
@@ -12659,7 +12657,7 @@
       <w:r>
         <w:rPr>
           <w:rFonts w:ascii="Times New Roman" w:hAnsi="Times New Roman" w:eastAsia="SimSun" w:cs="Times New Roman"/>
-          <w:sz w:val="20"/>
+          <w:sz w:val="19"/>
           <w:szCs w:val="20"/>
           <w:color w:val="000000"/>
           <w:b w:val="0"/>
@@ -12674,7 +12672,7 @@
         <w:pStyle w:val="BodyText"/>
         <w:snapToGrid w:val="0"/>
         <w:widowControl/>
-        <w:spacing w:after="20" w:line="216" w:lineRule="auto"/>
+        <w:spacing w:after="16" w:line="211" w:lineRule="auto"/>
         <w:rPr>
           <w:rFonts w:ascii="Times New Roman" w:hAnsi="Times New Roman" w:eastAsia="SimSun" w:cs="Times New Roman"/>
           <w:sz w:val="20"/>
@@ -12686,7 +12684,7 @@
       <w:r>
         <w:rPr>
           <w:rFonts w:ascii="Times New Roman" w:hAnsi="Times New Roman" w:eastAsia="SimSun" w:cs="Times New Roman"/>
-          <w:sz w:val="20"/>
+          <w:sz w:val="19"/>
           <w:szCs w:val="20"/>
           <w:color w:val="000000"/>
           <w:b w:val="0"/>
@@ -13191,7 +13189,7 @@
         <w:pStyle w:val="BodyText"/>
         <w:snapToGrid w:val="0"/>
         <w:widowControl/>
-        <w:spacing w:after="20" w:line="216" w:lineRule="auto"/>
+        <w:spacing w:after="16" w:line="211" w:lineRule="auto"/>
         <w:rPr>
           <w:rFonts w:ascii="Times New Roman" w:hAnsi="Times New Roman" w:eastAsia="SimSun" w:cs="Times New Roman"/>
           <w:sz w:val="20"/>
@@ -13202,7 +13200,7 @@
       <w:r>
         <w:rPr>
           <w:rFonts w:ascii="Times New Roman" w:hAnsi="Times New Roman" w:eastAsia="SimSun" w:cs="Times New Roman"/>
-          <w:sz w:val="20"/>
+          <w:sz w:val="19"/>
           <w:szCs w:val="20"/>
           <w:color w:val="000000"/>
           <w:b w:val="0"/>
@@ -13421,7 +13419,7 @@
       <w:r>
         <w:rPr>
           <w:rFonts w:ascii="Times New Roman" w:hAnsi="Times New Roman" w:eastAsia="SimSun" w:cs="Times New Roman"/>
-          <w:sz w:val="20"/>
+          <w:sz w:val="19"/>
           <w:szCs w:val="20"/>
           <w:color w:val="000000"/>
           <w:b w:val="0"/>
@@ -13472,7 +13470,7 @@
       <w:r>
         <w:rPr>
           <w:rFonts w:ascii="Times New Roman" w:hAnsi="Times New Roman" w:eastAsia="SimSun" w:cs="Times New Roman"/>
-          <w:sz w:val="20"/>
+          <w:sz w:val="19"/>
           <w:szCs w:val="20"/>
           <w:color w:val="000000"/>
           <w:b w:val="0"/>
@@ -13852,7 +13850,7 @@
         <w:pStyle w:val="BodyText"/>
         <w:snapToGrid w:val="0"/>
         <w:widowControl/>
-        <w:spacing w:after="20" w:line="216" w:lineRule="auto"/>
+        <w:spacing w:after="16" w:line="211" w:lineRule="auto"/>
         <w:rPr>
           <w:rFonts w:ascii="Times New Roman" w:hAnsi="Times New Roman" w:eastAsia="SimSun" w:cs="Times New Roman"/>
           <w:sz w:val="20"/>
@@ -13864,7 +13862,7 @@
       <w:r>
         <w:rPr>
           <w:rFonts w:ascii="Times New Roman" w:hAnsi="Times New Roman" w:eastAsia="SimSun" w:cs="Times New Roman"/>
-          <w:sz w:val="20"/>
+          <w:sz w:val="19"/>
           <w:szCs w:val="20"/>
           <w:color w:val="000000"/>
           <w:b w:val="0"/>
@@ -13890,7 +13888,7 @@
       <w:r>
         <w:rPr>
           <w:rFonts w:ascii="Times New Roman" w:hAnsi="Times New Roman" w:eastAsia="SimSun" w:cs="Times New Roman"/>
-          <w:sz w:val="20"/>
+          <w:sz w:val="19"/>
           <w:szCs w:val="20"/>
           <w:color w:val="000000"/>
           <w:b w:val="0"/>
@@ -13928,7 +13926,7 @@
       <w:r>
         <w:rPr>
           <w:rFonts w:ascii="Times New Roman" w:hAnsi="Times New Roman" w:eastAsia="SimSun" w:cs="Times New Roman"/>
-          <w:sz w:val="20"/>
+          <w:sz w:val="19"/>
           <w:szCs w:val="20"/>
           <w:color w:val="000000"/>
           <w:b w:val="0"/>
@@ -13979,7 +13977,7 @@
       <w:r>
         <w:rPr>
           <w:rFonts w:ascii="Times New Roman" w:hAnsi="Times New Roman" w:eastAsia="SimSun" w:cs="Times New Roman"/>
-          <w:sz w:val="20"/>
+          <w:sz w:val="19"/>
           <w:szCs w:val="20"/>
           <w:color w:val="000000"/>
           <w:b w:val="0"/>
@@ -14169,7 +14167,7 @@
       <w:r>
         <w:rPr>
           <w:rFonts w:ascii="Times New Roman" w:hAnsi="Times New Roman" w:eastAsia="SimSun" w:cs="Times New Roman"/>
-          <w:sz w:val="20"/>
+          <w:sz w:val="19"/>
           <w:szCs w:val="20"/>
           <w:color w:val="000000"/>
           <w:b w:val="0"/>
@@ -15562,7 +15560,7 @@
         <w:pStyle w:val="BodyText"/>
         <w:snapToGrid w:val="0"/>
         <w:widowControl/>
-        <w:spacing w:after="20" w:line="216" w:lineRule="auto"/>
+        <w:spacing w:after="16" w:line="211" w:lineRule="auto"/>
         <w:rPr>
           <w:rFonts w:ascii="Times New Roman" w:hAnsi="Times New Roman" w:eastAsia="SimSun" w:cs="Times New Roman"/>
           <w:sz w:val="20"/>
@@ -15574,7 +15572,7 @@
       <w:r>
         <w:rPr>
           <w:rFonts w:ascii="Times New Roman" w:hAnsi="Times New Roman" w:eastAsia="SimSun" w:cs="Times New Roman"/>
-          <w:sz w:val="20"/>
+          <w:sz w:val="19"/>
           <w:szCs w:val="20"/>
           <w:color w:val="000000"/>
           <w:b w:val="0"/>
@@ -15600,7 +15598,7 @@
       <w:r>
         <w:rPr>
           <w:rFonts w:ascii="Times New Roman" w:hAnsi="Times New Roman" w:eastAsia="SimSun" w:cs="Times New Roman"/>
-          <w:sz w:val="20"/>
+          <w:sz w:val="19"/>
           <w:szCs w:val="20"/>
           <w:color w:val="000000"/>
           <w:b w:val="0"/>
@@ -15651,7 +15649,7 @@
       <w:r>
         <w:rPr>
           <w:rFonts w:ascii="Times New Roman" w:hAnsi="Times New Roman" w:eastAsia="SimSun" w:cs="Times New Roman"/>
-          <w:sz w:val="20"/>
+          <w:sz w:val="19"/>
           <w:szCs w:val="20"/>
           <w:color w:val="000000"/>
           <w:b w:val="0"/>
@@ -15702,7 +15700,7 @@
       <w:r>
         <w:rPr>
           <w:rFonts w:ascii="Times New Roman" w:hAnsi="Times New Roman" w:eastAsia="SimSun" w:cs="Times New Roman"/>
-          <w:sz w:val="20"/>
+          <w:sz w:val="19"/>
           <w:szCs w:val="20"/>
           <w:color w:val="000000"/>
           <w:b w:val="0"/>
@@ -15876,7 +15874,7 @@
         <w:pStyle w:val="BodyText"/>
         <w:snapToGrid w:val="0"/>
         <w:widowControl/>
-        <w:spacing w:after="20" w:line="216" w:lineRule="auto"/>
+        <w:spacing w:after="16" w:line="211" w:lineRule="auto"/>
         <w:rPr>
           <w:rFonts w:ascii="Times New Roman" w:hAnsi="Times New Roman" w:eastAsia="SimSun" w:cs="Times New Roman"/>
           <w:sz w:val="20"/>
@@ -15888,7 +15886,7 @@
       <w:r>
         <w:rPr>
           <w:rFonts w:ascii="Times New Roman" w:hAnsi="Times New Roman" w:eastAsia="SimSun" w:cs="Times New Roman"/>
-          <w:sz w:val="20"/>
+          <w:sz w:val="19"/>
           <w:szCs w:val="20"/>
           <w:color w:val="000000"/>
           <w:b w:val="0"/>
@@ -15992,7 +15990,7 @@
       <w:r>
         <w:rPr>
           <w:rFonts w:ascii="Times New Roman" w:hAnsi="Times New Roman" w:eastAsia="SimSun" w:cs="Times New Roman"/>
-          <w:sz w:val="20"/>
+          <w:sz w:val="19"/>
           <w:szCs w:val="20"/>
           <w:color w:val="000000"/>
           <w:b w:val="0"/>
@@ -16093,7 +16091,7 @@
       <w:r>
         <w:rPr>
           <w:rFonts w:ascii="Times New Roman" w:hAnsi="Times New Roman" w:eastAsia="SimSun" w:cs="Times New Roman"/>
-          <w:sz w:val="20"/>
+          <w:sz w:val="19"/>
           <w:szCs w:val="20"/>
           <w:color w:val="000000"/>
           <w:b w:val="0"/>
@@ -16512,7 +16510,7 @@
         <w:pStyle w:val="BodyText"/>
         <w:snapToGrid w:val="0"/>
         <w:widowControl/>
-        <w:spacing w:after="20" w:line="216" w:lineRule="auto"/>
+        <w:spacing w:after="16" w:line="211" w:lineRule="auto"/>
         <w:rPr>
           <w:rFonts w:ascii="Times New Roman" w:hAnsi="Times New Roman" w:eastAsia="SimSun" w:cs="Times New Roman"/>
           <w:sz w:val="20"/>
@@ -16523,7 +16521,7 @@
       <w:r>
         <w:rPr>
           <w:rFonts w:ascii="Times New Roman" w:hAnsi="Times New Roman" w:eastAsia="SimSun" w:cs="Times New Roman"/>
-          <w:sz w:val="20"/>
+          <w:sz w:val="19"/>
           <w:szCs w:val="20"/>
           <w:color w:val="000000"/>
           <w:b w:val="0"/>
@@ -16549,7 +16547,7 @@
       <w:r>
         <w:rPr>
           <w:rFonts w:ascii="Times New Roman" w:hAnsi="Times New Roman" w:eastAsia="SimSun" w:cs="Times New Roman"/>
-          <w:sz w:val="20"/>
+          <w:sz w:val="19"/>
           <w:szCs w:val="20"/>
           <w:color w:val="000000"/>
           <w:b w:val="0"/>
@@ -17702,7 +17700,7 @@
         <w:pStyle w:val="BodyText"/>
         <w:snapToGrid w:val="0"/>
         <w:widowControl/>
-        <w:spacing w:after="20" w:line="216" w:lineRule="auto"/>
+        <w:spacing w:after="16" w:line="211" w:lineRule="auto"/>
         <w:rPr>
           <w:rFonts w:ascii="Times New Roman" w:hAnsi="Times New Roman" w:eastAsia="SimSun" w:cs="Times New Roman"/>
           <w:sz w:val="20"/>
@@ -17713,7 +17711,7 @@
       <w:r>
         <w:rPr>
           <w:rFonts w:ascii="Times New Roman" w:hAnsi="Times New Roman" w:eastAsia="SimSun" w:cs="Times New Roman"/>
-          <w:sz w:val="20"/>
+          <w:sz w:val="19"/>
           <w:szCs w:val="20"/>
           <w:color w:val="000000"/>
           <w:b w:val="0"/>
@@ -17736,7 +17734,7 @@
       <w:r>
         <w:rPr>
           <w:rFonts w:ascii="Times New Roman" w:hAnsi="Times New Roman" w:eastAsia="SimSun" w:cs="Times New Roman"/>
-          <w:sz w:val="20"/>
+          <w:sz w:val="19"/>
           <w:szCs w:val="20"/>
           <w:color w:val="000000"/>
           <w:b w:val="0"/>
@@ -17796,7 +17794,7 @@
       <w:r>
         <w:rPr>
           <w:rFonts w:ascii="Times New Roman" w:hAnsi="Times New Roman" w:eastAsia="SimSun" w:cs="Times New Roman"/>
-          <w:sz w:val="20"/>
+          <w:sz w:val="19"/>
           <w:szCs w:val="20"/>
           <w:color w:val="000000"/>
           <w:b w:val="0"/>
@@ -17881,7 +17879,7 @@
       <w:r>
         <w:rPr>
           <w:rFonts w:ascii="Times New Roman" w:hAnsi="Times New Roman" w:eastAsia="SimSun" w:cs="Times New Roman"/>
-          <w:sz w:val="20"/>
+          <w:sz w:val="19"/>
           <w:szCs w:val="20"/>
           <w:color w:val="000000"/>
           <w:b w:val="0"/>
@@ -17963,7 +17961,7 @@
       <w:r>
         <w:rPr>
           <w:rFonts w:ascii="Times New Roman" w:hAnsi="Times New Roman" w:eastAsia="SimSun" w:cs="Times New Roman"/>
-          <w:sz w:val="20"/>
+          <w:sz w:val="19"/>
           <w:szCs w:val="20"/>
           <w:color w:val="000000"/>
           <w:b w:val="0"/>
@@ -18035,7 +18033,7 @@
       <w:r>
         <w:rPr>
           <w:rFonts w:ascii="Times New Roman" w:hAnsi="Times New Roman" w:eastAsia="SimSun" w:cs="Times New Roman"/>
-          <w:sz w:val="20"/>
+          <w:sz w:val="19"/>
           <w:szCs w:val="20"/>
           <w:color w:val="000000"/>
           <w:b w:val="0"/>
@@ -18132,7 +18130,7 @@
       <w:r>
         <w:rPr>
           <w:rFonts w:ascii="Times New Roman" w:hAnsi="Times New Roman" w:eastAsia="SimSun" w:cs="Times New Roman"/>
-          <w:sz w:val="20"/>
+          <w:sz w:val="19"/>
           <w:szCs w:val="20"/>
           <w:color w:val="000000"/>
           <w:b w:val="0"/>
@@ -18147,7 +18145,7 @@
         <w:pStyle w:val="BodyText"/>
         <w:snapToGrid w:val="0"/>
         <w:widowControl/>
-        <w:spacing w:after="20" w:line="216" w:lineRule="auto"/>
+        <w:spacing w:after="16" w:line="211" w:lineRule="auto"/>
         <w:rPr>
           <w:rFonts w:ascii="Times New Roman" w:hAnsi="Times New Roman" w:eastAsia="SimSun" w:cs="Times New Roman"/>
           <w:sz w:val="20"/>
@@ -18158,7 +18156,7 @@
       <w:r>
         <w:rPr>
           <w:rFonts w:ascii="Times New Roman" w:hAnsi="Times New Roman" w:eastAsia="SimSun" w:cs="Times New Roman"/>
-          <w:sz w:val="20"/>
+          <w:sz w:val="19"/>
           <w:szCs w:val="20"/>
           <w:color w:val="000000"/>
           <w:b w:val="0"/>
@@ -18215,7 +18213,7 @@
       <w:r>
         <w:rPr>
           <w:rFonts w:ascii="Times New Roman" w:hAnsi="Times New Roman" w:eastAsia="SimSun" w:cs="Times New Roman"/>
-          <w:sz w:val="20"/>
+          <w:sz w:val="19"/>
           <w:szCs w:val="20"/>
           <w:color w:val="000000"/>
           <w:b w:val="0"/>
@@ -18272,7 +18270,7 @@
       <w:r>
         <w:rPr>
           <w:rFonts w:ascii="Times New Roman" w:hAnsi="Times New Roman" w:eastAsia="SimSun" w:cs="Times New Roman"/>
-          <w:sz w:val="20"/>
+          <w:sz w:val="19"/>
           <w:szCs w:val="20"/>
           <w:color w:val="000000"/>
           <w:b w:val="0"/>
@@ -18366,7 +18364,7 @@
       <w:r>
         <w:rPr>
           <w:rFonts w:ascii="Times New Roman" w:hAnsi="Times New Roman" w:eastAsia="SimSun" w:cs="Times New Roman"/>
-          <w:sz w:val="20"/>
+          <w:sz w:val="19"/>
           <w:szCs w:val="20"/>
           <w:color w:val="000000"/>
           <w:b w:val="0"/>
@@ -18448,7 +18446,7 @@
       <w:r>
         <w:rPr>
           <w:rFonts w:ascii="Times New Roman" w:hAnsi="Times New Roman" w:eastAsia="SimSun" w:cs="Times New Roman"/>
-          <w:sz w:val="20"/>
+          <w:sz w:val="19"/>
           <w:szCs w:val="20"/>
           <w:color w:val="000000"/>
           <w:b w:val="0"/>
@@ -18539,7 +18537,7 @@
       <w:r>
         <w:rPr>
           <w:rFonts w:ascii="Times New Roman" w:hAnsi="Times New Roman" w:eastAsia="SimSun" w:cs="Times New Roman"/>
-          <w:sz w:val="20"/>
+          <w:sz w:val="19"/>
           <w:szCs w:val="20"/>
           <w:color w:val="000000"/>
           <w:b w:val="0"/>
@@ -18554,7 +18552,7 @@
         <w:pStyle w:val="BodyText"/>
         <w:snapToGrid w:val="0"/>
         <w:widowControl/>
-        <w:spacing w:after="20" w:line="216" w:lineRule="auto"/>
+        <w:spacing w:after="16" w:line="211" w:lineRule="auto"/>
         <w:rPr>
           <w:rFonts w:ascii="Times New Roman" w:hAnsi="Times New Roman" w:eastAsia="SimSun" w:cs="Times New Roman"/>
           <w:sz w:val="20"/>
@@ -18566,7 +18564,7 @@
       <w:r>
         <w:rPr>
           <w:rFonts w:ascii="Times New Roman" w:hAnsi="Times New Roman" w:eastAsia="SimSun" w:cs="Times New Roman"/>
-          <w:sz w:val="20"/>
+          <w:sz w:val="19"/>
           <w:szCs w:val="20"/>
           <w:color w:val="000000"/>
           <w:b w:val="0"/>
@@ -18614,7 +18612,7 @@
       <w:r>
         <w:rPr>
           <w:rFonts w:ascii="Times New Roman" w:hAnsi="Times New Roman" w:eastAsia="SimSun" w:cs="Times New Roman"/>
-          <w:sz w:val="20"/>
+          <w:sz w:val="19"/>
           <w:szCs w:val="20"/>
           <w:color w:val="000000"/>
           <w:b w:val="0"/>
@@ -18671,7 +18669,7 @@
       <w:r>
         <w:rPr>
           <w:rFonts w:ascii="Times New Roman" w:hAnsi="Times New Roman" w:eastAsia="SimSun" w:cs="Times New Roman"/>
-          <w:sz w:val="20"/>
+          <w:sz w:val="19"/>
           <w:szCs w:val="20"/>
           <w:color w:val="000000"/>
           <w:b w:val="0"/>
@@ -18728,7 +18726,7 @@
       <w:r>
         <w:rPr>
           <w:rFonts w:ascii="Times New Roman" w:hAnsi="Times New Roman" w:eastAsia="SimSun" w:cs="Times New Roman"/>
-          <w:sz w:val="20"/>
+          <w:sz w:val="19"/>
           <w:szCs w:val="20"/>
           <w:color w:val="000000"/>
           <w:b w:val="0"/>
@@ -18776,7 +18774,7 @@
       <w:r>
         <w:rPr>
           <w:rFonts w:ascii="Times New Roman" w:hAnsi="Times New Roman" w:eastAsia="SimSun" w:cs="Times New Roman"/>
-          <w:sz w:val="20"/>
+          <w:sz w:val="19"/>
           <w:szCs w:val="20"/>
           <w:color w:val="000000"/>
           <w:b w:val="0"/>
@@ -18824,7 +18822,7 @@
       <w:r>
         <w:rPr>
           <w:rFonts w:ascii="Times New Roman" w:hAnsi="Times New Roman" w:eastAsia="SimSun" w:cs="Times New Roman"/>
-          <w:sz w:val="20"/>
+          <w:sz w:val="19"/>
           <w:szCs w:val="20"/>
           <w:color w:val="000000"/>
           <w:b w:val="0"/>
@@ -19332,7 +19330,7 @@
         <w:pStyle w:val="BodyText"/>
         <w:snapToGrid w:val="0"/>
         <w:widowControl/>
-        <w:spacing w:after="20" w:line="216" w:lineRule="auto"/>
+        <w:spacing w:after="16" w:line="211" w:lineRule="auto"/>
         <w:rPr>
           <w:rFonts w:ascii="Times New Roman" w:hAnsi="Times New Roman" w:eastAsia="SimSun" w:cs="Times New Roman"/>
           <w:sz w:val="20"/>
@@ -19343,7 +19341,7 @@
       <w:r>
         <w:rPr>
           <w:rFonts w:ascii="Times New Roman" w:hAnsi="Times New Roman" w:eastAsia="SimSun" w:cs="Times New Roman"/>
-          <w:sz w:val="20"/>
+          <w:sz w:val="19"/>
           <w:szCs w:val="20"/>
           <w:color w:val="000000"/>
           <w:b w:val="0"/>
@@ -19393,7 +19391,7 @@
       <w:r>
         <w:rPr>
           <w:rFonts w:ascii="Times New Roman" w:hAnsi="Times New Roman" w:eastAsia="SimSun" w:cs="Times New Roman"/>
-          <w:sz w:val="20"/>
+          <w:sz w:val="19"/>
           <w:szCs w:val="20"/>
           <w:color w:val="000000"/>
           <w:b w:val="0"/>
@@ -19463,7 +19461,7 @@
       <w:r>
         <w:rPr>
           <w:rFonts w:ascii="Times New Roman" w:hAnsi="Times New Roman" w:eastAsia="SimSun" w:cs="Times New Roman"/>
-          <w:sz w:val="20"/>
+          <w:sz w:val="19"/>
           <w:szCs w:val="20"/>
           <w:color w:val="000000"/>
           <w:b w:val="0"/>
@@ -19486,7 +19484,7 @@
       <w:r>
         <w:rPr>
           <w:rFonts w:ascii="Times New Roman" w:hAnsi="Times New Roman" w:eastAsia="SimSun" w:cs="Times New Roman"/>
-          <w:sz w:val="20"/>
+          <w:sz w:val="19"/>
           <w:szCs w:val="20"/>
           <w:color w:val="000000"/>
           <w:b w:val="0"/>
@@ -19531,7 +19529,7 @@
       <w:r>
         <w:rPr>
           <w:rFonts w:ascii="Times New Roman" w:hAnsi="Times New Roman" w:eastAsia="SimSun" w:cs="Times New Roman"/>
-          <w:sz w:val="20"/>
+          <w:sz w:val="19"/>
           <w:szCs w:val="20"/>
           <w:color w:val="000000"/>
           <w:b w:val="0"/>
@@ -19576,7 +19574,7 @@
       <w:r>
         <w:rPr>
           <w:rFonts w:ascii="Times New Roman" w:hAnsi="Times New Roman" w:eastAsia="SimSun" w:cs="Times New Roman"/>
-          <w:sz w:val="20"/>
+          <w:sz w:val="19"/>
           <w:szCs w:val="20"/>
           <w:color w:val="000000"/>
           <w:b w:val="0"/>
@@ -19621,7 +19619,7 @@
       <w:r>
         <w:rPr>
           <w:rFonts w:ascii="Times New Roman" w:hAnsi="Times New Roman" w:eastAsia="SimSun" w:cs="Times New Roman"/>
-          <w:sz w:val="20"/>
+          <w:sz w:val="19"/>
           <w:szCs w:val="20"/>
           <w:color w:val="000000"/>
           <w:b w:val="0"/>
@@ -19666,7 +19664,7 @@
       <w:r>
         <w:rPr>
           <w:rFonts w:ascii="Times New Roman" w:hAnsi="Times New Roman" w:eastAsia="SimSun" w:cs="Times New Roman"/>
-          <w:sz w:val="20"/>
+          <w:sz w:val="19"/>
           <w:szCs w:val="20"/>
           <w:color w:val="000000"/>
           <w:b w:val="0"/>
@@ -19689,7 +19687,7 @@
       <w:r>
         <w:rPr>
           <w:rFonts w:ascii="Times New Roman" w:hAnsi="Times New Roman" w:eastAsia="SimSun" w:cs="Times New Roman"/>
-          <w:sz w:val="20"/>
+          <w:sz w:val="19"/>
           <w:szCs w:val="20"/>
           <w:color w:val="000000"/>
           <w:b w:val="0"/>
@@ -19737,7 +19735,7 @@
       <w:r>
         <w:rPr>
           <w:rFonts w:ascii="Times New Roman" w:hAnsi="Times New Roman" w:eastAsia="SimSun" w:cs="Times New Roman"/>
-          <w:sz w:val="20"/>
+          <w:sz w:val="19"/>
           <w:szCs w:val="20"/>
           <w:color w:val="000000"/>
           <w:b w:val="0"/>
@@ -19785,7 +19783,7 @@
       <w:r>
         <w:rPr>
           <w:rFonts w:ascii="Times New Roman" w:hAnsi="Times New Roman" w:eastAsia="SimSun" w:cs="Times New Roman"/>
-          <w:sz w:val="20"/>
+          <w:sz w:val="19"/>
           <w:szCs w:val="20"/>
           <w:color w:val="000000"/>
           <w:b w:val="0"/>
@@ -19836,7 +19834,7 @@
       <w:r>
         <w:rPr>
           <w:rFonts w:ascii="Times New Roman" w:hAnsi="Times New Roman" w:eastAsia="SimSun" w:cs="Times New Roman"/>
-          <w:sz w:val="20"/>
+          <w:sz w:val="19"/>
           <w:szCs w:val="20"/>
           <w:color w:val="000000"/>
           <w:b w:val="0"/>
@@ -19881,7 +19879,7 @@
       <w:r>
         <w:rPr>
           <w:rFonts w:ascii="Times New Roman" w:hAnsi="Times New Roman" w:eastAsia="SimSun" w:cs="Times New Roman"/>
-          <w:sz w:val="20"/>
+          <w:sz w:val="19"/>
           <w:szCs w:val="20"/>
           <w:color w:val="000000"/>
           <w:b w:val="0"/>
@@ -19951,7 +19949,7 @@
       <w:r>
         <w:rPr>
           <w:rFonts w:ascii="Times New Roman" w:hAnsi="Times New Roman" w:eastAsia="SimSun" w:cs="Times New Roman"/>
-          <w:sz w:val="20"/>
+          <w:sz w:val="19"/>
           <w:szCs w:val="20"/>
           <w:color w:val="000000"/>
           <w:b w:val="0"/>
@@ -20146,11 +20144,11 @@
     <w:p>
       <w:pPr>
         <w:pStyle w:val="BodyText"/>
-        <w:spacing w:after="20" w:line="216" w:lineRule="auto"/>
+        <w:spacing w:after="16" w:line="211" w:lineRule="auto"/>
       </w:pPr>
       <w:r>
         <w:rPr>
-          <w:sz w:val="20"/>
+          <w:sz w:val="19"/>
         </w:rPr>
         <w:t>Following Pieper’s analytical solution for a six-axis arm with a spherical wrist [9], the inverse kinematics separates wrist-center positioning from wrist orientation. Given the end-effector target p₀₆ and orientation R₀₆ in frame {0}, the wrist center is pW = p₀₆ − d₆R₀₆eᵧ, where eᵧ is the tool-frame +y unit vector and d₆ is the tool offset. Let ρW = √(xW² + yW²), ρA = √((ρW − a₁)² + (zW − d₁)²), γA = atan2(zW − d₁, ρW − a₁), ℓ₂ = a₂, and ℓ₃ = d₄. Here a₁, d₁, a₂, and d₄ are DH geometric parameters; d₄ locates the wrist center along z₃. The selected arm branch is:</w:t>
       </w:r>
@@ -20874,11 +20872,11 @@
     <w:p>
       <w:pPr>
         <w:pStyle w:val="BodyText"/>
-        <w:spacing w:after="20" w:line="216" w:lineRule="auto"/>
+        <w:spacing w:after="16" w:line="211" w:lineRule="auto"/>
       </w:pPr>
       <w:r>
         <w:rPr>
-          <w:sz w:val="20"/>
+          <w:sz w:val="19"/>
         </w:rPr>
         <w:t>Using the first three joint angles to form R₀₃ from the DH model, define R₃₆ = R₀₃ᵀR₀₆ = [n o a], whose columns are n, o, and a. For sin θ₅ ≠ 0, the wrist branches are:</w:t>
       </w:r>
@@ -21430,11 +21428,11 @@
     <w:p>
       <w:pPr>
         <w:pStyle w:val="BodyText"/>
-        <w:spacing w:after="20" w:line="216" w:lineRule="auto"/>
+        <w:spacing w:after="16" w:line="211" w:lineRule="auto"/>
       </w:pPr>
       <w:r>
         <w:rPr>
-          <w:sz w:val="20"/>
+          <w:sz w:val="19"/>
         </w:rPr>
         <w:t>The actual wrist joints are qₐ,j = θⱼ − θ₀,j (j = 4, 5, 6), where θ₀,j are the DH zero offsets. Forward-kinematics substitution verifies each candidate; the nearest feasible branch to the previous joint state is selected.</w:t>
       </w:r>
@@ -21540,7 +21538,7 @@
         <w:pStyle w:val="BodyText"/>
         <w:snapToGrid w:val="0"/>
         <w:widowControl/>
-        <w:spacing w:after="20" w:line="216" w:lineRule="auto"/>
+        <w:spacing w:after="16" w:line="211" w:lineRule="auto"/>
         <w:rPr>
           <w:rFonts w:ascii="Times New Roman" w:hAnsi="Times New Roman" w:eastAsia="SimSun" w:cs="Times New Roman"/>
           <w:sz w:val="20"/>
@@ -21551,7 +21549,7 @@
       <w:r>
         <w:rPr>
           <w:rFonts w:ascii="Times New Roman" w:hAnsi="Times New Roman" w:eastAsia="SimSun" w:cs="Times New Roman"/>
-          <w:sz w:val="20"/>
+          <w:sz w:val="19"/>
           <w:szCs w:val="20"/>
           <w:color w:val="000000"/>
           <w:b w:val="0"/>
@@ -21627,7 +21625,7 @@
         <w:pStyle w:val="BodyText"/>
         <w:snapToGrid w:val="0"/>
         <w:widowControl/>
-        <w:spacing w:after="20" w:line="216" w:lineRule="auto"/>
+        <w:spacing w:after="16" w:line="211" w:lineRule="auto"/>
         <w:rPr>
           <w:rFonts w:ascii="Times New Roman" w:hAnsi="Times New Roman" w:eastAsia="SimSun" w:cs="Times New Roman"/>
           <w:sz w:val="20"/>
@@ -21638,7 +21636,7 @@
       <w:r>
         <w:rPr>
           <w:rFonts w:ascii="Times New Roman" w:hAnsi="Times New Roman" w:eastAsia="SimSun" w:cs="Times New Roman"/>
-          <w:sz w:val="20"/>
+          <w:sz w:val="19"/>
           <w:szCs w:val="20"/>
           <w:color w:val="000000"/>
           <w:b w:val="0"/>
@@ -21664,7 +21662,7 @@
       <w:r>
         <w:rPr>
           <w:rFonts w:ascii="Times New Roman" w:hAnsi="Times New Roman" w:eastAsia="SimSun" w:cs="Times New Roman"/>
-          <w:sz w:val="20"/>
+          <w:sz w:val="19"/>
           <w:szCs w:val="20"/>
           <w:color w:val="000000"/>
           <w:b w:val="0"/>
@@ -21712,7 +21710,7 @@
       <w:r>
         <w:rPr>
           <w:rFonts w:ascii="Times New Roman" w:hAnsi="Times New Roman" w:eastAsia="SimSun" w:cs="Times New Roman"/>
-          <w:sz w:val="20"/>
+          <w:sz w:val="19"/>
           <w:szCs w:val="20"/>
           <w:color w:val="000000"/>
           <w:b w:val="0"/>
@@ -21760,7 +21758,7 @@
       <w:r>
         <w:rPr>
           <w:rFonts w:ascii="Times New Roman" w:hAnsi="Times New Roman" w:eastAsia="SimSun" w:cs="Times New Roman"/>
-          <w:sz w:val="20"/>
+          <w:sz w:val="19"/>
           <w:szCs w:val="20"/>
           <w:color w:val="000000"/>
           <w:b w:val="0"/>
@@ -21810,7 +21808,7 @@
       <w:r>
         <w:rPr>
           <w:rFonts w:ascii="Times New Roman" w:hAnsi="Times New Roman" w:eastAsia="SimSun" w:cs="Times New Roman"/>
-          <w:sz w:val="20"/>
+          <w:sz w:val="19"/>
           <w:szCs w:val="20"/>
           <w:color w:val="000000"/>
           <w:b w:val="0"/>
@@ -21858,7 +21856,7 @@
       <w:r>
         <w:rPr>
           <w:rFonts w:ascii="Times New Roman" w:hAnsi="Times New Roman" w:eastAsia="SimSun" w:cs="Times New Roman"/>
-          <w:sz w:val="20"/>
+          <w:sz w:val="19"/>
           <w:szCs w:val="20"/>
           <w:color w:val="000000"/>
           <w:b w:val="0"/>
@@ -21918,7 +21916,7 @@
       <w:r>
         <w:rPr>
           <w:rFonts w:ascii="Times New Roman" w:hAnsi="Times New Roman" w:eastAsia="SimSun" w:cs="Times New Roman"/>
-          <w:sz w:val="20"/>
+          <w:sz w:val="19"/>
           <w:szCs w:val="20"/>
           <w:color w:val="000000"/>
           <w:b w:val="0"/>
@@ -22014,7 +22012,7 @@
       <w:r>
         <w:rPr>
           <w:rFonts w:ascii="Times New Roman" w:hAnsi="Times New Roman" w:eastAsia="SimSun" w:cs="Times New Roman"/>
-          <w:sz w:val="20"/>
+          <w:sz w:val="19"/>
           <w:szCs w:val="20"/>
           <w:color w:val="000000"/>
           <w:b w:val="0"/>
@@ -22110,7 +22108,7 @@
       <w:r>
         <w:rPr>
           <w:rFonts w:ascii="Times New Roman" w:hAnsi="Times New Roman" w:eastAsia="SimSun" w:cs="Times New Roman"/>
-          <w:sz w:val="20"/>
+          <w:sz w:val="19"/>
           <w:szCs w:val="20"/>
           <w:color w:val="000000"/>
           <w:b w:val="0"/>
@@ -22158,7 +22156,7 @@
       <w:r>
         <w:rPr>
           <w:rFonts w:ascii="Times New Roman" w:hAnsi="Times New Roman" w:eastAsia="SimSun" w:cs="Times New Roman"/>
-          <w:sz w:val="20"/>
+          <w:sz w:val="19"/>
           <w:szCs w:val="20"/>
           <w:color w:val="000000"/>
           <w:b w:val="0"/>
@@ -22206,7 +22204,7 @@
       <w:r>
         <w:rPr>
           <w:rFonts w:ascii="Times New Roman" w:hAnsi="Times New Roman" w:eastAsia="SimSun" w:cs="Times New Roman"/>
-          <w:sz w:val="20"/>
+          <w:sz w:val="19"/>
           <w:szCs w:val="20"/>
           <w:color w:val="000000"/>
           <w:b w:val="0"/>
@@ -22351,7 +22349,7 @@
       <w:r>
         <w:rPr>
           <w:rFonts w:ascii="Times New Roman" w:hAnsi="Times New Roman" w:eastAsia="SimSun" w:cs="Times New Roman"/>
-          <w:sz w:val="20"/>
+          <w:sz w:val="19"/>
           <w:szCs w:val="20"/>
           <w:color w:val="000000"/>
           <w:b w:val="0"/>
@@ -22524,7 +22522,7 @@
       <w:r>
         <w:rPr>
           <w:rFonts w:ascii="Times New Roman" w:hAnsi="Times New Roman" w:eastAsia="SimSun" w:cs="Times New Roman"/>
-          <w:sz w:val="20"/>
+          <w:sz w:val="19"/>
           <w:szCs w:val="20"/>
           <w:color w:val="000000"/>
           <w:b w:val="0"/>
@@ -22581,7 +22579,7 @@
       <w:r>
         <w:rPr>
           <w:rFonts w:ascii="Times New Roman" w:hAnsi="Times New Roman" w:eastAsia="SimSun" w:cs="Times New Roman"/>
-          <w:sz w:val="20"/>
+          <w:sz w:val="19"/>
           <w:szCs w:val="20"/>
           <w:color w:val="000000"/>
           <w:b w:val="0"/>
@@ -22629,7 +22627,7 @@
       <w:r>
         <w:rPr>
           <w:rFonts w:ascii="Times New Roman" w:hAnsi="Times New Roman" w:eastAsia="SimSun" w:cs="Times New Roman"/>
-          <w:sz w:val="20"/>
+          <w:sz w:val="19"/>
           <w:szCs w:val="20"/>
           <w:color w:val="000000"/>
           <w:b w:val="0"/>
@@ -23808,7 +23806,7 @@
         <w:pStyle w:val="BodyText"/>
         <w:snapToGrid w:val="0"/>
         <w:widowControl/>
-        <w:spacing w:after="20" w:line="216" w:lineRule="auto"/>
+        <w:spacing w:after="16" w:line="211" w:lineRule="auto"/>
         <w:rPr>
           <w:rFonts w:ascii="Times New Roman" w:hAnsi="Times New Roman" w:eastAsia="SimSun" w:cs="Times New Roman"/>
           <w:sz w:val="20"/>
@@ -23820,7 +23818,7 @@
       <w:r>
         <w:rPr>
           <w:rFonts w:ascii="Times New Roman" w:hAnsi="Times New Roman" w:eastAsia="SimSun" w:cs="Times New Roman"/>
-          <w:sz w:val="20"/>
+          <w:sz w:val="19"/>
           <w:szCs w:val="20"/>
           <w:color w:val="000000"/>
           <w:b w:val="0"/>
@@ -24054,7 +24052,7 @@
       <w:r>
         <w:rPr>
           <w:rFonts w:ascii="Times New Roman" w:hAnsi="Times New Roman" w:eastAsia="SimSun" w:cs="Times New Roman"/>
-          <w:sz w:val="20"/>
+          <w:sz w:val="19"/>
           <w:szCs w:val="20"/>
           <w:color w:val="000000"/>
           <w:b w:val="0"/>
@@ -24546,7 +24544,7 @@
         <w:pStyle w:val="BodyText"/>
         <w:snapToGrid w:val="0"/>
         <w:widowControl/>
-        <w:spacing w:after="20" w:line="216" w:lineRule="auto"/>
+        <w:spacing w:after="16" w:line="211" w:lineRule="auto"/>
         <w:rPr>
           <w:rFonts w:ascii="Times New Roman" w:hAnsi="Times New Roman" w:eastAsia="SimSun" w:cs="Times New Roman"/>
           <w:sz w:val="20"/>
@@ -24558,7 +24556,7 @@
       <w:r>
         <w:rPr>
           <w:rFonts w:ascii="Times New Roman" w:hAnsi="Times New Roman" w:eastAsia="SimSun" w:cs="Times New Roman"/>
-          <w:sz w:val="20"/>
+          <w:sz w:val="19"/>
           <w:szCs w:val="20"/>
           <w:color w:val="000000"/>
           <w:b w:val="0"/>
@@ -24955,7 +24953,7 @@
         <w:pStyle w:val="BodyText"/>
         <w:snapToGrid w:val="0"/>
         <w:widowControl/>
-        <w:spacing w:after="20" w:line="216" w:lineRule="auto"/>
+        <w:spacing w:after="16" w:line="211" w:lineRule="auto"/>
         <w:rPr>
           <w:rFonts w:ascii="Times New Roman" w:hAnsi="Times New Roman" w:eastAsia="SimSun" w:cs="Times New Roman"/>
           <w:sz w:val="20"/>
@@ -24967,7 +24965,7 @@
       <w:r>
         <w:rPr>
           <w:rFonts w:ascii="Times New Roman" w:hAnsi="Times New Roman" w:eastAsia="SimSun" w:cs="Times New Roman"/>
-          <w:sz w:val="20"/>
+          <w:sz w:val="19"/>
           <w:szCs w:val="20"/>
           <w:color w:val="000000"/>
           <w:b w:val="0"/>
@@ -25518,7 +25516,7 @@
         <w:pStyle w:val="BodyText"/>
         <w:snapToGrid w:val="0"/>
         <w:widowControl/>
-        <w:spacing w:after="20" w:line="216" w:lineRule="auto"/>
+        <w:spacing w:after="16" w:line="211" w:lineRule="auto"/>
         <w:rPr>
           <w:rFonts w:ascii="Times New Roman" w:hAnsi="Times New Roman" w:eastAsia="SimSun" w:cs="Times New Roman"/>
           <w:sz w:val="20"/>
@@ -25530,7 +25528,7 @@
       <w:r>
         <w:rPr>
           <w:rFonts w:ascii="Times New Roman" w:hAnsi="Times New Roman" w:eastAsia="SimSun" w:cs="Times New Roman"/>
-          <w:sz w:val="20"/>
+          <w:sz w:val="19"/>
           <w:szCs w:val="20"/>
           <w:color w:val="000000"/>
           <w:b w:val="0"/>
@@ -25752,7 +25750,7 @@
       <w:r>
         <w:rPr>
           <w:rFonts w:ascii="Times New Roman" w:hAnsi="Times New Roman" w:eastAsia="SimSun" w:cs="Times New Roman"/>
-          <w:sz w:val="20"/>
+          <w:sz w:val="19"/>
           <w:szCs w:val="20"/>
           <w:color w:val="000000"/>
           <w:b w:val="0"/>
@@ -27015,7 +27013,7 @@
         <w:pStyle w:val="BodyText"/>
         <w:snapToGrid w:val="0"/>
         <w:widowControl/>
-        <w:spacing w:after="20" w:line="216" w:lineRule="auto"/>
+        <w:spacing w:after="16" w:line="211" w:lineRule="auto"/>
         <w:rPr>
           <w:rFonts w:ascii="Times New Roman" w:hAnsi="Times New Roman" w:eastAsia="SimSun" w:cs="Times New Roman"/>
           <w:sz w:val="20"/>
@@ -27026,7 +27024,7 @@
       <w:r>
         <w:rPr>
           <w:rFonts w:ascii="Times New Roman" w:hAnsi="Times New Roman" w:eastAsia="SimSun" w:cs="Times New Roman"/>
-          <w:sz w:val="20"/>
+          <w:sz w:val="19"/>
           <w:szCs w:val="20"/>
           <w:color w:val="000000"/>
           <w:b w:val="0"/>
@@ -27077,7 +27075,7 @@
       <w:r>
         <w:rPr>
           <w:rFonts w:ascii="Times New Roman" w:hAnsi="Times New Roman" w:eastAsia="SimSun" w:cs="Times New Roman"/>
-          <w:sz w:val="20"/>
+          <w:sz w:val="19"/>
           <w:szCs w:val="20"/>
           <w:color w:val="000000"/>
           <w:b w:val="0"/>
@@ -27221,7 +27219,7 @@
       <w:r>
         <w:rPr>
           <w:rFonts w:ascii="Times New Roman" w:hAnsi="Times New Roman" w:eastAsia="SimSun" w:cs="Times New Roman"/>
-          <w:sz w:val="20"/>
+          <w:sz w:val="19"/>
           <w:szCs w:val="20"/>
           <w:color w:val="000000"/>
           <w:b w:val="0"/>
@@ -27365,7 +27363,7 @@
       <w:r>
         <w:rPr>
           <w:rFonts w:ascii="Times New Roman" w:hAnsi="Times New Roman" w:eastAsia="SimSun" w:cs="Times New Roman"/>
-          <w:sz w:val="20"/>
+          <w:sz w:val="19"/>
           <w:szCs w:val="20"/>
           <w:color w:val="000000"/>
           <w:b w:val="0"/>
@@ -27613,7 +27611,7 @@
       </ns8:oMath>
       <w:r>
         <w:rPr>
-          <w:sz w:val="20"/>
+          <w:sz w:val="19"/>
         </w:rPr>
         <w:t>.</w:t>
       </w:r>
@@ -27768,7 +27766,7 @@
         <w:pStyle w:val="BodyText"/>
         <w:snapToGrid w:val="0"/>
         <w:widowControl/>
-        <w:spacing w:after="20" w:line="216" w:lineRule="auto"/>
+        <w:spacing w:after="16" w:line="211" w:lineRule="auto"/>
         <w:rPr>
           <w:rFonts w:ascii="Times New Roman" w:hAnsi="Times New Roman" w:eastAsia="SimSun" w:cs="Times New Roman"/>
           <w:sz w:val="20"/>
@@ -27780,7 +27778,7 @@
       <w:r>
         <w:rPr>
           <w:rFonts w:ascii="Times New Roman" w:hAnsi="Times New Roman" w:eastAsia="SimSun" w:cs="Times New Roman"/>
-          <w:sz w:val="20"/>
+          <w:sz w:val="19"/>
           <w:szCs w:val="20"/>
           <w:color w:val="000000"/>
           <w:b w:val="0"/>
@@ -27980,7 +27978,7 @@
       <w:r>
         <w:rPr>
           <w:rFonts w:ascii="Times New Roman" w:hAnsi="Times New Roman" w:eastAsia="SimSun" w:cs="Times New Roman"/>
-          <w:sz w:val="20"/>
+          <w:sz w:val="19"/>
           <w:szCs w:val="20"/>
           <w:color w:val="000000"/>
           <w:b w:val="0"/>
@@ -28236,7 +28234,7 @@
       <w:r>
         <w:rPr>
           <w:rFonts w:ascii="Times New Roman" w:hAnsi="Times New Roman" w:eastAsia="SimSun" w:cs="Times New Roman"/>
-          <w:sz w:val="20"/>
+          <w:sz w:val="19"/>
           <w:szCs w:val="20"/>
           <w:color w:val="000000"/>
           <w:b w:val="0"/>
@@ -29035,7 +29033,7 @@
         <w:pStyle w:val="BodyText"/>
         <w:snapToGrid w:val="0"/>
         <w:widowControl/>
-        <w:spacing w:after="20" w:line="216" w:lineRule="auto"/>
+        <w:spacing w:after="16" w:line="211" w:lineRule="auto"/>
         <w:rPr>
           <w:rFonts w:ascii="Times New Roman" w:hAnsi="Times New Roman" w:eastAsia="SimSun" w:cs="Times New Roman"/>
           <w:sz w:val="20"/>
@@ -29046,7 +29044,7 @@
       <w:r>
         <w:rPr>
           <w:rFonts w:ascii="Times New Roman" w:hAnsi="Times New Roman" w:eastAsia="SimSun" w:cs="Times New Roman"/>
-          <w:sz w:val="20"/>
+          <w:sz w:val="19"/>
           <w:szCs w:val="20"/>
           <w:color w:val="000000"/>
           <w:b w:val="0"/>
@@ -30152,7 +30150,7 @@
         <w:pStyle w:val="BodyText"/>
         <w:snapToGrid w:val="0"/>
         <w:widowControl/>
-        <w:spacing w:after="20" w:line="216" w:lineRule="auto"/>
+        <w:spacing w:after="16" w:line="211" w:lineRule="auto"/>
         <w:rPr>
           <w:rFonts w:ascii="Times New Roman" w:hAnsi="Times New Roman" w:eastAsia="SimSun" w:cs="Times New Roman"/>
           <w:sz w:val="20"/>
@@ -30163,7 +30161,7 @@
       <w:r>
         <w:rPr>
           <w:rFonts w:ascii="Times New Roman" w:hAnsi="Times New Roman" w:eastAsia="SimSun" w:cs="Times New Roman"/>
-          <w:sz w:val="20"/>
+          <w:sz w:val="19"/>
           <w:szCs w:val="20"/>
           <w:color w:val="000000"/>
           <w:b w:val="0"/>
@@ -30214,7 +30212,7 @@
       <w:r>
         <w:rPr>
           <w:rFonts w:ascii="Times New Roman" w:hAnsi="Times New Roman" w:eastAsia="SimSun" w:cs="Times New Roman"/>
-          <w:sz w:val="20"/>
+          <w:sz w:val="19"/>
           <w:szCs w:val="20"/>
           <w:color w:val="000000"/>
           <w:b w:val="0"/>
@@ -30265,7 +30263,7 @@
       <w:r>
         <w:rPr>
           <w:rFonts w:ascii="Times New Roman" w:hAnsi="Times New Roman" w:eastAsia="SimSun" w:cs="Times New Roman"/>
-          <w:sz w:val="20"/>
+          <w:sz w:val="19"/>
           <w:szCs w:val="20"/>
           <w:color w:val="000000"/>
           <w:b w:val="0"/>
@@ -30318,7 +30316,7 @@
       <w:r>
         <w:rPr>
           <w:rFonts w:ascii="Times New Roman" w:hAnsi="Times New Roman" w:eastAsia="SimSun" w:cs="Times New Roman"/>
-          <w:sz w:val="20"/>
+          <w:sz w:val="19"/>
           <w:szCs w:val="20"/>
           <w:color w:val="000000"/>
           <w:b w:val="0"/>
@@ -30369,7 +30367,7 @@
       <w:r>
         <w:rPr>
           <w:rFonts w:ascii="Times New Roman" w:hAnsi="Times New Roman" w:eastAsia="SimSun" w:cs="Times New Roman"/>
-          <w:sz w:val="20"/>
+          <w:sz w:val="19"/>
           <w:szCs w:val="20"/>
           <w:color w:val="000000"/>
           <w:b w:val="0"/>
@@ -30384,7 +30382,7 @@
         <w:pStyle w:val="BodyText"/>
         <w:snapToGrid w:val="0"/>
         <w:widowControl/>
-        <w:spacing w:after="20" w:line="216" w:lineRule="auto"/>
+        <w:spacing w:after="16" w:line="211" w:lineRule="auto"/>
         <w:rPr>
           <w:rFonts w:ascii="Times New Roman" w:hAnsi="Times New Roman" w:eastAsia="SimSun" w:cs="Times New Roman"/>
           <w:sz w:val="20"/>
@@ -30396,7 +30394,7 @@
       <w:r>
         <w:rPr>
           <w:rFonts w:ascii="Times New Roman" w:hAnsi="Times New Roman" w:eastAsia="SimSun" w:cs="Times New Roman"/>
-          <w:sz w:val="20"/>
+          <w:sz w:val="19"/>
           <w:szCs w:val="20"/>
           <w:color w:val="000000"/>
           <w:b w:val="0"/>
@@ -30447,7 +30445,7 @@
       <w:r>
         <w:rPr>
           <w:rFonts w:ascii="Times New Roman" w:hAnsi="Times New Roman" w:eastAsia="SimSun" w:cs="Times New Roman"/>
-          <w:sz w:val="20"/>
+          <w:sz w:val="19"/>
           <w:szCs w:val="20"/>
           <w:color w:val="000000"/>
           <w:b w:val="0"/>
@@ -30498,7 +30496,7 @@
       <w:r>
         <w:rPr>
           <w:rFonts w:ascii="Times New Roman" w:hAnsi="Times New Roman" w:eastAsia="SimSun" w:cs="Times New Roman"/>
-          <w:sz w:val="20"/>
+          <w:sz w:val="19"/>
           <w:szCs w:val="20"/>
           <w:color w:val="000000"/>
           <w:b w:val="0"/>
@@ -31036,7 +31034,7 @@
         <w:pStyle w:val="BodyText"/>
         <w:snapToGrid w:val="0"/>
         <w:widowControl/>
-        <w:spacing w:after="20" w:line="216" w:lineRule="auto"/>
+        <w:spacing w:after="16" w:line="211" w:lineRule="auto"/>
         <w:rPr>
           <w:rFonts w:ascii="Times New Roman" w:hAnsi="Times New Roman" w:eastAsia="SimSun" w:cs="Times New Roman"/>
           <w:sz w:val="20"/>
@@ -31047,7 +31045,7 @@
       <w:r>
         <w:rPr>
           <w:rFonts w:ascii="Times New Roman" w:hAnsi="Times New Roman" w:eastAsia="SimSun" w:cs="Times New Roman"/>
-          <w:sz w:val="20"/>
+          <w:sz w:val="19"/>
           <w:szCs w:val="20"/>
           <w:color w:val="000000"/>
           <w:b w:val="0"/>
@@ -31098,7 +31096,7 @@
       <w:r>
         <w:rPr>
           <w:rFonts w:ascii="Times New Roman" w:hAnsi="Times New Roman" w:eastAsia="SimSun" w:cs="Times New Roman"/>
-          <w:sz w:val="20"/>
+          <w:sz w:val="19"/>
           <w:szCs w:val="20"/>
           <w:color w:val="000000"/>
           <w:b w:val="0"/>
@@ -31302,7 +31300,7 @@
       <w:r>
         <w:rPr>
           <w:rFonts w:ascii="Times New Roman" w:hAnsi="Times New Roman" w:eastAsia="SimSun" w:cs="Times New Roman"/>
-          <w:sz w:val="20"/>
+          <w:sz w:val="19"/>
           <w:szCs w:val="20"/>
           <w:color w:val="000000"/>
           <w:b w:val="0"/>
@@ -31353,7 +31351,7 @@
       <w:r>
         <w:rPr>
           <w:rFonts w:ascii="Times New Roman" w:hAnsi="Times New Roman" w:eastAsia="SimSun" w:cs="Times New Roman"/>
-          <w:sz w:val="20"/>
+          <w:sz w:val="19"/>
           <w:szCs w:val="20"/>
           <w:color w:val="000000"/>
           <w:b w:val="0"/>
@@ -31404,7 +31402,7 @@
       <w:r>
         <w:rPr>
           <w:rFonts w:ascii="Times New Roman" w:hAnsi="Times New Roman" w:eastAsia="SimSun" w:cs="Times New Roman"/>
-          <w:sz w:val="20"/>
+          <w:sz w:val="19"/>
           <w:szCs w:val="20"/>
           <w:color w:val="000000"/>
           <w:b w:val="0"/>
@@ -31419,7 +31417,7 @@
         <w:pStyle w:val="BodyText"/>
         <w:snapToGrid w:val="0"/>
         <w:widowControl/>
-        <w:spacing w:after="20" w:line="216" w:lineRule="auto"/>
+        <w:spacing w:after="16" w:line="211" w:lineRule="auto"/>
         <w:rPr>
           <w:rFonts w:ascii="Times New Roman" w:hAnsi="Times New Roman" w:eastAsia="SimSun" w:cs="Times New Roman"/>
           <w:sz w:val="20"/>
@@ -31431,7 +31429,7 @@
       <w:r>
         <w:rPr>
           <w:rFonts w:ascii="Times New Roman" w:hAnsi="Times New Roman" w:eastAsia="SimSun" w:cs="Times New Roman"/>
-          <w:sz w:val="20"/>
+          <w:sz w:val="19"/>
           <w:szCs w:val="20"/>
           <w:color w:val="000000"/>
           <w:b w:val="0"/>
@@ -31725,7 +31723,7 @@
         <w:pStyle w:val="BodyText"/>
         <w:snapToGrid w:val="0"/>
         <w:widowControl/>
-        <w:spacing w:after="20" w:line="216" w:lineRule="auto"/>
+        <w:spacing w:after="16" w:line="211" w:lineRule="auto"/>
         <w:rPr>
           <w:rFonts w:ascii="Times New Roman" w:hAnsi="Times New Roman" w:eastAsia="SimSun" w:cs="Times New Roman"/>
           <w:sz w:val="20"/>
@@ -31737,7 +31735,7 @@
       <w:r>
         <w:rPr>
           <w:rFonts w:ascii="Times New Roman" w:hAnsi="Times New Roman" w:eastAsia="SimSun" w:cs="Times New Roman"/>
-          <w:sz w:val="20"/>
+          <w:sz w:val="19"/>
           <w:szCs w:val="20"/>
           <w:color w:val="000000"/>
           <w:b w:val="0"/>
@@ -31788,7 +31786,7 @@
       <w:r>
         <w:rPr>
           <w:rFonts w:ascii="Times New Roman" w:hAnsi="Times New Roman" w:eastAsia="SimSun" w:cs="Times New Roman"/>
-          <w:sz w:val="20"/>
+          <w:sz w:val="19"/>
           <w:szCs w:val="20"/>
           <w:color w:val="000000"/>
           <w:b w:val="0"/>
@@ -31995,7 +31993,7 @@
         <w:pStyle w:val="BodyText"/>
         <w:snapToGrid w:val="0"/>
         <w:widowControl/>
-        <w:spacing w:after="20" w:line="216" w:lineRule="auto"/>
+        <w:spacing w:after="16" w:line="211" w:lineRule="auto"/>
         <w:rPr>
           <w:rFonts w:ascii="Times New Roman" w:hAnsi="Times New Roman" w:eastAsia="SimSun" w:cs="Times New Roman"/>
           <w:sz w:val="20"/>
@@ -32006,7 +32004,7 @@
       <w:r>
         <w:rPr>
           <w:rFonts w:ascii="Times New Roman" w:hAnsi="Times New Roman" w:eastAsia="SimSun" w:cs="Times New Roman"/>
-          <w:sz w:val="20"/>
+          <w:sz w:val="19"/>
           <w:szCs w:val="20"/>
           <w:color w:val="000000"/>
           <w:b w:val="0"/>
@@ -32056,7 +32054,7 @@
         <w:pStyle w:val="BodyText"/>
         <w:snapToGrid w:val="0"/>
         <w:widowControl/>
-        <w:spacing w:after="20" w:line="216" w:lineRule="auto"/>
+        <w:spacing w:after="16" w:line="211" w:lineRule="auto"/>
         <w:rPr>
           <w:rFonts w:ascii="Times New Roman" w:hAnsi="Times New Roman" w:eastAsia="SimSun" w:cs="Times New Roman"/>
           <w:sz w:val="20"/>
@@ -32067,7 +32065,7 @@
       <w:r>
         <w:rPr>
           <w:rFonts w:ascii="Times New Roman" w:hAnsi="Times New Roman" w:eastAsia="SimSun" w:cs="Times New Roman"/>
-          <w:sz w:val="20"/>
+          <w:sz w:val="19"/>
           <w:szCs w:val="20"/>
           <w:color w:val="000000"/>
           <w:b w:val="0"/>
@@ -32620,7 +32618,7 @@
         <w:pStyle w:val="BodyText"/>
         <w:snapToGrid w:val="0"/>
         <w:widowControl/>
-        <w:spacing w:after="20" w:line="216" w:lineRule="auto"/>
+        <w:spacing w:after="16" w:line="211" w:lineRule="auto"/>
         <w:rPr>
           <w:rFonts w:ascii="Times New Roman" w:hAnsi="Times New Roman" w:eastAsia="SimSun" w:cs="Times New Roman"/>
           <w:sz w:val="20"/>
@@ -32631,7 +32629,7 @@
       <w:r>
         <w:rPr>
           <w:rFonts w:ascii="Times New Roman" w:hAnsi="Times New Roman" w:eastAsia="SimSun" w:cs="Times New Roman"/>
-          <w:sz w:val="20"/>
+          <w:sz w:val="19"/>
           <w:szCs w:val="20"/>
           <w:color w:val="000000"/>
           <w:b w:val="0"/>
@@ -33263,7 +33261,7 @@
         <w:pStyle w:val="BodyText"/>
         <w:snapToGrid w:val="0"/>
         <w:widowControl/>
-        <w:spacing w:after="20" w:line="216" w:lineRule="auto"/>
+        <w:spacing w:after="16" w:line="211" w:lineRule="auto"/>
         <w:rPr>
           <w:rFonts w:ascii="Times New Roman" w:hAnsi="Times New Roman" w:eastAsia="SimSun" w:cs="Times New Roman"/>
           <w:sz w:val="20"/>
@@ -33274,7 +33272,7 @@
       <w:r>
         <w:rPr>
           <w:rFonts w:ascii="Times New Roman" w:hAnsi="Times New Roman" w:eastAsia="SimSun" w:cs="Times New Roman"/>
-          <w:sz w:val="20"/>
+          <w:sz w:val="19"/>
           <w:szCs w:val="20"/>
           <w:color w:val="000000"/>
           <w:b w:val="0"/>
@@ -33289,7 +33287,7 @@
         <w:pStyle w:val="BodyText"/>
         <w:snapToGrid w:val="0"/>
         <w:widowControl/>
-        <w:spacing w:after="20" w:line="216" w:lineRule="auto"/>
+        <w:spacing w:after="16" w:line="211" w:lineRule="auto"/>
         <w:rPr>
           <w:rFonts w:ascii="Times New Roman" w:hAnsi="Times New Roman" w:eastAsia="SimSun" w:cs="Times New Roman"/>
           <w:sz w:val="20"/>
@@ -33300,7 +33298,7 @@
       <w:r>
         <w:rPr>
           <w:rFonts w:ascii="Times New Roman" w:hAnsi="Times New Roman" w:eastAsia="SimSun" w:cs="Times New Roman"/>
-          <w:sz w:val="20"/>
+          <w:sz w:val="19"/>
           <w:szCs w:val="20"/>
           <w:color w:val="000000"/>
           <w:b w:val="0"/>
@@ -36051,13 +36049,13 @@
       <w:tabs>
         <w:tab w:val="left" w:pos="288"/>
       </w:tabs>
-      <w:spacing w:after="20" w:line="216" w:lineRule="auto"/>
+      <w:spacing w:after="16" w:line="211" w:lineRule="auto"/>
       <w:ind w:firstLine="288"/>
       <w:jc w:val="both"/>
     </w:pPr>
     <w:rPr>
       <w:spacing w:val="-1"/>
-      <w:sz w:val="20"/>
+      <w:sz w:val="19"/>
       <w:lang w:val="x-none" w:eastAsia="x-none"/>
     </w:rPr>
   </w:style>

</xml_diff>

<commit_message>
Cite quadruped control reference for rigid-body model
</commit_message>
<xml_diff>
--- a/Article5_English_IEEE_Letter_Compact.docx
+++ b/Article5_English_IEEE_Letter_Compact.docx
@@ -13687,7 +13687,7 @@
           <w:i w:val="0"/>
           <w:iCs w:val="0"/>
         </w:rPr>
-        <w:t xml:space="preserve">Fig. 5 shows the whole-body center of mass and contact forces on the three-dimensional chassis configuration. During rapid chassis motion, the arm is usually stationary relative to the chassis. Both can then be approximated as one rigid body with equivalent mass and inertia. Let </w:t>
+        <w:t xml:space="preserve">Following the single-rigid-body modeling approach in [10], Fig. 5 shows the whole-body center of mass and contact forces on the three-dimensional chassis configuration. During rapid chassis motion, the arm is usually stationary relative to the chassis. Both can then be approximated as one rigid body with equivalent mass and inertia. Let </w:t>
       </w:r>
       <ns8:oMath>
         <ns8:r>
@@ -34007,6 +34007,42 @@
           <w:iCs w:val="0"/>
         </w:rPr>
         <w:t>D. L. Pieper, “The kinematics of manipulators under computer control,” Ph.D. dissertation, Stanford Univ., Stanford, CA, USA, 1968.</w:t>
+      </w:r>
+    </w:p>
+    <w:p ns2:paraId="4A7F63CD" ns2:textId="77777777">
+      <w:pPr>
+        <w:pStyle w:val="references"/>
+        <w:snapToGrid w:val="0"/>
+        <w:widowControl/>
+        <w:numPr>
+          <w:ilvl w:val="0"/>
+          <w:numId w:val="8"/>
+        </w:numPr>
+        <w:keepLines/>
+        <w:spacing w:after="0" w:line="216" w:lineRule="auto"/>
+        <w:ind w:left="360" w:hanging="360"/>
+        <w:rPr>
+          <w:rFonts w:ascii="Times New Roman" w:hAnsi="Times New Roman" w:eastAsia="SimSun" w:cs="Times New Roman"/>
+          <w:sz w:val="16"/>
+          <w:szCs w:val="16"/>
+          <w:color w:val="000000"/>
+          <w:b w:val="0"/>
+          <w:bCs w:val="0"/>
+          <w:i w:val="0"/>
+          <w:iCs w:val="0"/>
+        </w:rPr>
+      </w:pPr>
+      <w:r>
+        <w:t xml:space="preserve">Z. Bian and X. Wang, </w:t>
+      </w:r>
+      <w:r>
+        <w:rPr>
+          <w:i/>
+        </w:rPr>
+        <w:t>Quadruped Robot Control Algorithms: Modeling, Control, and Practice</w:t>
+      </w:r>
+      <w:r>
+        <w:t xml:space="preserve"> (in Chinese). Beijing, China: China Machine Press, 2023.</w:t>
       </w:r>
     </w:p>
     <w:p>

</xml_diff>